<commit_message>
Actualizacion del documento principal, inicio de investigación sobre CWB
</commit_message>
<xml_diff>
--- a/Investigacion-CoreWebVitals.docx
+++ b/Investigacion-CoreWebVitals.docx
@@ -43,7 +43,7 @@
                     </pic:cNvPicPr>
                   </pic:nvPicPr>
                   <pic:blipFill>
-                    <a:blip r:embed="rId7">
+                    <a:blip r:embed="rId8">
                       <a:extLst>
                         <a:ext uri="{28A0092B-C50C-407E-A947-70E740481C1C}">
                           <a14:useLocalDpi xmlns:a14="http://schemas.microsoft.com/office/drawing/2010/main" val="0"/>
@@ -204,7 +204,6 @@
           <w:rFonts w:ascii="Arial" w:hAnsi="Arial" w:cs="Arial"/>
           <w:sz w:val="26"/>
           <w:szCs w:val="26"/>
-          <w:lang w:val="en-US"/>
         </w:rPr>
       </w:pPr>
       <w:r>
@@ -212,7 +211,6 @@
           <w:rFonts w:ascii="Arial" w:hAnsi="Arial" w:cs="Arial"/>
           <w:sz w:val="26"/>
           <w:szCs w:val="26"/>
-          <w:lang w:val="en-US"/>
         </w:rPr>
         <w:t xml:space="preserve"> </w:t>
       </w:r>
@@ -221,7 +219,6 @@
           <w:rFonts w:ascii="Arial" w:hAnsi="Arial" w:cs="Arial"/>
           <w:sz w:val="26"/>
           <w:szCs w:val="26"/>
-          <w:lang w:val="en-US"/>
         </w:rPr>
         <w:t>Core Web Vitals</w:t>
       </w:r>
@@ -233,7 +230,6 @@
           <w:rFonts w:ascii="Arial" w:hAnsi="Arial" w:cs="Arial"/>
           <w:sz w:val="26"/>
           <w:szCs w:val="26"/>
-          <w:lang w:val="en-US"/>
         </w:rPr>
       </w:pPr>
     </w:p>
@@ -367,10 +363,13 @@
     <w:sdt>
       <w:sdtPr>
         <w:rPr>
-          <w:rFonts w:ascii="Arial" w:hAnsi="Arial" w:cs="Arial"/>
+          <w:rFonts w:ascii="Arial" w:eastAsiaTheme="minorEastAsia" w:hAnsi="Arial" w:cs="Arial"/>
+          <w:color w:val="auto"/>
+          <w:kern w:val="2"/>
           <w:sz w:val="22"/>
           <w:szCs w:val="22"/>
           <w:lang w:val="es-MX"/>
+          <w14:ligatures w14:val="standardContextual"/>
         </w:rPr>
         <w:id w:val="-543287463"/>
         <w:docPartObj>
@@ -378,14 +377,7 @@
           <w:docPartUnique/>
         </w:docPartObj>
       </w:sdtPr>
-      <w:sdtEndPr>
-        <w:rPr>
-          <w:rFonts w:eastAsiaTheme="minorEastAsia"/>
-          <w:color w:val="auto"/>
-          <w:kern w:val="2"/>
-          <w14:ligatures w14:val="standardContextual"/>
-        </w:rPr>
-      </w:sdtEndPr>
+      <w:sdtEndPr/>
       <w:sdtContent>
         <w:p>
           <w:pPr>
@@ -658,23 +650,6 @@
       <w:r>
         <w:rPr>
           <w:rFonts w:ascii="Arial" w:hAnsi="Arial" w:cs="Arial"/>
-          <w:sz w:val="22"/>
-          <w:szCs w:val="22"/>
-        </w:rPr>
-        <w:t>Esta es la sección más larga y puede subdividirse así:</w:t>
-      </w:r>
-    </w:p>
-    <w:p>
-      <w:pPr>
-        <w:rPr>
-          <w:rFonts w:ascii="Arial" w:hAnsi="Arial" w:cs="Arial"/>
-          <w:sz w:val="22"/>
-          <w:szCs w:val="22"/>
-        </w:rPr>
-      </w:pPr>
-      <w:r>
-        <w:rPr>
-          <w:rFonts w:ascii="Arial" w:hAnsi="Arial" w:cs="Arial"/>
           <w:b/>
           <w:bCs/>
           <w:sz w:val="22"/>
@@ -688,17 +663,25 @@
           <w:sz w:val="22"/>
           <w:szCs w:val="22"/>
         </w:rPr>
-        <w:t xml:space="preserve"> Qué son los Core Web Vitals, qué problema concreto resuelven.</w:t>
-      </w:r>
-    </w:p>
-    <w:p>
-      <w:pPr>
-        <w:rPr>
-          <w:rFonts w:ascii="Arial" w:hAnsi="Arial" w:cs="Arial"/>
-          <w:sz w:val="22"/>
-          <w:szCs w:val="22"/>
-        </w:rPr>
-      </w:pPr>
+        <w:t>.</w:t>
+      </w:r>
+    </w:p>
+    <w:p>
+      <w:pPr>
+        <w:rPr>
+          <w:rFonts w:ascii="Arial" w:hAnsi="Arial" w:cs="Arial"/>
+          <w:sz w:val="22"/>
+          <w:szCs w:val="22"/>
+        </w:rPr>
+      </w:pPr>
+      <w:r>
+        <w:rPr>
+          <w:rFonts w:ascii="Arial" w:hAnsi="Arial" w:cs="Arial"/>
+          <w:sz w:val="22"/>
+          <w:szCs w:val="22"/>
+        </w:rPr>
+        <w:t xml:space="preserve">Los </w:t>
+      </w:r>
       <w:r>
         <w:rPr>
           <w:rFonts w:ascii="Arial" w:hAnsi="Arial" w:cs="Arial"/>
@@ -707,15 +690,141 @@
           <w:sz w:val="22"/>
           <w:szCs w:val="22"/>
         </w:rPr>
-        <w:t>4.2 Funcionamiento interno</w:t>
-      </w:r>
-      <w:r>
-        <w:rPr>
-          <w:rFonts w:ascii="Arial" w:hAnsi="Arial" w:cs="Arial"/>
-          <w:sz w:val="22"/>
-          <w:szCs w:val="22"/>
-        </w:rPr>
-        <w:t xml:space="preserve"> Cómo los mide el navegador, </w:t>
+        <w:t>Core Web Vitals</w:t>
+      </w:r>
+      <w:r>
+        <w:rPr>
+          <w:rFonts w:ascii="Arial" w:hAnsi="Arial" w:cs="Arial"/>
+          <w:sz w:val="22"/>
+          <w:szCs w:val="22"/>
+        </w:rPr>
+        <w:t xml:space="preserve"> son un conjunto de métricas estandarizadas de Google diseñadas para cuantificar la experiencia real del usuario al navegar por una página web. Evalúan tres aspectos clave: velocidad de carga, interactividad y estabilidad visual</w:t>
+      </w:r>
+      <w:r>
+        <w:rPr>
+          <w:rFonts w:ascii="Arial" w:hAnsi="Arial" w:cs="Arial"/>
+          <w:sz w:val="22"/>
+          <w:szCs w:val="22"/>
+        </w:rPr>
+        <w:t xml:space="preserve">. </w:t>
+      </w:r>
+      <w:sdt>
+        <w:sdtPr>
+          <w:rPr>
+            <w:rFonts w:ascii="Arial" w:hAnsi="Arial" w:cs="Arial"/>
+            <w:sz w:val="22"/>
+            <w:szCs w:val="22"/>
+          </w:rPr>
+          <w:id w:val="923762585"/>
+          <w:citation/>
+        </w:sdtPr>
+        <w:sdtContent>
+          <w:r>
+            <w:rPr>
+              <w:rFonts w:ascii="Arial" w:hAnsi="Arial" w:cs="Arial"/>
+              <w:sz w:val="22"/>
+              <w:szCs w:val="22"/>
+            </w:rPr>
+            <w:fldChar w:fldCharType="begin"/>
+          </w:r>
+          <w:r>
+            <w:rPr>
+              <w:rFonts w:ascii="Arial" w:hAnsi="Arial" w:cs="Arial"/>
+              <w:sz w:val="22"/>
+              <w:szCs w:val="22"/>
+            </w:rPr>
+            <w:instrText xml:space="preserve"> CITATION Phi20 \l 5130 </w:instrText>
+          </w:r>
+          <w:r>
+            <w:rPr>
+              <w:rFonts w:ascii="Arial" w:hAnsi="Arial" w:cs="Arial"/>
+              <w:sz w:val="22"/>
+              <w:szCs w:val="22"/>
+            </w:rPr>
+            <w:fldChar w:fldCharType="separate"/>
+          </w:r>
+          <w:r>
+            <w:rPr>
+              <w:rFonts w:ascii="Arial" w:hAnsi="Arial" w:cs="Arial"/>
+              <w:noProof/>
+              <w:sz w:val="22"/>
+              <w:szCs w:val="22"/>
+            </w:rPr>
+            <w:t>(Walton, 2020)</w:t>
+          </w:r>
+          <w:r>
+            <w:rPr>
+              <w:rFonts w:ascii="Arial" w:hAnsi="Arial" w:cs="Arial"/>
+              <w:sz w:val="22"/>
+              <w:szCs w:val="22"/>
+            </w:rPr>
+            <w:fldChar w:fldCharType="end"/>
+          </w:r>
+        </w:sdtContent>
+      </w:sdt>
+    </w:p>
+    <w:p>
+      <w:pPr>
+        <w:rPr>
+          <w:rFonts w:ascii="Arial" w:hAnsi="Arial" w:cs="Arial"/>
+          <w:sz w:val="22"/>
+          <w:szCs w:val="22"/>
+        </w:rPr>
+      </w:pPr>
+      <w:r>
+        <w:rPr>
+          <w:rFonts w:ascii="Arial" w:hAnsi="Arial" w:cs="Arial"/>
+          <w:sz w:val="22"/>
+          <w:szCs w:val="22"/>
+        </w:rPr>
+        <w:t>Resuelven el problema de la frustración del usuario al navegar, evitando sitios web lentos, botones que no responden o elementos que se mueven bruscamente mientras se lee. Al mejorar estas métricas, se reduce el abandono y se mejora el posicionamiento orgánico en Google.</w:t>
+      </w:r>
+    </w:p>
+    <w:p>
+      <w:pPr>
+        <w:rPr>
+          <w:rFonts w:ascii="Arial" w:hAnsi="Arial" w:cs="Arial"/>
+          <w:sz w:val="22"/>
+          <w:szCs w:val="22"/>
+        </w:rPr>
+      </w:pPr>
+      <w:r>
+        <w:rPr>
+          <w:rFonts w:ascii="Arial" w:hAnsi="Arial" w:cs="Arial"/>
+          <w:sz w:val="22"/>
+          <w:szCs w:val="22"/>
+        </w:rPr>
+        <w:t>Se dividen en tres métricas principales y concretas:</w:t>
+      </w:r>
+      <w:r>
+        <w:rPr>
+          <w:rFonts w:ascii="Arial" w:hAnsi="Arial" w:cs="Arial"/>
+          <w:sz w:val="22"/>
+          <w:szCs w:val="22"/>
+        </w:rPr>
+        <w:t xml:space="preserve"> </w:t>
+      </w:r>
+    </w:p>
+    <w:p>
+      <w:pPr>
+        <w:pStyle w:val="Prrafodelista"/>
+        <w:numPr>
+          <w:ilvl w:val="0"/>
+          <w:numId w:val="1"/>
+        </w:numPr>
+        <w:rPr>
+          <w:rFonts w:ascii="Arial" w:hAnsi="Arial" w:cs="Arial"/>
+          <w:sz w:val="22"/>
+          <w:szCs w:val="22"/>
+        </w:rPr>
+      </w:pPr>
+      <w:r>
+        <w:rPr>
+          <w:rFonts w:ascii="Arial" w:hAnsi="Arial" w:cs="Arial"/>
+          <w:sz w:val="22"/>
+          <w:szCs w:val="22"/>
+        </w:rPr>
+        <w:t>LCP (</w:t>
       </w:r>
       <w:proofErr w:type="spellStart"/>
       <w:r>
@@ -724,7 +833,7 @@
           <w:sz w:val="22"/>
           <w:szCs w:val="22"/>
         </w:rPr>
-        <w:t>PerformanceObserver</w:t>
+        <w:t>Largest</w:t>
       </w:r>
       <w:proofErr w:type="spellEnd"/>
       <w:r>
@@ -733,8 +842,289 @@
           <w:sz w:val="22"/>
           <w:szCs w:val="22"/>
         </w:rPr>
-        <w:t>, flujo de datos.</w:t>
-      </w:r>
+        <w:t xml:space="preserve"> </w:t>
+      </w:r>
+      <w:proofErr w:type="spellStart"/>
+      <w:r>
+        <w:rPr>
+          <w:rFonts w:ascii="Arial" w:hAnsi="Arial" w:cs="Arial"/>
+          <w:sz w:val="22"/>
+          <w:szCs w:val="22"/>
+        </w:rPr>
+        <w:t>Contentful</w:t>
+      </w:r>
+      <w:proofErr w:type="spellEnd"/>
+      <w:r>
+        <w:rPr>
+          <w:rFonts w:ascii="Arial" w:hAnsi="Arial" w:cs="Arial"/>
+          <w:sz w:val="22"/>
+          <w:szCs w:val="22"/>
+        </w:rPr>
+        <w:t xml:space="preserve"> Paint - Carga): Mide cuánto tarda en cargarse el elemento principal (como una imagen grande o un bloque de texto) en la pantalla.</w:t>
+      </w:r>
+    </w:p>
+    <w:p>
+      <w:pPr>
+        <w:pStyle w:val="Prrafodelista"/>
+        <w:numPr>
+          <w:ilvl w:val="1"/>
+          <w:numId w:val="1"/>
+        </w:numPr>
+        <w:rPr>
+          <w:rFonts w:ascii="Arial" w:hAnsi="Arial" w:cs="Arial"/>
+          <w:sz w:val="22"/>
+          <w:szCs w:val="22"/>
+        </w:rPr>
+      </w:pPr>
+      <w:r>
+        <w:rPr>
+          <w:rFonts w:ascii="Arial" w:hAnsi="Arial" w:cs="Arial"/>
+          <w:sz w:val="22"/>
+          <w:szCs w:val="22"/>
+        </w:rPr>
+        <w:t>Problema que resuelve: Evita que el usuario mire una pantalla en blanco. El objetivo es que tarde menos de \(2,5\) segundos.</w:t>
+      </w:r>
+    </w:p>
+    <w:p>
+      <w:pPr>
+        <w:pStyle w:val="Prrafodelista"/>
+        <w:numPr>
+          <w:ilvl w:val="0"/>
+          <w:numId w:val="1"/>
+        </w:numPr>
+        <w:rPr>
+          <w:rFonts w:ascii="Arial" w:hAnsi="Arial" w:cs="Arial"/>
+          <w:sz w:val="22"/>
+          <w:szCs w:val="22"/>
+        </w:rPr>
+      </w:pPr>
+      <w:r>
+        <w:rPr>
+          <w:rFonts w:ascii="Arial" w:hAnsi="Arial" w:cs="Arial"/>
+          <w:sz w:val="22"/>
+          <w:szCs w:val="22"/>
+        </w:rPr>
+        <w:t>INP (</w:t>
+      </w:r>
+      <w:proofErr w:type="spellStart"/>
+      <w:r>
+        <w:rPr>
+          <w:rFonts w:ascii="Arial" w:hAnsi="Arial" w:cs="Arial"/>
+          <w:sz w:val="22"/>
+          <w:szCs w:val="22"/>
+        </w:rPr>
+        <w:t>Interaction</w:t>
+      </w:r>
+      <w:proofErr w:type="spellEnd"/>
+      <w:r>
+        <w:rPr>
+          <w:rFonts w:ascii="Arial" w:hAnsi="Arial" w:cs="Arial"/>
+          <w:sz w:val="22"/>
+          <w:szCs w:val="22"/>
+        </w:rPr>
+        <w:t xml:space="preserve"> to Next Paint - Interactividad): Mide el tiempo desde que el usuario interactúa con la página (un clic, un toque) hasta que el navegador actualiza la interfaz.</w:t>
+      </w:r>
+    </w:p>
+    <w:p>
+      <w:pPr>
+        <w:pStyle w:val="Prrafodelista"/>
+        <w:numPr>
+          <w:ilvl w:val="1"/>
+          <w:numId w:val="1"/>
+        </w:numPr>
+        <w:rPr>
+          <w:rFonts w:ascii="Arial" w:hAnsi="Arial" w:cs="Arial"/>
+          <w:sz w:val="22"/>
+          <w:szCs w:val="22"/>
+        </w:rPr>
+      </w:pPr>
+      <w:r>
+        <w:rPr>
+          <w:rFonts w:ascii="Arial" w:hAnsi="Arial" w:cs="Arial"/>
+          <w:sz w:val="22"/>
+          <w:szCs w:val="22"/>
+        </w:rPr>
+        <w:t>Problema que resuelve: Evita que la página parezca "congelada". El tiempo debe ser inferior a \(200\) milisegundos.</w:t>
+      </w:r>
+    </w:p>
+    <w:p>
+      <w:pPr>
+        <w:pStyle w:val="Prrafodelista"/>
+        <w:numPr>
+          <w:ilvl w:val="0"/>
+          <w:numId w:val="1"/>
+        </w:numPr>
+        <w:rPr>
+          <w:rFonts w:ascii="Arial" w:hAnsi="Arial" w:cs="Arial"/>
+          <w:sz w:val="22"/>
+          <w:szCs w:val="22"/>
+        </w:rPr>
+      </w:pPr>
+      <w:r>
+        <w:rPr>
+          <w:rFonts w:ascii="Arial" w:hAnsi="Arial" w:cs="Arial"/>
+          <w:sz w:val="22"/>
+          <w:szCs w:val="22"/>
+        </w:rPr>
+        <w:t xml:space="preserve">CLS (Cumulative </w:t>
+      </w:r>
+      <w:proofErr w:type="spellStart"/>
+      <w:r>
+        <w:rPr>
+          <w:rFonts w:ascii="Arial" w:hAnsi="Arial" w:cs="Arial"/>
+          <w:sz w:val="22"/>
+          <w:szCs w:val="22"/>
+        </w:rPr>
+        <w:t>Layout</w:t>
+      </w:r>
+      <w:proofErr w:type="spellEnd"/>
+      <w:r>
+        <w:rPr>
+          <w:rFonts w:ascii="Arial" w:hAnsi="Arial" w:cs="Arial"/>
+          <w:sz w:val="22"/>
+          <w:szCs w:val="22"/>
+        </w:rPr>
+        <w:t xml:space="preserve"> Shift - Estabilidad visual): Mide si los elementos de la página cambian de lugar de forma inesperada mientras se lee.</w:t>
+      </w:r>
+    </w:p>
+    <w:p>
+      <w:pPr>
+        <w:pStyle w:val="Prrafodelista"/>
+        <w:numPr>
+          <w:ilvl w:val="1"/>
+          <w:numId w:val="1"/>
+        </w:numPr>
+        <w:rPr>
+          <w:rFonts w:ascii="Arial" w:hAnsi="Arial" w:cs="Arial"/>
+          <w:sz w:val="22"/>
+          <w:szCs w:val="22"/>
+        </w:rPr>
+      </w:pPr>
+      <w:r>
+        <w:rPr>
+          <w:rFonts w:ascii="Arial" w:hAnsi="Arial" w:cs="Arial"/>
+          <w:sz w:val="22"/>
+          <w:szCs w:val="22"/>
+        </w:rPr>
+        <w:t>Problema que resuelve: Evita que hagas clic por accidente en el botón equivocado (como comprar o cancelar) porque el texto se movió. El valor debe ser menor a \(0,1\).</w:t>
+      </w:r>
+    </w:p>
+    <w:p>
+      <w:pPr>
+        <w:rPr>
+          <w:rFonts w:ascii="Arial" w:hAnsi="Arial" w:cs="Arial"/>
+          <w:sz w:val="22"/>
+          <w:szCs w:val="22"/>
+        </w:rPr>
+      </w:pPr>
+      <w:r>
+        <w:rPr>
+          <w:rFonts w:ascii="Arial" w:hAnsi="Arial" w:cs="Arial"/>
+          <w:sz w:val="22"/>
+          <w:szCs w:val="22"/>
+        </w:rPr>
+        <w:lastRenderedPageBreak/>
+        <w:t xml:space="preserve">Para saber si tu sitio cumple con estos estándares y solucionar posibles fallos, puedes medir y analizar tu página utilizando herramientas gratuitas como </w:t>
+      </w:r>
+      <w:proofErr w:type="spellStart"/>
+      <w:r>
+        <w:rPr>
+          <w:rFonts w:ascii="Arial" w:hAnsi="Arial" w:cs="Arial"/>
+          <w:sz w:val="22"/>
+          <w:szCs w:val="22"/>
+        </w:rPr>
+        <w:t>PageSpeed</w:t>
+      </w:r>
+      <w:proofErr w:type="spellEnd"/>
+      <w:r>
+        <w:rPr>
+          <w:rFonts w:ascii="Arial" w:hAnsi="Arial" w:cs="Arial"/>
+          <w:sz w:val="22"/>
+          <w:szCs w:val="22"/>
+        </w:rPr>
+        <w:t xml:space="preserve"> </w:t>
+      </w:r>
+      <w:proofErr w:type="spellStart"/>
+      <w:r>
+        <w:rPr>
+          <w:rFonts w:ascii="Arial" w:hAnsi="Arial" w:cs="Arial"/>
+          <w:sz w:val="22"/>
+          <w:szCs w:val="22"/>
+        </w:rPr>
+        <w:t>Insights</w:t>
+      </w:r>
+      <w:proofErr w:type="spellEnd"/>
+      <w:r>
+        <w:rPr>
+          <w:rFonts w:ascii="Arial" w:hAnsi="Arial" w:cs="Arial"/>
+          <w:sz w:val="22"/>
+          <w:szCs w:val="22"/>
+        </w:rPr>
+        <w:t xml:space="preserve"> o el informe oficial de Google Search Console.</w:t>
+      </w:r>
+      <w:sdt>
+        <w:sdtPr>
+          <w:rPr>
+            <w:rFonts w:ascii="Arial" w:hAnsi="Arial" w:cs="Arial"/>
+            <w:sz w:val="22"/>
+            <w:szCs w:val="22"/>
+          </w:rPr>
+          <w:id w:val="591747484"/>
+          <w:citation/>
+        </w:sdtPr>
+        <w:sdtContent>
+          <w:r>
+            <w:rPr>
+              <w:rFonts w:ascii="Arial" w:hAnsi="Arial" w:cs="Arial"/>
+              <w:sz w:val="22"/>
+              <w:szCs w:val="22"/>
+            </w:rPr>
+            <w:fldChar w:fldCharType="begin"/>
+          </w:r>
+          <w:r>
+            <w:rPr>
+              <w:rFonts w:ascii="Arial" w:hAnsi="Arial" w:cs="Arial"/>
+              <w:sz w:val="22"/>
+              <w:szCs w:val="22"/>
+            </w:rPr>
+            <w:instrText xml:space="preserve"> CITATION Arj26 \l 5130 </w:instrText>
+          </w:r>
+          <w:r>
+            <w:rPr>
+              <w:rFonts w:ascii="Arial" w:hAnsi="Arial" w:cs="Arial"/>
+              <w:sz w:val="22"/>
+              <w:szCs w:val="22"/>
+            </w:rPr>
+            <w:fldChar w:fldCharType="separate"/>
+          </w:r>
+          <w:r>
+            <w:rPr>
+              <w:rFonts w:ascii="Arial" w:hAnsi="Arial" w:cs="Arial"/>
+              <w:noProof/>
+              <w:sz w:val="22"/>
+              <w:szCs w:val="22"/>
+            </w:rPr>
+            <w:t xml:space="preserve"> </w:t>
+          </w:r>
+          <w:r>
+            <w:rPr>
+              <w:rFonts w:ascii="Arial" w:hAnsi="Arial" w:cs="Arial"/>
+              <w:noProof/>
+              <w:sz w:val="22"/>
+              <w:szCs w:val="22"/>
+            </w:rPr>
+            <w:t>(Karel, 2026)</w:t>
+          </w:r>
+          <w:r>
+            <w:rPr>
+              <w:rFonts w:ascii="Arial" w:hAnsi="Arial" w:cs="Arial"/>
+              <w:sz w:val="22"/>
+              <w:szCs w:val="22"/>
+            </w:rPr>
+            <w:fldChar w:fldCharType="end"/>
+          </w:r>
+        </w:sdtContent>
+      </w:sdt>
     </w:p>
     <w:p>
       <w:pPr>
@@ -752,15 +1142,202 @@
           <w:sz w:val="22"/>
           <w:szCs w:val="22"/>
         </w:rPr>
-        <w:t>4.3 Casos de uso</w:t>
-      </w:r>
-      <w:r>
-        <w:rPr>
-          <w:rFonts w:ascii="Arial" w:hAnsi="Arial" w:cs="Arial"/>
-          <w:sz w:val="22"/>
-          <w:szCs w:val="22"/>
-        </w:rPr>
-        <w:t xml:space="preserve"> Cuándo conviene usarlos y cuándo no, con ejemplos reales.</w:t>
+        <w:t>4.2 Funcionamiento interno</w:t>
+      </w:r>
+      <w:r>
+        <w:rPr>
+          <w:rFonts w:ascii="Arial" w:hAnsi="Arial" w:cs="Arial"/>
+          <w:sz w:val="22"/>
+          <w:szCs w:val="22"/>
+        </w:rPr>
+        <w:t xml:space="preserve"> Cómo los mide el navegador, </w:t>
+      </w:r>
+      <w:proofErr w:type="spellStart"/>
+      <w:r>
+        <w:rPr>
+          <w:rFonts w:ascii="Arial" w:hAnsi="Arial" w:cs="Arial"/>
+          <w:sz w:val="22"/>
+          <w:szCs w:val="22"/>
+        </w:rPr>
+        <w:t>PerformanceObserver</w:t>
+      </w:r>
+      <w:proofErr w:type="spellEnd"/>
+      <w:r>
+        <w:rPr>
+          <w:rFonts w:ascii="Arial" w:hAnsi="Arial" w:cs="Arial"/>
+          <w:sz w:val="22"/>
+          <w:szCs w:val="22"/>
+        </w:rPr>
+        <w:t>, flujo de datos.</w:t>
+      </w:r>
+    </w:p>
+    <w:p>
+      <w:pPr>
+        <w:rPr>
+          <w:rFonts w:ascii="Arial" w:hAnsi="Arial" w:cs="Arial"/>
+          <w:sz w:val="22"/>
+          <w:szCs w:val="22"/>
+        </w:rPr>
+      </w:pPr>
+      <w:r>
+        <w:rPr>
+          <w:rFonts w:ascii="Arial" w:hAnsi="Arial" w:cs="Arial"/>
+          <w:sz w:val="22"/>
+          <w:szCs w:val="22"/>
+        </w:rPr>
+        <w:t xml:space="preserve">l navegador mide el rendimiento recopilando eventos del ciclo de vida de la página (como carga de recursos, pintura y pulsaciones de teclas). La interfaz </w:t>
+      </w:r>
+      <w:proofErr w:type="spellStart"/>
+      <w:r>
+        <w:rPr>
+          <w:rFonts w:ascii="Arial" w:hAnsi="Arial" w:cs="Arial"/>
+          <w:sz w:val="22"/>
+          <w:szCs w:val="22"/>
+        </w:rPr>
+        <w:t>PerformanceObserver</w:t>
+      </w:r>
+      <w:proofErr w:type="spellEnd"/>
+      <w:r>
+        <w:rPr>
+          <w:rFonts w:ascii="Arial" w:hAnsi="Arial" w:cs="Arial"/>
+          <w:sz w:val="22"/>
+          <w:szCs w:val="22"/>
+        </w:rPr>
+        <w:t xml:space="preserve"> actúa como un sistema de escucha, capturando estos datos de forma asíncrona a medida que </w:t>
+      </w:r>
+      <w:proofErr w:type="spellStart"/>
+      <w:r>
+        <w:rPr>
+          <w:rFonts w:ascii="Arial" w:hAnsi="Arial" w:cs="Arial"/>
+          <w:sz w:val="22"/>
+          <w:szCs w:val="22"/>
+        </w:rPr>
+        <w:t>ocurren.Cómo</w:t>
+      </w:r>
+      <w:proofErr w:type="spellEnd"/>
+      <w:r>
+        <w:rPr>
+          <w:rFonts w:ascii="Arial" w:hAnsi="Arial" w:cs="Arial"/>
+          <w:sz w:val="22"/>
+          <w:szCs w:val="22"/>
+        </w:rPr>
+        <w:t xml:space="preserve"> funciona el flujo de datos</w:t>
+      </w:r>
+    </w:p>
+    <w:p>
+      <w:pPr>
+        <w:rPr>
+          <w:rFonts w:ascii="Arial" w:hAnsi="Arial" w:cs="Arial"/>
+          <w:sz w:val="22"/>
+          <w:szCs w:val="22"/>
+        </w:rPr>
+      </w:pPr>
+    </w:p>
+    <w:p>
+      <w:pPr>
+        <w:rPr>
+          <w:rFonts w:ascii="Arial" w:hAnsi="Arial" w:cs="Arial"/>
+          <w:sz w:val="22"/>
+          <w:szCs w:val="22"/>
+        </w:rPr>
+      </w:pPr>
+      <w:r>
+        <w:rPr>
+          <w:rFonts w:ascii="Arial" w:hAnsi="Arial" w:cs="Arial"/>
+          <w:sz w:val="22"/>
+          <w:szCs w:val="22"/>
+        </w:rPr>
+        <w:t xml:space="preserve">El Navegador (Buffer): A medida que la página se carga e interactúa, el navegador registra marcas y medidas en su propia línea de tiempo interna (Performance Timeline).El Observador: Creas una instancia de </w:t>
+      </w:r>
+      <w:proofErr w:type="spellStart"/>
+      <w:r>
+        <w:rPr>
+          <w:rFonts w:ascii="Arial" w:hAnsi="Arial" w:cs="Arial"/>
+          <w:sz w:val="22"/>
+          <w:szCs w:val="22"/>
+        </w:rPr>
+        <w:t>PerformanceObserver</w:t>
+      </w:r>
+      <w:proofErr w:type="spellEnd"/>
+      <w:r>
+        <w:rPr>
+          <w:rFonts w:ascii="Arial" w:hAnsi="Arial" w:cs="Arial"/>
+          <w:sz w:val="22"/>
+          <w:szCs w:val="22"/>
+        </w:rPr>
+        <w:t xml:space="preserve"> y le indicas qué métricas específicas deseas </w:t>
+      </w:r>
+      <w:proofErr w:type="spellStart"/>
+      <w:r>
+        <w:rPr>
+          <w:rFonts w:ascii="Arial" w:hAnsi="Arial" w:cs="Arial"/>
+          <w:sz w:val="22"/>
+          <w:szCs w:val="22"/>
+        </w:rPr>
+        <w:t>rastrear.El</w:t>
+      </w:r>
+      <w:proofErr w:type="spellEnd"/>
+      <w:r>
+        <w:rPr>
+          <w:rFonts w:ascii="Arial" w:hAnsi="Arial" w:cs="Arial"/>
+          <w:sz w:val="22"/>
+          <w:szCs w:val="22"/>
+        </w:rPr>
+        <w:t xml:space="preserve"> </w:t>
+      </w:r>
+      <w:proofErr w:type="spellStart"/>
+      <w:r>
+        <w:rPr>
+          <w:rFonts w:ascii="Arial" w:hAnsi="Arial" w:cs="Arial"/>
+          <w:sz w:val="22"/>
+          <w:szCs w:val="22"/>
+        </w:rPr>
+        <w:t>Callback</w:t>
+      </w:r>
+      <w:proofErr w:type="spellEnd"/>
+      <w:r>
+        <w:rPr>
+          <w:rFonts w:ascii="Arial" w:hAnsi="Arial" w:cs="Arial"/>
+          <w:sz w:val="22"/>
+          <w:szCs w:val="22"/>
+        </w:rPr>
+        <w:t>: Cuando el navegador registra una entrada del tipo que estás observando, activa una función de devolución de llamada (</w:t>
+      </w:r>
+      <w:proofErr w:type="spellStart"/>
+      <w:r>
+        <w:rPr>
+          <w:rFonts w:ascii="Arial" w:hAnsi="Arial" w:cs="Arial"/>
+          <w:sz w:val="22"/>
+          <w:szCs w:val="22"/>
+        </w:rPr>
+        <w:t>callback</w:t>
+      </w:r>
+      <w:proofErr w:type="spellEnd"/>
+      <w:r>
+        <w:rPr>
+          <w:rFonts w:ascii="Arial" w:hAnsi="Arial" w:cs="Arial"/>
+          <w:sz w:val="22"/>
+          <w:szCs w:val="22"/>
+        </w:rPr>
+        <w:t xml:space="preserve">) que recibe un lote de objetos </w:t>
+      </w:r>
+      <w:proofErr w:type="spellStart"/>
+      <w:r>
+        <w:rPr>
+          <w:rFonts w:ascii="Arial" w:hAnsi="Arial" w:cs="Arial"/>
+          <w:sz w:val="22"/>
+          <w:szCs w:val="22"/>
+        </w:rPr>
+        <w:t>PerformanceEntry.Procesamiento</w:t>
+      </w:r>
+      <w:proofErr w:type="spellEnd"/>
+      <w:r>
+        <w:rPr>
+          <w:rFonts w:ascii="Arial" w:hAnsi="Arial" w:cs="Arial"/>
+          <w:sz w:val="22"/>
+          <w:szCs w:val="22"/>
+        </w:rPr>
+        <w:t>: Puedes leer, enviar, o procesar los datos de cada evento (duración, marca de tiempo, tipo) para su análisis.</w:t>
       </w:r>
     </w:p>
     <w:p>
@@ -779,15 +1356,15 @@
           <w:sz w:val="22"/>
           <w:szCs w:val="22"/>
         </w:rPr>
-        <w:t>4.4 Comparativa con alternativas</w:t>
-      </w:r>
-      <w:r>
-        <w:rPr>
-          <w:rFonts w:ascii="Arial" w:hAnsi="Arial" w:cs="Arial"/>
-          <w:sz w:val="22"/>
-          <w:szCs w:val="22"/>
-        </w:rPr>
-        <w:t xml:space="preserve"> CWV vs métricas anteriores (FID, FCP, TTFB), tabla comparativa.</w:t>
+        <w:t>4.3 Casos de uso</w:t>
+      </w:r>
+      <w:r>
+        <w:rPr>
+          <w:rFonts w:ascii="Arial" w:hAnsi="Arial" w:cs="Arial"/>
+          <w:sz w:val="22"/>
+          <w:szCs w:val="22"/>
+        </w:rPr>
+        <w:t xml:space="preserve"> Cuándo conviene usarlos y cuándo no, con ejemplos reales.</w:t>
       </w:r>
     </w:p>
     <w:p>
@@ -806,6 +1383,33 @@
           <w:sz w:val="22"/>
           <w:szCs w:val="22"/>
         </w:rPr>
+        <w:t>4.4 Comparativa con alternativas</w:t>
+      </w:r>
+      <w:r>
+        <w:rPr>
+          <w:rFonts w:ascii="Arial" w:hAnsi="Arial" w:cs="Arial"/>
+          <w:sz w:val="22"/>
+          <w:szCs w:val="22"/>
+        </w:rPr>
+        <w:t xml:space="preserve"> CWV vs métricas anteriores (FID, FCP, TTFB), tabla comparativa.</w:t>
+      </w:r>
+    </w:p>
+    <w:p>
+      <w:pPr>
+        <w:rPr>
+          <w:rFonts w:ascii="Arial" w:hAnsi="Arial" w:cs="Arial"/>
+          <w:sz w:val="22"/>
+          <w:szCs w:val="22"/>
+        </w:rPr>
+      </w:pPr>
+      <w:r>
+        <w:rPr>
+          <w:rFonts w:ascii="Arial" w:hAnsi="Arial" w:cs="Arial"/>
+          <w:b/>
+          <w:bCs/>
+          <w:sz w:val="22"/>
+          <w:szCs w:val="22"/>
+        </w:rPr>
         <w:t>4.5 Ecosistema actual</w:t>
       </w:r>
       <w:r>
@@ -894,6 +1498,7 @@
           <w:sz w:val="22"/>
           <w:szCs w:val="22"/>
         </w:rPr>
+        <w:lastRenderedPageBreak/>
         <w:br w:type="page"/>
       </w:r>
     </w:p>
@@ -1016,7 +1621,8 @@
     <w:sdt>
       <w:sdtPr>
         <w:rPr>
-          <w:rFonts w:ascii="Arial" w:hAnsi="Arial" w:cs="Arial"/>
+          <w:rFonts w:ascii="Arial" w:eastAsiaTheme="minorEastAsia" w:hAnsi="Arial" w:cs="Arial"/>
+          <w:color w:val="auto"/>
           <w:sz w:val="22"/>
           <w:szCs w:val="22"/>
           <w:lang w:val="es-MX"/>
@@ -1029,8 +1635,6 @@
       </w:sdtPr>
       <w:sdtEndPr>
         <w:rPr>
-          <w:rFonts w:eastAsiaTheme="minorEastAsia"/>
-          <w:color w:val="auto"/>
           <w:lang w:val="es-CR"/>
         </w:rPr>
       </w:sdtEndPr>
@@ -1064,6 +1668,7 @@
             <w:id w:val="-573587230"/>
             <w:bibliography/>
           </w:sdtPr>
+          <w:sdtEndPr/>
           <w:sdtContent>
             <w:p>
               <w:pPr>
@@ -1130,7 +1735,7 @@
       </w:pPr>
     </w:p>
     <w:sectPr>
-      <w:headerReference w:type="default" r:id="rId8"/>
+      <w:headerReference w:type="default" r:id="rId9"/>
       <w:pgSz w:w="12240" w:h="15840"/>
       <w:pgMar w:top="1417" w:right="1701" w:bottom="1417" w:left="1701" w:header="708" w:footer="708" w:gutter="0"/>
       <w:cols w:space="708"/>
@@ -1201,6 +1806,7 @@
         <w:docPartUnique/>
       </w:docPartObj>
     </w:sdtPr>
+    <w:sdtEndPr/>
     <w:sdtContent>
       <w:p>
         <w:pPr>
@@ -1234,6 +1840,103 @@
     </w:pPr>
   </w:p>
 </w:hdr>
+</file>
+
+<file path=word/numbering.xml><?xml version="1.0" encoding="utf-8"?>
+<w:numbering xmlns:wpc="http://schemas.microsoft.com/office/word/2010/wordprocessingCanvas" xmlns:cx="http://schemas.microsoft.com/office/drawing/2014/chartex" xmlns:cx1="http://schemas.microsoft.com/office/drawing/2015/9/8/chartex" xmlns:cx2="http://schemas.microsoft.com/office/drawing/2015/10/21/chartex" xmlns:cx3="http://schemas.microsoft.com/office/drawing/2016/5/9/chartex" xmlns:cx4="http://schemas.microsoft.com/office/drawing/2016/5/10/chartex" xmlns:cx5="http://schemas.microsoft.com/office/drawing/2016/5/11/chartex" xmlns:cx6="http://schemas.microsoft.com/office/drawing/2016/5/12/chartex" xmlns:cx7="http://schemas.microsoft.com/office/drawing/2016/5/13/chartex" xmlns:cx8="http://schemas.microsoft.com/office/drawing/2016/5/14/chartex" xmlns:mc="http://schemas.openxmlformats.org/markup-compatibility/2006" xmlns:aink="http://schemas.microsoft.com/office/drawing/2016/ink" xmlns:am3d="http://schemas.microsoft.com/office/drawing/2017/model3d" xmlns:o="urn:schemas-microsoft-com:office:office" xmlns:oel="http://schemas.microsoft.com/office/2019/extlst" xmlns:r="http://schemas.openxmlformats.org/officeDocument/2006/relationships" xmlns:m="http://schemas.openxmlformats.org/officeDocument/2006/math" xmlns:v="urn:schemas-microsoft-com:vml" xmlns:wp14="http://schemas.microsoft.com/office/word/2010/wordprocessingDrawing" xmlns:wp="http://schemas.openxmlformats.org/drawingml/2006/wordprocessingDrawing" xmlns:w10="urn:schemas-microsoft-com:office:word" xmlns:w="http://schemas.openxmlformats.org/wordprocessingml/2006/main" xmlns:w14="http://schemas.microsoft.com/office/word/2010/wordml" xmlns:w15="http://schemas.microsoft.com/office/word/2012/wordml" xmlns:w16cex="http://schemas.microsoft.com/office/word/2018/wordml/cex" xmlns:w16cid="http://schemas.microsoft.com/office/word/2016/wordml/cid" xmlns:w16="http://schemas.microsoft.com/office/word/2018/wordml" xmlns:w16du="http://schemas.microsoft.com/office/word/2023/wordml/word16du" xmlns:w16sdtdh="http://schemas.microsoft.com/office/word/2020/wordml/sdtdatahash" xmlns:w16sdtfl="http://schemas.microsoft.com/office/word/2024/wordml/sdtformatlock" xmlns:w16se="http://schemas.microsoft.com/office/word/2015/wordml/symex" xmlns:wpg="http://schemas.microsoft.com/office/word/2010/wordprocessingGroup" xmlns:wpi="http://schemas.microsoft.com/office/word/2010/wordprocessingInk" xmlns:wne="http://schemas.microsoft.com/office/word/2006/wordml" xmlns:wps="http://schemas.microsoft.com/office/word/2010/wordprocessingShape" mc:Ignorable="w14 w15 w16se w16cid w16 w16cex w16sdtdh w16sdtfl w16du wp14">
+  <w:abstractNum w:abstractNumId="0" w15:restartNumberingAfterBreak="0">
+    <w:nsid w:val="7CD54309"/>
+    <w:multiLevelType w:val="hybridMultilevel"/>
+    <w:tmpl w:val="D81C5DE8"/>
+    <w:lvl w:ilvl="0" w:tplc="140A000F">
+      <w:start w:val="1"/>
+      <w:numFmt w:val="decimal"/>
+      <w:lvlText w:val="%1."/>
+      <w:lvlJc w:val="left"/>
+      <w:pPr>
+        <w:ind w:left="720" w:hanging="360"/>
+      </w:pPr>
+      <w:rPr>
+        <w:rFonts w:hint="default"/>
+      </w:rPr>
+    </w:lvl>
+    <w:lvl w:ilvl="1" w:tplc="140A0019">
+      <w:start w:val="1"/>
+      <w:numFmt w:val="lowerLetter"/>
+      <w:lvlText w:val="%2."/>
+      <w:lvlJc w:val="left"/>
+      <w:pPr>
+        <w:ind w:left="1440" w:hanging="360"/>
+      </w:pPr>
+    </w:lvl>
+    <w:lvl w:ilvl="2" w:tplc="140A001B" w:tentative="1">
+      <w:start w:val="1"/>
+      <w:numFmt w:val="lowerRoman"/>
+      <w:lvlText w:val="%3."/>
+      <w:lvlJc w:val="right"/>
+      <w:pPr>
+        <w:ind w:left="2160" w:hanging="180"/>
+      </w:pPr>
+    </w:lvl>
+    <w:lvl w:ilvl="3" w:tplc="140A000F" w:tentative="1">
+      <w:start w:val="1"/>
+      <w:numFmt w:val="decimal"/>
+      <w:lvlText w:val="%4."/>
+      <w:lvlJc w:val="left"/>
+      <w:pPr>
+        <w:ind w:left="2880" w:hanging="360"/>
+      </w:pPr>
+    </w:lvl>
+    <w:lvl w:ilvl="4" w:tplc="140A0019" w:tentative="1">
+      <w:start w:val="1"/>
+      <w:numFmt w:val="lowerLetter"/>
+      <w:lvlText w:val="%5."/>
+      <w:lvlJc w:val="left"/>
+      <w:pPr>
+        <w:ind w:left="3600" w:hanging="360"/>
+      </w:pPr>
+    </w:lvl>
+    <w:lvl w:ilvl="5" w:tplc="140A001B" w:tentative="1">
+      <w:start w:val="1"/>
+      <w:numFmt w:val="lowerRoman"/>
+      <w:lvlText w:val="%6."/>
+      <w:lvlJc w:val="right"/>
+      <w:pPr>
+        <w:ind w:left="4320" w:hanging="180"/>
+      </w:pPr>
+    </w:lvl>
+    <w:lvl w:ilvl="6" w:tplc="140A000F" w:tentative="1">
+      <w:start w:val="1"/>
+      <w:numFmt w:val="decimal"/>
+      <w:lvlText w:val="%7."/>
+      <w:lvlJc w:val="left"/>
+      <w:pPr>
+        <w:ind w:left="5040" w:hanging="360"/>
+      </w:pPr>
+    </w:lvl>
+    <w:lvl w:ilvl="7" w:tplc="140A0019" w:tentative="1">
+      <w:start w:val="1"/>
+      <w:numFmt w:val="lowerLetter"/>
+      <w:lvlText w:val="%8."/>
+      <w:lvlJc w:val="left"/>
+      <w:pPr>
+        <w:ind w:left="5760" w:hanging="360"/>
+      </w:pPr>
+    </w:lvl>
+    <w:lvl w:ilvl="8" w:tplc="140A001B" w:tentative="1">
+      <w:start w:val="1"/>
+      <w:numFmt w:val="lowerRoman"/>
+      <w:lvlText w:val="%9."/>
+      <w:lvlJc w:val="right"/>
+      <w:pPr>
+        <w:ind w:left="6480" w:hanging="180"/>
+      </w:pPr>
+    </w:lvl>
+  </w:abstractNum>
+  <w:num w:numId="1" w16cid:durableId="852376502">
+    <w:abstractNumId w:val="0"/>
+  </w:num>
+</w:numbering>
 </file>
 
 <file path=word/styles.xml><?xml version="1.0" encoding="utf-8"?>
@@ -2537,11 +3240,55 @@
 </file>
 
 <file path=customXml/item1.xml><?xml version="1.0" encoding="utf-8"?>
-<b:Sources xmlns:b="http://schemas.openxmlformats.org/officeDocument/2006/bibliography" xmlns="http://schemas.openxmlformats.org/officeDocument/2006/bibliography" SelectedStyle="\APASixthEditionOfficeOnline.xsl" StyleName="APA" Version="6"/>
+<b:Sources xmlns:b="http://schemas.openxmlformats.org/officeDocument/2006/bibliography" xmlns="http://schemas.openxmlformats.org/officeDocument/2006/bibliography" SelectedStyle="\APASixthEditionOfficeOnline.xsl" StyleName="APA" Version="6">
+  <b:Source>
+    <b:Tag>Phi20</b:Tag>
+    <b:SourceType>InternetSite</b:SourceType>
+    <b:Guid>{5DCF8193-A1D5-447D-BFE6-D0EB2EDCEEC2}</b:Guid>
+    <b:Author>
+      <b:Author>
+        <b:NameList>
+          <b:Person>
+            <b:Last>Walton</b:Last>
+            <b:First>Philip</b:First>
+          </b:Person>
+        </b:NameList>
+      </b:Author>
+    </b:Author>
+    <b:InternetSiteTitle>https://web.dev/</b:InternetSiteTitle>
+    <b:Year>2020</b:Year>
+    <b:Month>Mayo</b:Month>
+    <b:Day>4</b:Day>
+    <b:URL>https://web.dev/articles/vitals?hl=es-419</b:URL>
+    <b:RefOrder>1</b:RefOrder>
+  </b:Source>
+  <b:Source>
+    <b:Tag>Arj26</b:Tag>
+    <b:SourceType>InternetSite</b:SourceType>
+    <b:Guid>{2DE66C75-2BF5-4226-928B-E8ADCB93F30E}</b:Guid>
+    <b:Author>
+      <b:Author>
+        <b:NameList>
+          <b:Person>
+            <b:Last>Karel</b:Last>
+            <b:First>Arjen</b:First>
+          </b:Person>
+        </b:NameList>
+      </b:Author>
+    </b:Author>
+    <b:Title>Core Web Vtals</b:Title>
+    <b:InternetSiteTitle>www.corewebvitals.io</b:InternetSiteTitle>
+    <b:Year>2026</b:Year>
+    <b:Month>Marzo</b:Month>
+    <b:Day>3</b:Day>
+    <b:URL>https://www.corewebvitals.io/es/core-web-vitals</b:URL>
+    <b:RefOrder>2</b:RefOrder>
+  </b:Source>
+</b:Sources>
 </file>
 
 <file path=customXml/itemProps1.xml><?xml version="1.0" encoding="utf-8"?>
-<ds:datastoreItem xmlns:ds="http://schemas.openxmlformats.org/officeDocument/2006/customXml" ds:itemID="{FB54ACC5-9050-40D6-88E9-A69670476C69}">
+<ds:datastoreItem xmlns:ds="http://schemas.openxmlformats.org/officeDocument/2006/customXml" ds:itemID="{64A738CF-7088-4596-A4BA-117DE70E06F1}">
   <ds:schemaRefs>
     <ds:schemaRef ds:uri="http://schemas.openxmlformats.org/officeDocument/2006/bibliography"/>
   </ds:schemaRefs>

</xml_diff>

<commit_message>
Modificación de documento: Casos de uso y tabla comparativa.
</commit_message>
<xml_diff>
--- a/Investigacion-CoreWebVitals.docx
+++ b/Investigacion-CoreWebVitals.docx
@@ -685,8 +685,6 @@
       <w:r>
         <w:rPr>
           <w:rFonts w:ascii="Arial" w:hAnsi="Arial" w:cs="Arial"/>
-          <w:b/>
-          <w:bCs/>
           <w:sz w:val="22"/>
           <w:szCs w:val="22"/>
         </w:rPr>
@@ -698,7 +696,23 @@
           <w:sz w:val="22"/>
           <w:szCs w:val="22"/>
         </w:rPr>
-        <w:t xml:space="preserve"> son un conjunto de métricas estandarizadas de Google diseñadas para cuantificar la experiencia real del usuario al navegar por una página web. Evalúan tres aspectos clave: velocidad de carga, interactividad y estabilidad visual</w:t>
+        <w:t xml:space="preserve"> son un conjunto de métricas estandarizadas de Google diseñadas para cuantificar la experiencia real del usuario al navegar por una página web. Evalúan tres aspectos </w:t>
+      </w:r>
+      <w:r>
+        <w:rPr>
+          <w:rFonts w:ascii="Arial" w:hAnsi="Arial" w:cs="Arial"/>
+          <w:sz w:val="22"/>
+          <w:szCs w:val="22"/>
+        </w:rPr>
+        <w:t>clave: velocidad de carga, interactividad y estabilidad</w:t>
+      </w:r>
+      <w:r>
+        <w:rPr>
+          <w:rFonts w:ascii="Arial" w:hAnsi="Arial" w:cs="Arial"/>
+          <w:sz w:val="22"/>
+          <w:szCs w:val="22"/>
+        </w:rPr>
+        <w:t xml:space="preserve"> visual</w:t>
       </w:r>
       <w:r>
         <w:rPr>
@@ -718,6 +732,7 @@
           <w:id w:val="923762585"/>
           <w:citation/>
         </w:sdtPr>
+        <w:sdtEndPr/>
         <w:sdtContent>
           <w:r>
             <w:rPr>
@@ -824,18 +839,8 @@
           <w:sz w:val="22"/>
           <w:szCs w:val="22"/>
         </w:rPr>
-        <w:t>LCP (</w:t>
-      </w:r>
-      <w:proofErr w:type="spellStart"/>
-      <w:r>
-        <w:rPr>
-          <w:rFonts w:ascii="Arial" w:hAnsi="Arial" w:cs="Arial"/>
-          <w:sz w:val="22"/>
-          <w:szCs w:val="22"/>
-        </w:rPr>
-        <w:t>Largest</w:t>
-      </w:r>
-      <w:proofErr w:type="spellEnd"/>
+        <w:t>LCP (Largest Contentful Paint - Carga): Mide cuánto tarda en cargarse el elemento principal (como una imagen grande o un bloque de texto) en la pantalla.</w:t>
+      </w:r>
       <w:r>
         <w:rPr>
           <w:rFonts w:ascii="Arial" w:hAnsi="Arial" w:cs="Arial"/>
@@ -844,24 +849,60 @@
         </w:rPr>
         <w:t xml:space="preserve"> </w:t>
       </w:r>
-      <w:proofErr w:type="spellStart"/>
-      <w:r>
-        <w:rPr>
-          <w:rFonts w:ascii="Arial" w:hAnsi="Arial" w:cs="Arial"/>
-          <w:sz w:val="22"/>
-          <w:szCs w:val="22"/>
-        </w:rPr>
-        <w:t>Contentful</w:t>
-      </w:r>
-      <w:proofErr w:type="spellEnd"/>
-      <w:r>
-        <w:rPr>
-          <w:rFonts w:ascii="Arial" w:hAnsi="Arial" w:cs="Arial"/>
-          <w:sz w:val="22"/>
-          <w:szCs w:val="22"/>
-        </w:rPr>
-        <w:t xml:space="preserve"> Paint - Carga): Mide cuánto tarda en cargarse el elemento principal (como una imagen grande o un bloque de texto) en la pantalla.</w:t>
-      </w:r>
+      <w:sdt>
+        <w:sdtPr>
+          <w:rPr>
+            <w:rFonts w:ascii="Arial" w:hAnsi="Arial" w:cs="Arial"/>
+            <w:sz w:val="22"/>
+            <w:szCs w:val="22"/>
+          </w:rPr>
+          <w:id w:val="343594307"/>
+          <w:citation/>
+        </w:sdtPr>
+        <w:sdtContent>
+          <w:r>
+            <w:rPr>
+              <w:rFonts w:ascii="Arial" w:hAnsi="Arial" w:cs="Arial"/>
+              <w:sz w:val="22"/>
+              <w:szCs w:val="22"/>
+            </w:rPr>
+            <w:fldChar w:fldCharType="begin"/>
+          </w:r>
+          <w:r>
+            <w:rPr>
+              <w:rFonts w:ascii="Arial" w:hAnsi="Arial" w:cs="Arial"/>
+              <w:sz w:val="22"/>
+              <w:szCs w:val="22"/>
+            </w:rPr>
+            <w:instrText xml:space="preserve">CITATION Wal19 \l 5130 </w:instrText>
+          </w:r>
+          <w:r>
+            <w:rPr>
+              <w:rFonts w:ascii="Arial" w:hAnsi="Arial" w:cs="Arial"/>
+              <w:sz w:val="22"/>
+              <w:szCs w:val="22"/>
+            </w:rPr>
+            <w:fldChar w:fldCharType="separate"/>
+          </w:r>
+          <w:r>
+            <w:rPr>
+              <w:rFonts w:ascii="Arial" w:hAnsi="Arial" w:cs="Arial"/>
+              <w:noProof/>
+              <w:sz w:val="22"/>
+              <w:szCs w:val="22"/>
+            </w:rPr>
+            <w:t>(Walton &amp; Pollard, Largest Contentful Paint (LCP), 2019)</w:t>
+          </w:r>
+          <w:r>
+            <w:rPr>
+              <w:rFonts w:ascii="Arial" w:hAnsi="Arial" w:cs="Arial"/>
+              <w:sz w:val="22"/>
+              <w:szCs w:val="22"/>
+            </w:rPr>
+            <w:fldChar w:fldCharType="end"/>
+          </w:r>
+        </w:sdtContent>
+      </w:sdt>
     </w:p>
     <w:p>
       <w:pPr>
@@ -924,6 +965,68 @@
         </w:rPr>
         <w:t xml:space="preserve"> to Next Paint - Interactividad): Mide el tiempo desde que el usuario interactúa con la página (un clic, un toque) hasta que el navegador actualiza la interfaz.</w:t>
       </w:r>
+      <w:r>
+        <w:rPr>
+          <w:rFonts w:ascii="Arial" w:hAnsi="Arial" w:cs="Arial"/>
+          <w:sz w:val="22"/>
+          <w:szCs w:val="22"/>
+        </w:rPr>
+        <w:t xml:space="preserve"> </w:t>
+      </w:r>
+      <w:sdt>
+        <w:sdtPr>
+          <w:rPr>
+            <w:rFonts w:ascii="Arial" w:hAnsi="Arial" w:cs="Arial"/>
+            <w:sz w:val="22"/>
+            <w:szCs w:val="22"/>
+          </w:rPr>
+          <w:id w:val="551350750"/>
+          <w:citation/>
+        </w:sdtPr>
+        <w:sdtContent>
+          <w:r>
+            <w:rPr>
+              <w:rFonts w:ascii="Arial" w:hAnsi="Arial" w:cs="Arial"/>
+              <w:sz w:val="22"/>
+              <w:szCs w:val="22"/>
+            </w:rPr>
+            <w:fldChar w:fldCharType="begin"/>
+          </w:r>
+          <w:r>
+            <w:rPr>
+              <w:rFonts w:ascii="Arial" w:hAnsi="Arial" w:cs="Arial"/>
+              <w:sz w:val="22"/>
+              <w:szCs w:val="22"/>
+            </w:rPr>
+            <w:instrText xml:space="preserve"> CITATION Wag22 \l 5130 </w:instrText>
+          </w:r>
+          <w:r>
+            <w:rPr>
+              <w:rFonts w:ascii="Arial" w:hAnsi="Arial" w:cs="Arial"/>
+              <w:sz w:val="22"/>
+              <w:szCs w:val="22"/>
+            </w:rPr>
+            <w:fldChar w:fldCharType="separate"/>
+          </w:r>
+          <w:r>
+            <w:rPr>
+              <w:rFonts w:ascii="Arial" w:hAnsi="Arial" w:cs="Arial"/>
+              <w:noProof/>
+              <w:sz w:val="22"/>
+              <w:szCs w:val="22"/>
+            </w:rPr>
+            <w:t>(Wagner &amp; Pollard, 2022)</w:t>
+          </w:r>
+          <w:r>
+            <w:rPr>
+              <w:rFonts w:ascii="Arial" w:hAnsi="Arial" w:cs="Arial"/>
+              <w:sz w:val="22"/>
+              <w:szCs w:val="22"/>
+            </w:rPr>
+            <w:fldChar w:fldCharType="end"/>
+          </w:r>
+        </w:sdtContent>
+      </w:sdt>
     </w:p>
     <w:p>
       <w:pPr>
@@ -966,26 +1069,70 @@
           <w:sz w:val="22"/>
           <w:szCs w:val="22"/>
         </w:rPr>
-        <w:t xml:space="preserve">CLS (Cumulative </w:t>
-      </w:r>
-      <w:proofErr w:type="spellStart"/>
-      <w:r>
-        <w:rPr>
-          <w:rFonts w:ascii="Arial" w:hAnsi="Arial" w:cs="Arial"/>
-          <w:sz w:val="22"/>
-          <w:szCs w:val="22"/>
-        </w:rPr>
-        <w:t>Layout</w:t>
-      </w:r>
-      <w:proofErr w:type="spellEnd"/>
-      <w:r>
-        <w:rPr>
-          <w:rFonts w:ascii="Arial" w:hAnsi="Arial" w:cs="Arial"/>
-          <w:sz w:val="22"/>
-          <w:szCs w:val="22"/>
-        </w:rPr>
-        <w:t xml:space="preserve"> Shift - Estabilidad visual): Mide si los elementos de la página cambian de lugar de forma inesperada mientras se lee.</w:t>
-      </w:r>
+        <w:t>CLS (Cumulative Layout Shift - Estabilidad visual): Mide si los elementos de la página cambian de lugar de forma inesperada mientras se lee.</w:t>
+      </w:r>
+      <w:r>
+        <w:rPr>
+          <w:rFonts w:ascii="Arial" w:hAnsi="Arial" w:cs="Arial"/>
+          <w:sz w:val="22"/>
+          <w:szCs w:val="22"/>
+        </w:rPr>
+        <w:t xml:space="preserve"> </w:t>
+      </w:r>
+      <w:sdt>
+        <w:sdtPr>
+          <w:rPr>
+            <w:rFonts w:ascii="Arial" w:hAnsi="Arial" w:cs="Arial"/>
+            <w:sz w:val="22"/>
+            <w:szCs w:val="22"/>
+          </w:rPr>
+          <w:id w:val="-1348782850"/>
+          <w:citation/>
+        </w:sdtPr>
+        <w:sdtContent>
+          <w:r>
+            <w:rPr>
+              <w:rFonts w:ascii="Arial" w:hAnsi="Arial" w:cs="Arial"/>
+              <w:sz w:val="22"/>
+              <w:szCs w:val="22"/>
+            </w:rPr>
+            <w:fldChar w:fldCharType="begin"/>
+          </w:r>
+          <w:r>
+            <w:rPr>
+              <w:rFonts w:ascii="Arial" w:hAnsi="Arial" w:cs="Arial"/>
+              <w:sz w:val="22"/>
+              <w:szCs w:val="22"/>
+            </w:rPr>
+            <w:instrText xml:space="preserve"> CITATION Mih23 \l 5130 </w:instrText>
+          </w:r>
+          <w:r>
+            <w:rPr>
+              <w:rFonts w:ascii="Arial" w:hAnsi="Arial" w:cs="Arial"/>
+              <w:sz w:val="22"/>
+              <w:szCs w:val="22"/>
+            </w:rPr>
+            <w:fldChar w:fldCharType="separate"/>
+          </w:r>
+          <w:r>
+            <w:rPr>
+              <w:rFonts w:ascii="Arial" w:hAnsi="Arial" w:cs="Arial"/>
+              <w:noProof/>
+              <w:sz w:val="22"/>
+              <w:szCs w:val="22"/>
+            </w:rPr>
+            <w:t>(Mihajlija &amp; Walton, 2023)</w:t>
+          </w:r>
+          <w:r>
+            <w:rPr>
+              <w:rFonts w:ascii="Arial" w:hAnsi="Arial" w:cs="Arial"/>
+              <w:sz w:val="22"/>
+              <w:szCs w:val="22"/>
+            </w:rPr>
+            <w:fldChar w:fldCharType="end"/>
+          </w:r>
+        </w:sdtContent>
+      </w:sdt>
     </w:p>
     <w:p>
       <w:pPr>
@@ -1006,6 +1153,7 @@
           <w:sz w:val="22"/>
           <w:szCs w:val="22"/>
         </w:rPr>
+        <w:lastRenderedPageBreak/>
         <w:t>Problema que resuelve: Evita que hagas clic por accidente en el botón equivocado (como comprar o cancelar) porque el texto se movió. El valor debe ser menor a \(0,1\).</w:t>
       </w:r>
     </w:p>
@@ -1023,7 +1171,6 @@
           <w:sz w:val="22"/>
           <w:szCs w:val="22"/>
         </w:rPr>
-        <w:lastRenderedPageBreak/>
         <w:t xml:space="preserve">Para saber si tu sitio cumple con estos estándares y solucionar posibles fallos, puedes medir y analizar tu página utilizando herramientas gratuitas como </w:t>
       </w:r>
       <w:proofErr w:type="spellStart"/>
@@ -1072,6 +1219,7 @@
           <w:id w:val="591747484"/>
           <w:citation/>
         </w:sdtPr>
+        <w:sdtEndPr/>
         <w:sdtContent>
           <w:r>
             <w:rPr>
@@ -1203,7 +1351,138 @@
           <w:sz w:val="22"/>
           <w:szCs w:val="22"/>
         </w:rPr>
-        <w:t xml:space="preserve"> actúa como un sistema de escucha, capturando estos datos de forma asíncrona a medida que </w:t>
+        <w:t xml:space="preserve"> actúa como un sistema de escucha, capturando estos datos de forma asíncrona a medida que ocurren.</w:t>
+      </w:r>
+      <w:r>
+        <w:rPr>
+          <w:rFonts w:ascii="Arial" w:hAnsi="Arial" w:cs="Arial"/>
+          <w:sz w:val="22"/>
+          <w:szCs w:val="22"/>
+        </w:rPr>
+        <w:t xml:space="preserve"> </w:t>
+      </w:r>
+      <w:sdt>
+        <w:sdtPr>
+          <w:rPr>
+            <w:rFonts w:ascii="Arial" w:hAnsi="Arial" w:cs="Arial"/>
+            <w:sz w:val="22"/>
+            <w:szCs w:val="22"/>
+          </w:rPr>
+          <w:id w:val="-453021932"/>
+          <w:citation/>
+        </w:sdtPr>
+        <w:sdtContent>
+          <w:r>
+            <w:rPr>
+              <w:rFonts w:ascii="Arial" w:hAnsi="Arial" w:cs="Arial"/>
+              <w:sz w:val="22"/>
+              <w:szCs w:val="22"/>
+            </w:rPr>
+            <w:fldChar w:fldCharType="begin"/>
+          </w:r>
+          <w:r>
+            <w:rPr>
+              <w:rFonts w:ascii="Arial" w:hAnsi="Arial" w:cs="Arial"/>
+              <w:sz w:val="22"/>
+              <w:szCs w:val="22"/>
+            </w:rPr>
+            <w:instrText xml:space="preserve"> CITATION Mar16 \l 5130 </w:instrText>
+          </w:r>
+          <w:r>
+            <w:rPr>
+              <w:rFonts w:ascii="Arial" w:hAnsi="Arial" w:cs="Arial"/>
+              <w:sz w:val="22"/>
+              <w:szCs w:val="22"/>
+            </w:rPr>
+            <w:fldChar w:fldCharType="separate"/>
+          </w:r>
+          <w:r>
+            <w:rPr>
+              <w:rFonts w:ascii="Arial" w:hAnsi="Arial" w:cs="Arial"/>
+              <w:noProof/>
+              <w:sz w:val="22"/>
+              <w:szCs w:val="22"/>
+            </w:rPr>
+            <w:t>(Cohen, 2016)</w:t>
+          </w:r>
+          <w:r>
+            <w:rPr>
+              <w:rFonts w:ascii="Arial" w:hAnsi="Arial" w:cs="Arial"/>
+              <w:sz w:val="22"/>
+              <w:szCs w:val="22"/>
+            </w:rPr>
+            <w:fldChar w:fldCharType="end"/>
+          </w:r>
+        </w:sdtContent>
+      </w:sdt>
+    </w:p>
+    <w:p>
+      <w:pPr>
+        <w:rPr>
+          <w:rFonts w:ascii="Arial" w:hAnsi="Arial" w:cs="Arial"/>
+          <w:sz w:val="22"/>
+          <w:szCs w:val="22"/>
+        </w:rPr>
+      </w:pPr>
+      <w:r>
+        <w:rPr>
+          <w:rFonts w:ascii="Arial" w:hAnsi="Arial" w:cs="Arial"/>
+          <w:sz w:val="22"/>
+          <w:szCs w:val="22"/>
+        </w:rPr>
+        <w:t>Cómo funciona el flujo de datos</w:t>
+      </w:r>
+      <w:r>
+        <w:rPr>
+          <w:rFonts w:ascii="Arial" w:hAnsi="Arial" w:cs="Arial"/>
+          <w:sz w:val="22"/>
+          <w:szCs w:val="22"/>
+        </w:rPr>
+        <w:t>:</w:t>
+      </w:r>
+    </w:p>
+    <w:p>
+      <w:pPr>
+        <w:pStyle w:val="Prrafodelista"/>
+        <w:numPr>
+          <w:ilvl w:val="0"/>
+          <w:numId w:val="2"/>
+        </w:numPr>
+        <w:rPr>
+          <w:rFonts w:ascii="Arial" w:hAnsi="Arial" w:cs="Arial"/>
+          <w:sz w:val="22"/>
+          <w:szCs w:val="22"/>
+        </w:rPr>
+      </w:pPr>
+      <w:r>
+        <w:rPr>
+          <w:rFonts w:ascii="Arial" w:hAnsi="Arial" w:cs="Arial"/>
+          <w:sz w:val="22"/>
+          <w:szCs w:val="22"/>
+        </w:rPr>
+        <w:t>El Navegador (Buffer): A medida que la página se carga e interactúa, el navegador registra marcas y medidas en su propia línea de tiempo interna (Performance Timeline).</w:t>
+      </w:r>
+    </w:p>
+    <w:p>
+      <w:pPr>
+        <w:pStyle w:val="Prrafodelista"/>
+        <w:numPr>
+          <w:ilvl w:val="0"/>
+          <w:numId w:val="2"/>
+        </w:numPr>
+        <w:rPr>
+          <w:rFonts w:ascii="Arial" w:hAnsi="Arial" w:cs="Arial"/>
+          <w:sz w:val="22"/>
+          <w:szCs w:val="22"/>
+        </w:rPr>
+      </w:pPr>
+      <w:r>
+        <w:rPr>
+          <w:rFonts w:ascii="Arial" w:hAnsi="Arial" w:cs="Arial"/>
+          <w:sz w:val="22"/>
+          <w:szCs w:val="22"/>
+        </w:rPr>
+        <w:t xml:space="preserve">El Observador: Creas una instancia de </w:t>
       </w:r>
       <w:proofErr w:type="spellStart"/>
       <w:r>
@@ -1212,7 +1491,7 @@
           <w:sz w:val="22"/>
           <w:szCs w:val="22"/>
         </w:rPr>
-        <w:t>ocurren.Cómo</w:t>
+        <w:t>PerformanceObserver</w:t>
       </w:r>
       <w:proofErr w:type="spellEnd"/>
       <w:r>
@@ -1221,33 +1500,29 @@
           <w:sz w:val="22"/>
           <w:szCs w:val="22"/>
         </w:rPr>
-        <w:t xml:space="preserve"> funciona el flujo de datos</w:t>
-      </w:r>
-    </w:p>
-    <w:p>
-      <w:pPr>
-        <w:rPr>
-          <w:rFonts w:ascii="Arial" w:hAnsi="Arial" w:cs="Arial"/>
-          <w:sz w:val="22"/>
-          <w:szCs w:val="22"/>
-        </w:rPr>
-      </w:pPr>
-    </w:p>
-    <w:p>
-      <w:pPr>
-        <w:rPr>
-          <w:rFonts w:ascii="Arial" w:hAnsi="Arial" w:cs="Arial"/>
-          <w:sz w:val="22"/>
-          <w:szCs w:val="22"/>
-        </w:rPr>
-      </w:pPr>
-      <w:r>
-        <w:rPr>
-          <w:rFonts w:ascii="Arial" w:hAnsi="Arial" w:cs="Arial"/>
-          <w:sz w:val="22"/>
-          <w:szCs w:val="22"/>
-        </w:rPr>
-        <w:t xml:space="preserve">El Navegador (Buffer): A medida que la página se carga e interactúa, el navegador registra marcas y medidas en su propia línea de tiempo interna (Performance Timeline).El Observador: Creas una instancia de </w:t>
+        <w:t xml:space="preserve"> y le indicas qué métricas específicas deseas rastrear.</w:t>
+      </w:r>
+    </w:p>
+    <w:p>
+      <w:pPr>
+        <w:pStyle w:val="Prrafodelista"/>
+        <w:numPr>
+          <w:ilvl w:val="0"/>
+          <w:numId w:val="2"/>
+        </w:numPr>
+        <w:rPr>
+          <w:rFonts w:ascii="Arial" w:hAnsi="Arial" w:cs="Arial"/>
+          <w:sz w:val="22"/>
+          <w:szCs w:val="22"/>
+        </w:rPr>
+      </w:pPr>
+      <w:r>
+        <w:rPr>
+          <w:rFonts w:ascii="Arial" w:hAnsi="Arial" w:cs="Arial"/>
+          <w:sz w:val="22"/>
+          <w:szCs w:val="22"/>
+        </w:rPr>
+        <w:t xml:space="preserve">El </w:t>
       </w:r>
       <w:proofErr w:type="spellStart"/>
       <w:r>
@@ -1256,7 +1531,7 @@
           <w:sz w:val="22"/>
           <w:szCs w:val="22"/>
         </w:rPr>
-        <w:t>PerformanceObserver</w:t>
+        <w:t>Callback</w:t>
       </w:r>
       <w:proofErr w:type="spellEnd"/>
       <w:r>
@@ -1265,7 +1540,7 @@
           <w:sz w:val="22"/>
           <w:szCs w:val="22"/>
         </w:rPr>
-        <w:t xml:space="preserve"> y le indicas qué métricas específicas deseas </w:t>
+        <w:t>: Cuando el navegador registra una entrada del tipo que estás observando, activa una función de devolución de llamada (</w:t>
       </w:r>
       <w:proofErr w:type="spellStart"/>
       <w:r>
@@ -1274,7 +1549,7 @@
           <w:sz w:val="22"/>
           <w:szCs w:val="22"/>
         </w:rPr>
-        <w:t>rastrear.El</w:t>
+        <w:t>callback</w:t>
       </w:r>
       <w:proofErr w:type="spellEnd"/>
       <w:r>
@@ -1283,62 +1558,110 @@
           <w:sz w:val="22"/>
           <w:szCs w:val="22"/>
         </w:rPr>
+        <w:t xml:space="preserve">) que recibe un lote de objetos </w:t>
+      </w:r>
+      <w:proofErr w:type="spellStart"/>
+      <w:r>
+        <w:rPr>
+          <w:rFonts w:ascii="Arial" w:hAnsi="Arial" w:cs="Arial"/>
+          <w:sz w:val="22"/>
+          <w:szCs w:val="22"/>
+        </w:rPr>
+        <w:t>PerformanceEntry</w:t>
+      </w:r>
+      <w:proofErr w:type="spellEnd"/>
+      <w:r>
+        <w:rPr>
+          <w:rFonts w:ascii="Arial" w:hAnsi="Arial" w:cs="Arial"/>
+          <w:sz w:val="22"/>
+          <w:szCs w:val="22"/>
+        </w:rPr>
+        <w:t>.</w:t>
+      </w:r>
+    </w:p>
+    <w:p>
+      <w:pPr>
+        <w:pStyle w:val="Prrafodelista"/>
+        <w:numPr>
+          <w:ilvl w:val="0"/>
+          <w:numId w:val="2"/>
+        </w:numPr>
+        <w:rPr>
+          <w:rFonts w:ascii="Arial" w:hAnsi="Arial" w:cs="Arial"/>
+          <w:sz w:val="22"/>
+          <w:szCs w:val="22"/>
+        </w:rPr>
+      </w:pPr>
+      <w:r>
+        <w:rPr>
+          <w:rFonts w:ascii="Arial" w:hAnsi="Arial" w:cs="Arial"/>
+          <w:sz w:val="22"/>
+          <w:szCs w:val="22"/>
+        </w:rPr>
+        <w:t>Procesamiento: Puedes leer, enviar, o procesar los datos de cada evento (duración, marca de tiempo, tipo) para su análisis.</w:t>
+      </w:r>
+      <w:r>
+        <w:rPr>
+          <w:rFonts w:ascii="Arial" w:hAnsi="Arial" w:cs="Arial"/>
+          <w:sz w:val="22"/>
+          <w:szCs w:val="22"/>
+        </w:rPr>
         <w:t xml:space="preserve"> </w:t>
       </w:r>
-      <w:proofErr w:type="spellStart"/>
-      <w:r>
-        <w:rPr>
-          <w:rFonts w:ascii="Arial" w:hAnsi="Arial" w:cs="Arial"/>
-          <w:sz w:val="22"/>
-          <w:szCs w:val="22"/>
-        </w:rPr>
-        <w:t>Callback</w:t>
-      </w:r>
-      <w:proofErr w:type="spellEnd"/>
-      <w:r>
-        <w:rPr>
-          <w:rFonts w:ascii="Arial" w:hAnsi="Arial" w:cs="Arial"/>
-          <w:sz w:val="22"/>
-          <w:szCs w:val="22"/>
-        </w:rPr>
-        <w:t>: Cuando el navegador registra una entrada del tipo que estás observando, activa una función de devolución de llamada (</w:t>
-      </w:r>
-      <w:proofErr w:type="spellStart"/>
-      <w:r>
-        <w:rPr>
-          <w:rFonts w:ascii="Arial" w:hAnsi="Arial" w:cs="Arial"/>
-          <w:sz w:val="22"/>
-          <w:szCs w:val="22"/>
-        </w:rPr>
-        <w:t>callback</w:t>
-      </w:r>
-      <w:proofErr w:type="spellEnd"/>
-      <w:r>
-        <w:rPr>
-          <w:rFonts w:ascii="Arial" w:hAnsi="Arial" w:cs="Arial"/>
-          <w:sz w:val="22"/>
-          <w:szCs w:val="22"/>
-        </w:rPr>
-        <w:t xml:space="preserve">) que recibe un lote de objetos </w:t>
-      </w:r>
-      <w:proofErr w:type="spellStart"/>
-      <w:r>
-        <w:rPr>
-          <w:rFonts w:ascii="Arial" w:hAnsi="Arial" w:cs="Arial"/>
-          <w:sz w:val="22"/>
-          <w:szCs w:val="22"/>
-        </w:rPr>
-        <w:t>PerformanceEntry.Procesamiento</w:t>
-      </w:r>
-      <w:proofErr w:type="spellEnd"/>
-      <w:r>
-        <w:rPr>
-          <w:rFonts w:ascii="Arial" w:hAnsi="Arial" w:cs="Arial"/>
-          <w:sz w:val="22"/>
-          <w:szCs w:val="22"/>
-        </w:rPr>
-        <w:t>: Puedes leer, enviar, o procesar los datos de cada evento (duración, marca de tiempo, tipo) para su análisis.</w:t>
-      </w:r>
+      <w:sdt>
+        <w:sdtPr>
+          <w:rPr>
+            <w:rFonts w:ascii="Arial" w:hAnsi="Arial" w:cs="Arial"/>
+            <w:sz w:val="22"/>
+            <w:szCs w:val="22"/>
+          </w:rPr>
+          <w:id w:val="-1561781762"/>
+          <w:citation/>
+        </w:sdtPr>
+        <w:sdtContent>
+          <w:r>
+            <w:rPr>
+              <w:rFonts w:ascii="Arial" w:hAnsi="Arial" w:cs="Arial"/>
+              <w:sz w:val="22"/>
+              <w:szCs w:val="22"/>
+            </w:rPr>
+            <w:fldChar w:fldCharType="begin"/>
+          </w:r>
+          <w:r>
+            <w:rPr>
+              <w:rFonts w:ascii="Arial" w:hAnsi="Arial" w:cs="Arial"/>
+              <w:sz w:val="22"/>
+              <w:szCs w:val="22"/>
+            </w:rPr>
+            <w:instrText xml:space="preserve"> CITATION Mmd \l 5130 </w:instrText>
+          </w:r>
+          <w:r>
+            <w:rPr>
+              <w:rFonts w:ascii="Arial" w:hAnsi="Arial" w:cs="Arial"/>
+              <w:sz w:val="22"/>
+              <w:szCs w:val="22"/>
+            </w:rPr>
+            <w:fldChar w:fldCharType="separate"/>
+          </w:r>
+          <w:r>
+            <w:rPr>
+              <w:rFonts w:ascii="Arial" w:hAnsi="Arial" w:cs="Arial"/>
+              <w:noProof/>
+              <w:sz w:val="22"/>
+              <w:szCs w:val="22"/>
+            </w:rPr>
+            <w:t>(Mmdn_, s.f.)</w:t>
+          </w:r>
+          <w:r>
+            <w:rPr>
+              <w:rFonts w:ascii="Arial" w:hAnsi="Arial" w:cs="Arial"/>
+              <w:sz w:val="22"/>
+              <w:szCs w:val="22"/>
+            </w:rPr>
+            <w:fldChar w:fldCharType="end"/>
+          </w:r>
+        </w:sdtContent>
+      </w:sdt>
     </w:p>
     <w:p>
       <w:pPr>
@@ -1356,16 +1679,391 @@
           <w:sz w:val="22"/>
           <w:szCs w:val="22"/>
         </w:rPr>
-        <w:t>4.3 Casos de uso</w:t>
-      </w:r>
-      <w:r>
-        <w:rPr>
-          <w:rFonts w:ascii="Arial" w:hAnsi="Arial" w:cs="Arial"/>
-          <w:sz w:val="22"/>
-          <w:szCs w:val="22"/>
-        </w:rPr>
-        <w:t xml:space="preserve"> Cuándo conviene usarlos y cuándo no, con ejemplos reales.</w:t>
-      </w:r>
+        <w:t>Casos de uso</w:t>
+      </w:r>
+      <w:r>
+        <w:rPr>
+          <w:rFonts w:ascii="Arial" w:hAnsi="Arial" w:cs="Arial"/>
+          <w:sz w:val="22"/>
+          <w:szCs w:val="22"/>
+        </w:rPr>
+        <w:t xml:space="preserve"> </w:t>
+      </w:r>
+    </w:p>
+    <w:p>
+      <w:pPr>
+        <w:rPr>
+          <w:rFonts w:ascii="Arial" w:hAnsi="Arial" w:cs="Arial"/>
+          <w:sz w:val="22"/>
+          <w:szCs w:val="22"/>
+        </w:rPr>
+      </w:pPr>
+      <w:r>
+        <w:rPr>
+          <w:rFonts w:ascii="Arial" w:hAnsi="Arial" w:cs="Arial"/>
+          <w:sz w:val="22"/>
+          <w:szCs w:val="22"/>
+        </w:rPr>
+        <w:lastRenderedPageBreak/>
+        <w:t>Cuando es conveniente usarlos:</w:t>
+      </w:r>
+    </w:p>
+    <w:p>
+      <w:pPr>
+        <w:rPr>
+          <w:rFonts w:ascii="Arial" w:hAnsi="Arial" w:cs="Arial"/>
+          <w:sz w:val="22"/>
+          <w:szCs w:val="22"/>
+        </w:rPr>
+      </w:pPr>
+      <w:r>
+        <w:rPr>
+          <w:rFonts w:ascii="Arial" w:hAnsi="Arial" w:cs="Arial"/>
+          <w:sz w:val="22"/>
+          <w:szCs w:val="22"/>
+        </w:rPr>
+        <w:t>Para evaluar la experiencia técnica fundamental.</w:t>
+      </w:r>
+      <w:r>
+        <w:rPr>
+          <w:rFonts w:ascii="Arial" w:hAnsi="Arial" w:cs="Arial"/>
+          <w:sz w:val="22"/>
+          <w:szCs w:val="22"/>
+        </w:rPr>
+        <w:t xml:space="preserve"> </w:t>
+      </w:r>
+      <w:r>
+        <w:rPr>
+          <w:rFonts w:ascii="Arial" w:hAnsi="Arial" w:cs="Arial"/>
+          <w:sz w:val="22"/>
+          <w:szCs w:val="22"/>
+        </w:rPr>
+        <w:t xml:space="preserve">E-commerce: sitios de comercio </w:t>
+      </w:r>
+      <w:r>
+        <w:rPr>
+          <w:rFonts w:ascii="Arial" w:hAnsi="Arial" w:cs="Arial"/>
+          <w:sz w:val="22"/>
+          <w:szCs w:val="22"/>
+        </w:rPr>
+        <w:t>e</w:t>
+      </w:r>
+      <w:r>
+        <w:rPr>
+          <w:rFonts w:ascii="Arial" w:hAnsi="Arial" w:cs="Arial"/>
+          <w:sz w:val="22"/>
+          <w:szCs w:val="22"/>
+        </w:rPr>
+        <w:t>lectrónico</w:t>
+      </w:r>
+      <w:r>
+        <w:rPr>
+          <w:rFonts w:ascii="Arial" w:hAnsi="Arial" w:cs="Arial"/>
+          <w:sz w:val="22"/>
+          <w:szCs w:val="22"/>
+        </w:rPr>
+        <w:t xml:space="preserve"> </w:t>
+      </w:r>
+      <w:r>
+        <w:rPr>
+          <w:rFonts w:ascii="Arial" w:hAnsi="Arial" w:cs="Arial"/>
+          <w:sz w:val="22"/>
+          <w:szCs w:val="22"/>
+        </w:rPr>
+        <w:t>como plataformas</w:t>
+      </w:r>
+      <w:r>
+        <w:rPr>
+          <w:rFonts w:ascii="Arial" w:hAnsi="Arial" w:cs="Arial"/>
+          <w:sz w:val="22"/>
+          <w:szCs w:val="22"/>
+        </w:rPr>
+        <w:t xml:space="preserve"> que experimentan aumentos de hasta el 100% en sus tazas de conversión </w:t>
+      </w:r>
+      <w:r>
+        <w:rPr>
+          <w:rFonts w:ascii="Arial" w:hAnsi="Arial" w:cs="Arial"/>
+          <w:sz w:val="22"/>
+          <w:szCs w:val="22"/>
+        </w:rPr>
+        <w:t>móvil</w:t>
+      </w:r>
+      <w:r>
+        <w:rPr>
+          <w:rFonts w:ascii="Arial" w:hAnsi="Arial" w:cs="Arial"/>
+          <w:sz w:val="22"/>
+          <w:szCs w:val="22"/>
+        </w:rPr>
+        <w:t xml:space="preserve"> cuando sus tiempos de </w:t>
+      </w:r>
+      <w:r>
+        <w:rPr>
+          <w:rFonts w:ascii="Arial" w:hAnsi="Arial" w:cs="Arial"/>
+          <w:sz w:val="22"/>
+          <w:szCs w:val="22"/>
+        </w:rPr>
+        <w:t>cargas mejoran drásticamente y estabilizan elementos visuales de compra.</w:t>
+      </w:r>
+      <w:r>
+        <w:rPr>
+          <w:rFonts w:ascii="Arial" w:hAnsi="Arial" w:cs="Arial"/>
+          <w:sz w:val="22"/>
+          <w:szCs w:val="22"/>
+        </w:rPr>
+        <w:t xml:space="preserve"> Y también en blogs o sitios de noticias sufren caídas de trafi</w:t>
+      </w:r>
+      <w:r>
+        <w:rPr>
+          <w:rFonts w:ascii="Arial" w:hAnsi="Arial" w:cs="Arial"/>
+          <w:sz w:val="22"/>
+          <w:szCs w:val="22"/>
+        </w:rPr>
+        <w:t>co debido a malas puntuaciones. Al mejorar sus LCP y CLS, se recuperan</w:t>
+      </w:r>
+      <w:r>
+        <w:rPr>
+          <w:rFonts w:ascii="Arial" w:hAnsi="Arial" w:cs="Arial"/>
+          <w:sz w:val="22"/>
+          <w:szCs w:val="22"/>
+        </w:rPr>
+        <w:t xml:space="preserve"> </w:t>
+      </w:r>
+      <w:r>
+        <w:rPr>
+          <w:rFonts w:ascii="Arial" w:hAnsi="Arial" w:cs="Arial"/>
+          <w:sz w:val="22"/>
+          <w:szCs w:val="22"/>
+        </w:rPr>
+        <w:t>y elevan su posicionamiento global.</w:t>
+      </w:r>
+      <w:r>
+        <w:rPr>
+          <w:rFonts w:ascii="Arial" w:hAnsi="Arial" w:cs="Arial"/>
+          <w:sz w:val="22"/>
+          <w:szCs w:val="22"/>
+        </w:rPr>
+        <w:t xml:space="preserve"> </w:t>
+      </w:r>
+      <w:sdt>
+        <w:sdtPr>
+          <w:rPr>
+            <w:rFonts w:ascii="Arial" w:hAnsi="Arial" w:cs="Arial"/>
+            <w:sz w:val="22"/>
+            <w:szCs w:val="22"/>
+          </w:rPr>
+          <w:id w:val="1786925873"/>
+          <w:citation/>
+        </w:sdtPr>
+        <w:sdtContent>
+          <w:r>
+            <w:rPr>
+              <w:rFonts w:ascii="Arial" w:hAnsi="Arial" w:cs="Arial"/>
+              <w:sz w:val="22"/>
+              <w:szCs w:val="22"/>
+            </w:rPr>
+            <w:fldChar w:fldCharType="begin"/>
+          </w:r>
+          <w:r>
+            <w:rPr>
+              <w:rFonts w:ascii="Arial" w:hAnsi="Arial" w:cs="Arial"/>
+              <w:sz w:val="22"/>
+              <w:szCs w:val="22"/>
+            </w:rPr>
+            <w:instrText xml:space="preserve"> CITATION Raj21 \l 5130 </w:instrText>
+          </w:r>
+          <w:r>
+            <w:rPr>
+              <w:rFonts w:ascii="Arial" w:hAnsi="Arial" w:cs="Arial"/>
+              <w:sz w:val="22"/>
+              <w:szCs w:val="22"/>
+            </w:rPr>
+            <w:fldChar w:fldCharType="separate"/>
+          </w:r>
+          <w:r>
+            <w:rPr>
+              <w:rFonts w:ascii="Arial" w:hAnsi="Arial" w:cs="Arial"/>
+              <w:noProof/>
+              <w:sz w:val="22"/>
+              <w:szCs w:val="22"/>
+            </w:rPr>
+            <w:t>(Rajpal &amp; Gopalakrishnan, 2021)</w:t>
+          </w:r>
+          <w:r>
+            <w:rPr>
+              <w:rFonts w:ascii="Arial" w:hAnsi="Arial" w:cs="Arial"/>
+              <w:sz w:val="22"/>
+              <w:szCs w:val="22"/>
+            </w:rPr>
+            <w:fldChar w:fldCharType="end"/>
+          </w:r>
+        </w:sdtContent>
+      </w:sdt>
+      <w:r>
+        <w:rPr>
+          <w:rFonts w:ascii="Arial" w:hAnsi="Arial" w:cs="Arial"/>
+          <w:sz w:val="22"/>
+          <w:szCs w:val="22"/>
+        </w:rPr>
+        <w:br/>
+      </w:r>
+      <w:r>
+        <w:rPr>
+          <w:rFonts w:ascii="Arial" w:hAnsi="Arial" w:cs="Arial"/>
+          <w:sz w:val="22"/>
+          <w:szCs w:val="22"/>
+        </w:rPr>
+        <w:t xml:space="preserve">Para </w:t>
+      </w:r>
+      <w:r>
+        <w:rPr>
+          <w:rFonts w:ascii="Arial" w:hAnsi="Arial" w:cs="Arial"/>
+          <w:sz w:val="22"/>
+          <w:szCs w:val="22"/>
+        </w:rPr>
+        <w:t>p</w:t>
+      </w:r>
+      <w:r>
+        <w:rPr>
+          <w:rFonts w:ascii="Arial" w:hAnsi="Arial" w:cs="Arial"/>
+          <w:sz w:val="22"/>
+          <w:szCs w:val="22"/>
+        </w:rPr>
+        <w:t>r</w:t>
+      </w:r>
+      <w:r>
+        <w:rPr>
+          <w:rFonts w:ascii="Arial" w:hAnsi="Arial" w:cs="Arial"/>
+          <w:sz w:val="22"/>
+          <w:szCs w:val="22"/>
+        </w:rPr>
+        <w:t>i</w:t>
+      </w:r>
+      <w:r>
+        <w:rPr>
+          <w:rFonts w:ascii="Arial" w:hAnsi="Arial" w:cs="Arial"/>
+          <w:sz w:val="22"/>
+          <w:szCs w:val="22"/>
+        </w:rPr>
+        <w:t xml:space="preserve">orizar el rendimiento de móviles. Google penaliza permia la “Experiencia de la </w:t>
+      </w:r>
+      <w:r>
+        <w:rPr>
+          <w:rFonts w:ascii="Arial" w:hAnsi="Arial" w:cs="Arial"/>
+          <w:sz w:val="22"/>
+          <w:szCs w:val="22"/>
+        </w:rPr>
+        <w:t>página</w:t>
+      </w:r>
+      <w:r>
+        <w:rPr>
+          <w:rFonts w:ascii="Arial" w:hAnsi="Arial" w:cs="Arial"/>
+          <w:sz w:val="22"/>
+          <w:szCs w:val="22"/>
+        </w:rPr>
+        <w:t xml:space="preserve">”. Si tus </w:t>
+      </w:r>
+      <w:r>
+        <w:rPr>
+          <w:rFonts w:ascii="Arial" w:hAnsi="Arial" w:cs="Arial"/>
+          <w:sz w:val="22"/>
+          <w:szCs w:val="22"/>
+        </w:rPr>
+        <w:t xml:space="preserve">métricas de campo fallan en móvil, se </w:t>
+      </w:r>
+      <w:r>
+        <w:rPr>
+          <w:rFonts w:ascii="Arial" w:hAnsi="Arial" w:cs="Arial"/>
+          <w:sz w:val="22"/>
+          <w:szCs w:val="22"/>
+        </w:rPr>
+        <w:t>reflejará</w:t>
+      </w:r>
+      <w:r>
+        <w:rPr>
+          <w:rFonts w:ascii="Arial" w:hAnsi="Arial" w:cs="Arial"/>
+          <w:sz w:val="22"/>
+          <w:szCs w:val="22"/>
+        </w:rPr>
+        <w:t xml:space="preserve"> negativamente en tu </w:t>
+      </w:r>
+      <w:r>
+        <w:rPr>
+          <w:rFonts w:ascii="Arial" w:hAnsi="Arial" w:cs="Arial"/>
+          <w:sz w:val="22"/>
+          <w:szCs w:val="22"/>
+        </w:rPr>
+        <w:t>tráfico</w:t>
+      </w:r>
+      <w:r>
+        <w:rPr>
+          <w:rFonts w:ascii="Arial" w:hAnsi="Arial" w:cs="Arial"/>
+          <w:sz w:val="22"/>
+          <w:szCs w:val="22"/>
+        </w:rPr>
+        <w:t xml:space="preserve"> orgánico.</w:t>
+      </w:r>
+      <w:r>
+        <w:rPr>
+          <w:rFonts w:ascii="Arial" w:hAnsi="Arial" w:cs="Arial"/>
+          <w:sz w:val="22"/>
+          <w:szCs w:val="22"/>
+        </w:rPr>
+        <w:t xml:space="preserve"> </w:t>
+      </w:r>
+      <w:sdt>
+        <w:sdtPr>
+          <w:rPr>
+            <w:rFonts w:ascii="Arial" w:hAnsi="Arial" w:cs="Arial"/>
+            <w:sz w:val="22"/>
+            <w:szCs w:val="22"/>
+          </w:rPr>
+          <w:id w:val="86128691"/>
+          <w:citation/>
+        </w:sdtPr>
+        <w:sdtContent>
+          <w:r>
+            <w:rPr>
+              <w:rFonts w:ascii="Arial" w:hAnsi="Arial" w:cs="Arial"/>
+              <w:sz w:val="22"/>
+              <w:szCs w:val="22"/>
+            </w:rPr>
+            <w:fldChar w:fldCharType="begin"/>
+          </w:r>
+          <w:r>
+            <w:rPr>
+              <w:rFonts w:ascii="Arial" w:hAnsi="Arial" w:cs="Arial"/>
+              <w:sz w:val="22"/>
+              <w:szCs w:val="22"/>
+            </w:rPr>
+            <w:instrText xml:space="preserve"> CITATION sit \l 5130 </w:instrText>
+          </w:r>
+          <w:r>
+            <w:rPr>
+              <w:rFonts w:ascii="Arial" w:hAnsi="Arial" w:cs="Arial"/>
+              <w:sz w:val="22"/>
+              <w:szCs w:val="22"/>
+            </w:rPr>
+            <w:fldChar w:fldCharType="separate"/>
+          </w:r>
+          <w:r>
+            <w:rPr>
+              <w:rFonts w:ascii="Arial" w:hAnsi="Arial" w:cs="Arial"/>
+              <w:noProof/>
+              <w:sz w:val="22"/>
+              <w:szCs w:val="22"/>
+            </w:rPr>
+            <w:t>(sitecare, s.f.)</w:t>
+          </w:r>
+          <w:r>
+            <w:rPr>
+              <w:rFonts w:ascii="Arial" w:hAnsi="Arial" w:cs="Arial"/>
+              <w:sz w:val="22"/>
+              <w:szCs w:val="22"/>
+            </w:rPr>
+            <w:fldChar w:fldCharType="end"/>
+          </w:r>
+        </w:sdtContent>
+      </w:sdt>
     </w:p>
     <w:p>
       <w:pPr>
@@ -1391,8 +2089,1859 @@
           <w:sz w:val="22"/>
           <w:szCs w:val="22"/>
         </w:rPr>
-        <w:t xml:space="preserve"> CWV vs métricas anteriores (FID, FCP, TTFB), tabla comparativa.</w:t>
-      </w:r>
+        <w:t xml:space="preserve"> </w:t>
+      </w:r>
+    </w:p>
+    <w:p>
+      <w:pPr>
+        <w:rPr>
+          <w:rFonts w:ascii="Arial" w:hAnsi="Arial" w:cs="Arial"/>
+          <w:sz w:val="22"/>
+          <w:szCs w:val="22"/>
+        </w:rPr>
+      </w:pPr>
+      <w:r>
+        <w:rPr>
+          <w:rFonts w:ascii="Arial" w:hAnsi="Arial" w:cs="Arial"/>
+          <w:sz w:val="22"/>
+          <w:szCs w:val="22"/>
+        </w:rPr>
+        <w:t>La evaluación de las Core Web Vitals (CWV) no puede realizarse de manera aislada sin considerar el conjunto de métricas de rendimiento web que las antecedieron y que, en algunos casos, coexisten con ellas como indicadores complementarios. Desde la introducción de métricas como el First Input Delay (FID), el First Contentful Paint (FCP) y el Time to First Byte (TTFB), la industria del desarrollo web ha transitado hacia un modelo de medición más centrado en la experiencia real del usuario, proceso que culminó con la consolidación de las tres métricas estables que conforman las CWV en su estado actual: LCP, INP y CLS. En este contexto, la presente sección establece una comparación sistemática entre las CWV vigentes y sus métricas predecesoras o suplementarias, con el propósito de identificar las limitaciones que motivaron su evolución, las diferencias metodológicas en cuanto al tipo de datos que capturan</w:t>
+      </w:r>
+      <w:r>
+        <w:rPr>
+          <w:rFonts w:ascii="Arial" w:hAnsi="Arial" w:cs="Arial"/>
+          <w:sz w:val="22"/>
+          <w:szCs w:val="22"/>
+        </w:rPr>
+        <w:t xml:space="preserve">, </w:t>
+      </w:r>
+      <w:r>
+        <w:rPr>
+          <w:rFonts w:ascii="Arial" w:hAnsi="Arial" w:cs="Arial"/>
+          <w:sz w:val="22"/>
+          <w:szCs w:val="22"/>
+        </w:rPr>
+        <w:t>de laboratorio versus de campo, y su relevancia como factores de posicionamiento en los resultados de búsqueda de Google.</w:t>
+      </w:r>
+      <w:r>
+        <w:rPr>
+          <w:rFonts w:ascii="Arial" w:hAnsi="Arial" w:cs="Arial"/>
+          <w:sz w:val="22"/>
+          <w:szCs w:val="22"/>
+        </w:rPr>
+        <w:t xml:space="preserve"> </w:t>
+      </w:r>
+      <w:sdt>
+        <w:sdtPr>
+          <w:rPr>
+            <w:rFonts w:ascii="Arial" w:hAnsi="Arial" w:cs="Arial"/>
+            <w:sz w:val="22"/>
+            <w:szCs w:val="22"/>
+          </w:rPr>
+          <w:id w:val="-25947230"/>
+          <w:citation/>
+        </w:sdtPr>
+        <w:sdtContent>
+          <w:r>
+            <w:rPr>
+              <w:rFonts w:ascii="Arial" w:hAnsi="Arial" w:cs="Arial"/>
+              <w:sz w:val="22"/>
+              <w:szCs w:val="22"/>
+            </w:rPr>
+            <w:fldChar w:fldCharType="begin"/>
+          </w:r>
+          <w:r>
+            <w:rPr>
+              <w:rFonts w:ascii="Arial" w:hAnsi="Arial" w:cs="Arial"/>
+              <w:sz w:val="22"/>
+              <w:szCs w:val="22"/>
+            </w:rPr>
+            <w:instrText xml:space="preserve"> CITATION Goo25 \l 5130 </w:instrText>
+          </w:r>
+          <w:r>
+            <w:rPr>
+              <w:rFonts w:ascii="Arial" w:hAnsi="Arial" w:cs="Arial"/>
+              <w:sz w:val="22"/>
+              <w:szCs w:val="22"/>
+            </w:rPr>
+            <w:fldChar w:fldCharType="separate"/>
+          </w:r>
+          <w:r>
+            <w:rPr>
+              <w:rFonts w:ascii="Arial" w:hAnsi="Arial" w:cs="Arial"/>
+              <w:noProof/>
+              <w:sz w:val="22"/>
+              <w:szCs w:val="22"/>
+            </w:rPr>
+            <w:t>(Google, 2025)</w:t>
+          </w:r>
+          <w:r>
+            <w:rPr>
+              <w:rFonts w:ascii="Arial" w:hAnsi="Arial" w:cs="Arial"/>
+              <w:sz w:val="22"/>
+              <w:szCs w:val="22"/>
+            </w:rPr>
+            <w:fldChar w:fldCharType="end"/>
+          </w:r>
+        </w:sdtContent>
+      </w:sdt>
+    </w:p>
+    <w:p>
+      <w:pPr>
+        <w:rPr>
+          <w:rFonts w:ascii="Arial" w:hAnsi="Arial" w:cs="Arial"/>
+          <w:sz w:val="22"/>
+          <w:szCs w:val="22"/>
+        </w:rPr>
+      </w:pPr>
+      <w:r>
+        <w:rPr>
+          <w:rFonts w:ascii="Arial" w:hAnsi="Arial" w:cs="Arial"/>
+          <w:sz w:val="22"/>
+          <w:szCs w:val="22"/>
+        </w:rPr>
+        <w:lastRenderedPageBreak/>
+        <w:t>Tabla 1</w:t>
+      </w:r>
+    </w:p>
+    <w:p>
+      <w:pPr>
+        <w:rPr>
+          <w:rFonts w:ascii="Arial" w:hAnsi="Arial" w:cs="Arial"/>
+          <w:i/>
+          <w:iCs/>
+          <w:sz w:val="22"/>
+          <w:szCs w:val="22"/>
+        </w:rPr>
+      </w:pPr>
+      <w:r>
+        <w:rPr>
+          <w:rFonts w:ascii="Arial" w:hAnsi="Arial" w:cs="Arial"/>
+          <w:i/>
+          <w:iCs/>
+          <w:sz w:val="22"/>
+          <w:szCs w:val="22"/>
+        </w:rPr>
+        <w:t>Comparación de Core Web Vitals y métricas anteriores de rendimiento web</w:t>
+      </w:r>
+    </w:p>
+    <w:tbl>
+      <w:tblPr>
+        <w:tblStyle w:val="Tabladelista6concolores"/>
+        <w:tblW w:w="8789" w:type="dxa"/>
+        <w:tblLook w:val="04A0" w:firstRow="1" w:lastRow="0" w:firstColumn="1" w:lastColumn="0" w:noHBand="0" w:noVBand="1"/>
+      </w:tblPr>
+      <w:tblGrid>
+        <w:gridCol w:w="1189"/>
+        <w:gridCol w:w="1754"/>
+        <w:gridCol w:w="1652"/>
+        <w:gridCol w:w="1022"/>
+        <w:gridCol w:w="1672"/>
+        <w:gridCol w:w="1500"/>
+      </w:tblGrid>
+      <w:tr>
+        <w:trPr>
+          <w:cnfStyle w:val="100000000000" w:firstRow="1" w:lastRow="0" w:firstColumn="0" w:lastColumn="0" w:oddVBand="0" w:evenVBand="0" w:oddHBand="0" w:evenHBand="0" w:firstRowFirstColumn="0" w:firstRowLastColumn="0" w:lastRowFirstColumn="0" w:lastRowLastColumn="0"/>
+        </w:trPr>
+        <w:tc>
+          <w:tcPr>
+            <w:cnfStyle w:val="001000000000" w:firstRow="0" w:lastRow="0" w:firstColumn="1" w:lastColumn="0" w:oddVBand="0" w:evenVBand="0" w:oddHBand="0" w:evenHBand="0" w:firstRowFirstColumn="0" w:firstRowLastColumn="0" w:lastRowFirstColumn="0" w:lastRowLastColumn="0"/>
+            <w:tcW w:w="1470" w:type="dxa"/>
+          </w:tcPr>
+          <w:p>
+            <w:pPr>
+              <w:rPr>
+                <w:rFonts w:ascii="Arial" w:hAnsi="Arial" w:cs="Arial"/>
+                <w:sz w:val="22"/>
+                <w:szCs w:val="22"/>
+              </w:rPr>
+            </w:pPr>
+            <w:r>
+              <w:rPr>
+                <w:rFonts w:ascii="Arial" w:hAnsi="Arial" w:cs="Arial"/>
+                <w:sz w:val="22"/>
+                <w:szCs w:val="22"/>
+              </w:rPr>
+              <w:t>Métrica</w:t>
+            </w:r>
+          </w:p>
+        </w:tc>
+        <w:tc>
+          <w:tcPr>
+            <w:tcW w:w="1931" w:type="dxa"/>
+          </w:tcPr>
+          <w:p>
+            <w:pPr>
+              <w:cnfStyle w:val="100000000000" w:firstRow="1" w:lastRow="0" w:firstColumn="0" w:lastColumn="0" w:oddVBand="0" w:evenVBand="0" w:oddHBand="0" w:evenHBand="0" w:firstRowFirstColumn="0" w:firstRowLastColumn="0" w:lastRowFirstColumn="0" w:lastRowLastColumn="0"/>
+              <w:rPr>
+                <w:rFonts w:ascii="Arial" w:hAnsi="Arial" w:cs="Arial"/>
+                <w:sz w:val="22"/>
+                <w:szCs w:val="22"/>
+              </w:rPr>
+            </w:pPr>
+            <w:r>
+              <w:rPr>
+                <w:rFonts w:ascii="Arial" w:hAnsi="Arial" w:cs="Arial"/>
+                <w:sz w:val="22"/>
+                <w:szCs w:val="22"/>
+              </w:rPr>
+              <w:t>Qu</w:t>
+            </w:r>
+            <w:r>
+              <w:rPr>
+                <w:rFonts w:ascii="Arial" w:hAnsi="Arial" w:cs="Arial"/>
+                <w:sz w:val="22"/>
+                <w:szCs w:val="22"/>
+              </w:rPr>
+              <w:t>é</w:t>
+            </w:r>
+            <w:r>
+              <w:rPr>
+                <w:rFonts w:ascii="Arial" w:hAnsi="Arial" w:cs="Arial"/>
+                <w:sz w:val="22"/>
+                <w:szCs w:val="22"/>
+              </w:rPr>
+              <w:t xml:space="preserve"> mide</w:t>
+            </w:r>
+          </w:p>
+        </w:tc>
+        <w:tc>
+          <w:tcPr>
+            <w:tcW w:w="1743" w:type="dxa"/>
+          </w:tcPr>
+          <w:p>
+            <w:pPr>
+              <w:cnfStyle w:val="100000000000" w:firstRow="1" w:lastRow="0" w:firstColumn="0" w:lastColumn="0" w:oddVBand="0" w:evenVBand="0" w:oddHBand="0" w:evenHBand="0" w:firstRowFirstColumn="0" w:firstRowLastColumn="0" w:lastRowFirstColumn="0" w:lastRowLastColumn="0"/>
+              <w:rPr>
+                <w:rFonts w:ascii="Arial" w:hAnsi="Arial" w:cs="Arial"/>
+                <w:sz w:val="22"/>
+                <w:szCs w:val="22"/>
+              </w:rPr>
+            </w:pPr>
+            <w:r>
+              <w:rPr>
+                <w:rFonts w:ascii="Arial" w:hAnsi="Arial" w:cs="Arial"/>
+                <w:sz w:val="22"/>
+                <w:szCs w:val="22"/>
+              </w:rPr>
+              <w:t>Estado</w:t>
+            </w:r>
+          </w:p>
+        </w:tc>
+        <w:tc>
+          <w:tcPr>
+            <w:tcW w:w="1285" w:type="dxa"/>
+          </w:tcPr>
+          <w:p>
+            <w:pPr>
+              <w:cnfStyle w:val="100000000000" w:firstRow="1" w:lastRow="0" w:firstColumn="0" w:lastColumn="0" w:oddVBand="0" w:evenVBand="0" w:oddHBand="0" w:evenHBand="0" w:firstRowFirstColumn="0" w:firstRowLastColumn="0" w:lastRowFirstColumn="0" w:lastRowLastColumn="0"/>
+              <w:rPr>
+                <w:rFonts w:ascii="Arial" w:hAnsi="Arial" w:cs="Arial"/>
+                <w:sz w:val="22"/>
+                <w:szCs w:val="22"/>
+              </w:rPr>
+            </w:pPr>
+            <w:r>
+              <w:rPr>
+                <w:rFonts w:ascii="Arial" w:hAnsi="Arial" w:cs="Arial"/>
+                <w:sz w:val="22"/>
+                <w:szCs w:val="22"/>
+              </w:rPr>
+              <w:t>Umbral bueno</w:t>
+            </w:r>
+          </w:p>
+        </w:tc>
+        <w:tc>
+          <w:tcPr>
+            <w:tcW w:w="1672" w:type="dxa"/>
+          </w:tcPr>
+          <w:p>
+            <w:pPr>
+              <w:cnfStyle w:val="100000000000" w:firstRow="1" w:lastRow="0" w:firstColumn="0" w:lastColumn="0" w:oddVBand="0" w:evenVBand="0" w:oddHBand="0" w:evenHBand="0" w:firstRowFirstColumn="0" w:firstRowLastColumn="0" w:lastRowFirstColumn="0" w:lastRowLastColumn="0"/>
+              <w:rPr>
+                <w:rFonts w:ascii="Arial" w:hAnsi="Arial" w:cs="Arial"/>
+                <w:sz w:val="22"/>
+                <w:szCs w:val="22"/>
+              </w:rPr>
+            </w:pPr>
+            <w:r>
+              <w:rPr>
+                <w:rFonts w:ascii="Arial" w:hAnsi="Arial" w:cs="Arial"/>
+                <w:sz w:val="22"/>
+                <w:szCs w:val="22"/>
+              </w:rPr>
+              <w:t>Afecta SEO</w:t>
+            </w:r>
+          </w:p>
+        </w:tc>
+        <w:tc>
+          <w:tcPr>
+            <w:tcW w:w="688" w:type="dxa"/>
+          </w:tcPr>
+          <w:p>
+            <w:pPr>
+              <w:cnfStyle w:val="100000000000" w:firstRow="1" w:lastRow="0" w:firstColumn="0" w:lastColumn="0" w:oddVBand="0" w:evenVBand="0" w:oddHBand="0" w:evenHBand="0" w:firstRowFirstColumn="0" w:firstRowLastColumn="0" w:lastRowFirstColumn="0" w:lastRowLastColumn="0"/>
+              <w:rPr>
+                <w:rFonts w:ascii="Arial" w:hAnsi="Arial" w:cs="Arial"/>
+                <w:sz w:val="22"/>
+                <w:szCs w:val="22"/>
+              </w:rPr>
+            </w:pPr>
+            <w:r>
+              <w:rPr>
+                <w:rFonts w:ascii="Arial" w:hAnsi="Arial" w:cs="Arial"/>
+                <w:sz w:val="22"/>
+                <w:szCs w:val="22"/>
+              </w:rPr>
+              <w:t>Herramienta</w:t>
+            </w:r>
+          </w:p>
+        </w:tc>
+      </w:tr>
+      <w:tr>
+        <w:trPr>
+          <w:cnfStyle w:val="000000100000" w:firstRow="0" w:lastRow="0" w:firstColumn="0" w:lastColumn="0" w:oddVBand="0" w:evenVBand="0" w:oddHBand="1" w:evenHBand="0" w:firstRowFirstColumn="0" w:firstRowLastColumn="0" w:lastRowFirstColumn="0" w:lastRowLastColumn="0"/>
+        </w:trPr>
+        <w:tc>
+          <w:tcPr>
+            <w:cnfStyle w:val="001000000000" w:firstRow="0" w:lastRow="0" w:firstColumn="1" w:lastColumn="0" w:oddVBand="0" w:evenVBand="0" w:oddHBand="0" w:evenHBand="0" w:firstRowFirstColumn="0" w:firstRowLastColumn="0" w:lastRowFirstColumn="0" w:lastRowLastColumn="0"/>
+            <w:tcW w:w="1470" w:type="dxa"/>
+          </w:tcPr>
+          <w:p>
+            <w:pPr>
+              <w:rPr>
+                <w:rFonts w:ascii="Arial" w:hAnsi="Arial" w:cs="Arial"/>
+                <w:sz w:val="22"/>
+                <w:szCs w:val="22"/>
+              </w:rPr>
+            </w:pPr>
+            <w:r>
+              <w:rPr>
+                <w:rFonts w:ascii="Arial" w:hAnsi="Arial" w:cs="Arial"/>
+                <w:sz w:val="22"/>
+                <w:szCs w:val="22"/>
+              </w:rPr>
+              <w:t>LCP</w:t>
+            </w:r>
+            <w:r>
+              <w:rPr>
+                <w:rFonts w:ascii="Arial" w:hAnsi="Arial" w:cs="Arial"/>
+                <w:sz w:val="22"/>
+                <w:szCs w:val="22"/>
+              </w:rPr>
+              <w:br/>
+            </w:r>
+            <w:r>
+              <w:rPr>
+                <w:rFonts w:ascii="Arial" w:hAnsi="Arial" w:cs="Arial"/>
+                <w:sz w:val="16"/>
+                <w:szCs w:val="16"/>
+              </w:rPr>
+              <w:t>L</w:t>
+            </w:r>
+            <w:r>
+              <w:rPr>
+                <w:rFonts w:ascii="Arial" w:hAnsi="Arial" w:cs="Arial"/>
+                <w:sz w:val="16"/>
+                <w:szCs w:val="16"/>
+              </w:rPr>
+              <w:t>a</w:t>
+            </w:r>
+            <w:r>
+              <w:rPr>
+                <w:rFonts w:ascii="Arial" w:hAnsi="Arial" w:cs="Arial"/>
+                <w:sz w:val="16"/>
+                <w:szCs w:val="16"/>
+              </w:rPr>
+              <w:t>rgest Conte</w:t>
+            </w:r>
+            <w:r>
+              <w:rPr>
+                <w:rFonts w:ascii="Arial" w:hAnsi="Arial" w:cs="Arial"/>
+                <w:sz w:val="16"/>
+                <w:szCs w:val="16"/>
+              </w:rPr>
+              <w:t>n</w:t>
+            </w:r>
+            <w:r>
+              <w:rPr>
+                <w:rFonts w:ascii="Arial" w:hAnsi="Arial" w:cs="Arial"/>
+                <w:sz w:val="16"/>
+                <w:szCs w:val="16"/>
+              </w:rPr>
+              <w:t>t</w:t>
+            </w:r>
+            <w:r>
+              <w:rPr>
+                <w:rFonts w:ascii="Arial" w:hAnsi="Arial" w:cs="Arial"/>
+                <w:sz w:val="16"/>
+                <w:szCs w:val="16"/>
+              </w:rPr>
+              <w:t>ful</w:t>
+            </w:r>
+            <w:r>
+              <w:rPr>
+                <w:rFonts w:ascii="Arial" w:hAnsi="Arial" w:cs="Arial"/>
+                <w:sz w:val="16"/>
+                <w:szCs w:val="16"/>
+              </w:rPr>
+              <w:t xml:space="preserve"> </w:t>
+            </w:r>
+            <w:r>
+              <w:rPr>
+                <w:rFonts w:ascii="Arial" w:hAnsi="Arial" w:cs="Arial"/>
+                <w:sz w:val="16"/>
+                <w:szCs w:val="16"/>
+              </w:rPr>
+              <w:t>Paint</w:t>
+            </w:r>
+          </w:p>
+        </w:tc>
+        <w:tc>
+          <w:tcPr>
+            <w:tcW w:w="1931" w:type="dxa"/>
+          </w:tcPr>
+          <w:p>
+            <w:pPr>
+              <w:cnfStyle w:val="000000100000" w:firstRow="0" w:lastRow="0" w:firstColumn="0" w:lastColumn="0" w:oddVBand="0" w:evenVBand="0" w:oddHBand="1" w:evenHBand="0" w:firstRowFirstColumn="0" w:firstRowLastColumn="0" w:lastRowFirstColumn="0" w:lastRowLastColumn="0"/>
+              <w:rPr>
+                <w:rFonts w:ascii="Arial" w:hAnsi="Arial" w:cs="Arial"/>
+                <w:sz w:val="22"/>
+                <w:szCs w:val="22"/>
+              </w:rPr>
+            </w:pPr>
+            <w:r>
+              <w:rPr>
+                <w:rFonts w:ascii="Arial" w:hAnsi="Arial" w:cs="Arial"/>
+                <w:sz w:val="22"/>
+                <w:szCs w:val="22"/>
+              </w:rPr>
+              <w:t xml:space="preserve">Velocidad de carga del elemento visual </w:t>
+            </w:r>
+            <w:r>
+              <w:rPr>
+                <w:rFonts w:ascii="Arial" w:hAnsi="Arial" w:cs="Arial"/>
+                <w:sz w:val="22"/>
+                <w:szCs w:val="22"/>
+              </w:rPr>
+              <w:t>más</w:t>
+            </w:r>
+            <w:r>
+              <w:rPr>
+                <w:rFonts w:ascii="Arial" w:hAnsi="Arial" w:cs="Arial"/>
+                <w:sz w:val="22"/>
+                <w:szCs w:val="22"/>
+              </w:rPr>
+              <w:t xml:space="preserve"> grande</w:t>
+            </w:r>
+          </w:p>
+        </w:tc>
+        <w:tc>
+          <w:tcPr>
+            <w:tcW w:w="1743" w:type="dxa"/>
+          </w:tcPr>
+          <w:p>
+            <w:pPr>
+              <w:cnfStyle w:val="000000100000" w:firstRow="0" w:lastRow="0" w:firstColumn="0" w:lastColumn="0" w:oddVBand="0" w:evenVBand="0" w:oddHBand="1" w:evenHBand="0" w:firstRowFirstColumn="0" w:firstRowLastColumn="0" w:lastRowFirstColumn="0" w:lastRowLastColumn="0"/>
+              <w:rPr>
+                <w:rFonts w:ascii="Arial" w:hAnsi="Arial" w:cs="Arial"/>
+                <w:sz w:val="22"/>
+                <w:szCs w:val="22"/>
+              </w:rPr>
+            </w:pPr>
+            <w:r>
+              <w:rPr>
+                <w:rFonts w:ascii="Arial" w:hAnsi="Arial" w:cs="Arial"/>
+                <w:sz w:val="22"/>
+                <w:szCs w:val="22"/>
+              </w:rPr>
+              <w:t>CWV activo</w:t>
+            </w:r>
+          </w:p>
+        </w:tc>
+        <w:tc>
+          <w:tcPr>
+            <w:tcW w:w="1285" w:type="dxa"/>
+          </w:tcPr>
+          <w:p>
+            <w:pPr>
+              <w:cnfStyle w:val="000000100000" w:firstRow="0" w:lastRow="0" w:firstColumn="0" w:lastColumn="0" w:oddVBand="0" w:evenVBand="0" w:oddHBand="1" w:evenHBand="0" w:firstRowFirstColumn="0" w:firstRowLastColumn="0" w:lastRowFirstColumn="0" w:lastRowLastColumn="0"/>
+              <w:rPr>
+                <w:rFonts w:ascii="Arial" w:hAnsi="Arial" w:cs="Arial"/>
+                <w:sz w:val="22"/>
+                <w:szCs w:val="22"/>
+              </w:rPr>
+            </w:pPr>
+            <w:r>
+              <w:rPr>
+                <w:rFonts w:ascii="Arial" w:hAnsi="Arial" w:cs="Arial"/>
+                <w:sz w:val="22"/>
+                <w:szCs w:val="22"/>
+              </w:rPr>
+              <w:t>≤ 2.5 s</w:t>
+            </w:r>
+          </w:p>
+        </w:tc>
+        <w:tc>
+          <w:tcPr>
+            <w:tcW w:w="1672" w:type="dxa"/>
+          </w:tcPr>
+          <w:p>
+            <w:pPr>
+              <w:cnfStyle w:val="000000100000" w:firstRow="0" w:lastRow="0" w:firstColumn="0" w:lastColumn="0" w:oddVBand="0" w:evenVBand="0" w:oddHBand="1" w:evenHBand="0" w:firstRowFirstColumn="0" w:firstRowLastColumn="0" w:lastRowFirstColumn="0" w:lastRowLastColumn="0"/>
+              <w:rPr>
+                <w:rFonts w:ascii="Arial" w:hAnsi="Arial" w:cs="Arial"/>
+                <w:sz w:val="22"/>
+                <w:szCs w:val="22"/>
+              </w:rPr>
+            </w:pPr>
+            <w:r>
+              <w:rPr>
+                <w:rFonts w:ascii="Arial" w:hAnsi="Arial" w:cs="Arial"/>
+                <w:sz w:val="22"/>
+                <w:szCs w:val="22"/>
+              </w:rPr>
+              <w:t>Sí</w:t>
+            </w:r>
+          </w:p>
+        </w:tc>
+        <w:tc>
+          <w:tcPr>
+            <w:tcW w:w="688" w:type="dxa"/>
+          </w:tcPr>
+          <w:p>
+            <w:pPr>
+              <w:cnfStyle w:val="000000100000" w:firstRow="0" w:lastRow="0" w:firstColumn="0" w:lastColumn="0" w:oddVBand="0" w:evenVBand="0" w:oddHBand="1" w:evenHBand="0" w:firstRowFirstColumn="0" w:firstRowLastColumn="0" w:lastRowFirstColumn="0" w:lastRowLastColumn="0"/>
+              <w:rPr>
+                <w:rFonts w:ascii="Arial" w:hAnsi="Arial" w:cs="Arial"/>
+                <w:sz w:val="22"/>
+                <w:szCs w:val="22"/>
+              </w:rPr>
+            </w:pPr>
+            <w:r>
+              <w:rPr>
+                <w:rFonts w:ascii="Arial" w:hAnsi="Arial" w:cs="Arial"/>
+                <w:sz w:val="22"/>
+                <w:szCs w:val="22"/>
+              </w:rPr>
+              <w:t>Lab + campo</w:t>
+            </w:r>
+          </w:p>
+        </w:tc>
+      </w:tr>
+      <w:tr>
+        <w:tc>
+          <w:tcPr>
+            <w:cnfStyle w:val="001000000000" w:firstRow="0" w:lastRow="0" w:firstColumn="1" w:lastColumn="0" w:oddVBand="0" w:evenVBand="0" w:oddHBand="0" w:evenHBand="0" w:firstRowFirstColumn="0" w:firstRowLastColumn="0" w:lastRowFirstColumn="0" w:lastRowLastColumn="0"/>
+            <w:tcW w:w="1470" w:type="dxa"/>
+          </w:tcPr>
+          <w:p>
+            <w:pPr>
+              <w:rPr>
+                <w:rFonts w:ascii="Arial" w:hAnsi="Arial" w:cs="Arial"/>
+                <w:sz w:val="22"/>
+                <w:szCs w:val="22"/>
+                <w:lang w:val="en-US"/>
+              </w:rPr>
+            </w:pPr>
+            <w:r>
+              <w:rPr>
+                <w:rFonts w:ascii="Arial" w:hAnsi="Arial" w:cs="Arial"/>
+                <w:sz w:val="22"/>
+                <w:szCs w:val="22"/>
+                <w:lang w:val="en-US"/>
+              </w:rPr>
+              <w:t>INP</w:t>
+            </w:r>
+          </w:p>
+          <w:p>
+            <w:pPr>
+              <w:rPr>
+                <w:rFonts w:ascii="Arial" w:hAnsi="Arial" w:cs="Arial"/>
+                <w:sz w:val="18"/>
+                <w:szCs w:val="18"/>
+                <w:lang w:val="en-US"/>
+              </w:rPr>
+            </w:pPr>
+            <w:r>
+              <w:rPr>
+                <w:rFonts w:ascii="Arial" w:hAnsi="Arial" w:cs="Arial"/>
+                <w:sz w:val="18"/>
+                <w:szCs w:val="18"/>
+                <w:lang w:val="en-US"/>
+              </w:rPr>
+              <w:t>Interaction to Next Paint</w:t>
+            </w:r>
+          </w:p>
+        </w:tc>
+        <w:tc>
+          <w:tcPr>
+            <w:tcW w:w="1931" w:type="dxa"/>
+          </w:tcPr>
+          <w:p>
+            <w:pPr>
+              <w:cnfStyle w:val="000000000000" w:firstRow="0" w:lastRow="0" w:firstColumn="0" w:lastColumn="0" w:oddVBand="0" w:evenVBand="0" w:oddHBand="0" w:evenHBand="0" w:firstRowFirstColumn="0" w:firstRowLastColumn="0" w:lastRowFirstColumn="0" w:lastRowLastColumn="0"/>
+              <w:rPr>
+                <w:rFonts w:ascii="Arial" w:hAnsi="Arial" w:cs="Arial"/>
+                <w:sz w:val="22"/>
+                <w:szCs w:val="22"/>
+              </w:rPr>
+            </w:pPr>
+            <w:r>
+              <w:rPr>
+                <w:rFonts w:ascii="Arial" w:hAnsi="Arial" w:cs="Arial"/>
+                <w:sz w:val="22"/>
+                <w:szCs w:val="22"/>
+              </w:rPr>
+              <w:t>Respuesta a interacciones del usuario (clics, teclado)</w:t>
+            </w:r>
+          </w:p>
+        </w:tc>
+        <w:tc>
+          <w:tcPr>
+            <w:tcW w:w="1743" w:type="dxa"/>
+          </w:tcPr>
+          <w:p>
+            <w:pPr>
+              <w:cnfStyle w:val="000000000000" w:firstRow="0" w:lastRow="0" w:firstColumn="0" w:lastColumn="0" w:oddVBand="0" w:evenVBand="0" w:oddHBand="0" w:evenHBand="0" w:firstRowFirstColumn="0" w:firstRowLastColumn="0" w:lastRowFirstColumn="0" w:lastRowLastColumn="0"/>
+              <w:rPr>
+                <w:rFonts w:ascii="Arial" w:hAnsi="Arial" w:cs="Arial"/>
+                <w:sz w:val="22"/>
+                <w:szCs w:val="22"/>
+              </w:rPr>
+            </w:pPr>
+            <w:r>
+              <w:rPr>
+                <w:rFonts w:ascii="Arial" w:hAnsi="Arial" w:cs="Arial"/>
+                <w:sz w:val="22"/>
+                <w:szCs w:val="22"/>
+              </w:rPr>
+              <w:t>CWV activo</w:t>
+            </w:r>
+          </w:p>
+        </w:tc>
+        <w:tc>
+          <w:tcPr>
+            <w:tcW w:w="1285" w:type="dxa"/>
+          </w:tcPr>
+          <w:p>
+            <w:pPr>
+              <w:cnfStyle w:val="000000000000" w:firstRow="0" w:lastRow="0" w:firstColumn="0" w:lastColumn="0" w:oddVBand="0" w:evenVBand="0" w:oddHBand="0" w:evenHBand="0" w:firstRowFirstColumn="0" w:firstRowLastColumn="0" w:lastRowFirstColumn="0" w:lastRowLastColumn="0"/>
+              <w:rPr>
+                <w:rFonts w:ascii="Arial" w:hAnsi="Arial" w:cs="Arial"/>
+                <w:sz w:val="22"/>
+                <w:szCs w:val="22"/>
+              </w:rPr>
+            </w:pPr>
+            <w:r>
+              <w:rPr>
+                <w:rFonts w:ascii="Arial" w:hAnsi="Arial" w:cs="Arial"/>
+                <w:sz w:val="22"/>
+                <w:szCs w:val="22"/>
+              </w:rPr>
+              <w:t>≤ 200 ms</w:t>
+            </w:r>
+          </w:p>
+        </w:tc>
+        <w:tc>
+          <w:tcPr>
+            <w:tcW w:w="1672" w:type="dxa"/>
+          </w:tcPr>
+          <w:p>
+            <w:pPr>
+              <w:cnfStyle w:val="000000000000" w:firstRow="0" w:lastRow="0" w:firstColumn="0" w:lastColumn="0" w:oddVBand="0" w:evenVBand="0" w:oddHBand="0" w:evenHBand="0" w:firstRowFirstColumn="0" w:firstRowLastColumn="0" w:lastRowFirstColumn="0" w:lastRowLastColumn="0"/>
+              <w:rPr>
+                <w:rFonts w:ascii="Arial" w:hAnsi="Arial" w:cs="Arial"/>
+                <w:sz w:val="22"/>
+                <w:szCs w:val="22"/>
+              </w:rPr>
+            </w:pPr>
+            <w:r>
+              <w:rPr>
+                <w:rFonts w:ascii="Arial" w:hAnsi="Arial" w:cs="Arial"/>
+                <w:sz w:val="22"/>
+                <w:szCs w:val="22"/>
+              </w:rPr>
+              <w:t>Sí</w:t>
+            </w:r>
+          </w:p>
+        </w:tc>
+        <w:tc>
+          <w:tcPr>
+            <w:tcW w:w="688" w:type="dxa"/>
+          </w:tcPr>
+          <w:p>
+            <w:pPr>
+              <w:cnfStyle w:val="000000000000" w:firstRow="0" w:lastRow="0" w:firstColumn="0" w:lastColumn="0" w:oddVBand="0" w:evenVBand="0" w:oddHBand="0" w:evenHBand="0" w:firstRowFirstColumn="0" w:firstRowLastColumn="0" w:lastRowFirstColumn="0" w:lastRowLastColumn="0"/>
+              <w:rPr>
+                <w:rFonts w:ascii="Arial" w:hAnsi="Arial" w:cs="Arial"/>
+                <w:sz w:val="22"/>
+                <w:szCs w:val="22"/>
+              </w:rPr>
+            </w:pPr>
+            <w:r>
+              <w:rPr>
+                <w:rFonts w:ascii="Arial" w:hAnsi="Arial" w:cs="Arial"/>
+                <w:sz w:val="22"/>
+                <w:szCs w:val="22"/>
+              </w:rPr>
+              <w:t>C</w:t>
+            </w:r>
+            <w:r>
+              <w:rPr>
+                <w:rFonts w:ascii="Arial" w:hAnsi="Arial" w:cs="Arial"/>
+                <w:sz w:val="22"/>
+                <w:szCs w:val="22"/>
+              </w:rPr>
+              <w:t>ampo</w:t>
+            </w:r>
+            <w:r>
+              <w:rPr>
+                <w:rFonts w:ascii="Arial" w:hAnsi="Arial" w:cs="Arial"/>
+                <w:sz w:val="22"/>
+                <w:szCs w:val="22"/>
+              </w:rPr>
+              <w:t xml:space="preserve"> </w:t>
+            </w:r>
+          </w:p>
+        </w:tc>
+      </w:tr>
+      <w:tr>
+        <w:trPr>
+          <w:cnfStyle w:val="000000100000" w:firstRow="0" w:lastRow="0" w:firstColumn="0" w:lastColumn="0" w:oddVBand="0" w:evenVBand="0" w:oddHBand="1" w:evenHBand="0" w:firstRowFirstColumn="0" w:firstRowLastColumn="0" w:lastRowFirstColumn="0" w:lastRowLastColumn="0"/>
+        </w:trPr>
+        <w:tc>
+          <w:tcPr>
+            <w:cnfStyle w:val="001000000000" w:firstRow="0" w:lastRow="0" w:firstColumn="1" w:lastColumn="0" w:oddVBand="0" w:evenVBand="0" w:oddHBand="0" w:evenHBand="0" w:firstRowFirstColumn="0" w:firstRowLastColumn="0" w:lastRowFirstColumn="0" w:lastRowLastColumn="0"/>
+            <w:tcW w:w="1470" w:type="dxa"/>
+          </w:tcPr>
+          <w:p>
+            <w:pPr>
+              <w:rPr>
+                <w:rFonts w:ascii="Arial" w:hAnsi="Arial" w:cs="Arial"/>
+                <w:sz w:val="22"/>
+                <w:szCs w:val="22"/>
+              </w:rPr>
+            </w:pPr>
+            <w:r>
+              <w:rPr>
+                <w:rFonts w:ascii="Arial" w:hAnsi="Arial" w:cs="Arial"/>
+                <w:sz w:val="22"/>
+                <w:szCs w:val="22"/>
+              </w:rPr>
+              <w:t>CLS</w:t>
+            </w:r>
+          </w:p>
+          <w:p>
+            <w:pPr>
+              <w:rPr>
+                <w:rFonts w:ascii="Arial" w:hAnsi="Arial" w:cs="Arial"/>
+                <w:sz w:val="22"/>
+                <w:szCs w:val="22"/>
+              </w:rPr>
+            </w:pPr>
+            <w:r>
+              <w:rPr>
+                <w:rFonts w:ascii="Arial" w:hAnsi="Arial" w:cs="Arial"/>
+                <w:sz w:val="16"/>
+                <w:szCs w:val="16"/>
+              </w:rPr>
+              <w:t>Cumulative Layout Shift</w:t>
+            </w:r>
+          </w:p>
+        </w:tc>
+        <w:tc>
+          <w:tcPr>
+            <w:tcW w:w="1931" w:type="dxa"/>
+          </w:tcPr>
+          <w:p>
+            <w:pPr>
+              <w:cnfStyle w:val="000000100000" w:firstRow="0" w:lastRow="0" w:firstColumn="0" w:lastColumn="0" w:oddVBand="0" w:evenVBand="0" w:oddHBand="1" w:evenHBand="0" w:firstRowFirstColumn="0" w:firstRowLastColumn="0" w:lastRowFirstColumn="0" w:lastRowLastColumn="0"/>
+              <w:rPr>
+                <w:rFonts w:ascii="Arial" w:hAnsi="Arial" w:cs="Arial"/>
+                <w:sz w:val="22"/>
+                <w:szCs w:val="22"/>
+              </w:rPr>
+            </w:pPr>
+            <w:r>
+              <w:rPr>
+                <w:rFonts w:ascii="Arial" w:hAnsi="Arial" w:cs="Arial"/>
+                <w:sz w:val="22"/>
+                <w:szCs w:val="22"/>
+              </w:rPr>
+              <w:t>Estabilidad visual (saltos de contenido inesperados)</w:t>
+            </w:r>
+          </w:p>
+        </w:tc>
+        <w:tc>
+          <w:tcPr>
+            <w:tcW w:w="1743" w:type="dxa"/>
+          </w:tcPr>
+          <w:p>
+            <w:pPr>
+              <w:cnfStyle w:val="000000100000" w:firstRow="0" w:lastRow="0" w:firstColumn="0" w:lastColumn="0" w:oddVBand="0" w:evenVBand="0" w:oddHBand="1" w:evenHBand="0" w:firstRowFirstColumn="0" w:firstRowLastColumn="0" w:lastRowFirstColumn="0" w:lastRowLastColumn="0"/>
+              <w:rPr>
+                <w:rFonts w:ascii="Arial" w:hAnsi="Arial" w:cs="Arial"/>
+                <w:sz w:val="22"/>
+                <w:szCs w:val="22"/>
+              </w:rPr>
+            </w:pPr>
+            <w:r>
+              <w:rPr>
+                <w:rFonts w:ascii="Arial" w:hAnsi="Arial" w:cs="Arial"/>
+                <w:sz w:val="22"/>
+                <w:szCs w:val="22"/>
+              </w:rPr>
+              <w:t>CWV activo</w:t>
+            </w:r>
+          </w:p>
+        </w:tc>
+        <w:tc>
+          <w:tcPr>
+            <w:tcW w:w="1285" w:type="dxa"/>
+          </w:tcPr>
+          <w:p>
+            <w:pPr>
+              <w:cnfStyle w:val="000000100000" w:firstRow="0" w:lastRow="0" w:firstColumn="0" w:lastColumn="0" w:oddVBand="0" w:evenVBand="0" w:oddHBand="1" w:evenHBand="0" w:firstRowFirstColumn="0" w:firstRowLastColumn="0" w:lastRowFirstColumn="0" w:lastRowLastColumn="0"/>
+              <w:rPr>
+                <w:rFonts w:ascii="Arial" w:hAnsi="Arial" w:cs="Arial"/>
+                <w:sz w:val="22"/>
+                <w:szCs w:val="22"/>
+              </w:rPr>
+            </w:pPr>
+            <w:r>
+              <w:rPr>
+                <w:rFonts w:ascii="Arial" w:hAnsi="Arial" w:cs="Arial"/>
+                <w:sz w:val="22"/>
+                <w:szCs w:val="22"/>
+              </w:rPr>
+              <w:t>≤ 0.1</w:t>
+            </w:r>
+          </w:p>
+        </w:tc>
+        <w:tc>
+          <w:tcPr>
+            <w:tcW w:w="1672" w:type="dxa"/>
+          </w:tcPr>
+          <w:p>
+            <w:pPr>
+              <w:cnfStyle w:val="000000100000" w:firstRow="0" w:lastRow="0" w:firstColumn="0" w:lastColumn="0" w:oddVBand="0" w:evenVBand="0" w:oddHBand="1" w:evenHBand="0" w:firstRowFirstColumn="0" w:firstRowLastColumn="0" w:lastRowFirstColumn="0" w:lastRowLastColumn="0"/>
+              <w:rPr>
+                <w:rFonts w:ascii="Arial" w:hAnsi="Arial" w:cs="Arial"/>
+                <w:sz w:val="22"/>
+                <w:szCs w:val="22"/>
+              </w:rPr>
+            </w:pPr>
+            <w:r>
+              <w:rPr>
+                <w:rFonts w:ascii="Arial" w:hAnsi="Arial" w:cs="Arial"/>
+                <w:sz w:val="22"/>
+                <w:szCs w:val="22"/>
+              </w:rPr>
+              <w:t>Sí</w:t>
+            </w:r>
+          </w:p>
+        </w:tc>
+        <w:tc>
+          <w:tcPr>
+            <w:tcW w:w="688" w:type="dxa"/>
+          </w:tcPr>
+          <w:p>
+            <w:pPr>
+              <w:cnfStyle w:val="000000100000" w:firstRow="0" w:lastRow="0" w:firstColumn="0" w:lastColumn="0" w:oddVBand="0" w:evenVBand="0" w:oddHBand="1" w:evenHBand="0" w:firstRowFirstColumn="0" w:firstRowLastColumn="0" w:lastRowFirstColumn="0" w:lastRowLastColumn="0"/>
+              <w:rPr>
+                <w:rFonts w:ascii="Arial" w:hAnsi="Arial" w:cs="Arial"/>
+                <w:sz w:val="22"/>
+                <w:szCs w:val="22"/>
+              </w:rPr>
+            </w:pPr>
+            <w:r>
+              <w:rPr>
+                <w:rFonts w:ascii="Arial" w:hAnsi="Arial" w:cs="Arial"/>
+                <w:sz w:val="22"/>
+                <w:szCs w:val="22"/>
+              </w:rPr>
+              <w:t>Lab + campo</w:t>
+            </w:r>
+          </w:p>
+        </w:tc>
+      </w:tr>
+      <w:tr>
+        <w:tc>
+          <w:tcPr>
+            <w:cnfStyle w:val="001000000000" w:firstRow="0" w:lastRow="0" w:firstColumn="1" w:lastColumn="0" w:oddVBand="0" w:evenVBand="0" w:oddHBand="0" w:evenHBand="0" w:firstRowFirstColumn="0" w:firstRowLastColumn="0" w:lastRowFirstColumn="0" w:lastRowLastColumn="0"/>
+            <w:tcW w:w="1470" w:type="dxa"/>
+          </w:tcPr>
+          <w:p>
+            <w:pPr>
+              <w:rPr>
+                <w:rFonts w:ascii="Arial" w:hAnsi="Arial" w:cs="Arial"/>
+                <w:sz w:val="22"/>
+                <w:szCs w:val="22"/>
+              </w:rPr>
+            </w:pPr>
+            <w:r>
+              <w:rPr>
+                <w:rFonts w:ascii="Arial" w:hAnsi="Arial" w:cs="Arial"/>
+                <w:sz w:val="22"/>
+                <w:szCs w:val="22"/>
+              </w:rPr>
+              <w:t>FID</w:t>
+            </w:r>
+          </w:p>
+          <w:p>
+            <w:pPr>
+              <w:rPr>
+                <w:rFonts w:ascii="Arial" w:hAnsi="Arial" w:cs="Arial"/>
+                <w:sz w:val="22"/>
+                <w:szCs w:val="22"/>
+              </w:rPr>
+            </w:pPr>
+            <w:r>
+              <w:rPr>
+                <w:rFonts w:ascii="Arial" w:hAnsi="Arial" w:cs="Arial"/>
+                <w:sz w:val="16"/>
+                <w:szCs w:val="16"/>
+              </w:rPr>
+              <w:t>First Input Delay</w:t>
+            </w:r>
+          </w:p>
+        </w:tc>
+        <w:tc>
+          <w:tcPr>
+            <w:tcW w:w="1931" w:type="dxa"/>
+          </w:tcPr>
+          <w:p>
+            <w:pPr>
+              <w:cnfStyle w:val="000000000000" w:firstRow="0" w:lastRow="0" w:firstColumn="0" w:lastColumn="0" w:oddVBand="0" w:evenVBand="0" w:oddHBand="0" w:evenHBand="0" w:firstRowFirstColumn="0" w:firstRowLastColumn="0" w:lastRowFirstColumn="0" w:lastRowLastColumn="0"/>
+              <w:rPr>
+                <w:rFonts w:ascii="Arial" w:hAnsi="Arial" w:cs="Arial"/>
+                <w:sz w:val="22"/>
+                <w:szCs w:val="22"/>
+              </w:rPr>
+            </w:pPr>
+            <w:r>
+              <w:rPr>
+                <w:rFonts w:ascii="Arial" w:hAnsi="Arial" w:cs="Arial"/>
+                <w:sz w:val="22"/>
+                <w:szCs w:val="22"/>
+              </w:rPr>
+              <w:t>Delay al primer input del usuario</w:t>
+            </w:r>
+          </w:p>
+        </w:tc>
+        <w:tc>
+          <w:tcPr>
+            <w:tcW w:w="1743" w:type="dxa"/>
+          </w:tcPr>
+          <w:p>
+            <w:pPr>
+              <w:cnfStyle w:val="000000000000" w:firstRow="0" w:lastRow="0" w:firstColumn="0" w:lastColumn="0" w:oddVBand="0" w:evenVBand="0" w:oddHBand="0" w:evenHBand="0" w:firstRowFirstColumn="0" w:firstRowLastColumn="0" w:lastRowFirstColumn="0" w:lastRowLastColumn="0"/>
+              <w:rPr>
+                <w:rFonts w:ascii="Arial" w:hAnsi="Arial" w:cs="Arial"/>
+                <w:sz w:val="22"/>
+                <w:szCs w:val="22"/>
+              </w:rPr>
+            </w:pPr>
+            <w:r>
+              <w:rPr>
+                <w:rFonts w:ascii="Arial" w:hAnsi="Arial" w:cs="Arial"/>
+                <w:sz w:val="22"/>
+                <w:szCs w:val="22"/>
+              </w:rPr>
+              <w:t>Reemplazado</w:t>
+            </w:r>
+          </w:p>
+        </w:tc>
+        <w:tc>
+          <w:tcPr>
+            <w:tcW w:w="1285" w:type="dxa"/>
+          </w:tcPr>
+          <w:p>
+            <w:pPr>
+              <w:cnfStyle w:val="000000000000" w:firstRow="0" w:lastRow="0" w:firstColumn="0" w:lastColumn="0" w:oddVBand="0" w:evenVBand="0" w:oddHBand="0" w:evenHBand="0" w:firstRowFirstColumn="0" w:firstRowLastColumn="0" w:lastRowFirstColumn="0" w:lastRowLastColumn="0"/>
+              <w:rPr>
+                <w:rFonts w:ascii="Arial" w:hAnsi="Arial" w:cs="Arial"/>
+                <w:sz w:val="22"/>
+                <w:szCs w:val="22"/>
+              </w:rPr>
+            </w:pPr>
+            <w:r>
+              <w:rPr>
+                <w:rFonts w:ascii="Arial" w:hAnsi="Arial" w:cs="Arial"/>
+                <w:sz w:val="22"/>
+                <w:szCs w:val="22"/>
+              </w:rPr>
+              <w:t>≤ 100 ms</w:t>
+            </w:r>
+          </w:p>
+        </w:tc>
+        <w:tc>
+          <w:tcPr>
+            <w:tcW w:w="1672" w:type="dxa"/>
+          </w:tcPr>
+          <w:p>
+            <w:pPr>
+              <w:cnfStyle w:val="000000000000" w:firstRow="0" w:lastRow="0" w:firstColumn="0" w:lastColumn="0" w:oddVBand="0" w:evenVBand="0" w:oddHBand="0" w:evenHBand="0" w:firstRowFirstColumn="0" w:firstRowLastColumn="0" w:lastRowFirstColumn="0" w:lastRowLastColumn="0"/>
+              <w:rPr>
+                <w:rFonts w:ascii="Arial" w:hAnsi="Arial" w:cs="Arial"/>
+                <w:sz w:val="22"/>
+                <w:szCs w:val="22"/>
+              </w:rPr>
+            </w:pPr>
+            <w:r>
+              <w:rPr>
+                <w:rFonts w:ascii="Arial" w:hAnsi="Arial" w:cs="Arial"/>
+                <w:sz w:val="22"/>
+                <w:szCs w:val="22"/>
+              </w:rPr>
+              <w:t>No (desde mar 2024)</w:t>
+            </w:r>
+          </w:p>
+        </w:tc>
+        <w:tc>
+          <w:tcPr>
+            <w:tcW w:w="688" w:type="dxa"/>
+          </w:tcPr>
+          <w:p>
+            <w:pPr>
+              <w:cnfStyle w:val="000000000000" w:firstRow="0" w:lastRow="0" w:firstColumn="0" w:lastColumn="0" w:oddVBand="0" w:evenVBand="0" w:oddHBand="0" w:evenHBand="0" w:firstRowFirstColumn="0" w:firstRowLastColumn="0" w:lastRowFirstColumn="0" w:lastRowLastColumn="0"/>
+              <w:rPr>
+                <w:rFonts w:ascii="Arial" w:hAnsi="Arial" w:cs="Arial"/>
+                <w:sz w:val="22"/>
+                <w:szCs w:val="22"/>
+              </w:rPr>
+            </w:pPr>
+            <w:r>
+              <w:rPr>
+                <w:rFonts w:ascii="Arial" w:hAnsi="Arial" w:cs="Arial"/>
+                <w:sz w:val="22"/>
+                <w:szCs w:val="22"/>
+              </w:rPr>
+              <w:t>Solo campo</w:t>
+            </w:r>
+          </w:p>
+          <w:p>
+            <w:pPr>
+              <w:jc w:val="center"/>
+              <w:cnfStyle w:val="000000000000" w:firstRow="0" w:lastRow="0" w:firstColumn="0" w:lastColumn="0" w:oddVBand="0" w:evenVBand="0" w:oddHBand="0" w:evenHBand="0" w:firstRowFirstColumn="0" w:firstRowLastColumn="0" w:lastRowFirstColumn="0" w:lastRowLastColumn="0"/>
+              <w:rPr>
+                <w:rFonts w:ascii="Arial" w:hAnsi="Arial" w:cs="Arial"/>
+                <w:sz w:val="22"/>
+                <w:szCs w:val="22"/>
+              </w:rPr>
+            </w:pPr>
+          </w:p>
+        </w:tc>
+      </w:tr>
+      <w:tr>
+        <w:trPr>
+          <w:cnfStyle w:val="000000100000" w:firstRow="0" w:lastRow="0" w:firstColumn="0" w:lastColumn="0" w:oddVBand="0" w:evenVBand="0" w:oddHBand="1" w:evenHBand="0" w:firstRowFirstColumn="0" w:firstRowLastColumn="0" w:lastRowFirstColumn="0" w:lastRowLastColumn="0"/>
+        </w:trPr>
+        <w:tc>
+          <w:tcPr>
+            <w:cnfStyle w:val="001000000000" w:firstRow="0" w:lastRow="0" w:firstColumn="1" w:lastColumn="0" w:oddVBand="0" w:evenVBand="0" w:oddHBand="0" w:evenHBand="0" w:firstRowFirstColumn="0" w:firstRowLastColumn="0" w:lastRowFirstColumn="0" w:lastRowLastColumn="0"/>
+            <w:tcW w:w="1470" w:type="dxa"/>
+          </w:tcPr>
+          <w:p>
+            <w:pPr>
+              <w:rPr>
+                <w:rFonts w:ascii="Arial" w:hAnsi="Arial" w:cs="Arial"/>
+                <w:sz w:val="22"/>
+                <w:szCs w:val="22"/>
+              </w:rPr>
+            </w:pPr>
+            <w:r>
+              <w:rPr>
+                <w:rFonts w:ascii="Arial" w:hAnsi="Arial" w:cs="Arial"/>
+                <w:sz w:val="22"/>
+                <w:szCs w:val="22"/>
+              </w:rPr>
+              <w:t>FCP</w:t>
+            </w:r>
+          </w:p>
+          <w:p>
+            <w:pPr>
+              <w:rPr>
+                <w:rFonts w:ascii="Arial" w:hAnsi="Arial" w:cs="Arial"/>
+                <w:sz w:val="22"/>
+                <w:szCs w:val="22"/>
+              </w:rPr>
+            </w:pPr>
+            <w:r>
+              <w:rPr>
+                <w:rFonts w:ascii="Arial" w:hAnsi="Arial" w:cs="Arial"/>
+                <w:sz w:val="16"/>
+                <w:szCs w:val="16"/>
+              </w:rPr>
+              <w:t>First Contentful Paint</w:t>
+            </w:r>
+          </w:p>
+        </w:tc>
+        <w:tc>
+          <w:tcPr>
+            <w:tcW w:w="1931" w:type="dxa"/>
+          </w:tcPr>
+          <w:p>
+            <w:pPr>
+              <w:cnfStyle w:val="000000100000" w:firstRow="0" w:lastRow="0" w:firstColumn="0" w:lastColumn="0" w:oddVBand="0" w:evenVBand="0" w:oddHBand="1" w:evenHBand="0" w:firstRowFirstColumn="0" w:firstRowLastColumn="0" w:lastRowFirstColumn="0" w:lastRowLastColumn="0"/>
+              <w:rPr>
+                <w:rFonts w:ascii="Arial" w:hAnsi="Arial" w:cs="Arial"/>
+                <w:sz w:val="22"/>
+                <w:szCs w:val="22"/>
+              </w:rPr>
+            </w:pPr>
+            <w:r>
+              <w:rPr>
+                <w:rFonts w:ascii="Arial" w:hAnsi="Arial" w:cs="Arial"/>
+                <w:sz w:val="22"/>
+                <w:szCs w:val="22"/>
+              </w:rPr>
+              <w:t>Cuando</w:t>
+            </w:r>
+            <w:r>
+              <w:rPr>
+                <w:rFonts w:ascii="Arial" w:hAnsi="Arial" w:cs="Arial"/>
+                <w:sz w:val="22"/>
+                <w:szCs w:val="22"/>
+              </w:rPr>
+              <w:t xml:space="preserve"> aparece el primer pixel de contenido</w:t>
+            </w:r>
+          </w:p>
+        </w:tc>
+        <w:tc>
+          <w:tcPr>
+            <w:tcW w:w="1743" w:type="dxa"/>
+          </w:tcPr>
+          <w:p>
+            <w:pPr>
+              <w:cnfStyle w:val="000000100000" w:firstRow="0" w:lastRow="0" w:firstColumn="0" w:lastColumn="0" w:oddVBand="0" w:evenVBand="0" w:oddHBand="1" w:evenHBand="0" w:firstRowFirstColumn="0" w:firstRowLastColumn="0" w:lastRowFirstColumn="0" w:lastRowLastColumn="0"/>
+              <w:rPr>
+                <w:rFonts w:ascii="Arial" w:hAnsi="Arial" w:cs="Arial"/>
+                <w:sz w:val="22"/>
+                <w:szCs w:val="22"/>
+              </w:rPr>
+            </w:pPr>
+            <w:r>
+              <w:rPr>
+                <w:rFonts w:ascii="Arial" w:hAnsi="Arial" w:cs="Arial"/>
+                <w:sz w:val="22"/>
+                <w:szCs w:val="22"/>
+              </w:rPr>
+              <w:t>Suplementaria</w:t>
+            </w:r>
+          </w:p>
+        </w:tc>
+        <w:tc>
+          <w:tcPr>
+            <w:tcW w:w="1285" w:type="dxa"/>
+          </w:tcPr>
+          <w:p>
+            <w:pPr>
+              <w:cnfStyle w:val="000000100000" w:firstRow="0" w:lastRow="0" w:firstColumn="0" w:lastColumn="0" w:oddVBand="0" w:evenVBand="0" w:oddHBand="1" w:evenHBand="0" w:firstRowFirstColumn="0" w:firstRowLastColumn="0" w:lastRowFirstColumn="0" w:lastRowLastColumn="0"/>
+              <w:rPr>
+                <w:rFonts w:ascii="Arial" w:hAnsi="Arial" w:cs="Arial"/>
+                <w:sz w:val="22"/>
+                <w:szCs w:val="22"/>
+              </w:rPr>
+            </w:pPr>
+            <w:r>
+              <w:rPr>
+                <w:rFonts w:ascii="Arial" w:hAnsi="Arial" w:cs="Arial"/>
+                <w:sz w:val="22"/>
+                <w:szCs w:val="22"/>
+              </w:rPr>
+              <w:t>≤ 1.8 s</w:t>
+            </w:r>
+          </w:p>
+        </w:tc>
+        <w:tc>
+          <w:tcPr>
+            <w:tcW w:w="1672" w:type="dxa"/>
+          </w:tcPr>
+          <w:p>
+            <w:pPr>
+              <w:cnfStyle w:val="000000100000" w:firstRow="0" w:lastRow="0" w:firstColumn="0" w:lastColumn="0" w:oddVBand="0" w:evenVBand="0" w:oddHBand="1" w:evenHBand="0" w:firstRowFirstColumn="0" w:firstRowLastColumn="0" w:lastRowFirstColumn="0" w:lastRowLastColumn="0"/>
+              <w:rPr>
+                <w:rFonts w:ascii="Arial" w:hAnsi="Arial" w:cs="Arial"/>
+                <w:sz w:val="22"/>
+                <w:szCs w:val="22"/>
+              </w:rPr>
+            </w:pPr>
+            <w:r>
+              <w:rPr>
+                <w:rFonts w:ascii="Arial" w:hAnsi="Arial" w:cs="Arial"/>
+                <w:sz w:val="22"/>
+                <w:szCs w:val="22"/>
+              </w:rPr>
+              <w:t>Indirectamente</w:t>
+            </w:r>
+          </w:p>
+        </w:tc>
+        <w:tc>
+          <w:tcPr>
+            <w:tcW w:w="688" w:type="dxa"/>
+          </w:tcPr>
+          <w:p>
+            <w:pPr>
+              <w:cnfStyle w:val="000000100000" w:firstRow="0" w:lastRow="0" w:firstColumn="0" w:lastColumn="0" w:oddVBand="0" w:evenVBand="0" w:oddHBand="1" w:evenHBand="0" w:firstRowFirstColumn="0" w:firstRowLastColumn="0" w:lastRowFirstColumn="0" w:lastRowLastColumn="0"/>
+              <w:rPr>
+                <w:rFonts w:ascii="Arial" w:hAnsi="Arial" w:cs="Arial"/>
+                <w:sz w:val="22"/>
+                <w:szCs w:val="22"/>
+              </w:rPr>
+            </w:pPr>
+            <w:r>
+              <w:rPr>
+                <w:rFonts w:ascii="Arial" w:hAnsi="Arial" w:cs="Arial"/>
+                <w:sz w:val="22"/>
+                <w:szCs w:val="22"/>
+              </w:rPr>
+              <w:t>Lab + campo</w:t>
+            </w:r>
+          </w:p>
+        </w:tc>
+      </w:tr>
+      <w:tr>
+        <w:tc>
+          <w:tcPr>
+            <w:cnfStyle w:val="001000000000" w:firstRow="0" w:lastRow="0" w:firstColumn="1" w:lastColumn="0" w:oddVBand="0" w:evenVBand="0" w:oddHBand="0" w:evenHBand="0" w:firstRowFirstColumn="0" w:firstRowLastColumn="0" w:lastRowFirstColumn="0" w:lastRowLastColumn="0"/>
+            <w:tcW w:w="1470" w:type="dxa"/>
+          </w:tcPr>
+          <w:p>
+            <w:pPr>
+              <w:rPr>
+                <w:rFonts w:ascii="Arial" w:hAnsi="Arial" w:cs="Arial"/>
+                <w:sz w:val="22"/>
+                <w:szCs w:val="22"/>
+                <w:lang w:val="en-US"/>
+              </w:rPr>
+            </w:pPr>
+            <w:r>
+              <w:rPr>
+                <w:rFonts w:ascii="Arial" w:hAnsi="Arial" w:cs="Arial"/>
+                <w:sz w:val="22"/>
+                <w:szCs w:val="22"/>
+                <w:lang w:val="en-US"/>
+              </w:rPr>
+              <w:t>TTFB</w:t>
+            </w:r>
+          </w:p>
+          <w:p>
+            <w:pPr>
+              <w:rPr>
+                <w:rFonts w:ascii="Arial" w:hAnsi="Arial" w:cs="Arial"/>
+                <w:sz w:val="22"/>
+                <w:szCs w:val="22"/>
+                <w:lang w:val="en-US"/>
+              </w:rPr>
+            </w:pPr>
+            <w:r>
+              <w:rPr>
+                <w:rFonts w:ascii="Arial" w:hAnsi="Arial" w:cs="Arial"/>
+                <w:sz w:val="16"/>
+                <w:szCs w:val="16"/>
+              </w:rPr>
+              <w:t>Time to First Byte</w:t>
+            </w:r>
+          </w:p>
+        </w:tc>
+        <w:tc>
+          <w:tcPr>
+            <w:tcW w:w="1931" w:type="dxa"/>
+          </w:tcPr>
+          <w:p>
+            <w:pPr>
+              <w:cnfStyle w:val="000000000000" w:firstRow="0" w:lastRow="0" w:firstColumn="0" w:lastColumn="0" w:oddVBand="0" w:evenVBand="0" w:oddHBand="0" w:evenHBand="0" w:firstRowFirstColumn="0" w:firstRowLastColumn="0" w:lastRowFirstColumn="0" w:lastRowLastColumn="0"/>
+              <w:rPr>
+                <w:rFonts w:ascii="Arial" w:hAnsi="Arial" w:cs="Arial"/>
+                <w:sz w:val="22"/>
+                <w:szCs w:val="22"/>
+              </w:rPr>
+            </w:pPr>
+            <w:r>
+              <w:rPr>
+                <w:rFonts w:ascii="Arial" w:hAnsi="Arial" w:cs="Arial"/>
+                <w:sz w:val="22"/>
+                <w:szCs w:val="22"/>
+              </w:rPr>
+              <w:t>Tiempo hasta recibir el primer byte del servidor</w:t>
+            </w:r>
+          </w:p>
+        </w:tc>
+        <w:tc>
+          <w:tcPr>
+            <w:tcW w:w="1743" w:type="dxa"/>
+          </w:tcPr>
+          <w:p>
+            <w:pPr>
+              <w:cnfStyle w:val="000000000000" w:firstRow="0" w:lastRow="0" w:firstColumn="0" w:lastColumn="0" w:oddVBand="0" w:evenVBand="0" w:oddHBand="0" w:evenHBand="0" w:firstRowFirstColumn="0" w:firstRowLastColumn="0" w:lastRowFirstColumn="0" w:lastRowLastColumn="0"/>
+              <w:rPr>
+                <w:rFonts w:ascii="Arial" w:hAnsi="Arial" w:cs="Arial"/>
+                <w:sz w:val="22"/>
+                <w:szCs w:val="22"/>
+              </w:rPr>
+            </w:pPr>
+            <w:r>
+              <w:rPr>
+                <w:rFonts w:ascii="Arial" w:hAnsi="Arial" w:cs="Arial"/>
+                <w:sz w:val="22"/>
+                <w:szCs w:val="22"/>
+              </w:rPr>
+              <w:t>Suplementaria</w:t>
+            </w:r>
+          </w:p>
+        </w:tc>
+        <w:tc>
+          <w:tcPr>
+            <w:tcW w:w="1285" w:type="dxa"/>
+          </w:tcPr>
+          <w:p>
+            <w:pPr>
+              <w:cnfStyle w:val="000000000000" w:firstRow="0" w:lastRow="0" w:firstColumn="0" w:lastColumn="0" w:oddVBand="0" w:evenVBand="0" w:oddHBand="0" w:evenHBand="0" w:firstRowFirstColumn="0" w:firstRowLastColumn="0" w:lastRowFirstColumn="0" w:lastRowLastColumn="0"/>
+              <w:rPr>
+                <w:rFonts w:ascii="Arial" w:hAnsi="Arial" w:cs="Arial"/>
+                <w:sz w:val="22"/>
+                <w:szCs w:val="22"/>
+              </w:rPr>
+            </w:pPr>
+            <w:r>
+              <w:rPr>
+                <w:rFonts w:ascii="Arial" w:hAnsi="Arial" w:cs="Arial"/>
+                <w:sz w:val="22"/>
+                <w:szCs w:val="22"/>
+              </w:rPr>
+              <w:t>≤ 800 ms</w:t>
+            </w:r>
+          </w:p>
+        </w:tc>
+        <w:tc>
+          <w:tcPr>
+            <w:tcW w:w="1672" w:type="dxa"/>
+          </w:tcPr>
+          <w:p>
+            <w:pPr>
+              <w:cnfStyle w:val="000000000000" w:firstRow="0" w:lastRow="0" w:firstColumn="0" w:lastColumn="0" w:oddVBand="0" w:evenVBand="0" w:oddHBand="0" w:evenHBand="0" w:firstRowFirstColumn="0" w:firstRowLastColumn="0" w:lastRowFirstColumn="0" w:lastRowLastColumn="0"/>
+              <w:rPr>
+                <w:rFonts w:ascii="Arial" w:hAnsi="Arial" w:cs="Arial"/>
+                <w:sz w:val="22"/>
+                <w:szCs w:val="22"/>
+              </w:rPr>
+            </w:pPr>
+            <w:r>
+              <w:rPr>
+                <w:rFonts w:ascii="Arial" w:hAnsi="Arial" w:cs="Arial"/>
+                <w:sz w:val="22"/>
+                <w:szCs w:val="22"/>
+              </w:rPr>
+              <w:t>Indirectamente</w:t>
+            </w:r>
+          </w:p>
+        </w:tc>
+        <w:tc>
+          <w:tcPr>
+            <w:tcW w:w="688" w:type="dxa"/>
+          </w:tcPr>
+          <w:p>
+            <w:pPr>
+              <w:cnfStyle w:val="000000000000" w:firstRow="0" w:lastRow="0" w:firstColumn="0" w:lastColumn="0" w:oddVBand="0" w:evenVBand="0" w:oddHBand="0" w:evenHBand="0" w:firstRowFirstColumn="0" w:firstRowLastColumn="0" w:lastRowFirstColumn="0" w:lastRowLastColumn="0"/>
+              <w:rPr>
+                <w:rFonts w:ascii="Arial" w:hAnsi="Arial" w:cs="Arial"/>
+                <w:sz w:val="22"/>
+                <w:szCs w:val="22"/>
+              </w:rPr>
+            </w:pPr>
+            <w:r>
+              <w:rPr>
+                <w:rFonts w:ascii="Arial" w:hAnsi="Arial" w:cs="Arial"/>
+                <w:sz w:val="22"/>
+                <w:szCs w:val="22"/>
+              </w:rPr>
+              <w:t>Lab + campo</w:t>
+            </w:r>
+          </w:p>
+        </w:tc>
+      </w:tr>
+      <w:tr>
+        <w:trPr>
+          <w:cnfStyle w:val="000000100000" w:firstRow="0" w:lastRow="0" w:firstColumn="0" w:lastColumn="0" w:oddVBand="0" w:evenVBand="0" w:oddHBand="1" w:evenHBand="0" w:firstRowFirstColumn="0" w:firstRowLastColumn="0" w:lastRowFirstColumn="0" w:lastRowLastColumn="0"/>
+        </w:trPr>
+        <w:tc>
+          <w:tcPr>
+            <w:cnfStyle w:val="001000000000" w:firstRow="0" w:lastRow="0" w:firstColumn="1" w:lastColumn="0" w:oddVBand="0" w:evenVBand="0" w:oddHBand="0" w:evenHBand="0" w:firstRowFirstColumn="0" w:firstRowLastColumn="0" w:lastRowFirstColumn="0" w:lastRowLastColumn="0"/>
+            <w:tcW w:w="1470" w:type="dxa"/>
+          </w:tcPr>
+          <w:p>
+            <w:pPr>
+              <w:rPr>
+                <w:rFonts w:ascii="Arial" w:hAnsi="Arial" w:cs="Arial"/>
+                <w:sz w:val="22"/>
+                <w:szCs w:val="22"/>
+              </w:rPr>
+            </w:pPr>
+            <w:r>
+              <w:rPr>
+                <w:rFonts w:ascii="Arial" w:hAnsi="Arial" w:cs="Arial"/>
+                <w:sz w:val="22"/>
+                <w:szCs w:val="22"/>
+              </w:rPr>
+              <w:t>TTI</w:t>
+            </w:r>
+          </w:p>
+          <w:p>
+            <w:pPr>
+              <w:rPr>
+                <w:rFonts w:ascii="Arial" w:hAnsi="Arial" w:cs="Arial"/>
+                <w:sz w:val="22"/>
+                <w:szCs w:val="22"/>
+              </w:rPr>
+            </w:pPr>
+            <w:r>
+              <w:rPr>
+                <w:rFonts w:ascii="Arial" w:hAnsi="Arial" w:cs="Arial"/>
+                <w:sz w:val="16"/>
+                <w:szCs w:val="16"/>
+              </w:rPr>
+              <w:t>Time to Interactive</w:t>
+            </w:r>
+          </w:p>
+        </w:tc>
+        <w:tc>
+          <w:tcPr>
+            <w:tcW w:w="1931" w:type="dxa"/>
+          </w:tcPr>
+          <w:p>
+            <w:pPr>
+              <w:cnfStyle w:val="000000100000" w:firstRow="0" w:lastRow="0" w:firstColumn="0" w:lastColumn="0" w:oddVBand="0" w:evenVBand="0" w:oddHBand="1" w:evenHBand="0" w:firstRowFirstColumn="0" w:firstRowLastColumn="0" w:lastRowFirstColumn="0" w:lastRowLastColumn="0"/>
+              <w:rPr>
+                <w:rFonts w:ascii="Arial" w:hAnsi="Arial" w:cs="Arial"/>
+                <w:sz w:val="22"/>
+                <w:szCs w:val="22"/>
+              </w:rPr>
+            </w:pPr>
+            <w:r>
+              <w:rPr>
+                <w:rFonts w:ascii="Arial" w:hAnsi="Arial" w:cs="Arial"/>
+                <w:sz w:val="22"/>
+                <w:szCs w:val="22"/>
+              </w:rPr>
+              <w:t>Cuando</w:t>
+            </w:r>
+            <w:r>
+              <w:rPr>
+                <w:rFonts w:ascii="Arial" w:hAnsi="Arial" w:cs="Arial"/>
+                <w:sz w:val="22"/>
+                <w:szCs w:val="22"/>
+              </w:rPr>
+              <w:t xml:space="preserve"> la página es completamente interactiva</w:t>
+            </w:r>
+          </w:p>
+        </w:tc>
+        <w:tc>
+          <w:tcPr>
+            <w:tcW w:w="1743" w:type="dxa"/>
+          </w:tcPr>
+          <w:p>
+            <w:pPr>
+              <w:cnfStyle w:val="000000100000" w:firstRow="0" w:lastRow="0" w:firstColumn="0" w:lastColumn="0" w:oddVBand="0" w:evenVBand="0" w:oddHBand="1" w:evenHBand="0" w:firstRowFirstColumn="0" w:firstRowLastColumn="0" w:lastRowFirstColumn="0" w:lastRowLastColumn="0"/>
+              <w:rPr>
+                <w:rFonts w:ascii="Arial" w:hAnsi="Arial" w:cs="Arial"/>
+                <w:sz w:val="22"/>
+                <w:szCs w:val="22"/>
+              </w:rPr>
+            </w:pPr>
+            <w:r>
+              <w:rPr>
+                <w:rFonts w:ascii="Arial" w:hAnsi="Arial" w:cs="Arial"/>
+                <w:sz w:val="22"/>
+                <w:szCs w:val="22"/>
+              </w:rPr>
+              <w:t>Deprecada</w:t>
+            </w:r>
+          </w:p>
+        </w:tc>
+        <w:tc>
+          <w:tcPr>
+            <w:tcW w:w="1285" w:type="dxa"/>
+          </w:tcPr>
+          <w:p>
+            <w:pPr>
+              <w:cnfStyle w:val="000000100000" w:firstRow="0" w:lastRow="0" w:firstColumn="0" w:lastColumn="0" w:oddVBand="0" w:evenVBand="0" w:oddHBand="1" w:evenHBand="0" w:firstRowFirstColumn="0" w:firstRowLastColumn="0" w:lastRowFirstColumn="0" w:lastRowLastColumn="0"/>
+              <w:rPr>
+                <w:rFonts w:ascii="Arial" w:hAnsi="Arial" w:cs="Arial"/>
+                <w:sz w:val="22"/>
+                <w:szCs w:val="22"/>
+              </w:rPr>
+            </w:pPr>
+            <w:r>
+              <w:rPr>
+                <w:rFonts w:ascii="Arial" w:hAnsi="Arial" w:cs="Arial"/>
+                <w:sz w:val="22"/>
+                <w:szCs w:val="22"/>
+              </w:rPr>
+              <w:t>≤ 3.8 s</w:t>
+            </w:r>
+          </w:p>
+        </w:tc>
+        <w:tc>
+          <w:tcPr>
+            <w:tcW w:w="1672" w:type="dxa"/>
+          </w:tcPr>
+          <w:p>
+            <w:pPr>
+              <w:cnfStyle w:val="000000100000" w:firstRow="0" w:lastRow="0" w:firstColumn="0" w:lastColumn="0" w:oddVBand="0" w:evenVBand="0" w:oddHBand="1" w:evenHBand="0" w:firstRowFirstColumn="0" w:firstRowLastColumn="0" w:lastRowFirstColumn="0" w:lastRowLastColumn="0"/>
+              <w:rPr>
+                <w:rFonts w:ascii="Arial" w:hAnsi="Arial" w:cs="Arial"/>
+                <w:sz w:val="22"/>
+                <w:szCs w:val="22"/>
+              </w:rPr>
+            </w:pPr>
+            <w:r>
+              <w:rPr>
+                <w:rFonts w:ascii="Arial" w:hAnsi="Arial" w:cs="Arial"/>
+                <w:sz w:val="22"/>
+                <w:szCs w:val="22"/>
+              </w:rPr>
+              <w:t>No</w:t>
+            </w:r>
+          </w:p>
+        </w:tc>
+        <w:tc>
+          <w:tcPr>
+            <w:tcW w:w="688" w:type="dxa"/>
+          </w:tcPr>
+          <w:p>
+            <w:pPr>
+              <w:cnfStyle w:val="000000100000" w:firstRow="0" w:lastRow="0" w:firstColumn="0" w:lastColumn="0" w:oddVBand="0" w:evenVBand="0" w:oddHBand="1" w:evenHBand="0" w:firstRowFirstColumn="0" w:firstRowLastColumn="0" w:lastRowFirstColumn="0" w:lastRowLastColumn="0"/>
+              <w:rPr>
+                <w:rFonts w:ascii="Arial" w:hAnsi="Arial" w:cs="Arial"/>
+                <w:sz w:val="22"/>
+                <w:szCs w:val="22"/>
+              </w:rPr>
+            </w:pPr>
+            <w:r>
+              <w:rPr>
+                <w:rFonts w:ascii="Arial" w:hAnsi="Arial" w:cs="Arial"/>
+                <w:sz w:val="22"/>
+                <w:szCs w:val="22"/>
+              </w:rPr>
+              <w:t>Solo lab</w:t>
+            </w:r>
+          </w:p>
+        </w:tc>
+      </w:tr>
+      <w:tr>
+        <w:tc>
+          <w:tcPr>
+            <w:cnfStyle w:val="001000000000" w:firstRow="0" w:lastRow="0" w:firstColumn="1" w:lastColumn="0" w:oddVBand="0" w:evenVBand="0" w:oddHBand="0" w:evenHBand="0" w:firstRowFirstColumn="0" w:firstRowLastColumn="0" w:lastRowFirstColumn="0" w:lastRowLastColumn="0"/>
+            <w:tcW w:w="1470" w:type="dxa"/>
+          </w:tcPr>
+          <w:p>
+            <w:pPr>
+              <w:rPr>
+                <w:rFonts w:ascii="Arial" w:hAnsi="Arial" w:cs="Arial"/>
+                <w:sz w:val="22"/>
+                <w:szCs w:val="22"/>
+              </w:rPr>
+            </w:pPr>
+            <w:r>
+              <w:rPr>
+                <w:rFonts w:ascii="Arial" w:hAnsi="Arial" w:cs="Arial"/>
+                <w:sz w:val="22"/>
+                <w:szCs w:val="22"/>
+              </w:rPr>
+              <w:t>TBT</w:t>
+            </w:r>
+          </w:p>
+          <w:p>
+            <w:pPr>
+              <w:rPr>
+                <w:rFonts w:ascii="Arial" w:hAnsi="Arial" w:cs="Arial"/>
+                <w:sz w:val="22"/>
+                <w:szCs w:val="22"/>
+              </w:rPr>
+            </w:pPr>
+            <w:r>
+              <w:rPr>
+                <w:rFonts w:ascii="Arial" w:hAnsi="Arial" w:cs="Arial"/>
+                <w:sz w:val="16"/>
+                <w:szCs w:val="16"/>
+              </w:rPr>
+              <w:t>Total Blocking Time</w:t>
+            </w:r>
+          </w:p>
+        </w:tc>
+        <w:tc>
+          <w:tcPr>
+            <w:tcW w:w="1931" w:type="dxa"/>
+          </w:tcPr>
+          <w:p>
+            <w:pPr>
+              <w:cnfStyle w:val="000000000000" w:firstRow="0" w:lastRow="0" w:firstColumn="0" w:lastColumn="0" w:oddVBand="0" w:evenVBand="0" w:oddHBand="0" w:evenHBand="0" w:firstRowFirstColumn="0" w:firstRowLastColumn="0" w:lastRowFirstColumn="0" w:lastRowLastColumn="0"/>
+              <w:rPr>
+                <w:rFonts w:ascii="Arial" w:hAnsi="Arial" w:cs="Arial"/>
+                <w:sz w:val="22"/>
+                <w:szCs w:val="22"/>
+              </w:rPr>
+            </w:pPr>
+            <w:r>
+              <w:rPr>
+                <w:rFonts w:ascii="Arial" w:hAnsi="Arial" w:cs="Arial"/>
+                <w:sz w:val="22"/>
+                <w:szCs w:val="22"/>
+              </w:rPr>
+              <w:t>Tiempo total en que el hilo principal está bloqueado</w:t>
+            </w:r>
+          </w:p>
+        </w:tc>
+        <w:tc>
+          <w:tcPr>
+            <w:tcW w:w="1743" w:type="dxa"/>
+          </w:tcPr>
+          <w:p>
+            <w:pPr>
+              <w:cnfStyle w:val="000000000000" w:firstRow="0" w:lastRow="0" w:firstColumn="0" w:lastColumn="0" w:oddVBand="0" w:evenVBand="0" w:oddHBand="0" w:evenHBand="0" w:firstRowFirstColumn="0" w:firstRowLastColumn="0" w:lastRowFirstColumn="0" w:lastRowLastColumn="0"/>
+              <w:rPr>
+                <w:rFonts w:ascii="Arial" w:hAnsi="Arial" w:cs="Arial"/>
+                <w:sz w:val="22"/>
+                <w:szCs w:val="22"/>
+              </w:rPr>
+            </w:pPr>
+            <w:r>
+              <w:rPr>
+                <w:rFonts w:ascii="Arial" w:hAnsi="Arial" w:cs="Arial"/>
+                <w:sz w:val="22"/>
+                <w:szCs w:val="22"/>
+              </w:rPr>
+              <w:t>Suplementaria</w:t>
+            </w:r>
+          </w:p>
+        </w:tc>
+        <w:tc>
+          <w:tcPr>
+            <w:tcW w:w="1285" w:type="dxa"/>
+          </w:tcPr>
+          <w:p>
+            <w:pPr>
+              <w:cnfStyle w:val="000000000000" w:firstRow="0" w:lastRow="0" w:firstColumn="0" w:lastColumn="0" w:oddVBand="0" w:evenVBand="0" w:oddHBand="0" w:evenHBand="0" w:firstRowFirstColumn="0" w:firstRowLastColumn="0" w:lastRowFirstColumn="0" w:lastRowLastColumn="0"/>
+              <w:rPr>
+                <w:rFonts w:ascii="Arial" w:hAnsi="Arial" w:cs="Arial"/>
+                <w:sz w:val="22"/>
+                <w:szCs w:val="22"/>
+              </w:rPr>
+            </w:pPr>
+            <w:r>
+              <w:rPr>
+                <w:rFonts w:ascii="Arial" w:hAnsi="Arial" w:cs="Arial"/>
+                <w:sz w:val="22"/>
+                <w:szCs w:val="22"/>
+              </w:rPr>
+              <w:t>≤ 200 ms</w:t>
+            </w:r>
+          </w:p>
+        </w:tc>
+        <w:tc>
+          <w:tcPr>
+            <w:tcW w:w="1672" w:type="dxa"/>
+          </w:tcPr>
+          <w:p>
+            <w:pPr>
+              <w:cnfStyle w:val="000000000000" w:firstRow="0" w:lastRow="0" w:firstColumn="0" w:lastColumn="0" w:oddVBand="0" w:evenVBand="0" w:oddHBand="0" w:evenHBand="0" w:firstRowFirstColumn="0" w:firstRowLastColumn="0" w:lastRowFirstColumn="0" w:lastRowLastColumn="0"/>
+              <w:rPr>
+                <w:rFonts w:ascii="Arial" w:hAnsi="Arial" w:cs="Arial"/>
+                <w:sz w:val="22"/>
+                <w:szCs w:val="22"/>
+              </w:rPr>
+            </w:pPr>
+            <w:r>
+              <w:rPr>
+                <w:rFonts w:ascii="Arial" w:hAnsi="Arial" w:cs="Arial"/>
+                <w:sz w:val="22"/>
+                <w:szCs w:val="22"/>
+              </w:rPr>
+              <w:t>No (correlaciona con INP)</w:t>
+            </w:r>
+          </w:p>
+        </w:tc>
+        <w:tc>
+          <w:tcPr>
+            <w:tcW w:w="688" w:type="dxa"/>
+          </w:tcPr>
+          <w:p>
+            <w:pPr>
+              <w:cnfStyle w:val="000000000000" w:firstRow="0" w:lastRow="0" w:firstColumn="0" w:lastColumn="0" w:oddVBand="0" w:evenVBand="0" w:oddHBand="0" w:evenHBand="0" w:firstRowFirstColumn="0" w:firstRowLastColumn="0" w:lastRowFirstColumn="0" w:lastRowLastColumn="0"/>
+              <w:rPr>
+                <w:rFonts w:ascii="Arial" w:hAnsi="Arial" w:cs="Arial"/>
+                <w:sz w:val="22"/>
+                <w:szCs w:val="22"/>
+              </w:rPr>
+            </w:pPr>
+            <w:r>
+              <w:rPr>
+                <w:rFonts w:ascii="Arial" w:hAnsi="Arial" w:cs="Arial"/>
+                <w:sz w:val="22"/>
+                <w:szCs w:val="22"/>
+              </w:rPr>
+              <w:t xml:space="preserve">Solo </w:t>
+            </w:r>
+            <w:proofErr w:type="spellStart"/>
+            <w:r>
+              <w:rPr>
+                <w:rFonts w:ascii="Arial" w:hAnsi="Arial" w:cs="Arial"/>
+                <w:sz w:val="22"/>
+                <w:szCs w:val="22"/>
+              </w:rPr>
+              <w:t>lab</w:t>
+            </w:r>
+            <w:proofErr w:type="spellEnd"/>
+          </w:p>
+        </w:tc>
+      </w:tr>
+    </w:tbl>
+    <w:p>
+      <w:pPr>
+        <w:rPr>
+          <w:rFonts w:ascii="Arial" w:hAnsi="Arial" w:cs="Arial"/>
+          <w:sz w:val="18"/>
+          <w:szCs w:val="18"/>
+        </w:rPr>
+      </w:pPr>
+      <w:r>
+        <w:rPr>
+          <w:rFonts w:ascii="Arial" w:hAnsi="Arial" w:cs="Arial"/>
+          <w:i/>
+          <w:iCs/>
+          <w:sz w:val="18"/>
+          <w:szCs w:val="18"/>
+          <w:lang w:val="en-US"/>
+        </w:rPr>
+        <w:t>Nota.</w:t>
+      </w:r>
+      <w:r>
+        <w:rPr>
+          <w:rFonts w:ascii="Arial" w:hAnsi="Arial" w:cs="Arial"/>
+          <w:sz w:val="18"/>
+          <w:szCs w:val="18"/>
+          <w:lang w:val="en-US"/>
+        </w:rPr>
+        <w:t xml:space="preserve"> </w:t>
+      </w:r>
+      <w:proofErr w:type="spellStart"/>
+      <w:r>
+        <w:rPr>
+          <w:rFonts w:ascii="Arial" w:hAnsi="Arial" w:cs="Arial"/>
+          <w:sz w:val="18"/>
+          <w:szCs w:val="18"/>
+          <w:lang w:val="en-US"/>
+        </w:rPr>
+        <w:t>Adaptado</w:t>
+      </w:r>
+      <w:proofErr w:type="spellEnd"/>
+      <w:r>
+        <w:rPr>
+          <w:rFonts w:ascii="Arial" w:hAnsi="Arial" w:cs="Arial"/>
+          <w:sz w:val="18"/>
+          <w:szCs w:val="18"/>
+          <w:lang w:val="en-US"/>
+        </w:rPr>
+        <w:t xml:space="preserve"> de Web Vitals, de Google (2024) (https://web.dev/articles/vitals), y de Understanding Core Web Vitals and Google search results, de Google Search Central (2025) (https://developers.google.com/search/docs/appearance/core-web-vitals). CWV = Core Web Vitals; LCP = Largest Contentful Paint; INP = Interaction to Next Paint; CLS = Cumulative Layout Shift; FID = First Input Delay; FCP = First Contentful Paint; TTFB = Time to First Byte; TTI = Time to Interactive; TBT = Total Blocking Time. </w:t>
+      </w:r>
+      <w:proofErr w:type="spellStart"/>
+      <w:r>
+        <w:rPr>
+          <w:rFonts w:ascii="Arial" w:hAnsi="Arial" w:cs="Arial"/>
+          <w:sz w:val="18"/>
+          <w:szCs w:val="18"/>
+          <w:lang w:val="en-US"/>
+        </w:rPr>
+        <w:t>ms</w:t>
+      </w:r>
+      <w:proofErr w:type="spellEnd"/>
+      <w:r>
+        <w:rPr>
+          <w:rFonts w:ascii="Arial" w:hAnsi="Arial" w:cs="Arial"/>
+          <w:sz w:val="18"/>
+          <w:szCs w:val="18"/>
+          <w:lang w:val="en-US"/>
+        </w:rPr>
+        <w:t xml:space="preserve"> = </w:t>
+      </w:r>
+      <w:proofErr w:type="spellStart"/>
+      <w:r>
+        <w:rPr>
+          <w:rFonts w:ascii="Arial" w:hAnsi="Arial" w:cs="Arial"/>
+          <w:sz w:val="18"/>
+          <w:szCs w:val="18"/>
+          <w:lang w:val="en-US"/>
+        </w:rPr>
+        <w:t>milisegundos</w:t>
+      </w:r>
+      <w:proofErr w:type="spellEnd"/>
+      <w:r>
+        <w:rPr>
+          <w:rFonts w:ascii="Arial" w:hAnsi="Arial" w:cs="Arial"/>
+          <w:sz w:val="18"/>
+          <w:szCs w:val="18"/>
+          <w:lang w:val="en-US"/>
+        </w:rPr>
+        <w:t xml:space="preserve">; s = </w:t>
+      </w:r>
+      <w:proofErr w:type="spellStart"/>
+      <w:r>
+        <w:rPr>
+          <w:rFonts w:ascii="Arial" w:hAnsi="Arial" w:cs="Arial"/>
+          <w:sz w:val="18"/>
+          <w:szCs w:val="18"/>
+          <w:lang w:val="en-US"/>
+        </w:rPr>
+        <w:t>segundos</w:t>
+      </w:r>
+      <w:proofErr w:type="spellEnd"/>
+      <w:r>
+        <w:rPr>
+          <w:rFonts w:ascii="Arial" w:hAnsi="Arial" w:cs="Arial"/>
+          <w:sz w:val="18"/>
+          <w:szCs w:val="18"/>
+          <w:lang w:val="en-US"/>
+        </w:rPr>
+        <w:t xml:space="preserve">. </w:t>
+      </w:r>
+      <w:r>
+        <w:rPr>
+          <w:rFonts w:ascii="Arial" w:hAnsi="Arial" w:cs="Arial"/>
+          <w:sz w:val="18"/>
+          <w:szCs w:val="18"/>
+        </w:rPr>
+        <w:t>El umbral corresponde al percentil 75 de cargas de página según datos de campo de Chrome (</w:t>
+      </w:r>
+      <w:proofErr w:type="spellStart"/>
+      <w:r>
+        <w:rPr>
+          <w:rFonts w:ascii="Arial" w:hAnsi="Arial" w:cs="Arial"/>
+          <w:sz w:val="18"/>
+          <w:szCs w:val="18"/>
+        </w:rPr>
+        <w:t>CrUX</w:t>
+      </w:r>
+      <w:proofErr w:type="spellEnd"/>
+      <w:r>
+        <w:rPr>
+          <w:rFonts w:ascii="Arial" w:hAnsi="Arial" w:cs="Arial"/>
+          <w:sz w:val="18"/>
+          <w:szCs w:val="18"/>
+        </w:rPr>
+        <w:t>). INP reemplazó a FID como métrica oficial de Core Web Vitals en marzo de 2024.</w:t>
+      </w:r>
+    </w:p>
+    <w:p>
+      <w:pPr>
+        <w:rPr>
+          <w:rFonts w:ascii="Arial" w:hAnsi="Arial" w:cs="Arial"/>
+          <w:sz w:val="22"/>
+          <w:szCs w:val="22"/>
+        </w:rPr>
+      </w:pPr>
     </w:p>
     <w:p>
       <w:pPr>
@@ -1498,7 +4047,6 @@
           <w:sz w:val="22"/>
           <w:szCs w:val="22"/>
         </w:rPr>
-        <w:lastRenderedPageBreak/>
         <w:br w:type="page"/>
       </w:r>
     </w:p>
@@ -1845,6 +4393,132 @@
 <file path=word/numbering.xml><?xml version="1.0" encoding="utf-8"?>
 <w:numbering xmlns:wpc="http://schemas.microsoft.com/office/word/2010/wordprocessingCanvas" xmlns:cx="http://schemas.microsoft.com/office/drawing/2014/chartex" xmlns:cx1="http://schemas.microsoft.com/office/drawing/2015/9/8/chartex" xmlns:cx2="http://schemas.microsoft.com/office/drawing/2015/10/21/chartex" xmlns:cx3="http://schemas.microsoft.com/office/drawing/2016/5/9/chartex" xmlns:cx4="http://schemas.microsoft.com/office/drawing/2016/5/10/chartex" xmlns:cx5="http://schemas.microsoft.com/office/drawing/2016/5/11/chartex" xmlns:cx6="http://schemas.microsoft.com/office/drawing/2016/5/12/chartex" xmlns:cx7="http://schemas.microsoft.com/office/drawing/2016/5/13/chartex" xmlns:cx8="http://schemas.microsoft.com/office/drawing/2016/5/14/chartex" xmlns:mc="http://schemas.openxmlformats.org/markup-compatibility/2006" xmlns:aink="http://schemas.microsoft.com/office/drawing/2016/ink" xmlns:am3d="http://schemas.microsoft.com/office/drawing/2017/model3d" xmlns:o="urn:schemas-microsoft-com:office:office" xmlns:oel="http://schemas.microsoft.com/office/2019/extlst" xmlns:r="http://schemas.openxmlformats.org/officeDocument/2006/relationships" xmlns:m="http://schemas.openxmlformats.org/officeDocument/2006/math" xmlns:v="urn:schemas-microsoft-com:vml" xmlns:wp14="http://schemas.microsoft.com/office/word/2010/wordprocessingDrawing" xmlns:wp="http://schemas.openxmlformats.org/drawingml/2006/wordprocessingDrawing" xmlns:w10="urn:schemas-microsoft-com:office:word" xmlns:w="http://schemas.openxmlformats.org/wordprocessingml/2006/main" xmlns:w14="http://schemas.microsoft.com/office/word/2010/wordml" xmlns:w15="http://schemas.microsoft.com/office/word/2012/wordml" xmlns:w16cex="http://schemas.microsoft.com/office/word/2018/wordml/cex" xmlns:w16cid="http://schemas.microsoft.com/office/word/2016/wordml/cid" xmlns:w16="http://schemas.microsoft.com/office/word/2018/wordml" xmlns:w16du="http://schemas.microsoft.com/office/word/2023/wordml/word16du" xmlns:w16sdtdh="http://schemas.microsoft.com/office/word/2020/wordml/sdtdatahash" xmlns:w16sdtfl="http://schemas.microsoft.com/office/word/2024/wordml/sdtformatlock" xmlns:w16se="http://schemas.microsoft.com/office/word/2015/wordml/symex" xmlns:wpg="http://schemas.microsoft.com/office/word/2010/wordprocessingGroup" xmlns:wpi="http://schemas.microsoft.com/office/word/2010/wordprocessingInk" xmlns:wne="http://schemas.microsoft.com/office/word/2006/wordml" xmlns:wps="http://schemas.microsoft.com/office/word/2010/wordprocessingShape" mc:Ignorable="w14 w15 w16se w16cid w16 w16cex w16sdtdh w16sdtfl w16du wp14">
   <w:abstractNum w:abstractNumId="0" w15:restartNumberingAfterBreak="0">
+    <w:nsid w:val="40A12C7B"/>
+    <w:multiLevelType w:val="multilevel"/>
+    <w:tmpl w:val="C7BCEF48"/>
+    <w:lvl w:ilvl="0">
+      <w:start w:val="1"/>
+      <w:numFmt w:val="decimal"/>
+      <w:lvlText w:val="%1."/>
+      <w:lvlJc w:val="left"/>
+      <w:pPr>
+        <w:ind w:left="720" w:hanging="360"/>
+      </w:pPr>
+    </w:lvl>
+    <w:lvl w:ilvl="1">
+      <w:start w:val="3"/>
+      <w:numFmt w:val="decimal"/>
+      <w:isLgl/>
+      <w:lvlText w:val="%1.%2"/>
+      <w:lvlJc w:val="left"/>
+      <w:pPr>
+        <w:ind w:left="720" w:hanging="360"/>
+      </w:pPr>
+      <w:rPr>
+        <w:rFonts w:hint="default"/>
+        <w:b/>
+      </w:rPr>
+    </w:lvl>
+    <w:lvl w:ilvl="2">
+      <w:start w:val="1"/>
+      <w:numFmt w:val="decimal"/>
+      <w:isLgl/>
+      <w:lvlText w:val="%1.%2.%3"/>
+      <w:lvlJc w:val="left"/>
+      <w:pPr>
+        <w:ind w:left="1080" w:hanging="720"/>
+      </w:pPr>
+      <w:rPr>
+        <w:rFonts w:hint="default"/>
+        <w:b/>
+      </w:rPr>
+    </w:lvl>
+    <w:lvl w:ilvl="3">
+      <w:start w:val="1"/>
+      <w:numFmt w:val="decimal"/>
+      <w:isLgl/>
+      <w:lvlText w:val="%1.%2.%3.%4"/>
+      <w:lvlJc w:val="left"/>
+      <w:pPr>
+        <w:ind w:left="1080" w:hanging="720"/>
+      </w:pPr>
+      <w:rPr>
+        <w:rFonts w:hint="default"/>
+        <w:b/>
+      </w:rPr>
+    </w:lvl>
+    <w:lvl w:ilvl="4">
+      <w:start w:val="1"/>
+      <w:numFmt w:val="decimal"/>
+      <w:isLgl/>
+      <w:lvlText w:val="%1.%2.%3.%4.%5"/>
+      <w:lvlJc w:val="left"/>
+      <w:pPr>
+        <w:ind w:left="1440" w:hanging="1080"/>
+      </w:pPr>
+      <w:rPr>
+        <w:rFonts w:hint="default"/>
+        <w:b/>
+      </w:rPr>
+    </w:lvl>
+    <w:lvl w:ilvl="5">
+      <w:start w:val="1"/>
+      <w:numFmt w:val="decimal"/>
+      <w:isLgl/>
+      <w:lvlText w:val="%1.%2.%3.%4.%5.%6"/>
+      <w:lvlJc w:val="left"/>
+      <w:pPr>
+        <w:ind w:left="1440" w:hanging="1080"/>
+      </w:pPr>
+      <w:rPr>
+        <w:rFonts w:hint="default"/>
+        <w:b/>
+      </w:rPr>
+    </w:lvl>
+    <w:lvl w:ilvl="6">
+      <w:start w:val="1"/>
+      <w:numFmt w:val="decimal"/>
+      <w:isLgl/>
+      <w:lvlText w:val="%1.%2.%3.%4.%5.%6.%7"/>
+      <w:lvlJc w:val="left"/>
+      <w:pPr>
+        <w:ind w:left="1800" w:hanging="1440"/>
+      </w:pPr>
+      <w:rPr>
+        <w:rFonts w:hint="default"/>
+        <w:b/>
+      </w:rPr>
+    </w:lvl>
+    <w:lvl w:ilvl="7">
+      <w:start w:val="1"/>
+      <w:numFmt w:val="decimal"/>
+      <w:isLgl/>
+      <w:lvlText w:val="%1.%2.%3.%4.%5.%6.%7.%8"/>
+      <w:lvlJc w:val="left"/>
+      <w:pPr>
+        <w:ind w:left="1800" w:hanging="1440"/>
+      </w:pPr>
+      <w:rPr>
+        <w:rFonts w:hint="default"/>
+        <w:b/>
+      </w:rPr>
+    </w:lvl>
+    <w:lvl w:ilvl="8">
+      <w:start w:val="1"/>
+      <w:numFmt w:val="decimal"/>
+      <w:isLgl/>
+      <w:lvlText w:val="%1.%2.%3.%4.%5.%6.%7.%8.%9"/>
+      <w:lvlJc w:val="left"/>
+      <w:pPr>
+        <w:ind w:left="2160" w:hanging="1800"/>
+      </w:pPr>
+      <w:rPr>
+        <w:rFonts w:hint="default"/>
+        <w:b/>
+      </w:rPr>
+    </w:lvl>
+  </w:abstractNum>
+  <w:abstractNum w:abstractNumId="1" w15:restartNumberingAfterBreak="0">
     <w:nsid w:val="7CD54309"/>
     <w:multiLevelType w:val="hybridMultilevel"/>
     <w:tmpl w:val="D81C5DE8"/>
@@ -1934,6 +4608,9 @@
     </w:lvl>
   </w:abstractNum>
   <w:num w:numId="1" w16cid:durableId="852376502">
+    <w:abstractNumId w:val="1"/>
+  </w:num>
+  <w:num w:numId="2" w16cid:durableId="1497527481">
     <w:abstractNumId w:val="0"/>
   </w:num>
 </w:numbering>
@@ -2941,6 +5618,93 @@
     <w:uiPriority w:val="99"/>
     <w:rsid w:val="00094811"/>
   </w:style>
+  <w:style w:type="table" w:styleId="Tablaconcuadrcula">
+    <w:name w:val="Table Grid"/>
+    <w:basedOn w:val="Tablanormal"/>
+    <w:uiPriority w:val="39"/>
+    <w:rsid w:val="002D6125"/>
+    <w:pPr>
+      <w:spacing w:after="0" w:line="240" w:lineRule="auto"/>
+    </w:pPr>
+    <w:tblPr>
+      <w:tblBorders>
+        <w:top w:val="single" w:sz="4" w:space="0" w:color="auto"/>
+        <w:left w:val="single" w:sz="4" w:space="0" w:color="auto"/>
+        <w:bottom w:val="single" w:sz="4" w:space="0" w:color="auto"/>
+        <w:right w:val="single" w:sz="4" w:space="0" w:color="auto"/>
+        <w:insideH w:val="single" w:sz="4" w:space="0" w:color="auto"/>
+        <w:insideV w:val="single" w:sz="4" w:space="0" w:color="auto"/>
+      </w:tblBorders>
+    </w:tblPr>
+  </w:style>
+  <w:style w:type="table" w:styleId="Tabladelista6concolores">
+    <w:name w:val="List Table 6 Colorful"/>
+    <w:basedOn w:val="Tablanormal"/>
+    <w:uiPriority w:val="51"/>
+    <w:rsid w:val="004C4207"/>
+    <w:pPr>
+      <w:spacing w:after="0" w:line="240" w:lineRule="auto"/>
+    </w:pPr>
+    <w:rPr>
+      <w:color w:val="000000" w:themeColor="text1"/>
+    </w:rPr>
+    <w:tblPr>
+      <w:tblStyleRowBandSize w:val="1"/>
+      <w:tblStyleColBandSize w:val="1"/>
+      <w:tblBorders>
+        <w:top w:val="single" w:sz="4" w:space="0" w:color="000000" w:themeColor="text1"/>
+        <w:bottom w:val="single" w:sz="4" w:space="0" w:color="000000" w:themeColor="text1"/>
+      </w:tblBorders>
+    </w:tblPr>
+    <w:tblStylePr w:type="firstRow">
+      <w:rPr>
+        <w:b/>
+        <w:bCs/>
+      </w:rPr>
+      <w:tblPr/>
+      <w:tcPr>
+        <w:tcBorders>
+          <w:bottom w:val="single" w:sz="4" w:space="0" w:color="000000" w:themeColor="text1"/>
+        </w:tcBorders>
+      </w:tcPr>
+    </w:tblStylePr>
+    <w:tblStylePr w:type="lastRow">
+      <w:rPr>
+        <w:b/>
+        <w:bCs/>
+      </w:rPr>
+      <w:tblPr/>
+      <w:tcPr>
+        <w:tcBorders>
+          <w:top w:val="double" w:sz="4" w:space="0" w:color="000000" w:themeColor="text1"/>
+        </w:tcBorders>
+      </w:tcPr>
+    </w:tblStylePr>
+    <w:tblStylePr w:type="firstCol">
+      <w:rPr>
+        <w:b/>
+        <w:bCs/>
+      </w:rPr>
+    </w:tblStylePr>
+    <w:tblStylePr w:type="lastCol">
+      <w:rPr>
+        <w:b/>
+        <w:bCs/>
+      </w:rPr>
+    </w:tblStylePr>
+    <w:tblStylePr w:type="band1Vert">
+      <w:tblPr/>
+      <w:tcPr>
+        <w:shd w:val="clear" w:color="auto" w:fill="CCCCCC" w:themeFill="text1" w:themeFillTint="33"/>
+      </w:tcPr>
+    </w:tblStylePr>
+    <w:tblStylePr w:type="band1Horz">
+      <w:tblPr/>
+      <w:tcPr>
+        <w:shd w:val="clear" w:color="auto" w:fill="CCCCCC" w:themeFill="text1" w:themeFillTint="33"/>
+      </w:tcPr>
+    </w:tblStylePr>
+  </w:style>
 </w:styles>
 </file>
 
@@ -3282,13 +6046,176 @@
     <b:Month>Marzo</b:Month>
     <b:Day>3</b:Day>
     <b:URL>https://www.corewebvitals.io/es/core-web-vitals</b:URL>
+    <b:RefOrder>5</b:RefOrder>
+  </b:Source>
+  <b:Source>
+    <b:Tag>Mar16</b:Tag>
+    <b:SourceType>InternetSite</b:SourceType>
+    <b:Guid>{B8DC5F9F-2E30-468B-878C-B4C2BC3BB037}</b:Guid>
+    <b:Author>
+      <b:Author>
+        <b:NameList>
+          <b:Person>
+            <b:Last>Cohen</b:Last>
+            <b:First>Marc</b:First>
+          </b:Person>
+        </b:NameList>
+      </b:Author>
+    </b:Author>
+    <b:InternetSiteTitle>developer.chrome.com/</b:InternetSiteTitle>
+    <b:Year>2016</b:Year>
+    <b:Month>06</b:Month>
+    <b:Day>08</b:Day>
+    <b:URL>https://developer.chrome.com/blog/performance-observer?hl=es-419</b:URL>
+    <b:RefOrder>6</b:RefOrder>
+  </b:Source>
+  <b:Source>
+    <b:Tag>Mmd</b:Tag>
+    <b:SourceType>InternetSite</b:SourceType>
+    <b:Guid>{ADE736B8-6FF2-40C6-8700-D389A5F09EB5}</b:Guid>
+    <b:Author>
+      <b:Author>
+        <b:Corporate>Mmdn_</b:Corporate>
+      </b:Author>
+    </b:Author>
+    <b:Title>PerformanceObserver</b:Title>
+    <b:URL>https://developer.mozilla.org/en-US/docs/Web/API/PerformanceObserver</b:URL>
+    <b:RefOrder>7</b:RefOrder>
+  </b:Source>
+  <b:Source>
+    <b:Tag>Raj21</b:Tag>
+    <b:SourceType>InternetSite</b:SourceType>
+    <b:Guid>{55EC87B7-F335-4D13-8BB0-49B5083D4C51}</b:Guid>
+    <b:Author>
+      <b:Author>
+        <b:NameList>
+          <b:Person>
+            <b:Last>Rajpal</b:Last>
+            <b:First>Saurabh</b:First>
+          </b:Person>
+          <b:Person>
+            <b:Last>Gopalakrishnan</b:Last>
+            <b:First>Swetha</b:First>
+          </b:Person>
+        </b:NameList>
+      </b:Author>
+    </b:Author>
+    <b:Year>2021</b:Year>
+    <b:Month>09</b:Month>
+    <b:Day>01</b:Day>
+    <b:URL>https://web.dev/case-studies/vitals-business-impact?hl=es-419</b:URL>
+    <b:RefOrder>8</b:RefOrder>
+  </b:Source>
+  <b:Source>
+    <b:Tag>sit</b:Tag>
+    <b:SourceType>InternetSite</b:SourceType>
+    <b:Guid>{FF5A147A-AE42-4212-A85C-1158F5B600B8}</b:Guid>
+    <b:Author>
+      <b:Author>
+        <b:Corporate>sitecare</b:Corporate>
+      </b:Author>
+    </b:Author>
+    <b:InternetSiteTitle>sitecare.com</b:InternetSiteTitle>
+    <b:URL>https://sitecare.com/case-studies/core-web-vitals-zero-to-three/</b:URL>
+    <b:RefOrder>9</b:RefOrder>
+  </b:Source>
+  <b:Source>
+    <b:Tag>Goo25</b:Tag>
+    <b:SourceType>InternetSite</b:SourceType>
+    <b:Guid>{A573B47C-AF2A-445D-B1D7-986863B9BEE6}</b:Guid>
+    <b:Author>
+      <b:Author>
+        <b:Corporate>Google</b:Corporate>
+      </b:Author>
+    </b:Author>
+    <b:Title>google.com</b:Title>
+    <b:InternetSiteTitle>google.com</b:InternetSiteTitle>
+    <b:Year>2025</b:Year>
+    <b:Month>12</b:Month>
+    <b:Day>18</b:Day>
+    <b:URL>https://developers.google.com/search/docs/appearance/core-web-vitals?hl=es-419#metrics</b:URL>
+    <b:RefOrder>10</b:RefOrder>
+  </b:Source>
+  <b:Source>
+    <b:Tag>Wal19</b:Tag>
+    <b:SourceType>InternetSite</b:SourceType>
+    <b:Guid>{E13E05DC-34EC-408B-AC59-AB02983C4EBA}</b:Guid>
+    <b:Year>2019</b:Year>
+    <b:Month>8</b:Month>
+    <b:Day>8</b:Day>
+    <b:URL>https://web.dev/articles/lcp?hl=es-419</b:URL>
+    <b:Author>
+      <b:Author>
+        <b:NameList>
+          <b:Person>
+            <b:Last>Walton</b:Last>
+            <b:First>Philip</b:First>
+          </b:Person>
+          <b:Person>
+            <b:Last>Pollard</b:Last>
+            <b:First>Barry</b:First>
+          </b:Person>
+        </b:NameList>
+      </b:Author>
+    </b:Author>
+    <b:InternetSiteTitle>Largest Contentful Paint (LCP)</b:InternetSiteTitle>
     <b:RefOrder>2</b:RefOrder>
+  </b:Source>
+  <b:Source>
+    <b:Tag>Wag22</b:Tag>
+    <b:SourceType>InternetSite</b:SourceType>
+    <b:Guid>{136E6C37-2B82-4B3E-BA0A-CF57952C5BCA}</b:Guid>
+    <b:InternetSiteTitle>Interaction to Next Paint (INP)</b:InternetSiteTitle>
+    <b:Year>2022</b:Year>
+    <b:Month>4</b:Month>
+    <b:Day>6</b:Day>
+    <b:URL>https://web.dev/articles/inp?hl=es-419</b:URL>
+    <b:Author>
+      <b:Author>
+        <b:NameList>
+          <b:Person>
+            <b:Last>Wagner</b:Last>
+            <b:First>Jeremy</b:First>
+          </b:Person>
+          <b:Person>
+            <b:Last>Pollard</b:Last>
+            <b:First>Barry</b:First>
+          </b:Person>
+        </b:NameList>
+      </b:Author>
+    </b:Author>
+    <b:RefOrder>3</b:RefOrder>
+  </b:Source>
+  <b:Source>
+    <b:Tag>Mih23</b:Tag>
+    <b:SourceType>InternetSite</b:SourceType>
+    <b:Guid>{CDE4100E-B2D8-4E7B-A0AD-1039E4C75E6F}</b:Guid>
+    <b:InternetSiteTitle>Cumulative Layout Shift (CLS)</b:InternetSiteTitle>
+    <b:Year>2023</b:Year>
+    <b:Month>04</b:Month>
+    <b:Day>12</b:Day>
+    <b:URL>https://web.dev/articles/cls?hl=es-419</b:URL>
+    <b:Author>
+      <b:Author>
+        <b:NameList>
+          <b:Person>
+            <b:Last>Mihajlija</b:Last>
+            <b:First>Milica</b:First>
+          </b:Person>
+          <b:Person>
+            <b:Last>Walton</b:Last>
+            <b:First>Philip</b:First>
+          </b:Person>
+        </b:NameList>
+      </b:Author>
+    </b:Author>
+    <b:RefOrder>4</b:RefOrder>
   </b:Source>
 </b:Sources>
 </file>
 
 <file path=customXml/itemProps1.xml><?xml version="1.0" encoding="utf-8"?>
-<ds:datastoreItem xmlns:ds="http://schemas.openxmlformats.org/officeDocument/2006/customXml" ds:itemID="{64A738CF-7088-4596-A4BA-117DE70E06F1}">
+<ds:datastoreItem xmlns:ds="http://schemas.openxmlformats.org/officeDocument/2006/customXml" ds:itemID="{AEEC8DDD-3B28-442A-B016-A8A255DEB194}">
   <ds:schemaRefs>
     <ds:schemaRef ds:uri="http://schemas.openxmlformats.org/officeDocument/2006/bibliography"/>
   </ds:schemaRefs>

</xml_diff>

<commit_message>
Modificaciones APA7 al documento y finialización de la informacion general.
</commit_message>
<xml_diff>
--- a/Investigacion-CoreWebVitals.docx
+++ b/Investigacion-CoreWebVitals.docx
@@ -489,15 +489,23 @@
     </w:p>
     <w:p>
       <w:pPr>
-        <w:rPr>
-          <w:rFonts w:ascii="Arial" w:hAnsi="Arial" w:cs="Arial"/>
-          <w:sz w:val="22"/>
-          <w:szCs w:val="22"/>
-        </w:rPr>
-      </w:pPr>
-      <w:r>
-        <w:rPr>
-          <w:rFonts w:ascii="Arial" w:hAnsi="Arial" w:cs="Arial"/>
+        <w:pStyle w:val="Ttulo1"/>
+        <w:jc w:val="center"/>
+        <w:rPr>
+          <w:rFonts w:ascii="Arial" w:hAnsi="Arial" w:cs="Arial"/>
+          <w:b/>
+          <w:bCs/>
+          <w:color w:val="auto"/>
+          <w:sz w:val="22"/>
+          <w:szCs w:val="22"/>
+        </w:rPr>
+      </w:pPr>
+      <w:r>
+        <w:rPr>
+          <w:rFonts w:ascii="Arial" w:hAnsi="Arial" w:cs="Arial"/>
+          <w:b/>
+          <w:bCs/>
+          <w:color w:val="auto"/>
           <w:sz w:val="22"/>
           <w:szCs w:val="22"/>
         </w:rPr>
@@ -623,15 +631,23 @@
     </w:p>
     <w:p>
       <w:pPr>
-        <w:rPr>
-          <w:rFonts w:ascii="Arial" w:hAnsi="Arial" w:cs="Arial"/>
-          <w:sz w:val="22"/>
-          <w:szCs w:val="22"/>
-        </w:rPr>
-      </w:pPr>
-      <w:r>
-        <w:rPr>
-          <w:rFonts w:ascii="Arial" w:hAnsi="Arial" w:cs="Arial"/>
+        <w:pStyle w:val="Ttulo1"/>
+        <w:jc w:val="center"/>
+        <w:rPr>
+          <w:rFonts w:ascii="Arial" w:hAnsi="Arial" w:cs="Arial"/>
+          <w:b/>
+          <w:bCs/>
+          <w:color w:val="auto"/>
+          <w:sz w:val="22"/>
+          <w:szCs w:val="22"/>
+        </w:rPr>
+      </w:pPr>
+      <w:r>
+        <w:rPr>
+          <w:rFonts w:ascii="Arial" w:hAnsi="Arial" w:cs="Arial"/>
+          <w:b/>
+          <w:bCs/>
+          <w:color w:val="auto"/>
           <w:sz w:val="22"/>
           <w:szCs w:val="22"/>
         </w:rPr>
@@ -641,86 +657,44 @@
     </w:p>
     <w:p>
       <w:pPr>
-        <w:rPr>
-          <w:rFonts w:ascii="Arial" w:hAnsi="Arial" w:cs="Arial"/>
-          <w:sz w:val="22"/>
-          <w:szCs w:val="22"/>
-        </w:rPr>
-      </w:pPr>
-      <w:r>
+        <w:pStyle w:val="Ttulo2"/>
         <w:rPr>
           <w:rFonts w:ascii="Arial" w:hAnsi="Arial" w:cs="Arial"/>
           <w:b/>
           <w:bCs/>
-          <w:sz w:val="22"/>
-          <w:szCs w:val="22"/>
-        </w:rPr>
-        <w:t>4.1 Definición técnica</w:t>
-      </w:r>
-      <w:r>
-        <w:rPr>
-          <w:rFonts w:ascii="Arial" w:hAnsi="Arial" w:cs="Arial"/>
-          <w:sz w:val="22"/>
-          <w:szCs w:val="22"/>
-        </w:rPr>
-        <w:t>.</w:t>
-      </w:r>
-    </w:p>
-    <w:p>
-      <w:pPr>
-        <w:rPr>
-          <w:rFonts w:ascii="Arial" w:hAnsi="Arial" w:cs="Arial"/>
-          <w:sz w:val="22"/>
-          <w:szCs w:val="22"/>
-        </w:rPr>
-      </w:pPr>
-      <w:r>
-        <w:rPr>
-          <w:rFonts w:ascii="Arial" w:hAnsi="Arial" w:cs="Arial"/>
-          <w:sz w:val="22"/>
-          <w:szCs w:val="22"/>
-        </w:rPr>
-        <w:t xml:space="preserve">Los </w:t>
-      </w:r>
-      <w:r>
-        <w:rPr>
-          <w:rFonts w:ascii="Arial" w:hAnsi="Arial" w:cs="Arial"/>
-          <w:sz w:val="22"/>
-          <w:szCs w:val="22"/>
-        </w:rPr>
-        <w:t>Core Web Vitals</w:t>
-      </w:r>
-      <w:r>
-        <w:rPr>
-          <w:rFonts w:ascii="Arial" w:hAnsi="Arial" w:cs="Arial"/>
-          <w:sz w:val="22"/>
-          <w:szCs w:val="22"/>
-        </w:rPr>
-        <w:t xml:space="preserve"> son un conjunto de métricas estandarizadas de Google diseñadas para cuantificar la experiencia real del usuario al navegar por una página web. Evalúan tres aspectos </w:t>
-      </w:r>
-      <w:r>
-        <w:rPr>
-          <w:rFonts w:ascii="Arial" w:hAnsi="Arial" w:cs="Arial"/>
-          <w:sz w:val="22"/>
-          <w:szCs w:val="22"/>
-        </w:rPr>
-        <w:t>clave: velocidad de carga, interactividad y estabilidad</w:t>
-      </w:r>
-      <w:r>
-        <w:rPr>
-          <w:rFonts w:ascii="Arial" w:hAnsi="Arial" w:cs="Arial"/>
-          <w:sz w:val="22"/>
-          <w:szCs w:val="22"/>
-        </w:rPr>
-        <w:t xml:space="preserve"> visual</w:t>
-      </w:r>
-      <w:r>
-        <w:rPr>
-          <w:rFonts w:ascii="Arial" w:hAnsi="Arial" w:cs="Arial"/>
-          <w:sz w:val="22"/>
-          <w:szCs w:val="22"/>
-        </w:rPr>
-        <w:t xml:space="preserve">. </w:t>
+          <w:color w:val="auto"/>
+          <w:sz w:val="22"/>
+          <w:szCs w:val="22"/>
+        </w:rPr>
+      </w:pPr>
+      <w:r>
+        <w:rPr>
+          <w:rFonts w:ascii="Arial" w:hAnsi="Arial" w:cs="Arial"/>
+          <w:b/>
+          <w:bCs/>
+          <w:color w:val="auto"/>
+          <w:sz w:val="22"/>
+          <w:szCs w:val="22"/>
+        </w:rPr>
+        <w:t>Definición técnica</w:t>
+      </w:r>
+    </w:p>
+    <w:p>
+      <w:pPr>
+        <w:ind w:firstLine="720"/>
+        <w:rPr>
+          <w:rFonts w:ascii="Arial" w:hAnsi="Arial" w:cs="Arial"/>
+          <w:sz w:val="22"/>
+          <w:szCs w:val="22"/>
+        </w:rPr>
+      </w:pPr>
+      <w:r>
+        <w:rPr>
+          <w:rFonts w:ascii="Arial" w:hAnsi="Arial" w:cs="Arial"/>
+          <w:sz w:val="22"/>
+          <w:szCs w:val="22"/>
+        </w:rPr>
+        <w:t xml:space="preserve">Los Core Web Vitals son un conjunto de métricas estandarizadas de Google diseñadas para cuantificar la experiencia real del usuario al navegar por una página web. Evalúan tres aspectos clave: velocidad de carga, interactividad y estabilidad visual. </w:t>
       </w:r>
       <w:sdt>
         <w:sdtPr>
@@ -765,7 +739,7 @@
               <w:sz w:val="22"/>
               <w:szCs w:val="22"/>
             </w:rPr>
-            <w:t>(Walton, 2020)</w:t>
+            <w:t>(Walton, https://web.dev/, 2020)</w:t>
           </w:r>
           <w:r>
             <w:rPr>
@@ -780,6 +754,7 @@
     </w:p>
     <w:p>
       <w:pPr>
+        <w:ind w:firstLine="720"/>
         <w:rPr>
           <w:rFonts w:ascii="Arial" w:hAnsi="Arial" w:cs="Arial"/>
           <w:sz w:val="22"/>
@@ -797,27 +772,20 @@
     </w:p>
     <w:p>
       <w:pPr>
-        <w:rPr>
-          <w:rFonts w:ascii="Arial" w:hAnsi="Arial" w:cs="Arial"/>
-          <w:sz w:val="22"/>
-          <w:szCs w:val="22"/>
-        </w:rPr>
-      </w:pPr>
-      <w:r>
-        <w:rPr>
-          <w:rFonts w:ascii="Arial" w:hAnsi="Arial" w:cs="Arial"/>
-          <w:sz w:val="22"/>
-          <w:szCs w:val="22"/>
-        </w:rPr>
-        <w:t>Se dividen en tres métricas principales y concretas:</w:t>
-      </w:r>
-      <w:r>
-        <w:rPr>
-          <w:rFonts w:ascii="Arial" w:hAnsi="Arial" w:cs="Arial"/>
-          <w:sz w:val="22"/>
-          <w:szCs w:val="22"/>
-        </w:rPr>
-        <w:t xml:space="preserve"> </w:t>
+        <w:ind w:firstLine="720"/>
+        <w:rPr>
+          <w:rFonts w:ascii="Arial" w:hAnsi="Arial" w:cs="Arial"/>
+          <w:sz w:val="22"/>
+          <w:szCs w:val="22"/>
+        </w:rPr>
+      </w:pPr>
+      <w:r>
+        <w:rPr>
+          <w:rFonts w:ascii="Arial" w:hAnsi="Arial" w:cs="Arial"/>
+          <w:sz w:val="22"/>
+          <w:szCs w:val="22"/>
+        </w:rPr>
+        <w:t xml:space="preserve">Se dividen en tres métricas principales y concretas: </w:t>
       </w:r>
     </w:p>
     <w:p>
@@ -859,6 +827,7 @@
           <w:id w:val="343594307"/>
           <w:citation/>
         </w:sdtPr>
+        <w:sdtEndPr/>
         <w:sdtContent>
           <w:r>
             <w:rPr>
@@ -983,6 +952,7 @@
           <w:id w:val="551350750"/>
           <w:citation/>
         </w:sdtPr>
+        <w:sdtEndPr/>
         <w:sdtContent>
           <w:r>
             <w:rPr>
@@ -1089,6 +1059,7 @@
           <w:id w:val="-1348782850"/>
           <w:citation/>
         </w:sdtPr>
+        <w:sdtEndPr/>
         <w:sdtContent>
           <w:r>
             <w:rPr>
@@ -1159,55 +1130,20 @@
     </w:p>
     <w:p>
       <w:pPr>
-        <w:rPr>
-          <w:rFonts w:ascii="Arial" w:hAnsi="Arial" w:cs="Arial"/>
-          <w:sz w:val="22"/>
-          <w:szCs w:val="22"/>
-        </w:rPr>
-      </w:pPr>
-      <w:r>
-        <w:rPr>
-          <w:rFonts w:ascii="Arial" w:hAnsi="Arial" w:cs="Arial"/>
-          <w:sz w:val="22"/>
-          <w:szCs w:val="22"/>
-        </w:rPr>
-        <w:t xml:space="preserve">Para saber si tu sitio cumple con estos estándares y solucionar posibles fallos, puedes medir y analizar tu página utilizando herramientas gratuitas como </w:t>
-      </w:r>
-      <w:proofErr w:type="spellStart"/>
-      <w:r>
-        <w:rPr>
-          <w:rFonts w:ascii="Arial" w:hAnsi="Arial" w:cs="Arial"/>
-          <w:sz w:val="22"/>
-          <w:szCs w:val="22"/>
-        </w:rPr>
-        <w:t>PageSpeed</w:t>
-      </w:r>
-      <w:proofErr w:type="spellEnd"/>
-      <w:r>
-        <w:rPr>
-          <w:rFonts w:ascii="Arial" w:hAnsi="Arial" w:cs="Arial"/>
-          <w:sz w:val="22"/>
-          <w:szCs w:val="22"/>
-        </w:rPr>
-        <w:t xml:space="preserve"> </w:t>
-      </w:r>
-      <w:proofErr w:type="spellStart"/>
-      <w:r>
-        <w:rPr>
-          <w:rFonts w:ascii="Arial" w:hAnsi="Arial" w:cs="Arial"/>
-          <w:sz w:val="22"/>
-          <w:szCs w:val="22"/>
-        </w:rPr>
-        <w:t>Insights</w:t>
-      </w:r>
-      <w:proofErr w:type="spellEnd"/>
-      <w:r>
-        <w:rPr>
-          <w:rFonts w:ascii="Arial" w:hAnsi="Arial" w:cs="Arial"/>
-          <w:sz w:val="22"/>
-          <w:szCs w:val="22"/>
-        </w:rPr>
-        <w:t xml:space="preserve"> o el informe oficial de Google Search Console.</w:t>
+        <w:ind w:firstLine="720"/>
+        <w:rPr>
+          <w:rFonts w:ascii="Arial" w:hAnsi="Arial" w:cs="Arial"/>
+          <w:sz w:val="22"/>
+          <w:szCs w:val="22"/>
+        </w:rPr>
+      </w:pPr>
+      <w:r>
+        <w:rPr>
+          <w:rFonts w:ascii="Arial" w:hAnsi="Arial" w:cs="Arial"/>
+          <w:sz w:val="22"/>
+          <w:szCs w:val="22"/>
+        </w:rPr>
+        <w:t>Para saber si tu sitio cumple con estos estándares y solucionar posibles fallos, puedes medir y analizar tu página utilizando herramientas gratuitas como PageSpeed Insights o el informe oficial de Google Search Console.</w:t>
       </w:r>
       <w:sdt>
         <w:sdtPr>
@@ -1248,7 +1184,6 @@
           <w:r>
             <w:rPr>
               <w:rFonts w:ascii="Arial" w:hAnsi="Arial" w:cs="Arial"/>
-              <w:noProof/>
               <w:sz w:val="22"/>
               <w:szCs w:val="22"/>
             </w:rPr>
@@ -1257,11 +1192,10 @@
           <w:r>
             <w:rPr>
               <w:rFonts w:ascii="Arial" w:hAnsi="Arial" w:cs="Arial"/>
-              <w:noProof/>
-              <w:sz w:val="22"/>
-              <w:szCs w:val="22"/>
-            </w:rPr>
-            <w:t>(Karel, 2026)</w:t>
+              <w:sz w:val="22"/>
+              <w:szCs w:val="22"/>
+            </w:rPr>
+            <w:t>(Karel, Core Web Vtals, 2026)</w:t>
           </w:r>
           <w:r>
             <w:rPr>
@@ -1276,57 +1210,45 @@
     </w:p>
     <w:p>
       <w:pPr>
-        <w:rPr>
-          <w:rFonts w:ascii="Arial" w:hAnsi="Arial" w:cs="Arial"/>
-          <w:sz w:val="22"/>
-          <w:szCs w:val="22"/>
-        </w:rPr>
-      </w:pPr>
-      <w:r>
+        <w:pStyle w:val="Ttulo2"/>
         <w:rPr>
           <w:rFonts w:ascii="Arial" w:hAnsi="Arial" w:cs="Arial"/>
           <w:b/>
           <w:bCs/>
-          <w:sz w:val="22"/>
-          <w:szCs w:val="22"/>
-        </w:rPr>
-        <w:t>4.2 Funcionamiento interno</w:t>
-      </w:r>
-      <w:r>
-        <w:rPr>
-          <w:rFonts w:ascii="Arial" w:hAnsi="Arial" w:cs="Arial"/>
-          <w:sz w:val="22"/>
-          <w:szCs w:val="22"/>
-        </w:rPr>
-        <w:t xml:space="preserve"> Cómo los mide el navegador, </w:t>
-      </w:r>
-      <w:proofErr w:type="spellStart"/>
-      <w:r>
-        <w:rPr>
-          <w:rFonts w:ascii="Arial" w:hAnsi="Arial" w:cs="Arial"/>
-          <w:sz w:val="22"/>
-          <w:szCs w:val="22"/>
-        </w:rPr>
-        <w:t>PerformanceObserver</w:t>
-      </w:r>
-      <w:proofErr w:type="spellEnd"/>
-      <w:r>
-        <w:rPr>
-          <w:rFonts w:ascii="Arial" w:hAnsi="Arial" w:cs="Arial"/>
-          <w:sz w:val="22"/>
-          <w:szCs w:val="22"/>
-        </w:rPr>
-        <w:t>, flujo de datos.</w:t>
-      </w:r>
-    </w:p>
-    <w:p>
-      <w:pPr>
-        <w:rPr>
-          <w:rFonts w:ascii="Arial" w:hAnsi="Arial" w:cs="Arial"/>
-          <w:sz w:val="22"/>
-          <w:szCs w:val="22"/>
-        </w:rPr>
-      </w:pPr>
+          <w:color w:val="auto"/>
+          <w:sz w:val="22"/>
+          <w:szCs w:val="22"/>
+        </w:rPr>
+      </w:pPr>
+      <w:r>
+        <w:rPr>
+          <w:rFonts w:ascii="Arial" w:hAnsi="Arial" w:cs="Arial"/>
+          <w:b/>
+          <w:bCs/>
+          <w:color w:val="auto"/>
+          <w:sz w:val="22"/>
+          <w:szCs w:val="22"/>
+        </w:rPr>
+        <w:t xml:space="preserve">Funcionamiento interno </w:t>
+      </w:r>
+    </w:p>
+    <w:p>
+      <w:pPr>
+        <w:ind w:firstLine="720"/>
+        <w:rPr>
+          <w:rFonts w:ascii="Arial" w:hAnsi="Arial" w:cs="Arial"/>
+          <w:sz w:val="22"/>
+          <w:szCs w:val="22"/>
+        </w:rPr>
+      </w:pPr>
+      <w:r>
+        <w:rPr>
+          <w:rFonts w:ascii="Arial" w:hAnsi="Arial" w:cs="Arial"/>
+          <w:sz w:val="22"/>
+          <w:szCs w:val="22"/>
+        </w:rPr>
+        <w:t>E</w:t>
+      </w:r>
       <w:r>
         <w:rPr>
           <w:rFonts w:ascii="Arial" w:hAnsi="Arial" w:cs="Arial"/>
@@ -1371,6 +1293,7 @@
           <w:id w:val="-453021932"/>
           <w:citation/>
         </w:sdtPr>
+        <w:sdtEndPr/>
         <w:sdtContent>
           <w:r>
             <w:rPr>
@@ -1399,7 +1322,6 @@
           <w:r>
             <w:rPr>
               <w:rFonts w:ascii="Arial" w:hAnsi="Arial" w:cs="Arial"/>
-              <w:noProof/>
               <w:sz w:val="22"/>
               <w:szCs w:val="22"/>
             </w:rPr>
@@ -1418,6 +1340,7 @@
     </w:p>
     <w:p>
       <w:pPr>
+        <w:ind w:firstLine="720"/>
         <w:rPr>
           <w:rFonts w:ascii="Arial" w:hAnsi="Arial" w:cs="Arial"/>
           <w:sz w:val="22"/>
@@ -1618,6 +1541,7 @@
           <w:id w:val="-1561781762"/>
           <w:citation/>
         </w:sdtPr>
+        <w:sdtEndPr/>
         <w:sdtContent>
           <w:r>
             <w:rPr>
@@ -1671,15 +1595,90 @@
           <w:szCs w:val="22"/>
         </w:rPr>
       </w:pPr>
-      <w:r>
+    </w:p>
+    <w:p>
+      <w:pPr>
+        <w:pStyle w:val="Ttulo2"/>
         <w:rPr>
           <w:rFonts w:ascii="Arial" w:hAnsi="Arial" w:cs="Arial"/>
           <w:b/>
           <w:bCs/>
-          <w:sz w:val="22"/>
-          <w:szCs w:val="22"/>
-        </w:rPr>
-        <w:t>Casos de uso</w:t>
+          <w:color w:val="auto"/>
+          <w:sz w:val="22"/>
+          <w:szCs w:val="22"/>
+        </w:rPr>
+      </w:pPr>
+      <w:r>
+        <w:rPr>
+          <w:rFonts w:ascii="Arial" w:hAnsi="Arial" w:cs="Arial"/>
+          <w:b/>
+          <w:bCs/>
+          <w:color w:val="auto"/>
+          <w:sz w:val="22"/>
+          <w:szCs w:val="22"/>
+        </w:rPr>
+        <w:lastRenderedPageBreak/>
+        <w:t xml:space="preserve">Casos de uso </w:t>
+      </w:r>
+    </w:p>
+    <w:p>
+      <w:pPr>
+        <w:ind w:firstLine="720"/>
+        <w:rPr>
+          <w:rFonts w:ascii="Arial" w:hAnsi="Arial" w:cs="Arial"/>
+          <w:sz w:val="22"/>
+          <w:szCs w:val="22"/>
+        </w:rPr>
+      </w:pPr>
+      <w:r>
+        <w:rPr>
+          <w:rFonts w:ascii="Arial" w:hAnsi="Arial" w:cs="Arial"/>
+          <w:sz w:val="22"/>
+          <w:szCs w:val="22"/>
+        </w:rPr>
+        <w:t>Cuando es conveniente usarlos</w:t>
+      </w:r>
+      <w:r>
+        <w:rPr>
+          <w:rFonts w:ascii="Arial" w:hAnsi="Arial" w:cs="Arial"/>
+          <w:sz w:val="22"/>
+          <w:szCs w:val="22"/>
+        </w:rPr>
+        <w:t>.</w:t>
+      </w:r>
+    </w:p>
+    <w:p>
+      <w:pPr>
+        <w:ind w:firstLine="720"/>
+        <w:rPr>
+          <w:rFonts w:ascii="Arial" w:hAnsi="Arial" w:cs="Arial"/>
+          <w:sz w:val="22"/>
+          <w:szCs w:val="22"/>
+        </w:rPr>
+      </w:pPr>
+      <w:r>
+        <w:rPr>
+          <w:rFonts w:ascii="Arial" w:hAnsi="Arial" w:cs="Arial"/>
+          <w:sz w:val="22"/>
+          <w:szCs w:val="22"/>
+        </w:rPr>
+        <w:t>Para evaluar la experiencia técnica fundamental.</w:t>
+      </w:r>
+      <w:r>
+        <w:rPr>
+          <w:rFonts w:ascii="Arial" w:hAnsi="Arial" w:cs="Arial"/>
+          <w:sz w:val="22"/>
+          <w:szCs w:val="22"/>
+        </w:rPr>
+        <w:t xml:space="preserve"> E-commerce: sitios de comercio </w:t>
+      </w:r>
+      <w:r>
+        <w:rPr>
+          <w:rFonts w:ascii="Arial" w:hAnsi="Arial" w:cs="Arial"/>
+          <w:sz w:val="22"/>
+          <w:szCs w:val="22"/>
+        </w:rPr>
+        <w:t>electrónico</w:t>
       </w:r>
       <w:r>
         <w:rPr>
@@ -1689,81 +1688,6 @@
         </w:rPr>
         <w:t xml:space="preserve"> </w:t>
       </w:r>
-    </w:p>
-    <w:p>
-      <w:pPr>
-        <w:rPr>
-          <w:rFonts w:ascii="Arial" w:hAnsi="Arial" w:cs="Arial"/>
-          <w:sz w:val="22"/>
-          <w:szCs w:val="22"/>
-        </w:rPr>
-      </w:pPr>
-      <w:r>
-        <w:rPr>
-          <w:rFonts w:ascii="Arial" w:hAnsi="Arial" w:cs="Arial"/>
-          <w:sz w:val="22"/>
-          <w:szCs w:val="22"/>
-        </w:rPr>
-        <w:lastRenderedPageBreak/>
-        <w:t>Cuando es conveniente usarlos:</w:t>
-      </w:r>
-    </w:p>
-    <w:p>
-      <w:pPr>
-        <w:rPr>
-          <w:rFonts w:ascii="Arial" w:hAnsi="Arial" w:cs="Arial"/>
-          <w:sz w:val="22"/>
-          <w:szCs w:val="22"/>
-        </w:rPr>
-      </w:pPr>
-      <w:r>
-        <w:rPr>
-          <w:rFonts w:ascii="Arial" w:hAnsi="Arial" w:cs="Arial"/>
-          <w:sz w:val="22"/>
-          <w:szCs w:val="22"/>
-        </w:rPr>
-        <w:t>Para evaluar la experiencia técnica fundamental.</w:t>
-      </w:r>
-      <w:r>
-        <w:rPr>
-          <w:rFonts w:ascii="Arial" w:hAnsi="Arial" w:cs="Arial"/>
-          <w:sz w:val="22"/>
-          <w:szCs w:val="22"/>
-        </w:rPr>
-        <w:t xml:space="preserve"> </w:t>
-      </w:r>
-      <w:r>
-        <w:rPr>
-          <w:rFonts w:ascii="Arial" w:hAnsi="Arial" w:cs="Arial"/>
-          <w:sz w:val="22"/>
-          <w:szCs w:val="22"/>
-        </w:rPr>
-        <w:t xml:space="preserve">E-commerce: sitios de comercio </w:t>
-      </w:r>
-      <w:r>
-        <w:rPr>
-          <w:rFonts w:ascii="Arial" w:hAnsi="Arial" w:cs="Arial"/>
-          <w:sz w:val="22"/>
-          <w:szCs w:val="22"/>
-        </w:rPr>
-        <w:t>e</w:t>
-      </w:r>
-      <w:r>
-        <w:rPr>
-          <w:rFonts w:ascii="Arial" w:hAnsi="Arial" w:cs="Arial"/>
-          <w:sz w:val="22"/>
-          <w:szCs w:val="22"/>
-        </w:rPr>
-        <w:t>lectrónico</w:t>
-      </w:r>
-      <w:r>
-        <w:rPr>
-          <w:rFonts w:ascii="Arial" w:hAnsi="Arial" w:cs="Arial"/>
-          <w:sz w:val="22"/>
-          <w:szCs w:val="22"/>
-        </w:rPr>
-        <w:t xml:space="preserve"> </w:t>
-      </w:r>
       <w:r>
         <w:rPr>
           <w:rFonts w:ascii="Arial" w:hAnsi="Arial" w:cs="Arial"/>
@@ -1810,15 +1734,23 @@
           <w:sz w:val="22"/>
           <w:szCs w:val="22"/>
         </w:rPr>
-        <w:t xml:space="preserve"> Y también en blogs o sitios de noticias sufren caídas de trafi</w:t>
-      </w:r>
-      <w:r>
-        <w:rPr>
-          <w:rFonts w:ascii="Arial" w:hAnsi="Arial" w:cs="Arial"/>
-          <w:sz w:val="22"/>
-          <w:szCs w:val="22"/>
-        </w:rPr>
-        <w:t>co debido a malas puntuaciones. Al mejorar sus LCP y CLS, se recuperan</w:t>
+        <w:t xml:space="preserve"> Y también en blogs o sitios de noticias sufren caídas de </w:t>
+      </w:r>
+      <w:r>
+        <w:rPr>
+          <w:rFonts w:ascii="Arial" w:hAnsi="Arial" w:cs="Arial"/>
+          <w:sz w:val="22"/>
+          <w:szCs w:val="22"/>
+        </w:rPr>
+        <w:t>tráfico</w:t>
+      </w:r>
+      <w:r>
+        <w:rPr>
+          <w:rFonts w:ascii="Arial" w:hAnsi="Arial" w:cs="Arial"/>
+          <w:sz w:val="22"/>
+          <w:szCs w:val="22"/>
+        </w:rPr>
+        <w:t xml:space="preserve"> debido a malas puntuaciones. Al mejorar sus LCP y CLS, se recuperan</w:t>
       </w:r>
       <w:r>
         <w:rPr>
@@ -1854,6 +1786,7 @@
           <w:id w:val="1786925873"/>
           <w:citation/>
         </w:sdtPr>
+        <w:sdtEndPr/>
         <w:sdtContent>
           <w:r>
             <w:rPr>
@@ -1882,7 +1815,6 @@
           <w:r>
             <w:rPr>
               <w:rFonts w:ascii="Arial" w:hAnsi="Arial" w:cs="Arial"/>
-              <w:noProof/>
               <w:sz w:val="22"/>
               <w:szCs w:val="22"/>
             </w:rPr>
@@ -1898,14 +1830,16 @@
           </w:r>
         </w:sdtContent>
       </w:sdt>
-      <w:r>
-        <w:rPr>
-          <w:rFonts w:ascii="Arial" w:hAnsi="Arial" w:cs="Arial"/>
-          <w:sz w:val="22"/>
-          <w:szCs w:val="22"/>
-        </w:rPr>
-        <w:br/>
-      </w:r>
+    </w:p>
+    <w:p>
+      <w:pPr>
+        <w:ind w:firstLine="720"/>
+        <w:rPr>
+          <w:rFonts w:ascii="Arial" w:hAnsi="Arial" w:cs="Arial"/>
+          <w:sz w:val="22"/>
+          <w:szCs w:val="22"/>
+        </w:rPr>
+      </w:pPr>
       <w:r>
         <w:rPr>
           <w:rFonts w:ascii="Arial" w:hAnsi="Arial" w:cs="Arial"/>
@@ -2020,6 +1954,7 @@
           <w:id w:val="86128691"/>
           <w:citation/>
         </w:sdtPr>
+        <w:sdtEndPr/>
         <w:sdtContent>
           <w:r>
             <w:rPr>
@@ -2048,7 +1983,6 @@
           <w:r>
             <w:rPr>
               <w:rFonts w:ascii="Arial" w:hAnsi="Arial" w:cs="Arial"/>
-              <w:noProof/>
               <w:sz w:val="22"/>
               <w:szCs w:val="22"/>
             </w:rPr>
@@ -2067,70 +2001,44 @@
     </w:p>
     <w:p>
       <w:pPr>
-        <w:rPr>
-          <w:rFonts w:ascii="Arial" w:hAnsi="Arial" w:cs="Arial"/>
-          <w:sz w:val="22"/>
-          <w:szCs w:val="22"/>
-        </w:rPr>
-      </w:pPr>
-      <w:r>
+        <w:pStyle w:val="Ttulo2"/>
         <w:rPr>
           <w:rFonts w:ascii="Arial" w:hAnsi="Arial" w:cs="Arial"/>
           <w:b/>
           <w:bCs/>
-          <w:sz w:val="22"/>
-          <w:szCs w:val="22"/>
-        </w:rPr>
-        <w:t>4.4 Comparativa con alternativas</w:t>
-      </w:r>
-      <w:r>
-        <w:rPr>
-          <w:rFonts w:ascii="Arial" w:hAnsi="Arial" w:cs="Arial"/>
-          <w:sz w:val="22"/>
-          <w:szCs w:val="22"/>
-        </w:rPr>
-        <w:t xml:space="preserve"> </w:t>
-      </w:r>
-    </w:p>
-    <w:p>
-      <w:pPr>
-        <w:rPr>
-          <w:rFonts w:ascii="Arial" w:hAnsi="Arial" w:cs="Arial"/>
-          <w:sz w:val="22"/>
-          <w:szCs w:val="22"/>
-        </w:rPr>
-      </w:pPr>
-      <w:r>
-        <w:rPr>
-          <w:rFonts w:ascii="Arial" w:hAnsi="Arial" w:cs="Arial"/>
-          <w:sz w:val="22"/>
-          <w:szCs w:val="22"/>
-        </w:rPr>
-        <w:t>La evaluación de las Core Web Vitals (CWV) no puede realizarse de manera aislada sin considerar el conjunto de métricas de rendimiento web que las antecedieron y que, en algunos casos, coexisten con ellas como indicadores complementarios. Desde la introducción de métricas como el First Input Delay (FID), el First Contentful Paint (FCP) y el Time to First Byte (TTFB), la industria del desarrollo web ha transitado hacia un modelo de medición más centrado en la experiencia real del usuario, proceso que culminó con la consolidación de las tres métricas estables que conforman las CWV en su estado actual: LCP, INP y CLS. En este contexto, la presente sección establece una comparación sistemática entre las CWV vigentes y sus métricas predecesoras o suplementarias, con el propósito de identificar las limitaciones que motivaron su evolución, las diferencias metodológicas en cuanto al tipo de datos que capturan</w:t>
-      </w:r>
-      <w:r>
-        <w:rPr>
-          <w:rFonts w:ascii="Arial" w:hAnsi="Arial" w:cs="Arial"/>
-          <w:sz w:val="22"/>
-          <w:szCs w:val="22"/>
-        </w:rPr>
-        <w:t xml:space="preserve">, </w:t>
-      </w:r>
-      <w:r>
-        <w:rPr>
-          <w:rFonts w:ascii="Arial" w:hAnsi="Arial" w:cs="Arial"/>
-          <w:sz w:val="22"/>
-          <w:szCs w:val="22"/>
-        </w:rPr>
-        <w:t>de laboratorio versus de campo, y su relevancia como factores de posicionamiento en los resultados de búsqueda de Google.</w:t>
-      </w:r>
-      <w:r>
-        <w:rPr>
-          <w:rFonts w:ascii="Arial" w:hAnsi="Arial" w:cs="Arial"/>
-          <w:sz w:val="22"/>
-          <w:szCs w:val="22"/>
-        </w:rPr>
-        <w:t xml:space="preserve"> </w:t>
+          <w:color w:val="auto"/>
+          <w:sz w:val="22"/>
+          <w:szCs w:val="22"/>
+        </w:rPr>
+      </w:pPr>
+      <w:r>
+        <w:rPr>
+          <w:rFonts w:ascii="Arial" w:hAnsi="Arial" w:cs="Arial"/>
+          <w:b/>
+          <w:bCs/>
+          <w:color w:val="auto"/>
+          <w:sz w:val="22"/>
+          <w:szCs w:val="22"/>
+        </w:rPr>
+        <w:t xml:space="preserve">Comparativa con alternativas </w:t>
+      </w:r>
+    </w:p>
+    <w:p>
+      <w:pPr>
+        <w:ind w:firstLine="720"/>
+        <w:rPr>
+          <w:rFonts w:ascii="Arial" w:hAnsi="Arial" w:cs="Arial"/>
+          <w:sz w:val="22"/>
+          <w:szCs w:val="22"/>
+        </w:rPr>
+      </w:pPr>
+      <w:r>
+        <w:rPr>
+          <w:rFonts w:ascii="Arial" w:hAnsi="Arial" w:cs="Arial"/>
+          <w:sz w:val="22"/>
+          <w:szCs w:val="22"/>
+        </w:rPr>
+        <w:t>La evaluación de las Core Web Vitals (CWV) no puede realizarse de manera aislada sin considerar el conjunto de métricas de rendimiento web que las antecedieron y que, en algunos casos, coexisten con ellas como indicadores complementarios. Desde la introducción de métricas como el First Input Delay (FID), el First Contentful Paint (FCP) y el Time to First Byte (TTFB), la industria del desarrollo web ha transitado hacia un modelo de medición más centrado en la experiencia real del usuario, proceso que culminó con la consolidación de las tres métricas estables que conforman las CWV en su estado actual: LCP, INP y CLS.</w:t>
       </w:r>
       <w:sdt>
         <w:sdtPr>
@@ -2142,6 +2050,7 @@
           <w:id w:val="-25947230"/>
           <w:citation/>
         </w:sdtPr>
+        <w:sdtEndPr/>
         <w:sdtContent>
           <w:r>
             <w:rPr>
@@ -2170,7 +2079,6 @@
           <w:r>
             <w:rPr>
               <w:rFonts w:ascii="Arial" w:hAnsi="Arial" w:cs="Arial"/>
-              <w:noProof/>
               <w:sz w:val="22"/>
               <w:szCs w:val="22"/>
             </w:rPr>
@@ -2189,15 +2097,42 @@
     </w:p>
     <w:p>
       <w:pPr>
-        <w:rPr>
-          <w:rFonts w:ascii="Arial" w:hAnsi="Arial" w:cs="Arial"/>
-          <w:sz w:val="22"/>
-          <w:szCs w:val="22"/>
-        </w:rPr>
-      </w:pPr>
-      <w:r>
-        <w:rPr>
-          <w:rFonts w:ascii="Arial" w:hAnsi="Arial" w:cs="Arial"/>
+        <w:ind w:firstLine="720"/>
+        <w:rPr>
+          <w:rFonts w:ascii="Arial" w:hAnsi="Arial" w:cs="Arial"/>
+          <w:sz w:val="22"/>
+          <w:szCs w:val="22"/>
+        </w:rPr>
+      </w:pPr>
+    </w:p>
+    <w:p>
+      <w:pPr>
+        <w:ind w:firstLine="720"/>
+        <w:rPr>
+          <w:rFonts w:ascii="Arial" w:hAnsi="Arial" w:cs="Arial"/>
+          <w:sz w:val="22"/>
+          <w:szCs w:val="22"/>
+        </w:rPr>
+      </w:pPr>
+    </w:p>
+    <w:p>
+      <w:pPr>
+        <w:pStyle w:val="Ttulo2"/>
+        <w:rPr>
+          <w:rFonts w:ascii="Arial" w:hAnsi="Arial" w:cs="Arial"/>
+          <w:b/>
+          <w:bCs/>
+          <w:color w:val="auto"/>
+          <w:sz w:val="22"/>
+          <w:szCs w:val="22"/>
+        </w:rPr>
+      </w:pPr>
+      <w:r>
+        <w:rPr>
+          <w:rFonts w:ascii="Arial" w:hAnsi="Arial" w:cs="Arial"/>
+          <w:b/>
+          <w:bCs/>
+          <w:color w:val="auto"/>
           <w:sz w:val="22"/>
           <w:szCs w:val="22"/>
         </w:rPr>
@@ -2233,10 +2168,10 @@
         <w:tblLook w:val="04A0" w:firstRow="1" w:lastRow="0" w:firstColumn="1" w:lastColumn="0" w:noHBand="0" w:noVBand="1"/>
       </w:tblPr>
       <w:tblGrid>
-        <w:gridCol w:w="1189"/>
-        <w:gridCol w:w="1754"/>
-        <w:gridCol w:w="1652"/>
-        <w:gridCol w:w="1022"/>
+        <w:gridCol w:w="1402"/>
+        <w:gridCol w:w="1721"/>
+        <w:gridCol w:w="1635"/>
+        <w:gridCol w:w="974"/>
         <w:gridCol w:w="1672"/>
         <w:gridCol w:w="1500"/>
       </w:tblGrid>
@@ -2251,6 +2186,7 @@
           </w:tcPr>
           <w:p>
             <w:pPr>
+              <w:spacing w:line="480" w:lineRule="auto"/>
               <w:rPr>
                 <w:rFonts w:ascii="Arial" w:hAnsi="Arial" w:cs="Arial"/>
                 <w:sz w:val="22"/>
@@ -2273,6 +2209,7 @@
           </w:tcPr>
           <w:p>
             <w:pPr>
+              <w:spacing w:line="480" w:lineRule="auto"/>
               <w:cnfStyle w:val="100000000000" w:firstRow="1" w:lastRow="0" w:firstColumn="0" w:lastColumn="0" w:oddVBand="0" w:evenVBand="0" w:oddHBand="0" w:evenHBand="0" w:firstRowFirstColumn="0" w:firstRowLastColumn="0" w:lastRowFirstColumn="0" w:lastRowLastColumn="0"/>
               <w:rPr>
                 <w:rFonts w:ascii="Arial" w:hAnsi="Arial" w:cs="Arial"/>
@@ -2312,6 +2249,7 @@
           </w:tcPr>
           <w:p>
             <w:pPr>
+              <w:spacing w:line="480" w:lineRule="auto"/>
               <w:cnfStyle w:val="100000000000" w:firstRow="1" w:lastRow="0" w:firstColumn="0" w:lastColumn="0" w:oddVBand="0" w:evenVBand="0" w:oddHBand="0" w:evenHBand="0" w:firstRowFirstColumn="0" w:firstRowLastColumn="0" w:lastRowFirstColumn="0" w:lastRowLastColumn="0"/>
               <w:rPr>
                 <w:rFonts w:ascii="Arial" w:hAnsi="Arial" w:cs="Arial"/>
@@ -2335,6 +2273,7 @@
           </w:tcPr>
           <w:p>
             <w:pPr>
+              <w:spacing w:line="480" w:lineRule="auto"/>
               <w:cnfStyle w:val="100000000000" w:firstRow="1" w:lastRow="0" w:firstColumn="0" w:lastColumn="0" w:oddVBand="0" w:evenVBand="0" w:oddHBand="0" w:evenHBand="0" w:firstRowFirstColumn="0" w:firstRowLastColumn="0" w:lastRowFirstColumn="0" w:lastRowLastColumn="0"/>
               <w:rPr>
                 <w:rFonts w:ascii="Arial" w:hAnsi="Arial" w:cs="Arial"/>
@@ -2358,6 +2297,7 @@
           </w:tcPr>
           <w:p>
             <w:pPr>
+              <w:spacing w:line="480" w:lineRule="auto"/>
               <w:cnfStyle w:val="100000000000" w:firstRow="1" w:lastRow="0" w:firstColumn="0" w:lastColumn="0" w:oddVBand="0" w:evenVBand="0" w:oddHBand="0" w:evenHBand="0" w:firstRowFirstColumn="0" w:firstRowLastColumn="0" w:lastRowFirstColumn="0" w:lastRowLastColumn="0"/>
               <w:rPr>
                 <w:rFonts w:ascii="Arial" w:hAnsi="Arial" w:cs="Arial"/>
@@ -2381,6 +2321,7 @@
           </w:tcPr>
           <w:p>
             <w:pPr>
+              <w:spacing w:line="480" w:lineRule="auto"/>
               <w:cnfStyle w:val="100000000000" w:firstRow="1" w:lastRow="0" w:firstColumn="0" w:lastColumn="0" w:oddVBand="0" w:evenVBand="0" w:oddHBand="0" w:evenHBand="0" w:firstRowFirstColumn="0" w:firstRowLastColumn="0" w:lastRowFirstColumn="0" w:lastRowLastColumn="0"/>
               <w:rPr>
                 <w:rFonts w:ascii="Arial" w:hAnsi="Arial" w:cs="Arial"/>
@@ -2410,6 +2351,7 @@
           </w:tcPr>
           <w:p>
             <w:pPr>
+              <w:spacing w:line="480" w:lineRule="auto"/>
               <w:rPr>
                 <w:rFonts w:ascii="Arial" w:hAnsi="Arial" w:cs="Arial"/>
                 <w:sz w:val="22"/>
@@ -2431,68 +2373,61 @@
                 <w:szCs w:val="22"/>
               </w:rPr>
               <w:br/>
-            </w:r>
-            <w:r>
-              <w:rPr>
-                <w:rFonts w:ascii="Arial" w:hAnsi="Arial" w:cs="Arial"/>
-                <w:sz w:val="16"/>
-                <w:szCs w:val="16"/>
-              </w:rPr>
               <w:t>L</w:t>
             </w:r>
             <w:r>
               <w:rPr>
                 <w:rFonts w:ascii="Arial" w:hAnsi="Arial" w:cs="Arial"/>
-                <w:sz w:val="16"/>
-                <w:szCs w:val="16"/>
+                <w:sz w:val="22"/>
+                <w:szCs w:val="22"/>
               </w:rPr>
               <w:t>a</w:t>
             </w:r>
             <w:r>
               <w:rPr>
                 <w:rFonts w:ascii="Arial" w:hAnsi="Arial" w:cs="Arial"/>
-                <w:sz w:val="16"/>
-                <w:szCs w:val="16"/>
+                <w:sz w:val="22"/>
+                <w:szCs w:val="22"/>
               </w:rPr>
               <w:t>rgest Conte</w:t>
             </w:r>
             <w:r>
               <w:rPr>
                 <w:rFonts w:ascii="Arial" w:hAnsi="Arial" w:cs="Arial"/>
-                <w:sz w:val="16"/>
-                <w:szCs w:val="16"/>
+                <w:sz w:val="22"/>
+                <w:szCs w:val="22"/>
               </w:rPr>
               <w:t>n</w:t>
             </w:r>
             <w:r>
               <w:rPr>
                 <w:rFonts w:ascii="Arial" w:hAnsi="Arial" w:cs="Arial"/>
-                <w:sz w:val="16"/>
-                <w:szCs w:val="16"/>
+                <w:sz w:val="22"/>
+                <w:szCs w:val="22"/>
               </w:rPr>
               <w:t>t</w:t>
             </w:r>
             <w:r>
               <w:rPr>
                 <w:rFonts w:ascii="Arial" w:hAnsi="Arial" w:cs="Arial"/>
-                <w:sz w:val="16"/>
-                <w:szCs w:val="16"/>
+                <w:sz w:val="22"/>
+                <w:szCs w:val="22"/>
               </w:rPr>
               <w:t>ful</w:t>
             </w:r>
             <w:r>
               <w:rPr>
                 <w:rFonts w:ascii="Arial" w:hAnsi="Arial" w:cs="Arial"/>
-                <w:sz w:val="16"/>
-                <w:szCs w:val="16"/>
+                <w:sz w:val="22"/>
+                <w:szCs w:val="22"/>
               </w:rPr>
               <w:t xml:space="preserve"> </w:t>
             </w:r>
             <w:r>
               <w:rPr>
                 <w:rFonts w:ascii="Arial" w:hAnsi="Arial" w:cs="Arial"/>
-                <w:sz w:val="16"/>
-                <w:szCs w:val="16"/>
+                <w:sz w:val="22"/>
+                <w:szCs w:val="22"/>
               </w:rPr>
               <w:t>Paint</w:t>
             </w:r>
@@ -2504,6 +2439,7 @@
           </w:tcPr>
           <w:p>
             <w:pPr>
+              <w:spacing w:line="480" w:lineRule="auto"/>
               <w:cnfStyle w:val="000000100000" w:firstRow="0" w:lastRow="0" w:firstColumn="0" w:lastColumn="0" w:oddVBand="0" w:evenVBand="0" w:oddHBand="1" w:evenHBand="0" w:firstRowFirstColumn="0" w:firstRowLastColumn="0" w:lastRowFirstColumn="0" w:lastRowLastColumn="0"/>
               <w:rPr>
                 <w:rFonts w:ascii="Arial" w:hAnsi="Arial" w:cs="Arial"/>
@@ -2543,6 +2479,7 @@
           </w:tcPr>
           <w:p>
             <w:pPr>
+              <w:spacing w:line="480" w:lineRule="auto"/>
               <w:cnfStyle w:val="000000100000" w:firstRow="0" w:lastRow="0" w:firstColumn="0" w:lastColumn="0" w:oddVBand="0" w:evenVBand="0" w:oddHBand="1" w:evenHBand="0" w:firstRowFirstColumn="0" w:firstRowLastColumn="0" w:lastRowFirstColumn="0" w:lastRowLastColumn="0"/>
               <w:rPr>
                 <w:rFonts w:ascii="Arial" w:hAnsi="Arial" w:cs="Arial"/>
@@ -2566,6 +2503,7 @@
           </w:tcPr>
           <w:p>
             <w:pPr>
+              <w:spacing w:line="480" w:lineRule="auto"/>
               <w:cnfStyle w:val="000000100000" w:firstRow="0" w:lastRow="0" w:firstColumn="0" w:lastColumn="0" w:oddVBand="0" w:evenVBand="0" w:oddHBand="1" w:evenHBand="0" w:firstRowFirstColumn="0" w:firstRowLastColumn="0" w:lastRowFirstColumn="0" w:lastRowLastColumn="0"/>
               <w:rPr>
                 <w:rFonts w:ascii="Arial" w:hAnsi="Arial" w:cs="Arial"/>
@@ -2589,6 +2527,7 @@
           </w:tcPr>
           <w:p>
             <w:pPr>
+              <w:spacing w:line="480" w:lineRule="auto"/>
               <w:cnfStyle w:val="000000100000" w:firstRow="0" w:lastRow="0" w:firstColumn="0" w:lastColumn="0" w:oddVBand="0" w:evenVBand="0" w:oddHBand="1" w:evenHBand="0" w:firstRowFirstColumn="0" w:firstRowLastColumn="0" w:lastRowFirstColumn="0" w:lastRowLastColumn="0"/>
               <w:rPr>
                 <w:rFonts w:ascii="Arial" w:hAnsi="Arial" w:cs="Arial"/>
@@ -2612,6 +2551,7 @@
           </w:tcPr>
           <w:p>
             <w:pPr>
+              <w:spacing w:line="480" w:lineRule="auto"/>
               <w:cnfStyle w:val="000000100000" w:firstRow="0" w:lastRow="0" w:firstColumn="0" w:lastColumn="0" w:oddVBand="0" w:evenVBand="0" w:oddHBand="1" w:evenHBand="0" w:firstRowFirstColumn="0" w:firstRowLastColumn="0" w:lastRowFirstColumn="0" w:lastRowLastColumn="0"/>
               <w:rPr>
                 <w:rFonts w:ascii="Arial" w:hAnsi="Arial" w:cs="Arial"/>
@@ -2638,6 +2578,7 @@
           </w:tcPr>
           <w:p>
             <w:pPr>
+              <w:spacing w:line="480" w:lineRule="auto"/>
               <w:rPr>
                 <w:rFonts w:ascii="Arial" w:hAnsi="Arial" w:cs="Arial"/>
                 <w:sz w:val="22"/>
@@ -2657,18 +2598,19 @@
           </w:p>
           <w:p>
             <w:pPr>
-              <w:rPr>
-                <w:rFonts w:ascii="Arial" w:hAnsi="Arial" w:cs="Arial"/>
-                <w:sz w:val="18"/>
-                <w:szCs w:val="18"/>
+              <w:spacing w:line="480" w:lineRule="auto"/>
+              <w:rPr>
+                <w:rFonts w:ascii="Arial" w:hAnsi="Arial" w:cs="Arial"/>
+                <w:sz w:val="22"/>
+                <w:szCs w:val="22"/>
                 <w:lang w:val="en-US"/>
               </w:rPr>
             </w:pPr>
             <w:r>
               <w:rPr>
                 <w:rFonts w:ascii="Arial" w:hAnsi="Arial" w:cs="Arial"/>
-                <w:sz w:val="18"/>
-                <w:szCs w:val="18"/>
+                <w:sz w:val="22"/>
+                <w:szCs w:val="22"/>
                 <w:lang w:val="en-US"/>
               </w:rPr>
               <w:t>Interaction to Next Paint</w:t>
@@ -2681,6 +2623,7 @@
           </w:tcPr>
           <w:p>
             <w:pPr>
+              <w:spacing w:line="480" w:lineRule="auto"/>
               <w:cnfStyle w:val="000000000000" w:firstRow="0" w:lastRow="0" w:firstColumn="0" w:lastColumn="0" w:oddVBand="0" w:evenVBand="0" w:oddHBand="0" w:evenHBand="0" w:firstRowFirstColumn="0" w:firstRowLastColumn="0" w:lastRowFirstColumn="0" w:lastRowLastColumn="0"/>
               <w:rPr>
                 <w:rFonts w:ascii="Arial" w:hAnsi="Arial" w:cs="Arial"/>
@@ -2704,6 +2647,7 @@
           </w:tcPr>
           <w:p>
             <w:pPr>
+              <w:spacing w:line="480" w:lineRule="auto"/>
               <w:cnfStyle w:val="000000000000" w:firstRow="0" w:lastRow="0" w:firstColumn="0" w:lastColumn="0" w:oddVBand="0" w:evenVBand="0" w:oddHBand="0" w:evenHBand="0" w:firstRowFirstColumn="0" w:firstRowLastColumn="0" w:lastRowFirstColumn="0" w:lastRowLastColumn="0"/>
               <w:rPr>
                 <w:rFonts w:ascii="Arial" w:hAnsi="Arial" w:cs="Arial"/>
@@ -2727,6 +2671,7 @@
           </w:tcPr>
           <w:p>
             <w:pPr>
+              <w:spacing w:line="480" w:lineRule="auto"/>
               <w:cnfStyle w:val="000000000000" w:firstRow="0" w:lastRow="0" w:firstColumn="0" w:lastColumn="0" w:oddVBand="0" w:evenVBand="0" w:oddHBand="0" w:evenHBand="0" w:firstRowFirstColumn="0" w:firstRowLastColumn="0" w:lastRowFirstColumn="0" w:lastRowLastColumn="0"/>
               <w:rPr>
                 <w:rFonts w:ascii="Arial" w:hAnsi="Arial" w:cs="Arial"/>
@@ -2750,6 +2695,7 @@
           </w:tcPr>
           <w:p>
             <w:pPr>
+              <w:spacing w:line="480" w:lineRule="auto"/>
               <w:cnfStyle w:val="000000000000" w:firstRow="0" w:lastRow="0" w:firstColumn="0" w:lastColumn="0" w:oddVBand="0" w:evenVBand="0" w:oddHBand="0" w:evenHBand="0" w:firstRowFirstColumn="0" w:firstRowLastColumn="0" w:lastRowFirstColumn="0" w:lastRowLastColumn="0"/>
               <w:rPr>
                 <w:rFonts w:ascii="Arial" w:hAnsi="Arial" w:cs="Arial"/>
@@ -2773,6 +2719,7 @@
           </w:tcPr>
           <w:p>
             <w:pPr>
+              <w:spacing w:line="480" w:lineRule="auto"/>
               <w:cnfStyle w:val="000000000000" w:firstRow="0" w:lastRow="0" w:firstColumn="0" w:lastColumn="0" w:oddVBand="0" w:evenVBand="0" w:oddHBand="0" w:evenHBand="0" w:firstRowFirstColumn="0" w:firstRowLastColumn="0" w:lastRowFirstColumn="0" w:lastRowLastColumn="0"/>
               <w:rPr>
                 <w:rFonts w:ascii="Arial" w:hAnsi="Arial" w:cs="Arial"/>
@@ -2786,23 +2733,7 @@
                 <w:sz w:val="22"/>
                 <w:szCs w:val="22"/>
               </w:rPr>
-              <w:t>C</w:t>
-            </w:r>
-            <w:r>
-              <w:rPr>
-                <w:rFonts w:ascii="Arial" w:hAnsi="Arial" w:cs="Arial"/>
-                <w:sz w:val="22"/>
-                <w:szCs w:val="22"/>
-              </w:rPr>
-              <w:t>ampo</w:t>
-            </w:r>
-            <w:r>
-              <w:rPr>
-                <w:rFonts w:ascii="Arial" w:hAnsi="Arial" w:cs="Arial"/>
-                <w:sz w:val="22"/>
-                <w:szCs w:val="22"/>
-              </w:rPr>
-              <w:t xml:space="preserve"> </w:t>
+              <w:t xml:space="preserve">Campo </w:t>
             </w:r>
           </w:p>
         </w:tc>
@@ -2818,6 +2749,7 @@
           </w:tcPr>
           <w:p>
             <w:pPr>
+              <w:spacing w:line="480" w:lineRule="auto"/>
               <w:rPr>
                 <w:rFonts w:ascii="Arial" w:hAnsi="Arial" w:cs="Arial"/>
                 <w:sz w:val="22"/>
@@ -2835,6 +2767,7 @@
           </w:p>
           <w:p>
             <w:pPr>
+              <w:spacing w:line="480" w:lineRule="auto"/>
               <w:rPr>
                 <w:rFonts w:ascii="Arial" w:hAnsi="Arial" w:cs="Arial"/>
                 <w:sz w:val="22"/>
@@ -2844,8 +2777,8 @@
             <w:r>
               <w:rPr>
                 <w:rFonts w:ascii="Arial" w:hAnsi="Arial" w:cs="Arial"/>
-                <w:sz w:val="16"/>
-                <w:szCs w:val="16"/>
+                <w:sz w:val="22"/>
+                <w:szCs w:val="22"/>
               </w:rPr>
               <w:t>Cumulative Layout Shift</w:t>
             </w:r>
@@ -2857,6 +2790,7 @@
           </w:tcPr>
           <w:p>
             <w:pPr>
+              <w:spacing w:line="480" w:lineRule="auto"/>
               <w:cnfStyle w:val="000000100000" w:firstRow="0" w:lastRow="0" w:firstColumn="0" w:lastColumn="0" w:oddVBand="0" w:evenVBand="0" w:oddHBand="1" w:evenHBand="0" w:firstRowFirstColumn="0" w:firstRowLastColumn="0" w:lastRowFirstColumn="0" w:lastRowLastColumn="0"/>
               <w:rPr>
                 <w:rFonts w:ascii="Arial" w:hAnsi="Arial" w:cs="Arial"/>
@@ -2880,6 +2814,7 @@
           </w:tcPr>
           <w:p>
             <w:pPr>
+              <w:spacing w:line="480" w:lineRule="auto"/>
               <w:cnfStyle w:val="000000100000" w:firstRow="0" w:lastRow="0" w:firstColumn="0" w:lastColumn="0" w:oddVBand="0" w:evenVBand="0" w:oddHBand="1" w:evenHBand="0" w:firstRowFirstColumn="0" w:firstRowLastColumn="0" w:lastRowFirstColumn="0" w:lastRowLastColumn="0"/>
               <w:rPr>
                 <w:rFonts w:ascii="Arial" w:hAnsi="Arial" w:cs="Arial"/>
@@ -2903,6 +2838,7 @@
           </w:tcPr>
           <w:p>
             <w:pPr>
+              <w:spacing w:line="480" w:lineRule="auto"/>
               <w:cnfStyle w:val="000000100000" w:firstRow="0" w:lastRow="0" w:firstColumn="0" w:lastColumn="0" w:oddVBand="0" w:evenVBand="0" w:oddHBand="1" w:evenHBand="0" w:firstRowFirstColumn="0" w:firstRowLastColumn="0" w:lastRowFirstColumn="0" w:lastRowLastColumn="0"/>
               <w:rPr>
                 <w:rFonts w:ascii="Arial" w:hAnsi="Arial" w:cs="Arial"/>
@@ -2926,6 +2862,7 @@
           </w:tcPr>
           <w:p>
             <w:pPr>
+              <w:spacing w:line="480" w:lineRule="auto"/>
               <w:cnfStyle w:val="000000100000" w:firstRow="0" w:lastRow="0" w:firstColumn="0" w:lastColumn="0" w:oddVBand="0" w:evenVBand="0" w:oddHBand="1" w:evenHBand="0" w:firstRowFirstColumn="0" w:firstRowLastColumn="0" w:lastRowFirstColumn="0" w:lastRowLastColumn="0"/>
               <w:rPr>
                 <w:rFonts w:ascii="Arial" w:hAnsi="Arial" w:cs="Arial"/>
@@ -2949,6 +2886,7 @@
           </w:tcPr>
           <w:p>
             <w:pPr>
+              <w:spacing w:line="480" w:lineRule="auto"/>
               <w:cnfStyle w:val="000000100000" w:firstRow="0" w:lastRow="0" w:firstColumn="0" w:lastColumn="0" w:oddVBand="0" w:evenVBand="0" w:oddHBand="1" w:evenHBand="0" w:firstRowFirstColumn="0" w:firstRowLastColumn="0" w:lastRowFirstColumn="0" w:lastRowLastColumn="0"/>
               <w:rPr>
                 <w:rFonts w:ascii="Arial" w:hAnsi="Arial" w:cs="Arial"/>
@@ -2975,6 +2913,7 @@
           </w:tcPr>
           <w:p>
             <w:pPr>
+              <w:spacing w:line="480" w:lineRule="auto"/>
               <w:rPr>
                 <w:rFonts w:ascii="Arial" w:hAnsi="Arial" w:cs="Arial"/>
                 <w:sz w:val="22"/>
@@ -2992,6 +2931,7 @@
           </w:p>
           <w:p>
             <w:pPr>
+              <w:spacing w:line="480" w:lineRule="auto"/>
               <w:rPr>
                 <w:rFonts w:ascii="Arial" w:hAnsi="Arial" w:cs="Arial"/>
                 <w:sz w:val="22"/>
@@ -3001,8 +2941,8 @@
             <w:r>
               <w:rPr>
                 <w:rFonts w:ascii="Arial" w:hAnsi="Arial" w:cs="Arial"/>
-                <w:sz w:val="16"/>
-                <w:szCs w:val="16"/>
+                <w:sz w:val="22"/>
+                <w:szCs w:val="22"/>
               </w:rPr>
               <w:t>First Input Delay</w:t>
             </w:r>
@@ -3014,6 +2954,7 @@
           </w:tcPr>
           <w:p>
             <w:pPr>
+              <w:spacing w:line="480" w:lineRule="auto"/>
               <w:cnfStyle w:val="000000000000" w:firstRow="0" w:lastRow="0" w:firstColumn="0" w:lastColumn="0" w:oddVBand="0" w:evenVBand="0" w:oddHBand="0" w:evenHBand="0" w:firstRowFirstColumn="0" w:firstRowLastColumn="0" w:lastRowFirstColumn="0" w:lastRowLastColumn="0"/>
               <w:rPr>
                 <w:rFonts w:ascii="Arial" w:hAnsi="Arial" w:cs="Arial"/>
@@ -3037,6 +2978,7 @@
           </w:tcPr>
           <w:p>
             <w:pPr>
+              <w:spacing w:line="480" w:lineRule="auto"/>
               <w:cnfStyle w:val="000000000000" w:firstRow="0" w:lastRow="0" w:firstColumn="0" w:lastColumn="0" w:oddVBand="0" w:evenVBand="0" w:oddHBand="0" w:evenHBand="0" w:firstRowFirstColumn="0" w:firstRowLastColumn="0" w:lastRowFirstColumn="0" w:lastRowLastColumn="0"/>
               <w:rPr>
                 <w:rFonts w:ascii="Arial" w:hAnsi="Arial" w:cs="Arial"/>
@@ -3060,6 +3002,7 @@
           </w:tcPr>
           <w:p>
             <w:pPr>
+              <w:spacing w:line="480" w:lineRule="auto"/>
               <w:cnfStyle w:val="000000000000" w:firstRow="0" w:lastRow="0" w:firstColumn="0" w:lastColumn="0" w:oddVBand="0" w:evenVBand="0" w:oddHBand="0" w:evenHBand="0" w:firstRowFirstColumn="0" w:firstRowLastColumn="0" w:lastRowFirstColumn="0" w:lastRowLastColumn="0"/>
               <w:rPr>
                 <w:rFonts w:ascii="Arial" w:hAnsi="Arial" w:cs="Arial"/>
@@ -3083,6 +3026,7 @@
           </w:tcPr>
           <w:p>
             <w:pPr>
+              <w:spacing w:line="480" w:lineRule="auto"/>
               <w:cnfStyle w:val="000000000000" w:firstRow="0" w:lastRow="0" w:firstColumn="0" w:lastColumn="0" w:oddVBand="0" w:evenVBand="0" w:oddHBand="0" w:evenHBand="0" w:firstRowFirstColumn="0" w:firstRowLastColumn="0" w:lastRowFirstColumn="0" w:lastRowLastColumn="0"/>
               <w:rPr>
                 <w:rFonts w:ascii="Arial" w:hAnsi="Arial" w:cs="Arial"/>
@@ -3106,6 +3050,7 @@
           </w:tcPr>
           <w:p>
             <w:pPr>
+              <w:spacing w:line="480" w:lineRule="auto"/>
               <w:cnfStyle w:val="000000000000" w:firstRow="0" w:lastRow="0" w:firstColumn="0" w:lastColumn="0" w:oddVBand="0" w:evenVBand="0" w:oddHBand="0" w:evenHBand="0" w:firstRowFirstColumn="0" w:firstRowLastColumn="0" w:lastRowFirstColumn="0" w:lastRowLastColumn="0"/>
               <w:rPr>
                 <w:rFonts w:ascii="Arial" w:hAnsi="Arial" w:cs="Arial"/>
@@ -3124,6 +3069,7 @@
           </w:p>
           <w:p>
             <w:pPr>
+              <w:spacing w:line="480" w:lineRule="auto"/>
               <w:jc w:val="center"/>
               <w:cnfStyle w:val="000000000000" w:firstRow="0" w:lastRow="0" w:firstColumn="0" w:lastColumn="0" w:oddVBand="0" w:evenVBand="0" w:oddHBand="0" w:evenHBand="0" w:firstRowFirstColumn="0" w:firstRowLastColumn="0" w:lastRowFirstColumn="0" w:lastRowLastColumn="0"/>
               <w:rPr>
@@ -3146,6 +3092,7 @@
           </w:tcPr>
           <w:p>
             <w:pPr>
+              <w:spacing w:line="480" w:lineRule="auto"/>
               <w:rPr>
                 <w:rFonts w:ascii="Arial" w:hAnsi="Arial" w:cs="Arial"/>
                 <w:sz w:val="22"/>
@@ -3163,6 +3110,7 @@
           </w:p>
           <w:p>
             <w:pPr>
+              <w:spacing w:line="480" w:lineRule="auto"/>
               <w:rPr>
                 <w:rFonts w:ascii="Arial" w:hAnsi="Arial" w:cs="Arial"/>
                 <w:sz w:val="22"/>
@@ -3172,8 +3120,8 @@
             <w:r>
               <w:rPr>
                 <w:rFonts w:ascii="Arial" w:hAnsi="Arial" w:cs="Arial"/>
-                <w:sz w:val="16"/>
-                <w:szCs w:val="16"/>
+                <w:sz w:val="22"/>
+                <w:szCs w:val="22"/>
               </w:rPr>
               <w:t>First Contentful Paint</w:t>
             </w:r>
@@ -3185,6 +3133,7 @@
           </w:tcPr>
           <w:p>
             <w:pPr>
+              <w:spacing w:line="480" w:lineRule="auto"/>
               <w:cnfStyle w:val="000000100000" w:firstRow="0" w:lastRow="0" w:firstColumn="0" w:lastColumn="0" w:oddVBand="0" w:evenVBand="0" w:oddHBand="1" w:evenHBand="0" w:firstRowFirstColumn="0" w:firstRowLastColumn="0" w:lastRowFirstColumn="0" w:lastRowLastColumn="0"/>
               <w:rPr>
                 <w:rFonts w:ascii="Arial" w:hAnsi="Arial" w:cs="Arial"/>
@@ -3216,6 +3165,7 @@
           </w:tcPr>
           <w:p>
             <w:pPr>
+              <w:spacing w:line="480" w:lineRule="auto"/>
               <w:cnfStyle w:val="000000100000" w:firstRow="0" w:lastRow="0" w:firstColumn="0" w:lastColumn="0" w:oddVBand="0" w:evenVBand="0" w:oddHBand="1" w:evenHBand="0" w:firstRowFirstColumn="0" w:firstRowLastColumn="0" w:lastRowFirstColumn="0" w:lastRowLastColumn="0"/>
               <w:rPr>
                 <w:rFonts w:ascii="Arial" w:hAnsi="Arial" w:cs="Arial"/>
@@ -3239,6 +3189,7 @@
           </w:tcPr>
           <w:p>
             <w:pPr>
+              <w:spacing w:line="480" w:lineRule="auto"/>
               <w:cnfStyle w:val="000000100000" w:firstRow="0" w:lastRow="0" w:firstColumn="0" w:lastColumn="0" w:oddVBand="0" w:evenVBand="0" w:oddHBand="1" w:evenHBand="0" w:firstRowFirstColumn="0" w:firstRowLastColumn="0" w:lastRowFirstColumn="0" w:lastRowLastColumn="0"/>
               <w:rPr>
                 <w:rFonts w:ascii="Arial" w:hAnsi="Arial" w:cs="Arial"/>
@@ -3262,6 +3213,7 @@
           </w:tcPr>
           <w:p>
             <w:pPr>
+              <w:spacing w:line="480" w:lineRule="auto"/>
               <w:cnfStyle w:val="000000100000" w:firstRow="0" w:lastRow="0" w:firstColumn="0" w:lastColumn="0" w:oddVBand="0" w:evenVBand="0" w:oddHBand="1" w:evenHBand="0" w:firstRowFirstColumn="0" w:firstRowLastColumn="0" w:lastRowFirstColumn="0" w:lastRowLastColumn="0"/>
               <w:rPr>
                 <w:rFonts w:ascii="Arial" w:hAnsi="Arial" w:cs="Arial"/>
@@ -3285,6 +3237,7 @@
           </w:tcPr>
           <w:p>
             <w:pPr>
+              <w:spacing w:line="480" w:lineRule="auto"/>
               <w:cnfStyle w:val="000000100000" w:firstRow="0" w:lastRow="0" w:firstColumn="0" w:lastColumn="0" w:oddVBand="0" w:evenVBand="0" w:oddHBand="1" w:evenHBand="0" w:firstRowFirstColumn="0" w:firstRowLastColumn="0" w:lastRowFirstColumn="0" w:lastRowLastColumn="0"/>
               <w:rPr>
                 <w:rFonts w:ascii="Arial" w:hAnsi="Arial" w:cs="Arial"/>
@@ -3311,6 +3264,7 @@
           </w:tcPr>
           <w:p>
             <w:pPr>
+              <w:spacing w:line="480" w:lineRule="auto"/>
               <w:rPr>
                 <w:rFonts w:ascii="Arial" w:hAnsi="Arial" w:cs="Arial"/>
                 <w:sz w:val="22"/>
@@ -3325,11 +3279,13 @@
                 <w:szCs w:val="22"/>
                 <w:lang w:val="en-US"/>
               </w:rPr>
+              <w:lastRenderedPageBreak/>
               <w:t>TTFB</w:t>
             </w:r>
           </w:p>
           <w:p>
             <w:pPr>
+              <w:spacing w:line="480" w:lineRule="auto"/>
               <w:rPr>
                 <w:rFonts w:ascii="Arial" w:hAnsi="Arial" w:cs="Arial"/>
                 <w:sz w:val="22"/>
@@ -3340,8 +3296,9 @@
             <w:r>
               <w:rPr>
                 <w:rFonts w:ascii="Arial" w:hAnsi="Arial" w:cs="Arial"/>
-                <w:sz w:val="16"/>
-                <w:szCs w:val="16"/>
+                <w:sz w:val="22"/>
+                <w:szCs w:val="22"/>
+                <w:lang w:val="en-US"/>
               </w:rPr>
               <w:t>Time to First Byte</w:t>
             </w:r>
@@ -3353,6 +3310,7 @@
           </w:tcPr>
           <w:p>
             <w:pPr>
+              <w:spacing w:line="480" w:lineRule="auto"/>
               <w:cnfStyle w:val="000000000000" w:firstRow="0" w:lastRow="0" w:firstColumn="0" w:lastColumn="0" w:oddVBand="0" w:evenVBand="0" w:oddHBand="0" w:evenHBand="0" w:firstRowFirstColumn="0" w:firstRowLastColumn="0" w:lastRowFirstColumn="0" w:lastRowLastColumn="0"/>
               <w:rPr>
                 <w:rFonts w:ascii="Arial" w:hAnsi="Arial" w:cs="Arial"/>
@@ -3376,6 +3334,7 @@
           </w:tcPr>
           <w:p>
             <w:pPr>
+              <w:spacing w:line="480" w:lineRule="auto"/>
               <w:cnfStyle w:val="000000000000" w:firstRow="0" w:lastRow="0" w:firstColumn="0" w:lastColumn="0" w:oddVBand="0" w:evenVBand="0" w:oddHBand="0" w:evenHBand="0" w:firstRowFirstColumn="0" w:firstRowLastColumn="0" w:lastRowFirstColumn="0" w:lastRowLastColumn="0"/>
               <w:rPr>
                 <w:rFonts w:ascii="Arial" w:hAnsi="Arial" w:cs="Arial"/>
@@ -3399,6 +3358,7 @@
           </w:tcPr>
           <w:p>
             <w:pPr>
+              <w:spacing w:line="480" w:lineRule="auto"/>
               <w:cnfStyle w:val="000000000000" w:firstRow="0" w:lastRow="0" w:firstColumn="0" w:lastColumn="0" w:oddVBand="0" w:evenVBand="0" w:oddHBand="0" w:evenHBand="0" w:firstRowFirstColumn="0" w:firstRowLastColumn="0" w:lastRowFirstColumn="0" w:lastRowLastColumn="0"/>
               <w:rPr>
                 <w:rFonts w:ascii="Arial" w:hAnsi="Arial" w:cs="Arial"/>
@@ -3422,6 +3382,7 @@
           </w:tcPr>
           <w:p>
             <w:pPr>
+              <w:spacing w:line="480" w:lineRule="auto"/>
               <w:cnfStyle w:val="000000000000" w:firstRow="0" w:lastRow="0" w:firstColumn="0" w:lastColumn="0" w:oddVBand="0" w:evenVBand="0" w:oddHBand="0" w:evenHBand="0" w:firstRowFirstColumn="0" w:firstRowLastColumn="0" w:lastRowFirstColumn="0" w:lastRowLastColumn="0"/>
               <w:rPr>
                 <w:rFonts w:ascii="Arial" w:hAnsi="Arial" w:cs="Arial"/>
@@ -3445,6 +3406,7 @@
           </w:tcPr>
           <w:p>
             <w:pPr>
+              <w:spacing w:line="480" w:lineRule="auto"/>
               <w:cnfStyle w:val="000000000000" w:firstRow="0" w:lastRow="0" w:firstColumn="0" w:lastColumn="0" w:oddVBand="0" w:evenVBand="0" w:oddHBand="0" w:evenHBand="0" w:firstRowFirstColumn="0" w:firstRowLastColumn="0" w:lastRowFirstColumn="0" w:lastRowLastColumn="0"/>
               <w:rPr>
                 <w:rFonts w:ascii="Arial" w:hAnsi="Arial" w:cs="Arial"/>
@@ -3474,6 +3436,7 @@
           </w:tcPr>
           <w:p>
             <w:pPr>
+              <w:spacing w:line="480" w:lineRule="auto"/>
               <w:rPr>
                 <w:rFonts w:ascii="Arial" w:hAnsi="Arial" w:cs="Arial"/>
                 <w:sz w:val="22"/>
@@ -3491,6 +3454,7 @@
           </w:p>
           <w:p>
             <w:pPr>
+              <w:spacing w:line="480" w:lineRule="auto"/>
               <w:rPr>
                 <w:rFonts w:ascii="Arial" w:hAnsi="Arial" w:cs="Arial"/>
                 <w:sz w:val="22"/>
@@ -3500,8 +3464,8 @@
             <w:r>
               <w:rPr>
                 <w:rFonts w:ascii="Arial" w:hAnsi="Arial" w:cs="Arial"/>
-                <w:sz w:val="16"/>
-                <w:szCs w:val="16"/>
+                <w:sz w:val="22"/>
+                <w:szCs w:val="22"/>
               </w:rPr>
               <w:t>Time to Interactive</w:t>
             </w:r>
@@ -3513,6 +3477,7 @@
           </w:tcPr>
           <w:p>
             <w:pPr>
+              <w:spacing w:line="480" w:lineRule="auto"/>
               <w:cnfStyle w:val="000000100000" w:firstRow="0" w:lastRow="0" w:firstColumn="0" w:lastColumn="0" w:oddVBand="0" w:evenVBand="0" w:oddHBand="1" w:evenHBand="0" w:firstRowFirstColumn="0" w:firstRowLastColumn="0" w:lastRowFirstColumn="0" w:lastRowLastColumn="0"/>
               <w:rPr>
                 <w:rFonts w:ascii="Arial" w:hAnsi="Arial" w:cs="Arial"/>
@@ -3544,6 +3509,7 @@
           </w:tcPr>
           <w:p>
             <w:pPr>
+              <w:spacing w:line="480" w:lineRule="auto"/>
               <w:cnfStyle w:val="000000100000" w:firstRow="0" w:lastRow="0" w:firstColumn="0" w:lastColumn="0" w:oddVBand="0" w:evenVBand="0" w:oddHBand="1" w:evenHBand="0" w:firstRowFirstColumn="0" w:firstRowLastColumn="0" w:lastRowFirstColumn="0" w:lastRowLastColumn="0"/>
               <w:rPr>
                 <w:rFonts w:ascii="Arial" w:hAnsi="Arial" w:cs="Arial"/>
@@ -3567,6 +3533,7 @@
           </w:tcPr>
           <w:p>
             <w:pPr>
+              <w:spacing w:line="480" w:lineRule="auto"/>
               <w:cnfStyle w:val="000000100000" w:firstRow="0" w:lastRow="0" w:firstColumn="0" w:lastColumn="0" w:oddVBand="0" w:evenVBand="0" w:oddHBand="1" w:evenHBand="0" w:firstRowFirstColumn="0" w:firstRowLastColumn="0" w:lastRowFirstColumn="0" w:lastRowLastColumn="0"/>
               <w:rPr>
                 <w:rFonts w:ascii="Arial" w:hAnsi="Arial" w:cs="Arial"/>
@@ -3590,6 +3557,7 @@
           </w:tcPr>
           <w:p>
             <w:pPr>
+              <w:spacing w:line="480" w:lineRule="auto"/>
               <w:cnfStyle w:val="000000100000" w:firstRow="0" w:lastRow="0" w:firstColumn="0" w:lastColumn="0" w:oddVBand="0" w:evenVBand="0" w:oddHBand="1" w:evenHBand="0" w:firstRowFirstColumn="0" w:firstRowLastColumn="0" w:lastRowFirstColumn="0" w:lastRowLastColumn="0"/>
               <w:rPr>
                 <w:rFonts w:ascii="Arial" w:hAnsi="Arial" w:cs="Arial"/>
@@ -3613,6 +3581,7 @@
           </w:tcPr>
           <w:p>
             <w:pPr>
+              <w:spacing w:line="480" w:lineRule="auto"/>
               <w:cnfStyle w:val="000000100000" w:firstRow="0" w:lastRow="0" w:firstColumn="0" w:lastColumn="0" w:oddVBand="0" w:evenVBand="0" w:oddHBand="1" w:evenHBand="0" w:firstRowFirstColumn="0" w:firstRowLastColumn="0" w:lastRowFirstColumn="0" w:lastRowLastColumn="0"/>
               <w:rPr>
                 <w:rFonts w:ascii="Arial" w:hAnsi="Arial" w:cs="Arial"/>
@@ -3626,8 +3595,18 @@
                 <w:sz w:val="22"/>
                 <w:szCs w:val="22"/>
               </w:rPr>
-              <w:t>Solo lab</w:t>
+              <w:t xml:space="preserve">Solo </w:t>
             </w:r>
+            <w:proofErr w:type="spellStart"/>
+            <w:r>
+              <w:rPr>
+                <w:rFonts w:ascii="Arial" w:hAnsi="Arial" w:cs="Arial"/>
+                <w:sz w:val="22"/>
+                <w:szCs w:val="22"/>
+              </w:rPr>
+              <w:t>lab</w:t>
+            </w:r>
+            <w:proofErr w:type="spellEnd"/>
           </w:p>
         </w:tc>
       </w:tr>
@@ -3639,6 +3618,7 @@
           </w:tcPr>
           <w:p>
             <w:pPr>
+              <w:spacing w:line="480" w:lineRule="auto"/>
               <w:rPr>
                 <w:rFonts w:ascii="Arial" w:hAnsi="Arial" w:cs="Arial"/>
                 <w:sz w:val="22"/>
@@ -3656,6 +3636,7 @@
           </w:p>
           <w:p>
             <w:pPr>
+              <w:spacing w:line="480" w:lineRule="auto"/>
               <w:rPr>
                 <w:rFonts w:ascii="Arial" w:hAnsi="Arial" w:cs="Arial"/>
                 <w:sz w:val="22"/>
@@ -3665,8 +3646,8 @@
             <w:r>
               <w:rPr>
                 <w:rFonts w:ascii="Arial" w:hAnsi="Arial" w:cs="Arial"/>
-                <w:sz w:val="16"/>
-                <w:szCs w:val="16"/>
+                <w:sz w:val="22"/>
+                <w:szCs w:val="22"/>
               </w:rPr>
               <w:t>Total Blocking Time</w:t>
             </w:r>
@@ -3678,6 +3659,7 @@
           </w:tcPr>
           <w:p>
             <w:pPr>
+              <w:spacing w:line="480" w:lineRule="auto"/>
               <w:cnfStyle w:val="000000000000" w:firstRow="0" w:lastRow="0" w:firstColumn="0" w:lastColumn="0" w:oddVBand="0" w:evenVBand="0" w:oddHBand="0" w:evenHBand="0" w:firstRowFirstColumn="0" w:firstRowLastColumn="0" w:lastRowFirstColumn="0" w:lastRowLastColumn="0"/>
               <w:rPr>
                 <w:rFonts w:ascii="Arial" w:hAnsi="Arial" w:cs="Arial"/>
@@ -3701,6 +3683,7 @@
           </w:tcPr>
           <w:p>
             <w:pPr>
+              <w:spacing w:line="480" w:lineRule="auto"/>
               <w:cnfStyle w:val="000000000000" w:firstRow="0" w:lastRow="0" w:firstColumn="0" w:lastColumn="0" w:oddVBand="0" w:evenVBand="0" w:oddHBand="0" w:evenHBand="0" w:firstRowFirstColumn="0" w:firstRowLastColumn="0" w:lastRowFirstColumn="0" w:lastRowLastColumn="0"/>
               <w:rPr>
                 <w:rFonts w:ascii="Arial" w:hAnsi="Arial" w:cs="Arial"/>
@@ -3724,6 +3707,7 @@
           </w:tcPr>
           <w:p>
             <w:pPr>
+              <w:spacing w:line="480" w:lineRule="auto"/>
               <w:cnfStyle w:val="000000000000" w:firstRow="0" w:lastRow="0" w:firstColumn="0" w:lastColumn="0" w:oddVBand="0" w:evenVBand="0" w:oddHBand="0" w:evenHBand="0" w:firstRowFirstColumn="0" w:firstRowLastColumn="0" w:lastRowFirstColumn="0" w:lastRowLastColumn="0"/>
               <w:rPr>
                 <w:rFonts w:ascii="Arial" w:hAnsi="Arial" w:cs="Arial"/>
@@ -3747,6 +3731,7 @@
           </w:tcPr>
           <w:p>
             <w:pPr>
+              <w:spacing w:line="480" w:lineRule="auto"/>
               <w:cnfStyle w:val="000000000000" w:firstRow="0" w:lastRow="0" w:firstColumn="0" w:lastColumn="0" w:oddVBand="0" w:evenVBand="0" w:oddHBand="0" w:evenHBand="0" w:firstRowFirstColumn="0" w:firstRowLastColumn="0" w:lastRowFirstColumn="0" w:lastRowLastColumn="0"/>
               <w:rPr>
                 <w:rFonts w:ascii="Arial" w:hAnsi="Arial" w:cs="Arial"/>
@@ -3770,6 +3755,7 @@
           </w:tcPr>
           <w:p>
             <w:pPr>
+              <w:spacing w:line="480" w:lineRule="auto"/>
               <w:cnfStyle w:val="000000000000" w:firstRow="0" w:lastRow="0" w:firstColumn="0" w:lastColumn="0" w:oddVBand="0" w:evenVBand="0" w:oddHBand="0" w:evenHBand="0" w:firstRowFirstColumn="0" w:firstRowLastColumn="0" w:lastRowFirstColumn="0" w:lastRowLastColumn="0"/>
               <w:rPr>
                 <w:rFonts w:ascii="Arial" w:hAnsi="Arial" w:cs="Arial"/>
@@ -3936,38 +3922,187 @@
     </w:p>
     <w:p>
       <w:pPr>
-        <w:rPr>
-          <w:rFonts w:ascii="Arial" w:hAnsi="Arial" w:cs="Arial"/>
-          <w:sz w:val="22"/>
-          <w:szCs w:val="22"/>
-        </w:rPr>
-      </w:pPr>
-    </w:p>
-    <w:p>
-      <w:pPr>
-        <w:rPr>
-          <w:rFonts w:ascii="Arial" w:hAnsi="Arial" w:cs="Arial"/>
-          <w:sz w:val="22"/>
-          <w:szCs w:val="22"/>
-        </w:rPr>
-      </w:pPr>
-      <w:r>
+        <w:pStyle w:val="Ttulo2"/>
         <w:rPr>
           <w:rFonts w:ascii="Arial" w:hAnsi="Arial" w:cs="Arial"/>
           <w:b/>
           <w:bCs/>
-          <w:sz w:val="22"/>
-          <w:szCs w:val="22"/>
-        </w:rPr>
-        <w:t>4.5 Ecosistema actual</w:t>
-      </w:r>
-      <w:r>
-        <w:rPr>
-          <w:rFonts w:ascii="Arial" w:hAnsi="Arial" w:cs="Arial"/>
-          <w:sz w:val="22"/>
-          <w:szCs w:val="22"/>
-        </w:rPr>
-        <w:t xml:space="preserve"> Estado de adopción en la industria, versión estable, tendencias verificables (</w:t>
+          <w:color w:val="auto"/>
+          <w:sz w:val="22"/>
+          <w:szCs w:val="22"/>
+        </w:rPr>
+      </w:pPr>
+      <w:r>
+        <w:rPr>
+          <w:rFonts w:ascii="Arial" w:hAnsi="Arial" w:cs="Arial"/>
+          <w:b/>
+          <w:bCs/>
+          <w:color w:val="auto"/>
+          <w:sz w:val="22"/>
+          <w:szCs w:val="22"/>
+        </w:rPr>
+        <w:t xml:space="preserve">Ecosistema actual </w:t>
+      </w:r>
+    </w:p>
+    <w:p>
+      <w:pPr>
+        <w:ind w:firstLine="720"/>
+        <w:rPr>
+          <w:rFonts w:ascii="Arial" w:hAnsi="Arial" w:cs="Arial"/>
+          <w:sz w:val="22"/>
+          <w:szCs w:val="22"/>
+        </w:rPr>
+      </w:pPr>
+      <w:r>
+        <w:rPr>
+          <w:rFonts w:ascii="Arial" w:hAnsi="Arial" w:cs="Arial"/>
+          <w:sz w:val="22"/>
+          <w:szCs w:val="22"/>
+        </w:rPr>
+        <w:t>El ecosistema actual de Core Web Vitals (CWV) se basa en tres métricas estables evaluadas en el percentil \(75\) de las cargas de usuarios reales. A nivel de industria, la tasa de adopción de sitios que aprueban todas las métricas ronda el 52% en dispositivos móviles y el 59% en equipos de escritorio.</w:t>
+      </w:r>
+      <w:r>
+        <w:rPr>
+          <w:rFonts w:ascii="Arial" w:hAnsi="Arial" w:cs="Arial"/>
+          <w:sz w:val="22"/>
+          <w:szCs w:val="22"/>
+        </w:rPr>
+        <w:t xml:space="preserve"> </w:t>
+      </w:r>
+      <w:sdt>
+        <w:sdtPr>
+          <w:rPr>
+            <w:rFonts w:ascii="Arial" w:hAnsi="Arial" w:cs="Arial"/>
+            <w:sz w:val="22"/>
+            <w:szCs w:val="22"/>
+          </w:rPr>
+          <w:id w:val="-740865022"/>
+          <w:citation/>
+        </w:sdtPr>
+        <w:sdtEndPr/>
+        <w:sdtContent>
+          <w:r>
+            <w:rPr>
+              <w:rFonts w:ascii="Arial" w:hAnsi="Arial" w:cs="Arial"/>
+              <w:sz w:val="22"/>
+              <w:szCs w:val="22"/>
+            </w:rPr>
+            <w:fldChar w:fldCharType="begin"/>
+          </w:r>
+          <w:r>
+            <w:rPr>
+              <w:rFonts w:ascii="Arial" w:hAnsi="Arial" w:cs="Arial"/>
+              <w:sz w:val="22"/>
+              <w:szCs w:val="22"/>
+            </w:rPr>
+            <w:instrText xml:space="preserve"> CITATION Arj261 \l 5130 </w:instrText>
+          </w:r>
+          <w:r>
+            <w:rPr>
+              <w:rFonts w:ascii="Arial" w:hAnsi="Arial" w:cs="Arial"/>
+              <w:sz w:val="22"/>
+              <w:szCs w:val="22"/>
+            </w:rPr>
+            <w:fldChar w:fldCharType="separate"/>
+          </w:r>
+          <w:r>
+            <w:rPr>
+              <w:rFonts w:ascii="Arial" w:hAnsi="Arial" w:cs="Arial"/>
+              <w:sz w:val="22"/>
+              <w:szCs w:val="22"/>
+            </w:rPr>
+            <w:t>(Karel, corewebvitals.io, 2026)</w:t>
+          </w:r>
+          <w:r>
+            <w:rPr>
+              <w:rFonts w:ascii="Arial" w:hAnsi="Arial" w:cs="Arial"/>
+              <w:sz w:val="22"/>
+              <w:szCs w:val="22"/>
+            </w:rPr>
+            <w:fldChar w:fldCharType="end"/>
+          </w:r>
+        </w:sdtContent>
+      </w:sdt>
+    </w:p>
+    <w:p>
+      <w:pPr>
+        <w:pStyle w:val="Ttulo3"/>
+        <w:rPr>
+          <w:rFonts w:ascii="Arial" w:hAnsi="Arial" w:cs="Arial"/>
+          <w:b/>
+          <w:bCs/>
+          <w:color w:val="auto"/>
+          <w:sz w:val="22"/>
+          <w:szCs w:val="22"/>
+        </w:rPr>
+      </w:pPr>
+      <w:r>
+        <w:rPr>
+          <w:rFonts w:ascii="Arial" w:hAnsi="Arial" w:cs="Arial"/>
+          <w:b/>
+          <w:bCs/>
+          <w:color w:val="auto"/>
+          <w:sz w:val="22"/>
+          <w:szCs w:val="22"/>
+        </w:rPr>
+        <w:lastRenderedPageBreak/>
+        <w:t xml:space="preserve">Versiones estables de las </w:t>
+      </w:r>
+      <w:r>
+        <w:rPr>
+          <w:rFonts w:ascii="Arial" w:hAnsi="Arial" w:cs="Arial"/>
+          <w:b/>
+          <w:bCs/>
+          <w:color w:val="auto"/>
+          <w:sz w:val="22"/>
+          <w:szCs w:val="22"/>
+        </w:rPr>
+        <w:t>métricas</w:t>
+      </w:r>
+      <w:r>
+        <w:rPr>
+          <w:rFonts w:ascii="Arial" w:hAnsi="Arial" w:cs="Arial"/>
+          <w:b/>
+          <w:bCs/>
+          <w:color w:val="auto"/>
+          <w:sz w:val="22"/>
+          <w:szCs w:val="22"/>
+        </w:rPr>
+        <w:t>.</w:t>
+      </w:r>
+    </w:p>
+    <w:p>
+      <w:pPr>
+        <w:ind w:firstLine="720"/>
+        <w:rPr>
+          <w:rFonts w:ascii="Arial" w:hAnsi="Arial" w:cs="Arial"/>
+          <w:sz w:val="22"/>
+          <w:szCs w:val="22"/>
+        </w:rPr>
+      </w:pPr>
+      <w:r>
+        <w:rPr>
+          <w:rFonts w:ascii="Arial" w:hAnsi="Arial" w:cs="Arial"/>
+          <w:sz w:val="22"/>
+          <w:szCs w:val="22"/>
+        </w:rPr>
+        <w:t xml:space="preserve">Las tres métricas que conforman las versiones estables de las CWV son el </w:t>
+      </w:r>
+      <w:r>
+        <w:rPr>
+          <w:rFonts w:ascii="Arial" w:hAnsi="Arial" w:cs="Arial"/>
+          <w:sz w:val="22"/>
+          <w:szCs w:val="22"/>
+        </w:rPr>
+        <w:t>Largest Contentful Paint</w:t>
+      </w:r>
+      <w:r>
+        <w:rPr>
+          <w:rFonts w:ascii="Arial" w:hAnsi="Arial" w:cs="Arial"/>
+          <w:sz w:val="22"/>
+          <w:szCs w:val="22"/>
+        </w:rPr>
+        <w:t xml:space="preserve"> (LCP), el </w:t>
       </w:r>
       <w:proofErr w:type="spellStart"/>
       <w:r>
@@ -3976,6 +4111,442 @@
           <w:sz w:val="22"/>
           <w:szCs w:val="22"/>
         </w:rPr>
+        <w:t>Interaction</w:t>
+      </w:r>
+      <w:proofErr w:type="spellEnd"/>
+      <w:r>
+        <w:rPr>
+          <w:rFonts w:ascii="Arial" w:hAnsi="Arial" w:cs="Arial"/>
+          <w:sz w:val="22"/>
+          <w:szCs w:val="22"/>
+        </w:rPr>
+        <w:t xml:space="preserve"> to Next Paint</w:t>
+      </w:r>
+      <w:r>
+        <w:rPr>
+          <w:rFonts w:ascii="Arial" w:hAnsi="Arial" w:cs="Arial"/>
+          <w:sz w:val="22"/>
+          <w:szCs w:val="22"/>
+        </w:rPr>
+        <w:t xml:space="preserve"> (INP) y el </w:t>
+      </w:r>
+      <w:r>
+        <w:rPr>
+          <w:rFonts w:ascii="Arial" w:hAnsi="Arial" w:cs="Arial"/>
+          <w:sz w:val="22"/>
+          <w:szCs w:val="22"/>
+        </w:rPr>
+        <w:t>Cumulative Layout Shift</w:t>
+      </w:r>
+      <w:r>
+        <w:rPr>
+          <w:rFonts w:ascii="Arial" w:hAnsi="Arial" w:cs="Arial"/>
+          <w:sz w:val="22"/>
+          <w:szCs w:val="22"/>
+        </w:rPr>
+        <w:t xml:space="preserve"> (CLS). El LCP mide el rendimiento de carga, con un objetivo ideal menor a 2.5 segundos; el INP mide la capacidad de respuesta e interactividad, con un umbral de 200 milisegundos, siendo estable desde marzo de 2024, cuando reemplazó definitivamente al </w:t>
+      </w:r>
+      <w:r>
+        <w:rPr>
+          <w:rFonts w:ascii="Arial" w:hAnsi="Arial" w:cs="Arial"/>
+          <w:sz w:val="22"/>
+          <w:szCs w:val="22"/>
+        </w:rPr>
+        <w:t>First Input Delay</w:t>
+      </w:r>
+      <w:r>
+        <w:rPr>
+          <w:rFonts w:ascii="Arial" w:hAnsi="Arial" w:cs="Arial"/>
+          <w:sz w:val="22"/>
+          <w:szCs w:val="22"/>
+        </w:rPr>
+        <w:t xml:space="preserve"> (FID); y el CLS mide la estabilidad visual evaluando los cambios de diseño no esperados, con una puntuación ideal de 0.1 o menor </w:t>
+      </w:r>
+      <w:sdt>
+        <w:sdtPr>
+          <w:rPr>
+            <w:rFonts w:ascii="Arial" w:hAnsi="Arial" w:cs="Arial"/>
+            <w:sz w:val="22"/>
+            <w:szCs w:val="22"/>
+          </w:rPr>
+          <w:id w:val="-1403679813"/>
+          <w:citation/>
+        </w:sdtPr>
+        <w:sdtEndPr/>
+        <w:sdtContent>
+          <w:r>
+            <w:rPr>
+              <w:rFonts w:ascii="Arial" w:hAnsi="Arial" w:cs="Arial"/>
+              <w:sz w:val="22"/>
+              <w:szCs w:val="22"/>
+            </w:rPr>
+            <w:fldChar w:fldCharType="begin"/>
+          </w:r>
+          <w:r>
+            <w:rPr>
+              <w:rFonts w:ascii="Arial" w:hAnsi="Arial" w:cs="Arial"/>
+              <w:sz w:val="22"/>
+              <w:szCs w:val="22"/>
+            </w:rPr>
+            <w:instrText xml:space="preserve"> CITATION Goo25 \l 5130 </w:instrText>
+          </w:r>
+          <w:r>
+            <w:rPr>
+              <w:rFonts w:ascii="Arial" w:hAnsi="Arial" w:cs="Arial"/>
+              <w:sz w:val="22"/>
+              <w:szCs w:val="22"/>
+            </w:rPr>
+            <w:fldChar w:fldCharType="separate"/>
+          </w:r>
+          <w:r>
+            <w:rPr>
+              <w:rFonts w:ascii="Arial" w:hAnsi="Arial" w:cs="Arial"/>
+              <w:sz w:val="22"/>
+              <w:szCs w:val="22"/>
+            </w:rPr>
+            <w:t>(Google, 2025)</w:t>
+          </w:r>
+          <w:r>
+            <w:rPr>
+              <w:rFonts w:ascii="Arial" w:hAnsi="Arial" w:cs="Arial"/>
+              <w:sz w:val="22"/>
+              <w:szCs w:val="22"/>
+            </w:rPr>
+            <w:fldChar w:fldCharType="end"/>
+          </w:r>
+        </w:sdtContent>
+      </w:sdt>
+    </w:p>
+    <w:p>
+      <w:pPr>
+        <w:pStyle w:val="Ttulo3"/>
+        <w:rPr>
+          <w:rFonts w:ascii="Arial" w:hAnsi="Arial" w:cs="Arial"/>
+          <w:b/>
+          <w:bCs/>
+          <w:color w:val="auto"/>
+          <w:sz w:val="22"/>
+          <w:szCs w:val="22"/>
+        </w:rPr>
+      </w:pPr>
+      <w:r>
+        <w:rPr>
+          <w:rFonts w:ascii="Arial" w:hAnsi="Arial" w:cs="Arial"/>
+          <w:b/>
+          <w:bCs/>
+          <w:color w:val="auto"/>
+          <w:sz w:val="22"/>
+          <w:szCs w:val="22"/>
+        </w:rPr>
+        <w:t>Estado de Adopción y tendencias en la industria</w:t>
+      </w:r>
+      <w:r>
+        <w:rPr>
+          <w:rFonts w:ascii="Arial" w:hAnsi="Arial" w:cs="Arial"/>
+          <w:b/>
+          <w:bCs/>
+          <w:color w:val="auto"/>
+          <w:sz w:val="22"/>
+          <w:szCs w:val="22"/>
+        </w:rPr>
+        <w:t>.</w:t>
+      </w:r>
+    </w:p>
+    <w:p>
+      <w:pPr>
+        <w:ind w:firstLine="720"/>
+        <w:rPr>
+          <w:rFonts w:ascii="Arial" w:hAnsi="Arial" w:cs="Arial"/>
+          <w:sz w:val="22"/>
+          <w:szCs w:val="22"/>
+        </w:rPr>
+      </w:pPr>
+      <w:r>
+        <w:rPr>
+          <w:rFonts w:ascii="Arial" w:hAnsi="Arial" w:cs="Arial"/>
+          <w:sz w:val="22"/>
+          <w:szCs w:val="22"/>
+        </w:rPr>
+        <w:t xml:space="preserve">La optimización ha dejado de ser opcional y es un factor clave tanto para el posicionamiento orgánico (SEO) como para el rendimiento comercial. </w:t>
+      </w:r>
+    </w:p>
+    <w:p>
+      <w:pPr>
+        <w:ind w:firstLine="720"/>
+        <w:rPr>
+          <w:rFonts w:ascii="Arial" w:hAnsi="Arial" w:cs="Arial"/>
+          <w:sz w:val="22"/>
+          <w:szCs w:val="22"/>
+        </w:rPr>
+      </w:pPr>
+      <w:r>
+        <w:rPr>
+          <w:rFonts w:ascii="Arial" w:hAnsi="Arial" w:cs="Arial"/>
+          <w:sz w:val="22"/>
+          <w:szCs w:val="22"/>
+        </w:rPr>
+        <w:t>Estado de adopción global (</w:t>
+      </w:r>
+      <w:proofErr w:type="spellStart"/>
+      <w:r>
+        <w:rPr>
+          <w:rFonts w:ascii="Arial" w:hAnsi="Arial" w:cs="Arial"/>
+          <w:sz w:val="22"/>
+          <w:szCs w:val="22"/>
+        </w:rPr>
+        <w:t>CrUX</w:t>
+      </w:r>
+      <w:proofErr w:type="spellEnd"/>
+      <w:r>
+        <w:rPr>
+          <w:rFonts w:ascii="Arial" w:hAnsi="Arial" w:cs="Arial"/>
+          <w:sz w:val="22"/>
+          <w:szCs w:val="22"/>
+        </w:rPr>
+        <w:t xml:space="preserve"> / HTTP Archive): Los datos de campo oficiales del Chrome UX Report (</w:t>
+      </w:r>
+      <w:proofErr w:type="spellStart"/>
+      <w:r>
+        <w:rPr>
+          <w:rFonts w:ascii="Arial" w:hAnsi="Arial" w:cs="Arial"/>
+          <w:sz w:val="22"/>
+          <w:szCs w:val="22"/>
+        </w:rPr>
+        <w:t>CrUX</w:t>
+      </w:r>
+      <w:proofErr w:type="spellEnd"/>
+      <w:r>
+        <w:rPr>
+          <w:rFonts w:ascii="Arial" w:hAnsi="Arial" w:cs="Arial"/>
+          <w:sz w:val="22"/>
+          <w:szCs w:val="22"/>
+        </w:rPr>
+        <w:t>) muestran que cerca del 52% de los orígenes web en móviles aprueban todas las métricas, mientras que en escritorio la cifra asciende al 58.8%.</w:t>
+      </w:r>
+      <w:r>
+        <w:rPr>
+          <w:rFonts w:ascii="Arial" w:hAnsi="Arial" w:cs="Arial"/>
+          <w:sz w:val="22"/>
+          <w:szCs w:val="22"/>
+        </w:rPr>
+        <w:t xml:space="preserve"> </w:t>
+      </w:r>
+      <w:sdt>
+        <w:sdtPr>
+          <w:rPr>
+            <w:rFonts w:ascii="Arial" w:hAnsi="Arial" w:cs="Arial"/>
+            <w:sz w:val="22"/>
+            <w:szCs w:val="22"/>
+          </w:rPr>
+          <w:id w:val="-1484620416"/>
+          <w:citation/>
+        </w:sdtPr>
+        <w:sdtEndPr/>
+        <w:sdtContent>
+          <w:r>
+            <w:rPr>
+              <w:rFonts w:ascii="Arial" w:hAnsi="Arial" w:cs="Arial"/>
+              <w:sz w:val="22"/>
+              <w:szCs w:val="22"/>
+            </w:rPr>
+            <w:fldChar w:fldCharType="begin"/>
+          </w:r>
+          <w:r>
+            <w:rPr>
+              <w:rFonts w:ascii="Arial" w:hAnsi="Arial" w:cs="Arial"/>
+              <w:sz w:val="22"/>
+              <w:szCs w:val="22"/>
+            </w:rPr>
+            <w:instrText xml:space="preserve"> CITATION htt \l 5130 </w:instrText>
+          </w:r>
+          <w:r>
+            <w:rPr>
+              <w:rFonts w:ascii="Arial" w:hAnsi="Arial" w:cs="Arial"/>
+              <w:sz w:val="22"/>
+              <w:szCs w:val="22"/>
+            </w:rPr>
+            <w:fldChar w:fldCharType="separate"/>
+          </w:r>
+          <w:r>
+            <w:rPr>
+              <w:rFonts w:ascii="Arial" w:hAnsi="Arial" w:cs="Arial"/>
+              <w:sz w:val="22"/>
+              <w:szCs w:val="22"/>
+            </w:rPr>
+            <w:t>(httpArchive, s.f.)</w:t>
+          </w:r>
+          <w:r>
+            <w:rPr>
+              <w:rFonts w:ascii="Arial" w:hAnsi="Arial" w:cs="Arial"/>
+              <w:sz w:val="22"/>
+              <w:szCs w:val="22"/>
+            </w:rPr>
+            <w:fldChar w:fldCharType="end"/>
+          </w:r>
+        </w:sdtContent>
+      </w:sdt>
+    </w:p>
+    <w:p>
+      <w:pPr>
+        <w:ind w:firstLine="720"/>
+        <w:rPr>
+          <w:rFonts w:ascii="Arial" w:hAnsi="Arial" w:cs="Arial"/>
+          <w:sz w:val="22"/>
+          <w:szCs w:val="22"/>
+        </w:rPr>
+      </w:pPr>
+      <w:r>
+        <w:rPr>
+          <w:rFonts w:ascii="Arial" w:hAnsi="Arial" w:cs="Arial"/>
+          <w:sz w:val="22"/>
+          <w:szCs w:val="22"/>
+        </w:rPr>
+        <w:t>Tendencia de métricas individuales: El LCP sigue siendo el mayor desafío, superado solo por el \(69\%\) de los sitios. El CLS muestra las tasas más altas de mejora, con más del \(81\%\) de los dominios cumpliendo los estándares. El INP refleja una adopción positiva y estable desde su integración, con un \(87\%\) de los dominios ofreciendo una buena experiencia.</w:t>
+      </w:r>
+      <w:r>
+        <w:rPr>
+          <w:rFonts w:ascii="Arial" w:hAnsi="Arial" w:cs="Arial"/>
+          <w:sz w:val="22"/>
+          <w:szCs w:val="22"/>
+        </w:rPr>
+        <w:t xml:space="preserve"> </w:t>
+      </w:r>
+      <w:sdt>
+        <w:sdtPr>
+          <w:rPr>
+            <w:rFonts w:ascii="Arial" w:hAnsi="Arial" w:cs="Arial"/>
+            <w:sz w:val="22"/>
+            <w:szCs w:val="22"/>
+          </w:rPr>
+          <w:id w:val="1722012624"/>
+          <w:citation/>
+        </w:sdtPr>
+        <w:sdtEndPr/>
+        <w:sdtContent>
+          <w:r>
+            <w:rPr>
+              <w:rFonts w:ascii="Arial" w:hAnsi="Arial" w:cs="Arial"/>
+              <w:sz w:val="22"/>
+              <w:szCs w:val="22"/>
+            </w:rPr>
+            <w:fldChar w:fldCharType="begin"/>
+          </w:r>
+          <w:r>
+            <w:rPr>
+              <w:rFonts w:ascii="Arial" w:hAnsi="Arial" w:cs="Arial"/>
+              <w:sz w:val="22"/>
+              <w:szCs w:val="22"/>
+            </w:rPr>
+            <w:instrText xml:space="preserve"> CITATION Goo25 \l 5130 </w:instrText>
+          </w:r>
+          <w:r>
+            <w:rPr>
+              <w:rFonts w:ascii="Arial" w:hAnsi="Arial" w:cs="Arial"/>
+              <w:sz w:val="22"/>
+              <w:szCs w:val="22"/>
+            </w:rPr>
+            <w:fldChar w:fldCharType="separate"/>
+          </w:r>
+          <w:r>
+            <w:rPr>
+              <w:rFonts w:ascii="Arial" w:hAnsi="Arial" w:cs="Arial"/>
+              <w:sz w:val="22"/>
+              <w:szCs w:val="22"/>
+            </w:rPr>
+            <w:t>(Google, 2025)</w:t>
+          </w:r>
+          <w:r>
+            <w:rPr>
+              <w:rFonts w:ascii="Arial" w:hAnsi="Arial" w:cs="Arial"/>
+              <w:sz w:val="22"/>
+              <w:szCs w:val="22"/>
+            </w:rPr>
+            <w:fldChar w:fldCharType="end"/>
+          </w:r>
+        </w:sdtContent>
+      </w:sdt>
+    </w:p>
+    <w:p>
+      <w:pPr>
+        <w:pStyle w:val="Ttulo3"/>
+        <w:rPr>
+          <w:rFonts w:ascii="Arial" w:hAnsi="Arial" w:cs="Arial"/>
+          <w:b/>
+          <w:bCs/>
+          <w:color w:val="auto"/>
+          <w:sz w:val="22"/>
+          <w:szCs w:val="22"/>
+        </w:rPr>
+      </w:pPr>
+      <w:r>
+        <w:rPr>
+          <w:rFonts w:ascii="Arial" w:hAnsi="Arial" w:cs="Arial"/>
+          <w:b/>
+          <w:bCs/>
+          <w:color w:val="auto"/>
+          <w:sz w:val="22"/>
+          <w:szCs w:val="22"/>
+        </w:rPr>
+        <w:t>Ecosistema y Tendencias Tecnológicas</w:t>
+      </w:r>
+      <w:r>
+        <w:rPr>
+          <w:rFonts w:ascii="Arial" w:hAnsi="Arial" w:cs="Arial"/>
+          <w:b/>
+          <w:bCs/>
+          <w:color w:val="auto"/>
+          <w:sz w:val="22"/>
+          <w:szCs w:val="22"/>
+        </w:rPr>
+        <w:t>.</w:t>
+      </w:r>
+    </w:p>
+    <w:p>
+      <w:pPr>
+        <w:pStyle w:val="Prrafodelista"/>
+        <w:numPr>
+          <w:ilvl w:val="0"/>
+          <w:numId w:val="3"/>
+        </w:numPr>
+        <w:rPr>
+          <w:rFonts w:ascii="Arial" w:hAnsi="Arial" w:cs="Arial"/>
+          <w:sz w:val="22"/>
+          <w:szCs w:val="22"/>
+        </w:rPr>
+      </w:pPr>
+      <w:r>
+        <w:rPr>
+          <w:rFonts w:ascii="Arial" w:hAnsi="Arial" w:cs="Arial"/>
+          <w:sz w:val="22"/>
+          <w:szCs w:val="22"/>
+        </w:rPr>
+        <w:t>Librería web-</w:t>
+      </w:r>
+      <w:proofErr w:type="spellStart"/>
+      <w:r>
+        <w:rPr>
+          <w:rFonts w:ascii="Arial" w:hAnsi="Arial" w:cs="Arial"/>
+          <w:sz w:val="22"/>
+          <w:szCs w:val="22"/>
+        </w:rPr>
+        <w:t>vitals</w:t>
+      </w:r>
+      <w:proofErr w:type="spellEnd"/>
+      <w:r>
+        <w:rPr>
+          <w:rFonts w:ascii="Arial" w:hAnsi="Arial" w:cs="Arial"/>
+          <w:sz w:val="22"/>
+          <w:szCs w:val="22"/>
+        </w:rPr>
+        <w:t xml:space="preserve"> (</w:t>
+      </w:r>
+      <w:proofErr w:type="spellStart"/>
+      <w:r>
+        <w:rPr>
+          <w:rFonts w:ascii="Arial" w:hAnsi="Arial" w:cs="Arial"/>
+          <w:sz w:val="22"/>
+          <w:szCs w:val="22"/>
+        </w:rPr>
         <w:t>npm</w:t>
       </w:r>
       <w:proofErr w:type="spellEnd"/>
@@ -3985,62 +4556,301 @@
           <w:sz w:val="22"/>
           <w:szCs w:val="22"/>
         </w:rPr>
+        <w:t xml:space="preserve">): En el entorno de desarrollo, la librería oficial @google/web-vitals mantiene un ritmo de descarga constante y elevado. Su adopción es estándar en </w:t>
+      </w:r>
+      <w:r>
+        <w:rPr>
+          <w:rFonts w:ascii="Arial" w:hAnsi="Arial" w:cs="Arial"/>
+          <w:sz w:val="22"/>
+          <w:szCs w:val="22"/>
+        </w:rPr>
+        <w:lastRenderedPageBreak/>
+        <w:t>el ecosistema JavaScript para registrar el rendimiento de usuarios reales (RUM) y enviar dichos eventos a herramientas como Google Analytics</w:t>
+      </w:r>
+      <w:r>
+        <w:rPr>
+          <w:rFonts w:ascii="Arial" w:hAnsi="Arial" w:cs="Arial"/>
+          <w:sz w:val="22"/>
+          <w:szCs w:val="22"/>
+        </w:rPr>
+        <w:t xml:space="preserve">. </w:t>
+      </w:r>
+    </w:p>
+    <w:p>
+      <w:pPr>
+        <w:pStyle w:val="Prrafodelista"/>
+        <w:numPr>
+          <w:ilvl w:val="0"/>
+          <w:numId w:val="3"/>
+        </w:numPr>
+        <w:rPr>
+          <w:rFonts w:ascii="Arial" w:hAnsi="Arial" w:cs="Arial"/>
+          <w:sz w:val="22"/>
+          <w:szCs w:val="22"/>
+        </w:rPr>
+      </w:pPr>
+      <w:r>
+        <w:rPr>
+          <w:rFonts w:ascii="Arial" w:hAnsi="Arial" w:cs="Arial"/>
+          <w:sz w:val="22"/>
+          <w:szCs w:val="22"/>
+        </w:rPr>
+        <w:t xml:space="preserve">Ecosistema Frontend (State of JS / Frameworks):Frameworks como Next.js (con las mejoras en Server Components), </w:t>
+      </w:r>
+      <w:proofErr w:type="spellStart"/>
+      <w:r>
+        <w:rPr>
+          <w:rFonts w:ascii="Arial" w:hAnsi="Arial" w:cs="Arial"/>
+          <w:sz w:val="22"/>
+          <w:szCs w:val="22"/>
+        </w:rPr>
+        <w:t>Nuxt</w:t>
+      </w:r>
+      <w:proofErr w:type="spellEnd"/>
+      <w:r>
+        <w:rPr>
+          <w:rFonts w:ascii="Arial" w:hAnsi="Arial" w:cs="Arial"/>
+          <w:sz w:val="22"/>
+          <w:szCs w:val="22"/>
+        </w:rPr>
+        <w:t>, y herramientas de compilación como Vite, priorizan por defecto la división de código (</w:t>
+      </w:r>
+      <w:proofErr w:type="spellStart"/>
+      <w:r>
+        <w:rPr>
+          <w:rFonts w:ascii="Arial" w:hAnsi="Arial" w:cs="Arial"/>
+          <w:sz w:val="22"/>
+          <w:szCs w:val="22"/>
+        </w:rPr>
+        <w:t>code-splitting</w:t>
+      </w:r>
+      <w:proofErr w:type="spellEnd"/>
+      <w:r>
+        <w:rPr>
+          <w:rFonts w:ascii="Arial" w:hAnsi="Arial" w:cs="Arial"/>
+          <w:sz w:val="22"/>
+          <w:szCs w:val="22"/>
+        </w:rPr>
+        <w:t>) y la optimización de activos estáticos para garantizar el cumplimiento de los umbrales de LCP y CLS.</w:t>
+      </w:r>
+      <w:r>
+        <w:rPr>
+          <w:rFonts w:ascii="Arial" w:hAnsi="Arial" w:cs="Arial"/>
+          <w:sz w:val="22"/>
+          <w:szCs w:val="22"/>
+        </w:rPr>
         <w:t xml:space="preserve"> </w:t>
       </w:r>
-      <w:proofErr w:type="spellStart"/>
-      <w:r>
-        <w:rPr>
-          <w:rFonts w:ascii="Arial" w:hAnsi="Arial" w:cs="Arial"/>
-          <w:sz w:val="22"/>
-          <w:szCs w:val="22"/>
-        </w:rPr>
-        <w:t>trends</w:t>
-      </w:r>
-      <w:proofErr w:type="spellEnd"/>
-      <w:r>
-        <w:rPr>
-          <w:rFonts w:ascii="Arial" w:hAnsi="Arial" w:cs="Arial"/>
-          <w:sz w:val="22"/>
-          <w:szCs w:val="22"/>
-        </w:rPr>
-        <w:t xml:space="preserve">, State of JS, </w:t>
-      </w:r>
-      <w:proofErr w:type="spellStart"/>
-      <w:r>
-        <w:rPr>
-          <w:rFonts w:ascii="Arial" w:hAnsi="Arial" w:cs="Arial"/>
-          <w:sz w:val="22"/>
-          <w:szCs w:val="22"/>
-        </w:rPr>
-        <w:t>CrUX</w:t>
-      </w:r>
-      <w:proofErr w:type="spellEnd"/>
-      <w:r>
-        <w:rPr>
-          <w:rFonts w:ascii="Arial" w:hAnsi="Arial" w:cs="Arial"/>
-          <w:sz w:val="22"/>
-          <w:szCs w:val="22"/>
-        </w:rPr>
-        <w:t>).</w:t>
-      </w:r>
-    </w:p>
-    <w:p>
-      <w:pPr>
-        <w:rPr>
-          <w:rFonts w:ascii="Arial" w:hAnsi="Arial" w:cs="Arial"/>
-          <w:sz w:val="22"/>
-          <w:szCs w:val="22"/>
-        </w:rPr>
-      </w:pPr>
-    </w:p>
-    <w:p>
-      <w:pPr>
-        <w:rPr>
-          <w:rFonts w:ascii="Arial" w:hAnsi="Arial" w:cs="Arial"/>
-          <w:sz w:val="22"/>
-          <w:szCs w:val="22"/>
-        </w:rPr>
-      </w:pPr>
+      <w:sdt>
+        <w:sdtPr>
+          <w:rPr>
+            <w:rFonts w:ascii="Arial" w:hAnsi="Arial" w:cs="Arial"/>
+            <w:sz w:val="22"/>
+            <w:szCs w:val="22"/>
+          </w:rPr>
+          <w:id w:val="-1488234229"/>
+          <w:citation/>
+        </w:sdtPr>
+        <w:sdtEndPr/>
+        <w:sdtContent>
+          <w:r>
+            <w:rPr>
+              <w:rFonts w:ascii="Arial" w:hAnsi="Arial" w:cs="Arial"/>
+              <w:sz w:val="22"/>
+              <w:szCs w:val="22"/>
+            </w:rPr>
+            <w:fldChar w:fldCharType="begin"/>
+          </w:r>
+          <w:r>
+            <w:rPr>
+              <w:rFonts w:ascii="Arial" w:hAnsi="Arial" w:cs="Arial"/>
+              <w:sz w:val="22"/>
+              <w:szCs w:val="22"/>
+            </w:rPr>
+            <w:instrText xml:space="preserve"> CITATION Kev25 \l 5130 </w:instrText>
+          </w:r>
+          <w:r>
+            <w:rPr>
+              <w:rFonts w:ascii="Arial" w:hAnsi="Arial" w:cs="Arial"/>
+              <w:sz w:val="22"/>
+              <w:szCs w:val="22"/>
+            </w:rPr>
+            <w:fldChar w:fldCharType="separate"/>
+          </w:r>
+          <w:r>
+            <w:rPr>
+              <w:rFonts w:ascii="Arial" w:hAnsi="Arial" w:cs="Arial"/>
+              <w:noProof/>
+              <w:sz w:val="22"/>
+              <w:szCs w:val="22"/>
+            </w:rPr>
+            <w:t>(Kevin, 2025)</w:t>
+          </w:r>
+          <w:r>
+            <w:rPr>
+              <w:rFonts w:ascii="Arial" w:hAnsi="Arial" w:cs="Arial"/>
+              <w:sz w:val="22"/>
+              <w:szCs w:val="22"/>
+            </w:rPr>
+            <w:fldChar w:fldCharType="end"/>
+          </w:r>
+        </w:sdtContent>
+      </w:sdt>
+    </w:p>
+    <w:p>
+      <w:pPr>
+        <w:pStyle w:val="Ttulo3"/>
+        <w:rPr>
+          <w:rFonts w:ascii="Arial" w:hAnsi="Arial" w:cs="Arial"/>
+          <w:b/>
+          <w:bCs/>
+          <w:color w:val="auto"/>
+          <w:sz w:val="22"/>
+          <w:szCs w:val="22"/>
+        </w:rPr>
+      </w:pPr>
+      <w:r>
+        <w:rPr>
+          <w:rFonts w:ascii="Arial" w:hAnsi="Arial" w:cs="Arial"/>
+          <w:b/>
+          <w:bCs/>
+          <w:color w:val="auto"/>
+          <w:sz w:val="22"/>
+          <w:szCs w:val="22"/>
+        </w:rPr>
+        <w:t>Herramientas y Medición</w:t>
+      </w:r>
+      <w:r>
+        <w:rPr>
+          <w:rFonts w:ascii="Arial" w:hAnsi="Arial" w:cs="Arial"/>
+          <w:b/>
+          <w:bCs/>
+          <w:color w:val="auto"/>
+          <w:sz w:val="22"/>
+          <w:szCs w:val="22"/>
+        </w:rPr>
+        <w:t>.</w:t>
+      </w:r>
+    </w:p>
+    <w:p>
+      <w:pPr>
+        <w:ind w:firstLine="720"/>
+        <w:rPr>
+          <w:rFonts w:ascii="Arial" w:hAnsi="Arial" w:cs="Arial"/>
+          <w:sz w:val="22"/>
+          <w:szCs w:val="22"/>
+        </w:rPr>
+      </w:pPr>
+      <w:r>
+        <w:rPr>
+          <w:rFonts w:ascii="Arial" w:hAnsi="Arial" w:cs="Arial"/>
+          <w:sz w:val="22"/>
+          <w:szCs w:val="22"/>
+        </w:rPr>
+        <w:t>Para evaluar estas tendencias, la industria utiliza un enfoque doble: datos de laboratorio (para diagnóstico rápido y depuración) y datos de campo (para la evaluación real del usuario):</w:t>
+      </w:r>
+    </w:p>
+    <w:p>
+      <w:pPr>
+        <w:pStyle w:val="Prrafodelista"/>
+        <w:numPr>
+          <w:ilvl w:val="0"/>
+          <w:numId w:val="5"/>
+        </w:numPr>
+        <w:rPr>
+          <w:rFonts w:ascii="Arial" w:hAnsi="Arial" w:cs="Arial"/>
+          <w:sz w:val="22"/>
+          <w:szCs w:val="22"/>
+        </w:rPr>
+      </w:pPr>
+      <w:r>
+        <w:rPr>
+          <w:rFonts w:ascii="Arial" w:hAnsi="Arial" w:cs="Arial"/>
+          <w:sz w:val="22"/>
+          <w:szCs w:val="22"/>
+        </w:rPr>
+        <w:t>Datos de Campo: Se monitorean principalmente a través del Chrome UX Report, Google Search Console y PageSpeed Insights.</w:t>
+      </w:r>
+    </w:p>
+    <w:p>
+      <w:pPr>
+        <w:pStyle w:val="Prrafodelista"/>
+        <w:numPr>
+          <w:ilvl w:val="0"/>
+          <w:numId w:val="5"/>
+        </w:numPr>
+        <w:rPr>
+          <w:rFonts w:ascii="Arial" w:hAnsi="Arial" w:cs="Arial"/>
+          <w:sz w:val="22"/>
+          <w:szCs w:val="22"/>
+        </w:rPr>
+      </w:pPr>
+      <w:r>
+        <w:rPr>
+          <w:rFonts w:ascii="Arial" w:hAnsi="Arial" w:cs="Arial"/>
+          <w:sz w:val="22"/>
+          <w:szCs w:val="22"/>
+        </w:rPr>
+        <w:t>Datos de Laboratorio: Se apoyan en herramientas como Lighthouse para simular condiciones de red y hardware, ayudando a identificar el código o los recursos que generan cuellos de botella.</w:t>
+      </w:r>
+      <w:r>
+        <w:rPr>
+          <w:rFonts w:ascii="Arial" w:hAnsi="Arial" w:cs="Arial"/>
+          <w:sz w:val="22"/>
+          <w:szCs w:val="22"/>
+        </w:rPr>
+        <w:t xml:space="preserve"> </w:t>
+      </w:r>
+      <w:sdt>
+        <w:sdtPr>
+          <w:id w:val="2129888134"/>
+          <w:citation/>
+        </w:sdtPr>
+        <w:sdtEndPr/>
+        <w:sdtContent>
+          <w:r>
+            <w:rPr>
+              <w:rFonts w:ascii="Arial" w:hAnsi="Arial" w:cs="Arial"/>
+              <w:sz w:val="22"/>
+              <w:szCs w:val="22"/>
+            </w:rPr>
+            <w:fldChar w:fldCharType="begin"/>
+          </w:r>
+          <w:r>
+            <w:rPr>
+              <w:rFonts w:ascii="Arial" w:hAnsi="Arial" w:cs="Arial"/>
+              <w:sz w:val="22"/>
+              <w:szCs w:val="22"/>
+            </w:rPr>
+            <w:instrText xml:space="preserve"> CITATION Arj261 \l 5130 </w:instrText>
+          </w:r>
+          <w:r>
+            <w:rPr>
+              <w:rFonts w:ascii="Arial" w:hAnsi="Arial" w:cs="Arial"/>
+              <w:sz w:val="22"/>
+              <w:szCs w:val="22"/>
+            </w:rPr>
+            <w:fldChar w:fldCharType="separate"/>
+          </w:r>
+          <w:r>
+            <w:rPr>
+              <w:rFonts w:ascii="Arial" w:hAnsi="Arial" w:cs="Arial"/>
+              <w:noProof/>
+              <w:sz w:val="22"/>
+              <w:szCs w:val="22"/>
+            </w:rPr>
+            <w:t>(Karel, corewebvitals.io, 2026)</w:t>
+          </w:r>
+          <w:r>
+            <w:rPr>
+              <w:rFonts w:ascii="Arial" w:hAnsi="Arial" w:cs="Arial"/>
+              <w:sz w:val="22"/>
+              <w:szCs w:val="22"/>
+            </w:rPr>
+            <w:fldChar w:fldCharType="end"/>
+          </w:r>
+        </w:sdtContent>
+      </w:sdt>
       <w:r>
         <w:rPr>
           <w:rFonts w:ascii="Arial" w:hAnsi="Arial" w:cs="Arial"/>
@@ -4052,15 +4862,23 @@
     </w:p>
     <w:p>
       <w:pPr>
-        <w:rPr>
-          <w:rFonts w:ascii="Arial" w:hAnsi="Arial" w:cs="Arial"/>
-          <w:sz w:val="22"/>
-          <w:szCs w:val="22"/>
-        </w:rPr>
-      </w:pPr>
-      <w:r>
-        <w:rPr>
-          <w:rFonts w:ascii="Arial" w:hAnsi="Arial" w:cs="Arial"/>
+        <w:pStyle w:val="Ttulo1"/>
+        <w:jc w:val="center"/>
+        <w:rPr>
+          <w:rFonts w:ascii="Arial" w:hAnsi="Arial" w:cs="Arial"/>
+          <w:b/>
+          <w:bCs/>
+          <w:color w:val="auto"/>
+          <w:sz w:val="22"/>
+          <w:szCs w:val="22"/>
+        </w:rPr>
+      </w:pPr>
+      <w:r>
+        <w:rPr>
+          <w:rFonts w:ascii="Arial" w:hAnsi="Arial" w:cs="Arial"/>
+          <w:b/>
+          <w:bCs/>
+          <w:color w:val="auto"/>
           <w:sz w:val="22"/>
           <w:szCs w:val="22"/>
         </w:rPr>
@@ -4190,8 +5008,12 @@
         <w:p>
           <w:pPr>
             <w:pStyle w:val="Ttulo1"/>
-            <w:rPr>
-              <w:rFonts w:ascii="Arial" w:hAnsi="Arial" w:cs="Arial"/>
+            <w:jc w:val="center"/>
+            <w:rPr>
+              <w:rFonts w:ascii="Arial" w:hAnsi="Arial" w:cs="Arial"/>
+              <w:b/>
+              <w:bCs/>
+              <w:color w:val="auto"/>
               <w:sz w:val="22"/>
               <w:szCs w:val="22"/>
             </w:rPr>
@@ -4199,9 +5021,11 @@
           <w:r>
             <w:rPr>
               <w:rFonts w:ascii="Arial" w:hAnsi="Arial" w:cs="Arial"/>
-              <w:sz w:val="22"/>
-              <w:szCs w:val="22"/>
-              <w:lang w:val="es-MX"/>
+              <w:b/>
+              <w:bCs/>
+              <w:color w:val="auto"/>
+              <w:sz w:val="22"/>
+              <w:szCs w:val="22"/>
             </w:rPr>
             <w:t>Referencias</w:t>
           </w:r>
@@ -4220,10 +5044,12 @@
           <w:sdtContent>
             <w:p>
               <w:pPr>
+                <w:pStyle w:val="Bibliografa"/>
+                <w:ind w:left="720" w:hanging="720"/>
                 <w:rPr>
-                  <w:rFonts w:ascii="Arial" w:hAnsi="Arial" w:cs="Arial"/>
-                  <w:sz w:val="22"/>
-                  <w:szCs w:val="22"/>
+                  <w:noProof/>
+                  <w:kern w:val="0"/>
+                  <w14:ligatures w14:val="none"/>
                 </w:rPr>
               </w:pPr>
               <w:r>
@@ -4252,14 +5078,250 @@
               </w:r>
               <w:r>
                 <w:rPr>
+                  <w:noProof/>
+                </w:rPr>
+                <w:t>Cohen, M. (08 de 06 de 2016). Obtenido de developer.chrome.com/: https://developer.chrome.com/blog/performance-observer?hl=es-419</w:t>
+              </w:r>
+            </w:p>
+            <w:p>
+              <w:pPr>
+                <w:pStyle w:val="Bibliografa"/>
+                <w:ind w:left="720" w:hanging="720"/>
+                <w:rPr>
+                  <w:noProof/>
+                </w:rPr>
+              </w:pPr>
+              <w:r>
+                <w:rPr>
+                  <w:noProof/>
+                </w:rPr>
+                <w:t xml:space="preserve">Google. (18 de 12 de 2025). </w:t>
+              </w:r>
+              <w:r>
+                <w:rPr>
+                  <w:i/>
+                  <w:iCs/>
+                  <w:noProof/>
+                </w:rPr>
+                <w:t>google.com</w:t>
+              </w:r>
+              <w:r>
+                <w:rPr>
+                  <w:noProof/>
+                </w:rPr>
+                <w:t>. Obtenido de google.com: https://developers.google.com/search/docs/appearance/core-web-vitals?hl=es-419#metrics</w:t>
+              </w:r>
+            </w:p>
+            <w:p>
+              <w:pPr>
+                <w:pStyle w:val="Bibliografa"/>
+                <w:ind w:left="720" w:hanging="720"/>
+                <w:rPr>
+                  <w:noProof/>
+                </w:rPr>
+              </w:pPr>
+              <w:r>
+                <w:rPr>
+                  <w:noProof/>
+                </w:rPr>
+                <w:t>httpArchive. (s.f.). Obtenido de httpArchive: https://httparchive.org/reports/chrome-ux-report</w:t>
+              </w:r>
+            </w:p>
+            <w:p>
+              <w:pPr>
+                <w:pStyle w:val="Bibliografa"/>
+                <w:ind w:left="720" w:hanging="720"/>
+                <w:rPr>
+                  <w:noProof/>
+                </w:rPr>
+              </w:pPr>
+              <w:r>
+                <w:rPr>
+                  <w:noProof/>
+                </w:rPr>
+                <w:t>Karel, A. (03 de 03 de 2026). Obtenido de corewebvitals.io: https://www.corewebvitals.io/core-web-vitals</w:t>
+              </w:r>
+            </w:p>
+            <w:p>
+              <w:pPr>
+                <w:pStyle w:val="Bibliografa"/>
+                <w:ind w:left="720" w:hanging="720"/>
+                <w:rPr>
+                  <w:noProof/>
+                </w:rPr>
+              </w:pPr>
+              <w:r>
+                <w:rPr>
+                  <w:noProof/>
+                </w:rPr>
+                <w:t xml:space="preserve">Karel, A. (3 de Marzo de 2026). </w:t>
+              </w:r>
+              <w:r>
+                <w:rPr>
+                  <w:i/>
+                  <w:iCs/>
+                  <w:noProof/>
+                </w:rPr>
+                <w:t>Core Web Vtals</w:t>
+              </w:r>
+              <w:r>
+                <w:rPr>
+                  <w:noProof/>
+                </w:rPr>
+                <w:t>. Obtenido de www.corewebvitals.io: https://www.corewebvitals.io/es/core-web-vitals</w:t>
+              </w:r>
+            </w:p>
+            <w:p>
+              <w:pPr>
+                <w:pStyle w:val="Bibliografa"/>
+                <w:ind w:left="720" w:hanging="720"/>
+                <w:rPr>
+                  <w:noProof/>
+                </w:rPr>
+              </w:pPr>
+              <w:r>
+                <w:rPr>
+                  <w:noProof/>
+                </w:rPr>
+                <w:t>Kevin. (23 de 11 de 2025). Obtenido de https://medium.com/@mernstackdevbykevin/stop-guessing-about-react-performance-start-measuring-with-web-vitals-6189807e1390</w:t>
+              </w:r>
+            </w:p>
+            <w:p>
+              <w:pPr>
+                <w:pStyle w:val="Bibliografa"/>
+                <w:ind w:left="720" w:hanging="720"/>
+                <w:rPr>
+                  <w:noProof/>
+                </w:rPr>
+              </w:pPr>
+              <w:r>
+                <w:rPr>
+                  <w:noProof/>
+                </w:rPr>
+                <w:t>Mihajlija, M., &amp; Walton, P. (12 de 04 de 2023). Obtenido de Cumulative Layout Shift (CLS): https://web.dev/articles/cls?hl=es-419</w:t>
+              </w:r>
+            </w:p>
+            <w:p>
+              <w:pPr>
+                <w:pStyle w:val="Bibliografa"/>
+                <w:ind w:left="720" w:hanging="720"/>
+                <w:rPr>
+                  <w:noProof/>
+                </w:rPr>
+              </w:pPr>
+              <w:r>
+                <w:rPr>
+                  <w:noProof/>
+                </w:rPr>
+                <w:t xml:space="preserve">Mmdn_. (s.f.). </w:t>
+              </w:r>
+              <w:r>
+                <w:rPr>
+                  <w:i/>
+                  <w:iCs/>
+                  <w:noProof/>
+                </w:rPr>
+                <w:t>PerformanceObserver</w:t>
+              </w:r>
+              <w:r>
+                <w:rPr>
+                  <w:noProof/>
+                </w:rPr>
+                <w:t>. Obtenido de https://developer.mozilla.org/en-US/docs/Web/API/PerformanceObserver</w:t>
+              </w:r>
+            </w:p>
+            <w:p>
+              <w:pPr>
+                <w:pStyle w:val="Bibliografa"/>
+                <w:ind w:left="720" w:hanging="720"/>
+                <w:rPr>
+                  <w:noProof/>
+                </w:rPr>
+              </w:pPr>
+              <w:r>
+                <w:rPr>
+                  <w:noProof/>
+                </w:rPr>
+                <w:lastRenderedPageBreak/>
+                <w:t>Rajpal, S., &amp; Gopalakrishnan, S. (01 de 09 de 2021). Obtenido de https://web.dev/case-studies/vitals-business-impact?hl=es-419</w:t>
+              </w:r>
+            </w:p>
+            <w:p>
+              <w:pPr>
+                <w:pStyle w:val="Bibliografa"/>
+                <w:ind w:left="720" w:hanging="720"/>
+                <w:rPr>
+                  <w:noProof/>
+                </w:rPr>
+              </w:pPr>
+              <w:r>
+                <w:rPr>
+                  <w:noProof/>
+                </w:rPr>
+                <w:t>sitecare. (s.f.). Obtenido de sitecare.com: https://sitecare.com/case-studies/core-web-vitals-zero-to-three/</w:t>
+              </w:r>
+            </w:p>
+            <w:p>
+              <w:pPr>
+                <w:pStyle w:val="Bibliografa"/>
+                <w:ind w:left="720" w:hanging="720"/>
+                <w:rPr>
+                  <w:noProof/>
+                  <w:lang w:val="en-US"/>
+                </w:rPr>
+              </w:pPr>
+              <w:r>
+                <w:rPr>
+                  <w:noProof/>
+                </w:rPr>
+                <w:t xml:space="preserve">Wagner, J., &amp; Pollard, B. (6 de 4 de 2022). </w:t>
+              </w:r>
+              <w:r>
+                <w:rPr>
+                  <w:noProof/>
+                  <w:lang w:val="en-US"/>
+                </w:rPr>
+                <w:t>Obtenido de Interaction to Next Paint (INP): https://web.dev/articles/inp?hl=es-419</w:t>
+              </w:r>
+            </w:p>
+            <w:p>
+              <w:pPr>
+                <w:pStyle w:val="Bibliografa"/>
+                <w:ind w:left="720" w:hanging="720"/>
+                <w:rPr>
+                  <w:noProof/>
+                </w:rPr>
+              </w:pPr>
+              <w:r>
+                <w:rPr>
+                  <w:noProof/>
+                </w:rPr>
+                <w:t>Walton, P. (4 de Mayo de 2020). Obtenido de https://web.dev/: https://web.dev/articles/vitals?hl=es-419</w:t>
+              </w:r>
+            </w:p>
+            <w:p>
+              <w:pPr>
+                <w:pStyle w:val="Bibliografa"/>
+                <w:ind w:left="720" w:hanging="720"/>
+                <w:rPr>
+                  <w:noProof/>
+                </w:rPr>
+              </w:pPr>
+              <w:r>
+                <w:rPr>
+                  <w:noProof/>
+                </w:rPr>
+                <w:t>Walton, P., &amp; Pollard, B. (8 de 8 de 2019). Obtenido de Largest Contentful Paint (LCP): https://web.dev/articles/lcp?hl=es-419</w:t>
+              </w:r>
+            </w:p>
+            <w:p>
+              <w:pPr>
+                <w:rPr>
                   <w:rFonts w:ascii="Arial" w:hAnsi="Arial" w:cs="Arial"/>
-                  <w:noProof/>
                   <w:sz w:val="22"/>
                   <w:szCs w:val="22"/>
-                  <w:lang w:val="es-MX"/>
                 </w:rPr>
-                <w:t>No hay ninguna fuente en el documento actual.</w:t>
-              </w:r>
+              </w:pPr>
               <w:r>
                 <w:rPr>
                   <w:rFonts w:ascii="Arial" w:hAnsi="Arial" w:cs="Arial"/>
@@ -4285,7 +5347,7 @@
     <w:sectPr>
       <w:headerReference w:type="default" r:id="rId9"/>
       <w:pgSz w:w="12240" w:h="15840"/>
-      <w:pgMar w:top="1417" w:right="1701" w:bottom="1417" w:left="1701" w:header="708" w:footer="708" w:gutter="0"/>
+      <w:pgMar w:top="1440" w:right="1440" w:bottom="1440" w:left="1440" w:header="709" w:footer="709" w:gutter="0"/>
       <w:cols w:space="708"/>
       <w:titlePg/>
       <w:docGrid w:linePitch="360"/>
@@ -4393,6 +5455,232 @@
 <file path=word/numbering.xml><?xml version="1.0" encoding="utf-8"?>
 <w:numbering xmlns:wpc="http://schemas.microsoft.com/office/word/2010/wordprocessingCanvas" xmlns:cx="http://schemas.microsoft.com/office/drawing/2014/chartex" xmlns:cx1="http://schemas.microsoft.com/office/drawing/2015/9/8/chartex" xmlns:cx2="http://schemas.microsoft.com/office/drawing/2015/10/21/chartex" xmlns:cx3="http://schemas.microsoft.com/office/drawing/2016/5/9/chartex" xmlns:cx4="http://schemas.microsoft.com/office/drawing/2016/5/10/chartex" xmlns:cx5="http://schemas.microsoft.com/office/drawing/2016/5/11/chartex" xmlns:cx6="http://schemas.microsoft.com/office/drawing/2016/5/12/chartex" xmlns:cx7="http://schemas.microsoft.com/office/drawing/2016/5/13/chartex" xmlns:cx8="http://schemas.microsoft.com/office/drawing/2016/5/14/chartex" xmlns:mc="http://schemas.openxmlformats.org/markup-compatibility/2006" xmlns:aink="http://schemas.microsoft.com/office/drawing/2016/ink" xmlns:am3d="http://schemas.microsoft.com/office/drawing/2017/model3d" xmlns:o="urn:schemas-microsoft-com:office:office" xmlns:oel="http://schemas.microsoft.com/office/2019/extlst" xmlns:r="http://schemas.openxmlformats.org/officeDocument/2006/relationships" xmlns:m="http://schemas.openxmlformats.org/officeDocument/2006/math" xmlns:v="urn:schemas-microsoft-com:vml" xmlns:wp14="http://schemas.microsoft.com/office/word/2010/wordprocessingDrawing" xmlns:wp="http://schemas.openxmlformats.org/drawingml/2006/wordprocessingDrawing" xmlns:w10="urn:schemas-microsoft-com:office:word" xmlns:w="http://schemas.openxmlformats.org/wordprocessingml/2006/main" xmlns:w14="http://schemas.microsoft.com/office/word/2010/wordml" xmlns:w15="http://schemas.microsoft.com/office/word/2012/wordml" xmlns:w16cex="http://schemas.microsoft.com/office/word/2018/wordml/cex" xmlns:w16cid="http://schemas.microsoft.com/office/word/2016/wordml/cid" xmlns:w16="http://schemas.microsoft.com/office/word/2018/wordml" xmlns:w16du="http://schemas.microsoft.com/office/word/2023/wordml/word16du" xmlns:w16sdtdh="http://schemas.microsoft.com/office/word/2020/wordml/sdtdatahash" xmlns:w16sdtfl="http://schemas.microsoft.com/office/word/2024/wordml/sdtformatlock" xmlns:w16se="http://schemas.microsoft.com/office/word/2015/wordml/symex" xmlns:wpg="http://schemas.microsoft.com/office/word/2010/wordprocessingGroup" xmlns:wpi="http://schemas.microsoft.com/office/word/2010/wordprocessingInk" xmlns:wne="http://schemas.microsoft.com/office/word/2006/wordml" xmlns:wps="http://schemas.microsoft.com/office/word/2010/wordprocessingShape" mc:Ignorable="w14 w15 w16se w16cid w16 w16cex w16sdtdh w16sdtfl w16du wp14">
   <w:abstractNum w:abstractNumId="0" w15:restartNumberingAfterBreak="0">
+    <w:nsid w:val="11FA4D43"/>
+    <w:multiLevelType w:val="hybridMultilevel"/>
+    <w:tmpl w:val="A446B824"/>
+    <w:lvl w:ilvl="0" w:tplc="140A0001">
+      <w:start w:val="1"/>
+      <w:numFmt w:val="bullet"/>
+      <w:lvlText w:val=""/>
+      <w:lvlJc w:val="left"/>
+      <w:pPr>
+        <w:ind w:left="720" w:hanging="360"/>
+      </w:pPr>
+      <w:rPr>
+        <w:rFonts w:ascii="Symbol" w:hAnsi="Symbol" w:hint="default"/>
+      </w:rPr>
+    </w:lvl>
+    <w:lvl w:ilvl="1" w:tplc="140A0003" w:tentative="1">
+      <w:start w:val="1"/>
+      <w:numFmt w:val="bullet"/>
+      <w:lvlText w:val="o"/>
+      <w:lvlJc w:val="left"/>
+      <w:pPr>
+        <w:ind w:left="1440" w:hanging="360"/>
+      </w:pPr>
+      <w:rPr>
+        <w:rFonts w:ascii="Courier New" w:hAnsi="Courier New" w:cs="Courier New" w:hint="default"/>
+      </w:rPr>
+    </w:lvl>
+    <w:lvl w:ilvl="2" w:tplc="140A0005" w:tentative="1">
+      <w:start w:val="1"/>
+      <w:numFmt w:val="bullet"/>
+      <w:lvlText w:val=""/>
+      <w:lvlJc w:val="left"/>
+      <w:pPr>
+        <w:ind w:left="2160" w:hanging="360"/>
+      </w:pPr>
+      <w:rPr>
+        <w:rFonts w:ascii="Wingdings" w:hAnsi="Wingdings" w:hint="default"/>
+      </w:rPr>
+    </w:lvl>
+    <w:lvl w:ilvl="3" w:tplc="140A0001" w:tentative="1">
+      <w:start w:val="1"/>
+      <w:numFmt w:val="bullet"/>
+      <w:lvlText w:val=""/>
+      <w:lvlJc w:val="left"/>
+      <w:pPr>
+        <w:ind w:left="2880" w:hanging="360"/>
+      </w:pPr>
+      <w:rPr>
+        <w:rFonts w:ascii="Symbol" w:hAnsi="Symbol" w:hint="default"/>
+      </w:rPr>
+    </w:lvl>
+    <w:lvl w:ilvl="4" w:tplc="140A0003" w:tentative="1">
+      <w:start w:val="1"/>
+      <w:numFmt w:val="bullet"/>
+      <w:lvlText w:val="o"/>
+      <w:lvlJc w:val="left"/>
+      <w:pPr>
+        <w:ind w:left="3600" w:hanging="360"/>
+      </w:pPr>
+      <w:rPr>
+        <w:rFonts w:ascii="Courier New" w:hAnsi="Courier New" w:cs="Courier New" w:hint="default"/>
+      </w:rPr>
+    </w:lvl>
+    <w:lvl w:ilvl="5" w:tplc="140A0005" w:tentative="1">
+      <w:start w:val="1"/>
+      <w:numFmt w:val="bullet"/>
+      <w:lvlText w:val=""/>
+      <w:lvlJc w:val="left"/>
+      <w:pPr>
+        <w:ind w:left="4320" w:hanging="360"/>
+      </w:pPr>
+      <w:rPr>
+        <w:rFonts w:ascii="Wingdings" w:hAnsi="Wingdings" w:hint="default"/>
+      </w:rPr>
+    </w:lvl>
+    <w:lvl w:ilvl="6" w:tplc="140A0001" w:tentative="1">
+      <w:start w:val="1"/>
+      <w:numFmt w:val="bullet"/>
+      <w:lvlText w:val=""/>
+      <w:lvlJc w:val="left"/>
+      <w:pPr>
+        <w:ind w:left="5040" w:hanging="360"/>
+      </w:pPr>
+      <w:rPr>
+        <w:rFonts w:ascii="Symbol" w:hAnsi="Symbol" w:hint="default"/>
+      </w:rPr>
+    </w:lvl>
+    <w:lvl w:ilvl="7" w:tplc="140A0003" w:tentative="1">
+      <w:start w:val="1"/>
+      <w:numFmt w:val="bullet"/>
+      <w:lvlText w:val="o"/>
+      <w:lvlJc w:val="left"/>
+      <w:pPr>
+        <w:ind w:left="5760" w:hanging="360"/>
+      </w:pPr>
+      <w:rPr>
+        <w:rFonts w:ascii="Courier New" w:hAnsi="Courier New" w:cs="Courier New" w:hint="default"/>
+      </w:rPr>
+    </w:lvl>
+    <w:lvl w:ilvl="8" w:tplc="140A0005" w:tentative="1">
+      <w:start w:val="1"/>
+      <w:numFmt w:val="bullet"/>
+      <w:lvlText w:val=""/>
+      <w:lvlJc w:val="left"/>
+      <w:pPr>
+        <w:ind w:left="6480" w:hanging="360"/>
+      </w:pPr>
+      <w:rPr>
+        <w:rFonts w:ascii="Wingdings" w:hAnsi="Wingdings" w:hint="default"/>
+      </w:rPr>
+    </w:lvl>
+  </w:abstractNum>
+  <w:abstractNum w:abstractNumId="1" w15:restartNumberingAfterBreak="0">
+    <w:nsid w:val="31BE742F"/>
+    <w:multiLevelType w:val="hybridMultilevel"/>
+    <w:tmpl w:val="1CCC485E"/>
+    <w:lvl w:ilvl="0" w:tplc="140A0001">
+      <w:start w:val="1"/>
+      <w:numFmt w:val="bullet"/>
+      <w:lvlText w:val=""/>
+      <w:lvlJc w:val="left"/>
+      <w:pPr>
+        <w:ind w:left="720" w:hanging="360"/>
+      </w:pPr>
+      <w:rPr>
+        <w:rFonts w:ascii="Symbol" w:hAnsi="Symbol" w:hint="default"/>
+      </w:rPr>
+    </w:lvl>
+    <w:lvl w:ilvl="1" w:tplc="140A0003" w:tentative="1">
+      <w:start w:val="1"/>
+      <w:numFmt w:val="bullet"/>
+      <w:lvlText w:val="o"/>
+      <w:lvlJc w:val="left"/>
+      <w:pPr>
+        <w:ind w:left="1440" w:hanging="360"/>
+      </w:pPr>
+      <w:rPr>
+        <w:rFonts w:ascii="Courier New" w:hAnsi="Courier New" w:cs="Courier New" w:hint="default"/>
+      </w:rPr>
+    </w:lvl>
+    <w:lvl w:ilvl="2" w:tplc="140A0005" w:tentative="1">
+      <w:start w:val="1"/>
+      <w:numFmt w:val="bullet"/>
+      <w:lvlText w:val=""/>
+      <w:lvlJc w:val="left"/>
+      <w:pPr>
+        <w:ind w:left="2160" w:hanging="360"/>
+      </w:pPr>
+      <w:rPr>
+        <w:rFonts w:ascii="Wingdings" w:hAnsi="Wingdings" w:hint="default"/>
+      </w:rPr>
+    </w:lvl>
+    <w:lvl w:ilvl="3" w:tplc="140A0001" w:tentative="1">
+      <w:start w:val="1"/>
+      <w:numFmt w:val="bullet"/>
+      <w:lvlText w:val=""/>
+      <w:lvlJc w:val="left"/>
+      <w:pPr>
+        <w:ind w:left="2880" w:hanging="360"/>
+      </w:pPr>
+      <w:rPr>
+        <w:rFonts w:ascii="Symbol" w:hAnsi="Symbol" w:hint="default"/>
+      </w:rPr>
+    </w:lvl>
+    <w:lvl w:ilvl="4" w:tplc="140A0003" w:tentative="1">
+      <w:start w:val="1"/>
+      <w:numFmt w:val="bullet"/>
+      <w:lvlText w:val="o"/>
+      <w:lvlJc w:val="left"/>
+      <w:pPr>
+        <w:ind w:left="3600" w:hanging="360"/>
+      </w:pPr>
+      <w:rPr>
+        <w:rFonts w:ascii="Courier New" w:hAnsi="Courier New" w:cs="Courier New" w:hint="default"/>
+      </w:rPr>
+    </w:lvl>
+    <w:lvl w:ilvl="5" w:tplc="140A0005" w:tentative="1">
+      <w:start w:val="1"/>
+      <w:numFmt w:val="bullet"/>
+      <w:lvlText w:val=""/>
+      <w:lvlJc w:val="left"/>
+      <w:pPr>
+        <w:ind w:left="4320" w:hanging="360"/>
+      </w:pPr>
+      <w:rPr>
+        <w:rFonts w:ascii="Wingdings" w:hAnsi="Wingdings" w:hint="default"/>
+      </w:rPr>
+    </w:lvl>
+    <w:lvl w:ilvl="6" w:tplc="140A0001" w:tentative="1">
+      <w:start w:val="1"/>
+      <w:numFmt w:val="bullet"/>
+      <w:lvlText w:val=""/>
+      <w:lvlJc w:val="left"/>
+      <w:pPr>
+        <w:ind w:left="5040" w:hanging="360"/>
+      </w:pPr>
+      <w:rPr>
+        <w:rFonts w:ascii="Symbol" w:hAnsi="Symbol" w:hint="default"/>
+      </w:rPr>
+    </w:lvl>
+    <w:lvl w:ilvl="7" w:tplc="140A0003" w:tentative="1">
+      <w:start w:val="1"/>
+      <w:numFmt w:val="bullet"/>
+      <w:lvlText w:val="o"/>
+      <w:lvlJc w:val="left"/>
+      <w:pPr>
+        <w:ind w:left="5760" w:hanging="360"/>
+      </w:pPr>
+      <w:rPr>
+        <w:rFonts w:ascii="Courier New" w:hAnsi="Courier New" w:cs="Courier New" w:hint="default"/>
+      </w:rPr>
+    </w:lvl>
+    <w:lvl w:ilvl="8" w:tplc="140A0005" w:tentative="1">
+      <w:start w:val="1"/>
+      <w:numFmt w:val="bullet"/>
+      <w:lvlText w:val=""/>
+      <w:lvlJc w:val="left"/>
+      <w:pPr>
+        <w:ind w:left="6480" w:hanging="360"/>
+      </w:pPr>
+      <w:rPr>
+        <w:rFonts w:ascii="Wingdings" w:hAnsi="Wingdings" w:hint="default"/>
+      </w:rPr>
+    </w:lvl>
+  </w:abstractNum>
+  <w:abstractNum w:abstractNumId="2" w15:restartNumberingAfterBreak="0">
     <w:nsid w:val="40A12C7B"/>
     <w:multiLevelType w:val="multilevel"/>
     <w:tmpl w:val="C7BCEF48"/>
@@ -4518,7 +5806,120 @@
       </w:rPr>
     </w:lvl>
   </w:abstractNum>
-  <w:abstractNum w:abstractNumId="1" w15:restartNumberingAfterBreak="0">
+  <w:abstractNum w:abstractNumId="3" w15:restartNumberingAfterBreak="0">
+    <w:nsid w:val="6CD0431B"/>
+    <w:multiLevelType w:val="hybridMultilevel"/>
+    <w:tmpl w:val="6AA6D684"/>
+    <w:lvl w:ilvl="0" w:tplc="140A0001">
+      <w:start w:val="1"/>
+      <w:numFmt w:val="bullet"/>
+      <w:lvlText w:val=""/>
+      <w:lvlJc w:val="left"/>
+      <w:pPr>
+        <w:ind w:left="720" w:hanging="360"/>
+      </w:pPr>
+      <w:rPr>
+        <w:rFonts w:ascii="Symbol" w:hAnsi="Symbol" w:hint="default"/>
+      </w:rPr>
+    </w:lvl>
+    <w:lvl w:ilvl="1" w:tplc="140A0003" w:tentative="1">
+      <w:start w:val="1"/>
+      <w:numFmt w:val="bullet"/>
+      <w:lvlText w:val="o"/>
+      <w:lvlJc w:val="left"/>
+      <w:pPr>
+        <w:ind w:left="1440" w:hanging="360"/>
+      </w:pPr>
+      <w:rPr>
+        <w:rFonts w:ascii="Courier New" w:hAnsi="Courier New" w:cs="Courier New" w:hint="default"/>
+      </w:rPr>
+    </w:lvl>
+    <w:lvl w:ilvl="2" w:tplc="140A0005" w:tentative="1">
+      <w:start w:val="1"/>
+      <w:numFmt w:val="bullet"/>
+      <w:lvlText w:val=""/>
+      <w:lvlJc w:val="left"/>
+      <w:pPr>
+        <w:ind w:left="2160" w:hanging="360"/>
+      </w:pPr>
+      <w:rPr>
+        <w:rFonts w:ascii="Wingdings" w:hAnsi="Wingdings" w:hint="default"/>
+      </w:rPr>
+    </w:lvl>
+    <w:lvl w:ilvl="3" w:tplc="140A0001" w:tentative="1">
+      <w:start w:val="1"/>
+      <w:numFmt w:val="bullet"/>
+      <w:lvlText w:val=""/>
+      <w:lvlJc w:val="left"/>
+      <w:pPr>
+        <w:ind w:left="2880" w:hanging="360"/>
+      </w:pPr>
+      <w:rPr>
+        <w:rFonts w:ascii="Symbol" w:hAnsi="Symbol" w:hint="default"/>
+      </w:rPr>
+    </w:lvl>
+    <w:lvl w:ilvl="4" w:tplc="140A0003" w:tentative="1">
+      <w:start w:val="1"/>
+      <w:numFmt w:val="bullet"/>
+      <w:lvlText w:val="o"/>
+      <w:lvlJc w:val="left"/>
+      <w:pPr>
+        <w:ind w:left="3600" w:hanging="360"/>
+      </w:pPr>
+      <w:rPr>
+        <w:rFonts w:ascii="Courier New" w:hAnsi="Courier New" w:cs="Courier New" w:hint="default"/>
+      </w:rPr>
+    </w:lvl>
+    <w:lvl w:ilvl="5" w:tplc="140A0005" w:tentative="1">
+      <w:start w:val="1"/>
+      <w:numFmt w:val="bullet"/>
+      <w:lvlText w:val=""/>
+      <w:lvlJc w:val="left"/>
+      <w:pPr>
+        <w:ind w:left="4320" w:hanging="360"/>
+      </w:pPr>
+      <w:rPr>
+        <w:rFonts w:ascii="Wingdings" w:hAnsi="Wingdings" w:hint="default"/>
+      </w:rPr>
+    </w:lvl>
+    <w:lvl w:ilvl="6" w:tplc="140A0001" w:tentative="1">
+      <w:start w:val="1"/>
+      <w:numFmt w:val="bullet"/>
+      <w:lvlText w:val=""/>
+      <w:lvlJc w:val="left"/>
+      <w:pPr>
+        <w:ind w:left="5040" w:hanging="360"/>
+      </w:pPr>
+      <w:rPr>
+        <w:rFonts w:ascii="Symbol" w:hAnsi="Symbol" w:hint="default"/>
+      </w:rPr>
+    </w:lvl>
+    <w:lvl w:ilvl="7" w:tplc="140A0003" w:tentative="1">
+      <w:start w:val="1"/>
+      <w:numFmt w:val="bullet"/>
+      <w:lvlText w:val="o"/>
+      <w:lvlJc w:val="left"/>
+      <w:pPr>
+        <w:ind w:left="5760" w:hanging="360"/>
+      </w:pPr>
+      <w:rPr>
+        <w:rFonts w:ascii="Courier New" w:hAnsi="Courier New" w:cs="Courier New" w:hint="default"/>
+      </w:rPr>
+    </w:lvl>
+    <w:lvl w:ilvl="8" w:tplc="140A0005" w:tentative="1">
+      <w:start w:val="1"/>
+      <w:numFmt w:val="bullet"/>
+      <w:lvlText w:val=""/>
+      <w:lvlJc w:val="left"/>
+      <w:pPr>
+        <w:ind w:left="6480" w:hanging="360"/>
+      </w:pPr>
+      <w:rPr>
+        <w:rFonts w:ascii="Wingdings" w:hAnsi="Wingdings" w:hint="default"/>
+      </w:rPr>
+    </w:lvl>
+  </w:abstractNum>
+  <w:abstractNum w:abstractNumId="4" w15:restartNumberingAfterBreak="0">
     <w:nsid w:val="7CD54309"/>
     <w:multiLevelType w:val="hybridMultilevel"/>
     <w:tmpl w:val="D81C5DE8"/>
@@ -4608,10 +6009,19 @@
     </w:lvl>
   </w:abstractNum>
   <w:num w:numId="1" w16cid:durableId="852376502">
+    <w:abstractNumId w:val="4"/>
+  </w:num>
+  <w:num w:numId="2" w16cid:durableId="1497527481">
+    <w:abstractNumId w:val="2"/>
+  </w:num>
+  <w:num w:numId="3" w16cid:durableId="791023179">
+    <w:abstractNumId w:val="0"/>
+  </w:num>
+  <w:num w:numId="4" w16cid:durableId="1996491684">
     <w:abstractNumId w:val="1"/>
   </w:num>
-  <w:num w:numId="2" w16cid:durableId="1497527481">
-    <w:abstractNumId w:val="0"/>
+  <w:num w:numId="5" w16cid:durableId="695934623">
+    <w:abstractNumId w:val="3"/>
   </w:num>
 </w:numbering>
 </file>
@@ -5044,7 +6454,6 @@
     <w:next w:val="Normal"/>
     <w:link w:val="Ttulo2Car"/>
     <w:uiPriority w:val="9"/>
-    <w:semiHidden/>
     <w:unhideWhenUsed/>
     <w:qFormat/>
     <w:rsid w:val="002808CA"/>
@@ -5067,7 +6476,6 @@
     <w:next w:val="Normal"/>
     <w:link w:val="Ttulo3Car"/>
     <w:uiPriority w:val="9"/>
-    <w:semiHidden/>
     <w:unhideWhenUsed/>
     <w:qFormat/>
     <w:rsid w:val="002808CA"/>
@@ -5219,6 +6627,7 @@
   <w:style w:type="character" w:default="1" w:styleId="Fuentedeprrafopredeter">
     <w:name w:val="Default Paragraph Font"/>
     <w:uiPriority w:val="1"/>
+    <w:semiHidden/>
     <w:unhideWhenUsed/>
   </w:style>
   <w:style w:type="table" w:default="1" w:styleId="Tablanormal">
@@ -5260,7 +6669,6 @@
     <w:basedOn w:val="Fuentedeprrafopredeter"/>
     <w:link w:val="Ttulo2"/>
     <w:uiPriority w:val="9"/>
-    <w:semiHidden/>
     <w:rsid w:val="002808CA"/>
     <w:rPr>
       <w:rFonts w:asciiTheme="majorHAnsi" w:eastAsiaTheme="majorEastAsia" w:hAnsiTheme="majorHAnsi" w:cstheme="majorBidi"/>
@@ -5274,7 +6682,6 @@
     <w:basedOn w:val="Fuentedeprrafopredeter"/>
     <w:link w:val="Ttulo3"/>
     <w:uiPriority w:val="9"/>
-    <w:semiHidden/>
     <w:rsid w:val="002808CA"/>
     <w:rPr>
       <w:rFonts w:eastAsiaTheme="majorEastAsia" w:cstheme="majorBidi"/>
@@ -5704,6 +7111,14 @@
         <w:shd w:val="clear" w:color="auto" w:fill="CCCCCC" w:themeFill="text1" w:themeFillTint="33"/>
       </w:tcPr>
     </w:tblStylePr>
+  </w:style>
+  <w:style w:type="paragraph" w:styleId="Bibliografa">
+    <w:name w:val="Bibliography"/>
+    <w:basedOn w:val="Normal"/>
+    <w:next w:val="Normal"/>
+    <w:uiPriority w:val="37"/>
+    <w:unhideWhenUsed/>
+    <w:rsid w:val="006C524B"/>
   </w:style>
 </w:styles>
 </file>
@@ -6211,11 +7626,64 @@
     </b:Author>
     <b:RefOrder>4</b:RefOrder>
   </b:Source>
+  <b:Source>
+    <b:Tag>Arj261</b:Tag>
+    <b:SourceType>InternetSite</b:SourceType>
+    <b:Guid>{547ECDC4-6175-46CB-873B-EF16E78260C7}</b:Guid>
+    <b:Author>
+      <b:Author>
+        <b:NameList>
+          <b:Person>
+            <b:Last>Karel</b:Last>
+            <b:First>Arjen</b:First>
+          </b:Person>
+        </b:NameList>
+      </b:Author>
+    </b:Author>
+    <b:InternetSiteTitle>corewebvitals.io</b:InternetSiteTitle>
+    <b:Year>2026</b:Year>
+    <b:Month>03</b:Month>
+    <b:Day>03</b:Day>
+    <b:URL>https://www.corewebvitals.io/core-web-vitals</b:URL>
+    <b:RefOrder>11</b:RefOrder>
+  </b:Source>
+  <b:Source>
+    <b:Tag>htt</b:Tag>
+    <b:SourceType>InternetSite</b:SourceType>
+    <b:Guid>{6D869439-E371-4757-AF0F-069BACBD9B3A}</b:Guid>
+    <b:Author>
+      <b:Author>
+        <b:Corporate>httpArchive</b:Corporate>
+      </b:Author>
+    </b:Author>
+    <b:InternetSiteTitle>httpArchive</b:InternetSiteTitle>
+    <b:URL>https://httparchive.org/reports/chrome-ux-report</b:URL>
+    <b:RefOrder>12</b:RefOrder>
+  </b:Source>
+  <b:Source>
+    <b:Tag>Kev25</b:Tag>
+    <b:SourceType>InternetSite</b:SourceType>
+    <b:Guid>{F90C1A9B-3D23-42FE-A4E8-C4B6706A2080}</b:Guid>
+    <b:Author>
+      <b:Author>
+        <b:NameList>
+          <b:Person>
+            <b:Last>Kevin</b:Last>
+          </b:Person>
+        </b:NameList>
+      </b:Author>
+    </b:Author>
+    <b:Year>2025</b:Year>
+    <b:Month>11</b:Month>
+    <b:Day>23</b:Day>
+    <b:URL>https://medium.com/@mernstackdevbykevin/stop-guessing-about-react-performance-start-measuring-with-web-vitals-6189807e1390</b:URL>
+    <b:RefOrder>13</b:RefOrder>
+  </b:Source>
 </b:Sources>
 </file>
 
 <file path=customXml/itemProps1.xml><?xml version="1.0" encoding="utf-8"?>
-<ds:datastoreItem xmlns:ds="http://schemas.openxmlformats.org/officeDocument/2006/customXml" ds:itemID="{AEEC8DDD-3B28-442A-B016-A8A255DEB194}">
+<ds:datastoreItem xmlns:ds="http://schemas.openxmlformats.org/officeDocument/2006/customXml" ds:itemID="{277AB05A-1F8B-48D4-99A1-3E33D32CDAF7}">
   <ds:schemaRefs>
     <ds:schemaRef ds:uri="http://schemas.openxmlformats.org/officeDocument/2006/bibliography"/>
   </ds:schemaRefs>

</xml_diff>

<commit_message>
Versión final del documento y presentación del mismo.
</commit_message>
<xml_diff>
--- a/Investigacion-CoreWebVitals.docx
+++ b/Investigacion-CoreWebVitals.docx
@@ -382,8 +382,12 @@
         <w:p>
           <w:pPr>
             <w:pStyle w:val="TtuloTDC"/>
-            <w:rPr>
-              <w:rFonts w:ascii="Arial" w:hAnsi="Arial" w:cs="Arial"/>
+            <w:jc w:val="center"/>
+            <w:rPr>
+              <w:rFonts w:ascii="Arial" w:hAnsi="Arial" w:cs="Arial"/>
+              <w:b/>
+              <w:bCs/>
+              <w:color w:val="auto"/>
               <w:sz w:val="22"/>
               <w:szCs w:val="22"/>
             </w:rPr>
@@ -391,6 +395,9 @@
           <w:r>
             <w:rPr>
               <w:rFonts w:ascii="Arial" w:hAnsi="Arial" w:cs="Arial"/>
+              <w:b/>
+              <w:bCs/>
+              <w:color w:val="auto"/>
               <w:sz w:val="22"/>
               <w:szCs w:val="22"/>
               <w:lang w:val="es-MX"/>
@@ -400,8 +407,13 @@
         </w:p>
         <w:p>
           <w:pPr>
-            <w:rPr>
-              <w:rFonts w:ascii="Arial" w:hAnsi="Arial" w:cs="Arial"/>
+            <w:pStyle w:val="TDC1"/>
+            <w:tabs>
+              <w:tab w:val="right" w:leader="dot" w:pos="9350"/>
+            </w:tabs>
+            <w:rPr>
+              <w:rFonts w:ascii="Arial" w:hAnsi="Arial" w:cs="Arial"/>
+              <w:noProof/>
               <w:sz w:val="22"/>
               <w:szCs w:val="22"/>
             </w:rPr>
@@ -430,16 +442,1345 @@
             </w:rPr>
             <w:fldChar w:fldCharType="separate"/>
           </w:r>
-          <w:r>
+          <w:hyperlink w:anchor="_Toc231037588" w:history="1">
+            <w:r>
+              <w:rPr>
+                <w:rStyle w:val="Hipervnculo"/>
+                <w:rFonts w:ascii="Arial" w:hAnsi="Arial" w:cs="Arial"/>
+                <w:noProof/>
+                <w:color w:val="auto"/>
+                <w:sz w:val="22"/>
+                <w:szCs w:val="22"/>
+              </w:rPr>
+              <w:t>Introducción</w:t>
+            </w:r>
+            <w:r>
+              <w:rPr>
+                <w:rFonts w:ascii="Arial" w:hAnsi="Arial" w:cs="Arial"/>
+                <w:noProof/>
+                <w:webHidden/>
+                <w:sz w:val="22"/>
+                <w:szCs w:val="22"/>
+              </w:rPr>
+              <w:tab/>
+            </w:r>
+            <w:r>
+              <w:rPr>
+                <w:rFonts w:ascii="Arial" w:hAnsi="Arial" w:cs="Arial"/>
+                <w:noProof/>
+                <w:webHidden/>
+                <w:sz w:val="22"/>
+                <w:szCs w:val="22"/>
+              </w:rPr>
+              <w:fldChar w:fldCharType="begin"/>
+            </w:r>
+            <w:r>
+              <w:rPr>
+                <w:rFonts w:ascii="Arial" w:hAnsi="Arial" w:cs="Arial"/>
+                <w:noProof/>
+                <w:webHidden/>
+                <w:sz w:val="22"/>
+                <w:szCs w:val="22"/>
+              </w:rPr>
+              <w:instrText xml:space="preserve"> PAGEREF _Toc231037588 \h </w:instrText>
+            </w:r>
+            <w:r>
+              <w:rPr>
+                <w:rFonts w:ascii="Arial" w:hAnsi="Arial" w:cs="Arial"/>
+                <w:noProof/>
+                <w:webHidden/>
+                <w:sz w:val="22"/>
+                <w:szCs w:val="22"/>
+              </w:rPr>
+            </w:r>
+            <w:r>
+              <w:rPr>
+                <w:rFonts w:ascii="Arial" w:hAnsi="Arial" w:cs="Arial"/>
+                <w:noProof/>
+                <w:webHidden/>
+                <w:sz w:val="22"/>
+                <w:szCs w:val="22"/>
+              </w:rPr>
+              <w:fldChar w:fldCharType="separate"/>
+            </w:r>
+            <w:r>
+              <w:rPr>
+                <w:rFonts w:ascii="Arial" w:hAnsi="Arial" w:cs="Arial"/>
+                <w:noProof/>
+                <w:webHidden/>
+                <w:sz w:val="22"/>
+                <w:szCs w:val="22"/>
+              </w:rPr>
+              <w:t>3</w:t>
+            </w:r>
+            <w:r>
+              <w:rPr>
+                <w:rFonts w:ascii="Arial" w:hAnsi="Arial" w:cs="Arial"/>
+                <w:noProof/>
+                <w:webHidden/>
+                <w:sz w:val="22"/>
+                <w:szCs w:val="22"/>
+              </w:rPr>
+              <w:fldChar w:fldCharType="end"/>
+            </w:r>
+          </w:hyperlink>
+        </w:p>
+        <w:p>
+          <w:pPr>
+            <w:pStyle w:val="TDC1"/>
+            <w:tabs>
+              <w:tab w:val="right" w:leader="dot" w:pos="9350"/>
+            </w:tabs>
             <w:rPr>
               <w:rFonts w:ascii="Arial" w:hAnsi="Arial" w:cs="Arial"/>
               <w:noProof/>
               <w:sz w:val="22"/>
               <w:szCs w:val="22"/>
-              <w:lang w:val="es-MX"/>
-            </w:rPr>
-            <w:t>No se encontraron entradas de tabla de contenido.</w:t>
-          </w:r>
+            </w:rPr>
+          </w:pPr>
+          <w:hyperlink w:anchor="_Toc231037589" w:history="1">
+            <w:r>
+              <w:rPr>
+                <w:rStyle w:val="Hipervnculo"/>
+                <w:rFonts w:ascii="Arial" w:hAnsi="Arial" w:cs="Arial"/>
+                <w:noProof/>
+                <w:color w:val="auto"/>
+                <w:sz w:val="22"/>
+                <w:szCs w:val="22"/>
+              </w:rPr>
+              <w:t>Desarrollo</w:t>
+            </w:r>
+            <w:r>
+              <w:rPr>
+                <w:rFonts w:ascii="Arial" w:hAnsi="Arial" w:cs="Arial"/>
+                <w:noProof/>
+                <w:webHidden/>
+                <w:sz w:val="22"/>
+                <w:szCs w:val="22"/>
+              </w:rPr>
+              <w:tab/>
+            </w:r>
+            <w:r>
+              <w:rPr>
+                <w:rFonts w:ascii="Arial" w:hAnsi="Arial" w:cs="Arial"/>
+                <w:noProof/>
+                <w:webHidden/>
+                <w:sz w:val="22"/>
+                <w:szCs w:val="22"/>
+              </w:rPr>
+              <w:fldChar w:fldCharType="begin"/>
+            </w:r>
+            <w:r>
+              <w:rPr>
+                <w:rFonts w:ascii="Arial" w:hAnsi="Arial" w:cs="Arial"/>
+                <w:noProof/>
+                <w:webHidden/>
+                <w:sz w:val="22"/>
+                <w:szCs w:val="22"/>
+              </w:rPr>
+              <w:instrText xml:space="preserve"> PAGEREF _Toc231037589 \h </w:instrText>
+            </w:r>
+            <w:r>
+              <w:rPr>
+                <w:rFonts w:ascii="Arial" w:hAnsi="Arial" w:cs="Arial"/>
+                <w:noProof/>
+                <w:webHidden/>
+                <w:sz w:val="22"/>
+                <w:szCs w:val="22"/>
+              </w:rPr>
+            </w:r>
+            <w:r>
+              <w:rPr>
+                <w:rFonts w:ascii="Arial" w:hAnsi="Arial" w:cs="Arial"/>
+                <w:noProof/>
+                <w:webHidden/>
+                <w:sz w:val="22"/>
+                <w:szCs w:val="22"/>
+              </w:rPr>
+              <w:fldChar w:fldCharType="separate"/>
+            </w:r>
+            <w:r>
+              <w:rPr>
+                <w:rFonts w:ascii="Arial" w:hAnsi="Arial" w:cs="Arial"/>
+                <w:noProof/>
+                <w:webHidden/>
+                <w:sz w:val="22"/>
+                <w:szCs w:val="22"/>
+              </w:rPr>
+              <w:t>4</w:t>
+            </w:r>
+            <w:r>
+              <w:rPr>
+                <w:rFonts w:ascii="Arial" w:hAnsi="Arial" w:cs="Arial"/>
+                <w:noProof/>
+                <w:webHidden/>
+                <w:sz w:val="22"/>
+                <w:szCs w:val="22"/>
+              </w:rPr>
+              <w:fldChar w:fldCharType="end"/>
+            </w:r>
+          </w:hyperlink>
+        </w:p>
+        <w:p>
+          <w:pPr>
+            <w:pStyle w:val="TDC2"/>
+            <w:tabs>
+              <w:tab w:val="right" w:leader="dot" w:pos="9350"/>
+            </w:tabs>
+            <w:rPr>
+              <w:rFonts w:ascii="Arial" w:hAnsi="Arial" w:cs="Arial"/>
+              <w:noProof/>
+              <w:sz w:val="22"/>
+              <w:szCs w:val="22"/>
+            </w:rPr>
+          </w:pPr>
+          <w:hyperlink w:anchor="_Toc231037590" w:history="1">
+            <w:r>
+              <w:rPr>
+                <w:rStyle w:val="Hipervnculo"/>
+                <w:rFonts w:ascii="Arial" w:hAnsi="Arial" w:cs="Arial"/>
+                <w:noProof/>
+                <w:color w:val="auto"/>
+                <w:sz w:val="22"/>
+                <w:szCs w:val="22"/>
+              </w:rPr>
+              <w:t>Definición técnica</w:t>
+            </w:r>
+            <w:r>
+              <w:rPr>
+                <w:rFonts w:ascii="Arial" w:hAnsi="Arial" w:cs="Arial"/>
+                <w:noProof/>
+                <w:webHidden/>
+                <w:sz w:val="22"/>
+                <w:szCs w:val="22"/>
+              </w:rPr>
+              <w:tab/>
+            </w:r>
+            <w:r>
+              <w:rPr>
+                <w:rFonts w:ascii="Arial" w:hAnsi="Arial" w:cs="Arial"/>
+                <w:noProof/>
+                <w:webHidden/>
+                <w:sz w:val="22"/>
+                <w:szCs w:val="22"/>
+              </w:rPr>
+              <w:fldChar w:fldCharType="begin"/>
+            </w:r>
+            <w:r>
+              <w:rPr>
+                <w:rFonts w:ascii="Arial" w:hAnsi="Arial" w:cs="Arial"/>
+                <w:noProof/>
+                <w:webHidden/>
+                <w:sz w:val="22"/>
+                <w:szCs w:val="22"/>
+              </w:rPr>
+              <w:instrText xml:space="preserve"> PAGEREF _Toc231037590 \h </w:instrText>
+            </w:r>
+            <w:r>
+              <w:rPr>
+                <w:rFonts w:ascii="Arial" w:hAnsi="Arial" w:cs="Arial"/>
+                <w:noProof/>
+                <w:webHidden/>
+                <w:sz w:val="22"/>
+                <w:szCs w:val="22"/>
+              </w:rPr>
+            </w:r>
+            <w:r>
+              <w:rPr>
+                <w:rFonts w:ascii="Arial" w:hAnsi="Arial" w:cs="Arial"/>
+                <w:noProof/>
+                <w:webHidden/>
+                <w:sz w:val="22"/>
+                <w:szCs w:val="22"/>
+              </w:rPr>
+              <w:fldChar w:fldCharType="separate"/>
+            </w:r>
+            <w:r>
+              <w:rPr>
+                <w:rFonts w:ascii="Arial" w:hAnsi="Arial" w:cs="Arial"/>
+                <w:noProof/>
+                <w:webHidden/>
+                <w:sz w:val="22"/>
+                <w:szCs w:val="22"/>
+              </w:rPr>
+              <w:t>4</w:t>
+            </w:r>
+            <w:r>
+              <w:rPr>
+                <w:rFonts w:ascii="Arial" w:hAnsi="Arial" w:cs="Arial"/>
+                <w:noProof/>
+                <w:webHidden/>
+                <w:sz w:val="22"/>
+                <w:szCs w:val="22"/>
+              </w:rPr>
+              <w:fldChar w:fldCharType="end"/>
+            </w:r>
+          </w:hyperlink>
+        </w:p>
+        <w:p>
+          <w:pPr>
+            <w:pStyle w:val="TDC2"/>
+            <w:tabs>
+              <w:tab w:val="right" w:leader="dot" w:pos="9350"/>
+            </w:tabs>
+            <w:rPr>
+              <w:rFonts w:ascii="Arial" w:hAnsi="Arial" w:cs="Arial"/>
+              <w:noProof/>
+              <w:sz w:val="22"/>
+              <w:szCs w:val="22"/>
+            </w:rPr>
+          </w:pPr>
+          <w:hyperlink w:anchor="_Toc231037591" w:history="1">
+            <w:r>
+              <w:rPr>
+                <w:rStyle w:val="Hipervnculo"/>
+                <w:rFonts w:ascii="Arial" w:hAnsi="Arial" w:cs="Arial"/>
+                <w:noProof/>
+                <w:color w:val="auto"/>
+                <w:sz w:val="22"/>
+                <w:szCs w:val="22"/>
+              </w:rPr>
+              <w:t>Funcionamiento interno</w:t>
+            </w:r>
+            <w:r>
+              <w:rPr>
+                <w:rFonts w:ascii="Arial" w:hAnsi="Arial" w:cs="Arial"/>
+                <w:noProof/>
+                <w:webHidden/>
+                <w:sz w:val="22"/>
+                <w:szCs w:val="22"/>
+              </w:rPr>
+              <w:tab/>
+            </w:r>
+            <w:r>
+              <w:rPr>
+                <w:rFonts w:ascii="Arial" w:hAnsi="Arial" w:cs="Arial"/>
+                <w:noProof/>
+                <w:webHidden/>
+                <w:sz w:val="22"/>
+                <w:szCs w:val="22"/>
+              </w:rPr>
+              <w:fldChar w:fldCharType="begin"/>
+            </w:r>
+            <w:r>
+              <w:rPr>
+                <w:rFonts w:ascii="Arial" w:hAnsi="Arial" w:cs="Arial"/>
+                <w:noProof/>
+                <w:webHidden/>
+                <w:sz w:val="22"/>
+                <w:szCs w:val="22"/>
+              </w:rPr>
+              <w:instrText xml:space="preserve"> PAGEREF _Toc231037591 \h </w:instrText>
+            </w:r>
+            <w:r>
+              <w:rPr>
+                <w:rFonts w:ascii="Arial" w:hAnsi="Arial" w:cs="Arial"/>
+                <w:noProof/>
+                <w:webHidden/>
+                <w:sz w:val="22"/>
+                <w:szCs w:val="22"/>
+              </w:rPr>
+            </w:r>
+            <w:r>
+              <w:rPr>
+                <w:rFonts w:ascii="Arial" w:hAnsi="Arial" w:cs="Arial"/>
+                <w:noProof/>
+                <w:webHidden/>
+                <w:sz w:val="22"/>
+                <w:szCs w:val="22"/>
+              </w:rPr>
+              <w:fldChar w:fldCharType="separate"/>
+            </w:r>
+            <w:r>
+              <w:rPr>
+                <w:rFonts w:ascii="Arial" w:hAnsi="Arial" w:cs="Arial"/>
+                <w:noProof/>
+                <w:webHidden/>
+                <w:sz w:val="22"/>
+                <w:szCs w:val="22"/>
+              </w:rPr>
+              <w:t>5</w:t>
+            </w:r>
+            <w:r>
+              <w:rPr>
+                <w:rFonts w:ascii="Arial" w:hAnsi="Arial" w:cs="Arial"/>
+                <w:noProof/>
+                <w:webHidden/>
+                <w:sz w:val="22"/>
+                <w:szCs w:val="22"/>
+              </w:rPr>
+              <w:fldChar w:fldCharType="end"/>
+            </w:r>
+          </w:hyperlink>
+        </w:p>
+        <w:p>
+          <w:pPr>
+            <w:pStyle w:val="TDC2"/>
+            <w:tabs>
+              <w:tab w:val="right" w:leader="dot" w:pos="9350"/>
+            </w:tabs>
+            <w:rPr>
+              <w:rFonts w:ascii="Arial" w:hAnsi="Arial" w:cs="Arial"/>
+              <w:noProof/>
+              <w:sz w:val="22"/>
+              <w:szCs w:val="22"/>
+            </w:rPr>
+          </w:pPr>
+          <w:hyperlink w:anchor="_Toc231037592" w:history="1">
+            <w:r>
+              <w:rPr>
+                <w:rStyle w:val="Hipervnculo"/>
+                <w:rFonts w:ascii="Arial" w:hAnsi="Arial" w:cs="Arial"/>
+                <w:noProof/>
+                <w:color w:val="auto"/>
+                <w:sz w:val="22"/>
+                <w:szCs w:val="22"/>
+              </w:rPr>
+              <w:t>Casos de uso</w:t>
+            </w:r>
+            <w:r>
+              <w:rPr>
+                <w:rFonts w:ascii="Arial" w:hAnsi="Arial" w:cs="Arial"/>
+                <w:noProof/>
+                <w:webHidden/>
+                <w:sz w:val="22"/>
+                <w:szCs w:val="22"/>
+              </w:rPr>
+              <w:tab/>
+            </w:r>
+            <w:r>
+              <w:rPr>
+                <w:rFonts w:ascii="Arial" w:hAnsi="Arial" w:cs="Arial"/>
+                <w:noProof/>
+                <w:webHidden/>
+                <w:sz w:val="22"/>
+                <w:szCs w:val="22"/>
+              </w:rPr>
+              <w:fldChar w:fldCharType="begin"/>
+            </w:r>
+            <w:r>
+              <w:rPr>
+                <w:rFonts w:ascii="Arial" w:hAnsi="Arial" w:cs="Arial"/>
+                <w:noProof/>
+                <w:webHidden/>
+                <w:sz w:val="22"/>
+                <w:szCs w:val="22"/>
+              </w:rPr>
+              <w:instrText xml:space="preserve"> PAGEREF _Toc231037592 \h </w:instrText>
+            </w:r>
+            <w:r>
+              <w:rPr>
+                <w:rFonts w:ascii="Arial" w:hAnsi="Arial" w:cs="Arial"/>
+                <w:noProof/>
+                <w:webHidden/>
+                <w:sz w:val="22"/>
+                <w:szCs w:val="22"/>
+              </w:rPr>
+            </w:r>
+            <w:r>
+              <w:rPr>
+                <w:rFonts w:ascii="Arial" w:hAnsi="Arial" w:cs="Arial"/>
+                <w:noProof/>
+                <w:webHidden/>
+                <w:sz w:val="22"/>
+                <w:szCs w:val="22"/>
+              </w:rPr>
+              <w:fldChar w:fldCharType="separate"/>
+            </w:r>
+            <w:r>
+              <w:rPr>
+                <w:rFonts w:ascii="Arial" w:hAnsi="Arial" w:cs="Arial"/>
+                <w:noProof/>
+                <w:webHidden/>
+                <w:sz w:val="22"/>
+                <w:szCs w:val="22"/>
+              </w:rPr>
+              <w:t>6</w:t>
+            </w:r>
+            <w:r>
+              <w:rPr>
+                <w:rFonts w:ascii="Arial" w:hAnsi="Arial" w:cs="Arial"/>
+                <w:noProof/>
+                <w:webHidden/>
+                <w:sz w:val="22"/>
+                <w:szCs w:val="22"/>
+              </w:rPr>
+              <w:fldChar w:fldCharType="end"/>
+            </w:r>
+          </w:hyperlink>
+        </w:p>
+        <w:p>
+          <w:pPr>
+            <w:pStyle w:val="TDC2"/>
+            <w:tabs>
+              <w:tab w:val="right" w:leader="dot" w:pos="9350"/>
+            </w:tabs>
+            <w:rPr>
+              <w:rFonts w:ascii="Arial" w:hAnsi="Arial" w:cs="Arial"/>
+              <w:noProof/>
+              <w:sz w:val="22"/>
+              <w:szCs w:val="22"/>
+            </w:rPr>
+          </w:pPr>
+          <w:hyperlink w:anchor="_Toc231037593" w:history="1">
+            <w:r>
+              <w:rPr>
+                <w:rStyle w:val="Hipervnculo"/>
+                <w:rFonts w:ascii="Arial" w:hAnsi="Arial" w:cs="Arial"/>
+                <w:noProof/>
+                <w:color w:val="auto"/>
+                <w:sz w:val="22"/>
+                <w:szCs w:val="22"/>
+              </w:rPr>
+              <w:t>Comparativa con alternativas</w:t>
+            </w:r>
+            <w:r>
+              <w:rPr>
+                <w:rFonts w:ascii="Arial" w:hAnsi="Arial" w:cs="Arial"/>
+                <w:noProof/>
+                <w:webHidden/>
+                <w:sz w:val="22"/>
+                <w:szCs w:val="22"/>
+              </w:rPr>
+              <w:tab/>
+            </w:r>
+            <w:r>
+              <w:rPr>
+                <w:rFonts w:ascii="Arial" w:hAnsi="Arial" w:cs="Arial"/>
+                <w:noProof/>
+                <w:webHidden/>
+                <w:sz w:val="22"/>
+                <w:szCs w:val="22"/>
+              </w:rPr>
+              <w:fldChar w:fldCharType="begin"/>
+            </w:r>
+            <w:r>
+              <w:rPr>
+                <w:rFonts w:ascii="Arial" w:hAnsi="Arial" w:cs="Arial"/>
+                <w:noProof/>
+                <w:webHidden/>
+                <w:sz w:val="22"/>
+                <w:szCs w:val="22"/>
+              </w:rPr>
+              <w:instrText xml:space="preserve"> PAGEREF _Toc231037593 \h </w:instrText>
+            </w:r>
+            <w:r>
+              <w:rPr>
+                <w:rFonts w:ascii="Arial" w:hAnsi="Arial" w:cs="Arial"/>
+                <w:noProof/>
+                <w:webHidden/>
+                <w:sz w:val="22"/>
+                <w:szCs w:val="22"/>
+              </w:rPr>
+            </w:r>
+            <w:r>
+              <w:rPr>
+                <w:rFonts w:ascii="Arial" w:hAnsi="Arial" w:cs="Arial"/>
+                <w:noProof/>
+                <w:webHidden/>
+                <w:sz w:val="22"/>
+                <w:szCs w:val="22"/>
+              </w:rPr>
+              <w:fldChar w:fldCharType="separate"/>
+            </w:r>
+            <w:r>
+              <w:rPr>
+                <w:rFonts w:ascii="Arial" w:hAnsi="Arial" w:cs="Arial"/>
+                <w:noProof/>
+                <w:webHidden/>
+                <w:sz w:val="22"/>
+                <w:szCs w:val="22"/>
+              </w:rPr>
+              <w:t>6</w:t>
+            </w:r>
+            <w:r>
+              <w:rPr>
+                <w:rFonts w:ascii="Arial" w:hAnsi="Arial" w:cs="Arial"/>
+                <w:noProof/>
+                <w:webHidden/>
+                <w:sz w:val="22"/>
+                <w:szCs w:val="22"/>
+              </w:rPr>
+              <w:fldChar w:fldCharType="end"/>
+            </w:r>
+          </w:hyperlink>
+        </w:p>
+        <w:p>
+          <w:pPr>
+            <w:pStyle w:val="TDC2"/>
+            <w:tabs>
+              <w:tab w:val="right" w:leader="dot" w:pos="9350"/>
+            </w:tabs>
+            <w:rPr>
+              <w:rFonts w:ascii="Arial" w:hAnsi="Arial" w:cs="Arial"/>
+              <w:noProof/>
+              <w:sz w:val="22"/>
+              <w:szCs w:val="22"/>
+            </w:rPr>
+          </w:pPr>
+          <w:hyperlink w:anchor="_Toc231037594" w:history="1">
+            <w:r>
+              <w:rPr>
+                <w:rStyle w:val="Hipervnculo"/>
+                <w:rFonts w:ascii="Arial" w:hAnsi="Arial" w:cs="Arial"/>
+                <w:noProof/>
+                <w:color w:val="auto"/>
+                <w:sz w:val="22"/>
+                <w:szCs w:val="22"/>
+              </w:rPr>
+              <w:t>Tabla 1</w:t>
+            </w:r>
+            <w:r>
+              <w:rPr>
+                <w:rFonts w:ascii="Arial" w:hAnsi="Arial" w:cs="Arial"/>
+                <w:noProof/>
+                <w:webHidden/>
+                <w:sz w:val="22"/>
+                <w:szCs w:val="22"/>
+              </w:rPr>
+              <w:tab/>
+            </w:r>
+            <w:r>
+              <w:rPr>
+                <w:rFonts w:ascii="Arial" w:hAnsi="Arial" w:cs="Arial"/>
+                <w:noProof/>
+                <w:webHidden/>
+                <w:sz w:val="22"/>
+                <w:szCs w:val="22"/>
+              </w:rPr>
+              <w:fldChar w:fldCharType="begin"/>
+            </w:r>
+            <w:r>
+              <w:rPr>
+                <w:rFonts w:ascii="Arial" w:hAnsi="Arial" w:cs="Arial"/>
+                <w:noProof/>
+                <w:webHidden/>
+                <w:sz w:val="22"/>
+                <w:szCs w:val="22"/>
+              </w:rPr>
+              <w:instrText xml:space="preserve"> PAGEREF _Toc231037594 \h </w:instrText>
+            </w:r>
+            <w:r>
+              <w:rPr>
+                <w:rFonts w:ascii="Arial" w:hAnsi="Arial" w:cs="Arial"/>
+                <w:noProof/>
+                <w:webHidden/>
+                <w:sz w:val="22"/>
+                <w:szCs w:val="22"/>
+              </w:rPr>
+            </w:r>
+            <w:r>
+              <w:rPr>
+                <w:rFonts w:ascii="Arial" w:hAnsi="Arial" w:cs="Arial"/>
+                <w:noProof/>
+                <w:webHidden/>
+                <w:sz w:val="22"/>
+                <w:szCs w:val="22"/>
+              </w:rPr>
+              <w:fldChar w:fldCharType="separate"/>
+            </w:r>
+            <w:r>
+              <w:rPr>
+                <w:rFonts w:ascii="Arial" w:hAnsi="Arial" w:cs="Arial"/>
+                <w:noProof/>
+                <w:webHidden/>
+                <w:sz w:val="22"/>
+                <w:szCs w:val="22"/>
+              </w:rPr>
+              <w:t>7</w:t>
+            </w:r>
+            <w:r>
+              <w:rPr>
+                <w:rFonts w:ascii="Arial" w:hAnsi="Arial" w:cs="Arial"/>
+                <w:noProof/>
+                <w:webHidden/>
+                <w:sz w:val="22"/>
+                <w:szCs w:val="22"/>
+              </w:rPr>
+              <w:fldChar w:fldCharType="end"/>
+            </w:r>
+          </w:hyperlink>
+        </w:p>
+        <w:p>
+          <w:pPr>
+            <w:pStyle w:val="TDC2"/>
+            <w:tabs>
+              <w:tab w:val="right" w:leader="dot" w:pos="9350"/>
+            </w:tabs>
+            <w:rPr>
+              <w:rFonts w:ascii="Arial" w:hAnsi="Arial" w:cs="Arial"/>
+              <w:noProof/>
+              <w:sz w:val="22"/>
+              <w:szCs w:val="22"/>
+            </w:rPr>
+          </w:pPr>
+          <w:hyperlink w:anchor="_Toc231037595" w:history="1">
+            <w:r>
+              <w:rPr>
+                <w:rStyle w:val="Hipervnculo"/>
+                <w:rFonts w:ascii="Arial" w:hAnsi="Arial" w:cs="Arial"/>
+                <w:noProof/>
+                <w:color w:val="auto"/>
+                <w:sz w:val="22"/>
+                <w:szCs w:val="22"/>
+              </w:rPr>
+              <w:t>Ecosistema actual</w:t>
+            </w:r>
+            <w:r>
+              <w:rPr>
+                <w:rFonts w:ascii="Arial" w:hAnsi="Arial" w:cs="Arial"/>
+                <w:noProof/>
+                <w:webHidden/>
+                <w:sz w:val="22"/>
+                <w:szCs w:val="22"/>
+              </w:rPr>
+              <w:tab/>
+            </w:r>
+            <w:r>
+              <w:rPr>
+                <w:rFonts w:ascii="Arial" w:hAnsi="Arial" w:cs="Arial"/>
+                <w:noProof/>
+                <w:webHidden/>
+                <w:sz w:val="22"/>
+                <w:szCs w:val="22"/>
+              </w:rPr>
+              <w:fldChar w:fldCharType="begin"/>
+            </w:r>
+            <w:r>
+              <w:rPr>
+                <w:rFonts w:ascii="Arial" w:hAnsi="Arial" w:cs="Arial"/>
+                <w:noProof/>
+                <w:webHidden/>
+                <w:sz w:val="22"/>
+                <w:szCs w:val="22"/>
+              </w:rPr>
+              <w:instrText xml:space="preserve"> PAGEREF _Toc231037595 \h </w:instrText>
+            </w:r>
+            <w:r>
+              <w:rPr>
+                <w:rFonts w:ascii="Arial" w:hAnsi="Arial" w:cs="Arial"/>
+                <w:noProof/>
+                <w:webHidden/>
+                <w:sz w:val="22"/>
+                <w:szCs w:val="22"/>
+              </w:rPr>
+            </w:r>
+            <w:r>
+              <w:rPr>
+                <w:rFonts w:ascii="Arial" w:hAnsi="Arial" w:cs="Arial"/>
+                <w:noProof/>
+                <w:webHidden/>
+                <w:sz w:val="22"/>
+                <w:szCs w:val="22"/>
+              </w:rPr>
+              <w:fldChar w:fldCharType="separate"/>
+            </w:r>
+            <w:r>
+              <w:rPr>
+                <w:rFonts w:ascii="Arial" w:hAnsi="Arial" w:cs="Arial"/>
+                <w:noProof/>
+                <w:webHidden/>
+                <w:sz w:val="22"/>
+                <w:szCs w:val="22"/>
+              </w:rPr>
+              <w:t>8</w:t>
+            </w:r>
+            <w:r>
+              <w:rPr>
+                <w:rFonts w:ascii="Arial" w:hAnsi="Arial" w:cs="Arial"/>
+                <w:noProof/>
+                <w:webHidden/>
+                <w:sz w:val="22"/>
+                <w:szCs w:val="22"/>
+              </w:rPr>
+              <w:fldChar w:fldCharType="end"/>
+            </w:r>
+          </w:hyperlink>
+        </w:p>
+        <w:p>
+          <w:pPr>
+            <w:pStyle w:val="TDC3"/>
+            <w:tabs>
+              <w:tab w:val="right" w:leader="dot" w:pos="9350"/>
+            </w:tabs>
+            <w:rPr>
+              <w:rFonts w:ascii="Arial" w:hAnsi="Arial" w:cs="Arial"/>
+              <w:noProof/>
+              <w:sz w:val="22"/>
+              <w:szCs w:val="22"/>
+            </w:rPr>
+          </w:pPr>
+          <w:hyperlink w:anchor="_Toc231037596" w:history="1">
+            <w:r>
+              <w:rPr>
+                <w:rStyle w:val="Hipervnculo"/>
+                <w:rFonts w:ascii="Arial" w:hAnsi="Arial" w:cs="Arial"/>
+                <w:noProof/>
+                <w:color w:val="auto"/>
+                <w:sz w:val="22"/>
+                <w:szCs w:val="22"/>
+              </w:rPr>
+              <w:t>Versiones estables de las métricas.</w:t>
+            </w:r>
+            <w:r>
+              <w:rPr>
+                <w:rFonts w:ascii="Arial" w:hAnsi="Arial" w:cs="Arial"/>
+                <w:noProof/>
+                <w:webHidden/>
+                <w:sz w:val="22"/>
+                <w:szCs w:val="22"/>
+              </w:rPr>
+              <w:tab/>
+            </w:r>
+            <w:r>
+              <w:rPr>
+                <w:rFonts w:ascii="Arial" w:hAnsi="Arial" w:cs="Arial"/>
+                <w:noProof/>
+                <w:webHidden/>
+                <w:sz w:val="22"/>
+                <w:szCs w:val="22"/>
+              </w:rPr>
+              <w:fldChar w:fldCharType="begin"/>
+            </w:r>
+            <w:r>
+              <w:rPr>
+                <w:rFonts w:ascii="Arial" w:hAnsi="Arial" w:cs="Arial"/>
+                <w:noProof/>
+                <w:webHidden/>
+                <w:sz w:val="22"/>
+                <w:szCs w:val="22"/>
+              </w:rPr>
+              <w:instrText xml:space="preserve"> PAGEREF _Toc231037596 \h </w:instrText>
+            </w:r>
+            <w:r>
+              <w:rPr>
+                <w:rFonts w:ascii="Arial" w:hAnsi="Arial" w:cs="Arial"/>
+                <w:noProof/>
+                <w:webHidden/>
+                <w:sz w:val="22"/>
+                <w:szCs w:val="22"/>
+              </w:rPr>
+            </w:r>
+            <w:r>
+              <w:rPr>
+                <w:rFonts w:ascii="Arial" w:hAnsi="Arial" w:cs="Arial"/>
+                <w:noProof/>
+                <w:webHidden/>
+                <w:sz w:val="22"/>
+                <w:szCs w:val="22"/>
+              </w:rPr>
+              <w:fldChar w:fldCharType="separate"/>
+            </w:r>
+            <w:r>
+              <w:rPr>
+                <w:rFonts w:ascii="Arial" w:hAnsi="Arial" w:cs="Arial"/>
+                <w:noProof/>
+                <w:webHidden/>
+                <w:sz w:val="22"/>
+                <w:szCs w:val="22"/>
+              </w:rPr>
+              <w:t>9</w:t>
+            </w:r>
+            <w:r>
+              <w:rPr>
+                <w:rFonts w:ascii="Arial" w:hAnsi="Arial" w:cs="Arial"/>
+                <w:noProof/>
+                <w:webHidden/>
+                <w:sz w:val="22"/>
+                <w:szCs w:val="22"/>
+              </w:rPr>
+              <w:fldChar w:fldCharType="end"/>
+            </w:r>
+          </w:hyperlink>
+        </w:p>
+        <w:p>
+          <w:pPr>
+            <w:pStyle w:val="TDC3"/>
+            <w:tabs>
+              <w:tab w:val="right" w:leader="dot" w:pos="9350"/>
+            </w:tabs>
+            <w:rPr>
+              <w:rFonts w:ascii="Arial" w:hAnsi="Arial" w:cs="Arial"/>
+              <w:noProof/>
+              <w:sz w:val="22"/>
+              <w:szCs w:val="22"/>
+            </w:rPr>
+          </w:pPr>
+          <w:hyperlink w:anchor="_Toc231037597" w:history="1">
+            <w:r>
+              <w:rPr>
+                <w:rStyle w:val="Hipervnculo"/>
+                <w:rFonts w:ascii="Arial" w:hAnsi="Arial" w:cs="Arial"/>
+                <w:noProof/>
+                <w:color w:val="auto"/>
+                <w:sz w:val="22"/>
+                <w:szCs w:val="22"/>
+              </w:rPr>
+              <w:t>Estado de Adopción y tendencias en la industria.</w:t>
+            </w:r>
+            <w:r>
+              <w:rPr>
+                <w:rFonts w:ascii="Arial" w:hAnsi="Arial" w:cs="Arial"/>
+                <w:noProof/>
+                <w:webHidden/>
+                <w:sz w:val="22"/>
+                <w:szCs w:val="22"/>
+              </w:rPr>
+              <w:tab/>
+            </w:r>
+            <w:r>
+              <w:rPr>
+                <w:rFonts w:ascii="Arial" w:hAnsi="Arial" w:cs="Arial"/>
+                <w:noProof/>
+                <w:webHidden/>
+                <w:sz w:val="22"/>
+                <w:szCs w:val="22"/>
+              </w:rPr>
+              <w:fldChar w:fldCharType="begin"/>
+            </w:r>
+            <w:r>
+              <w:rPr>
+                <w:rFonts w:ascii="Arial" w:hAnsi="Arial" w:cs="Arial"/>
+                <w:noProof/>
+                <w:webHidden/>
+                <w:sz w:val="22"/>
+                <w:szCs w:val="22"/>
+              </w:rPr>
+              <w:instrText xml:space="preserve"> PAGEREF _Toc231037597 \h </w:instrText>
+            </w:r>
+            <w:r>
+              <w:rPr>
+                <w:rFonts w:ascii="Arial" w:hAnsi="Arial" w:cs="Arial"/>
+                <w:noProof/>
+                <w:webHidden/>
+                <w:sz w:val="22"/>
+                <w:szCs w:val="22"/>
+              </w:rPr>
+            </w:r>
+            <w:r>
+              <w:rPr>
+                <w:rFonts w:ascii="Arial" w:hAnsi="Arial" w:cs="Arial"/>
+                <w:noProof/>
+                <w:webHidden/>
+                <w:sz w:val="22"/>
+                <w:szCs w:val="22"/>
+              </w:rPr>
+              <w:fldChar w:fldCharType="separate"/>
+            </w:r>
+            <w:r>
+              <w:rPr>
+                <w:rFonts w:ascii="Arial" w:hAnsi="Arial" w:cs="Arial"/>
+                <w:noProof/>
+                <w:webHidden/>
+                <w:sz w:val="22"/>
+                <w:szCs w:val="22"/>
+              </w:rPr>
+              <w:t>9</w:t>
+            </w:r>
+            <w:r>
+              <w:rPr>
+                <w:rFonts w:ascii="Arial" w:hAnsi="Arial" w:cs="Arial"/>
+                <w:noProof/>
+                <w:webHidden/>
+                <w:sz w:val="22"/>
+                <w:szCs w:val="22"/>
+              </w:rPr>
+              <w:fldChar w:fldCharType="end"/>
+            </w:r>
+          </w:hyperlink>
+        </w:p>
+        <w:p>
+          <w:pPr>
+            <w:pStyle w:val="TDC3"/>
+            <w:tabs>
+              <w:tab w:val="right" w:leader="dot" w:pos="9350"/>
+            </w:tabs>
+            <w:rPr>
+              <w:rFonts w:ascii="Arial" w:hAnsi="Arial" w:cs="Arial"/>
+              <w:noProof/>
+              <w:sz w:val="22"/>
+              <w:szCs w:val="22"/>
+            </w:rPr>
+          </w:pPr>
+          <w:hyperlink w:anchor="_Toc231037598" w:history="1">
+            <w:r>
+              <w:rPr>
+                <w:rStyle w:val="Hipervnculo"/>
+                <w:rFonts w:ascii="Arial" w:hAnsi="Arial" w:cs="Arial"/>
+                <w:noProof/>
+                <w:color w:val="auto"/>
+                <w:sz w:val="22"/>
+                <w:szCs w:val="22"/>
+              </w:rPr>
+              <w:t>Ecosistema y Tendencias Tecnológicas.</w:t>
+            </w:r>
+            <w:r>
+              <w:rPr>
+                <w:rFonts w:ascii="Arial" w:hAnsi="Arial" w:cs="Arial"/>
+                <w:noProof/>
+                <w:webHidden/>
+                <w:sz w:val="22"/>
+                <w:szCs w:val="22"/>
+              </w:rPr>
+              <w:tab/>
+            </w:r>
+            <w:r>
+              <w:rPr>
+                <w:rFonts w:ascii="Arial" w:hAnsi="Arial" w:cs="Arial"/>
+                <w:noProof/>
+                <w:webHidden/>
+                <w:sz w:val="22"/>
+                <w:szCs w:val="22"/>
+              </w:rPr>
+              <w:fldChar w:fldCharType="begin"/>
+            </w:r>
+            <w:r>
+              <w:rPr>
+                <w:rFonts w:ascii="Arial" w:hAnsi="Arial" w:cs="Arial"/>
+                <w:noProof/>
+                <w:webHidden/>
+                <w:sz w:val="22"/>
+                <w:szCs w:val="22"/>
+              </w:rPr>
+              <w:instrText xml:space="preserve"> PAGEREF _Toc231037598 \h </w:instrText>
+            </w:r>
+            <w:r>
+              <w:rPr>
+                <w:rFonts w:ascii="Arial" w:hAnsi="Arial" w:cs="Arial"/>
+                <w:noProof/>
+                <w:webHidden/>
+                <w:sz w:val="22"/>
+                <w:szCs w:val="22"/>
+              </w:rPr>
+            </w:r>
+            <w:r>
+              <w:rPr>
+                <w:rFonts w:ascii="Arial" w:hAnsi="Arial" w:cs="Arial"/>
+                <w:noProof/>
+                <w:webHidden/>
+                <w:sz w:val="22"/>
+                <w:szCs w:val="22"/>
+              </w:rPr>
+              <w:fldChar w:fldCharType="separate"/>
+            </w:r>
+            <w:r>
+              <w:rPr>
+                <w:rFonts w:ascii="Arial" w:hAnsi="Arial" w:cs="Arial"/>
+                <w:noProof/>
+                <w:webHidden/>
+                <w:sz w:val="22"/>
+                <w:szCs w:val="22"/>
+              </w:rPr>
+              <w:t>9</w:t>
+            </w:r>
+            <w:r>
+              <w:rPr>
+                <w:rFonts w:ascii="Arial" w:hAnsi="Arial" w:cs="Arial"/>
+                <w:noProof/>
+                <w:webHidden/>
+                <w:sz w:val="22"/>
+                <w:szCs w:val="22"/>
+              </w:rPr>
+              <w:fldChar w:fldCharType="end"/>
+            </w:r>
+          </w:hyperlink>
+        </w:p>
+        <w:p>
+          <w:pPr>
+            <w:pStyle w:val="TDC3"/>
+            <w:tabs>
+              <w:tab w:val="right" w:leader="dot" w:pos="9350"/>
+            </w:tabs>
+            <w:rPr>
+              <w:rFonts w:ascii="Arial" w:hAnsi="Arial" w:cs="Arial"/>
+              <w:noProof/>
+              <w:sz w:val="22"/>
+              <w:szCs w:val="22"/>
+            </w:rPr>
+          </w:pPr>
+          <w:hyperlink w:anchor="_Toc231037599" w:history="1">
+            <w:r>
+              <w:rPr>
+                <w:rStyle w:val="Hipervnculo"/>
+                <w:rFonts w:ascii="Arial" w:hAnsi="Arial" w:cs="Arial"/>
+                <w:noProof/>
+                <w:color w:val="auto"/>
+                <w:sz w:val="22"/>
+                <w:szCs w:val="22"/>
+              </w:rPr>
+              <w:t>Herramientas y Medición.</w:t>
+            </w:r>
+            <w:r>
+              <w:rPr>
+                <w:rFonts w:ascii="Arial" w:hAnsi="Arial" w:cs="Arial"/>
+                <w:noProof/>
+                <w:webHidden/>
+                <w:sz w:val="22"/>
+                <w:szCs w:val="22"/>
+              </w:rPr>
+              <w:tab/>
+            </w:r>
+            <w:r>
+              <w:rPr>
+                <w:rFonts w:ascii="Arial" w:hAnsi="Arial" w:cs="Arial"/>
+                <w:noProof/>
+                <w:webHidden/>
+                <w:sz w:val="22"/>
+                <w:szCs w:val="22"/>
+              </w:rPr>
+              <w:fldChar w:fldCharType="begin"/>
+            </w:r>
+            <w:r>
+              <w:rPr>
+                <w:rFonts w:ascii="Arial" w:hAnsi="Arial" w:cs="Arial"/>
+                <w:noProof/>
+                <w:webHidden/>
+                <w:sz w:val="22"/>
+                <w:szCs w:val="22"/>
+              </w:rPr>
+              <w:instrText xml:space="preserve"> PAGEREF _Toc231037599 \h </w:instrText>
+            </w:r>
+            <w:r>
+              <w:rPr>
+                <w:rFonts w:ascii="Arial" w:hAnsi="Arial" w:cs="Arial"/>
+                <w:noProof/>
+                <w:webHidden/>
+                <w:sz w:val="22"/>
+                <w:szCs w:val="22"/>
+              </w:rPr>
+            </w:r>
+            <w:r>
+              <w:rPr>
+                <w:rFonts w:ascii="Arial" w:hAnsi="Arial" w:cs="Arial"/>
+                <w:noProof/>
+                <w:webHidden/>
+                <w:sz w:val="22"/>
+                <w:szCs w:val="22"/>
+              </w:rPr>
+              <w:fldChar w:fldCharType="separate"/>
+            </w:r>
+            <w:r>
+              <w:rPr>
+                <w:rFonts w:ascii="Arial" w:hAnsi="Arial" w:cs="Arial"/>
+                <w:noProof/>
+                <w:webHidden/>
+                <w:sz w:val="22"/>
+                <w:szCs w:val="22"/>
+              </w:rPr>
+              <w:t>10</w:t>
+            </w:r>
+            <w:r>
+              <w:rPr>
+                <w:rFonts w:ascii="Arial" w:hAnsi="Arial" w:cs="Arial"/>
+                <w:noProof/>
+                <w:webHidden/>
+                <w:sz w:val="22"/>
+                <w:szCs w:val="22"/>
+              </w:rPr>
+              <w:fldChar w:fldCharType="end"/>
+            </w:r>
+          </w:hyperlink>
+        </w:p>
+        <w:p>
+          <w:pPr>
+            <w:pStyle w:val="TDC1"/>
+            <w:tabs>
+              <w:tab w:val="right" w:leader="dot" w:pos="9350"/>
+            </w:tabs>
+            <w:rPr>
+              <w:rFonts w:ascii="Arial" w:hAnsi="Arial" w:cs="Arial"/>
+              <w:noProof/>
+              <w:sz w:val="22"/>
+              <w:szCs w:val="22"/>
+            </w:rPr>
+          </w:pPr>
+          <w:hyperlink w:anchor="_Toc231037600" w:history="1">
+            <w:r>
+              <w:rPr>
+                <w:rStyle w:val="Hipervnculo"/>
+                <w:rFonts w:ascii="Arial" w:hAnsi="Arial" w:cs="Arial"/>
+                <w:noProof/>
+                <w:color w:val="auto"/>
+                <w:sz w:val="22"/>
+                <w:szCs w:val="22"/>
+              </w:rPr>
+              <w:t>Conclusiones</w:t>
+            </w:r>
+            <w:r>
+              <w:rPr>
+                <w:rFonts w:ascii="Arial" w:hAnsi="Arial" w:cs="Arial"/>
+                <w:noProof/>
+                <w:webHidden/>
+                <w:sz w:val="22"/>
+                <w:szCs w:val="22"/>
+              </w:rPr>
+              <w:tab/>
+            </w:r>
+            <w:r>
+              <w:rPr>
+                <w:rFonts w:ascii="Arial" w:hAnsi="Arial" w:cs="Arial"/>
+                <w:noProof/>
+                <w:webHidden/>
+                <w:sz w:val="22"/>
+                <w:szCs w:val="22"/>
+              </w:rPr>
+              <w:fldChar w:fldCharType="begin"/>
+            </w:r>
+            <w:r>
+              <w:rPr>
+                <w:rFonts w:ascii="Arial" w:hAnsi="Arial" w:cs="Arial"/>
+                <w:noProof/>
+                <w:webHidden/>
+                <w:sz w:val="22"/>
+                <w:szCs w:val="22"/>
+              </w:rPr>
+              <w:instrText xml:space="preserve"> PAGEREF _Toc231037600 \h </w:instrText>
+            </w:r>
+            <w:r>
+              <w:rPr>
+                <w:rFonts w:ascii="Arial" w:hAnsi="Arial" w:cs="Arial"/>
+                <w:noProof/>
+                <w:webHidden/>
+                <w:sz w:val="22"/>
+                <w:szCs w:val="22"/>
+              </w:rPr>
+            </w:r>
+            <w:r>
+              <w:rPr>
+                <w:rFonts w:ascii="Arial" w:hAnsi="Arial" w:cs="Arial"/>
+                <w:noProof/>
+                <w:webHidden/>
+                <w:sz w:val="22"/>
+                <w:szCs w:val="22"/>
+              </w:rPr>
+              <w:fldChar w:fldCharType="separate"/>
+            </w:r>
+            <w:r>
+              <w:rPr>
+                <w:rFonts w:ascii="Arial" w:hAnsi="Arial" w:cs="Arial"/>
+                <w:noProof/>
+                <w:webHidden/>
+                <w:sz w:val="22"/>
+                <w:szCs w:val="22"/>
+              </w:rPr>
+              <w:t>11</w:t>
+            </w:r>
+            <w:r>
+              <w:rPr>
+                <w:rFonts w:ascii="Arial" w:hAnsi="Arial" w:cs="Arial"/>
+                <w:noProof/>
+                <w:webHidden/>
+                <w:sz w:val="22"/>
+                <w:szCs w:val="22"/>
+              </w:rPr>
+              <w:fldChar w:fldCharType="end"/>
+            </w:r>
+          </w:hyperlink>
+        </w:p>
+        <w:p>
+          <w:pPr>
+            <w:pStyle w:val="TDC1"/>
+            <w:tabs>
+              <w:tab w:val="right" w:leader="dot" w:pos="9350"/>
+            </w:tabs>
+            <w:rPr>
+              <w:rFonts w:ascii="Arial" w:hAnsi="Arial" w:cs="Arial"/>
+              <w:noProof/>
+              <w:sz w:val="22"/>
+              <w:szCs w:val="22"/>
+            </w:rPr>
+          </w:pPr>
+          <w:hyperlink w:anchor="_Toc231037601" w:history="1">
+            <w:r>
+              <w:rPr>
+                <w:rStyle w:val="Hipervnculo"/>
+                <w:rFonts w:ascii="Arial" w:hAnsi="Arial" w:cs="Arial"/>
+                <w:noProof/>
+                <w:color w:val="auto"/>
+                <w:sz w:val="22"/>
+                <w:szCs w:val="22"/>
+              </w:rPr>
+              <w:t>Referencias</w:t>
+            </w:r>
+            <w:r>
+              <w:rPr>
+                <w:rFonts w:ascii="Arial" w:hAnsi="Arial" w:cs="Arial"/>
+                <w:noProof/>
+                <w:webHidden/>
+                <w:sz w:val="22"/>
+                <w:szCs w:val="22"/>
+              </w:rPr>
+              <w:tab/>
+            </w:r>
+            <w:r>
+              <w:rPr>
+                <w:rFonts w:ascii="Arial" w:hAnsi="Arial" w:cs="Arial"/>
+                <w:noProof/>
+                <w:webHidden/>
+                <w:sz w:val="22"/>
+                <w:szCs w:val="22"/>
+              </w:rPr>
+              <w:fldChar w:fldCharType="begin"/>
+            </w:r>
+            <w:r>
+              <w:rPr>
+                <w:rFonts w:ascii="Arial" w:hAnsi="Arial" w:cs="Arial"/>
+                <w:noProof/>
+                <w:webHidden/>
+                <w:sz w:val="22"/>
+                <w:szCs w:val="22"/>
+              </w:rPr>
+              <w:instrText xml:space="preserve"> PAGEREF _Toc231037601 \h </w:instrText>
+            </w:r>
+            <w:r>
+              <w:rPr>
+                <w:rFonts w:ascii="Arial" w:hAnsi="Arial" w:cs="Arial"/>
+                <w:noProof/>
+                <w:webHidden/>
+                <w:sz w:val="22"/>
+                <w:szCs w:val="22"/>
+              </w:rPr>
+            </w:r>
+            <w:r>
+              <w:rPr>
+                <w:rFonts w:ascii="Arial" w:hAnsi="Arial" w:cs="Arial"/>
+                <w:noProof/>
+                <w:webHidden/>
+                <w:sz w:val="22"/>
+                <w:szCs w:val="22"/>
+              </w:rPr>
+              <w:fldChar w:fldCharType="separate"/>
+            </w:r>
+            <w:r>
+              <w:rPr>
+                <w:rFonts w:ascii="Arial" w:hAnsi="Arial" w:cs="Arial"/>
+                <w:noProof/>
+                <w:webHidden/>
+                <w:sz w:val="22"/>
+                <w:szCs w:val="22"/>
+              </w:rPr>
+              <w:t>12</w:t>
+            </w:r>
+            <w:r>
+              <w:rPr>
+                <w:rFonts w:ascii="Arial" w:hAnsi="Arial" w:cs="Arial"/>
+                <w:noProof/>
+                <w:webHidden/>
+                <w:sz w:val="22"/>
+                <w:szCs w:val="22"/>
+              </w:rPr>
+              <w:fldChar w:fldCharType="end"/>
+            </w:r>
+          </w:hyperlink>
+        </w:p>
+        <w:p>
+          <w:pPr>
+            <w:rPr>
+              <w:rFonts w:ascii="Arial" w:hAnsi="Arial" w:cs="Arial"/>
+              <w:sz w:val="22"/>
+              <w:szCs w:val="22"/>
+            </w:rPr>
+          </w:pPr>
           <w:r>
             <w:rPr>
               <w:rFonts w:ascii="Arial" w:hAnsi="Arial" w:cs="Arial"/>
@@ -500,6 +1841,7 @@
           <w:szCs w:val="22"/>
         </w:rPr>
       </w:pPr>
+      <w:bookmarkStart w:id="1" w:name="_Toc231037588"/>
       <w:r>
         <w:rPr>
           <w:rFonts w:ascii="Arial" w:hAnsi="Arial" w:cs="Arial"/>
@@ -512,113 +1854,42 @@
         <w:lastRenderedPageBreak/>
         <w:t>Introducción</w:t>
       </w:r>
+      <w:bookmarkEnd w:id="1"/>
     </w:p>
     <w:p>
       <w:pPr>
-        <w:rPr>
-          <w:rFonts w:ascii="Arial" w:hAnsi="Arial" w:cs="Arial"/>
-          <w:sz w:val="22"/>
-          <w:szCs w:val="22"/>
-        </w:rPr>
-      </w:pPr>
-      <w:proofErr w:type="gramStart"/>
-      <w:r>
-        <w:rPr>
-          <w:rFonts w:ascii="Arial" w:hAnsi="Arial" w:cs="Arial"/>
-          <w:sz w:val="22"/>
-          <w:szCs w:val="22"/>
-        </w:rPr>
-        <w:t>  Contexto</w:t>
-      </w:r>
-      <w:proofErr w:type="gramEnd"/>
-      <w:r>
-        <w:rPr>
-          <w:rFonts w:ascii="Arial" w:hAnsi="Arial" w:cs="Arial"/>
-          <w:sz w:val="22"/>
-          <w:szCs w:val="22"/>
-        </w:rPr>
-        <w:t xml:space="preserve"> general del tema (rendimiento web, experiencia del usuario) </w:t>
+        <w:ind w:firstLine="720"/>
+        <w:rPr>
+          <w:rFonts w:ascii="Arial" w:hAnsi="Arial" w:cs="Arial"/>
+          <w:sz w:val="22"/>
+          <w:szCs w:val="22"/>
+        </w:rPr>
+      </w:pPr>
+      <w:r>
+        <w:rPr>
+          <w:rFonts w:ascii="Arial" w:hAnsi="Arial" w:cs="Arial"/>
+          <w:sz w:val="22"/>
+          <w:szCs w:val="22"/>
+        </w:rPr>
+        <w:t>Los Core Web Vitals son un conjunto de métricas definidas por Google para medir, de forma objetiva y cuantificable, la experiencia real que tiene un usuario al navegar por un sitio web. A diferencia de indicadores técnicos tradicionales orientados al servidor, estas métricas se centran en tres dimensiones perceptibles por el usuario final: la velocidad con que carga el contenido principal, la fluidez con que responde la página a las interacciones, y la estabilidad visual de los elementos durante la navegación.</w:t>
       </w:r>
     </w:p>
     <w:p>
       <w:pPr>
-        <w:rPr>
-          <w:rFonts w:ascii="Arial" w:hAnsi="Arial" w:cs="Arial"/>
-          <w:sz w:val="22"/>
-          <w:szCs w:val="22"/>
-        </w:rPr>
-      </w:pPr>
-      <w:proofErr w:type="gramStart"/>
-      <w:r>
-        <w:rPr>
-          <w:rFonts w:ascii="Arial" w:hAnsi="Arial" w:cs="Arial"/>
-          <w:sz w:val="22"/>
-          <w:szCs w:val="22"/>
-        </w:rPr>
-        <w:t>  Por</w:t>
-      </w:r>
-      <w:proofErr w:type="gramEnd"/>
-      <w:r>
-        <w:rPr>
-          <w:rFonts w:ascii="Arial" w:hAnsi="Arial" w:cs="Arial"/>
-          <w:sz w:val="22"/>
-          <w:szCs w:val="22"/>
-        </w:rPr>
-        <w:t xml:space="preserve"> qué es relevante en el ecosistema actual </w:t>
-      </w:r>
-    </w:p>
-    <w:p>
-      <w:pPr>
-        <w:rPr>
-          <w:rFonts w:ascii="Arial" w:hAnsi="Arial" w:cs="Arial"/>
-          <w:sz w:val="22"/>
-          <w:szCs w:val="22"/>
-        </w:rPr>
-      </w:pPr>
-      <w:proofErr w:type="gramStart"/>
-      <w:r>
-        <w:rPr>
-          <w:rFonts w:ascii="Arial" w:hAnsi="Arial" w:cs="Arial"/>
-          <w:sz w:val="22"/>
-          <w:szCs w:val="22"/>
-        </w:rPr>
-        <w:t>  Objetivo</w:t>
-      </w:r>
-      <w:proofErr w:type="gramEnd"/>
-      <w:r>
-        <w:rPr>
-          <w:rFonts w:ascii="Arial" w:hAnsi="Arial" w:cs="Arial"/>
-          <w:sz w:val="22"/>
-          <w:szCs w:val="22"/>
-        </w:rPr>
-        <w:t xml:space="preserve"> del documento </w:t>
-      </w:r>
-    </w:p>
-    <w:p>
-      <w:pPr>
-        <w:rPr>
-          <w:rFonts w:ascii="Arial" w:hAnsi="Arial" w:cs="Arial"/>
-          <w:sz w:val="22"/>
-          <w:szCs w:val="22"/>
-        </w:rPr>
-      </w:pPr>
-      <w:proofErr w:type="gramStart"/>
-      <w:r>
-        <w:rPr>
-          <w:rFonts w:ascii="Arial" w:hAnsi="Arial" w:cs="Arial"/>
-          <w:sz w:val="22"/>
-          <w:szCs w:val="22"/>
-        </w:rPr>
-        <w:t>  Breve</w:t>
-      </w:r>
-      <w:proofErr w:type="gramEnd"/>
-      <w:r>
-        <w:rPr>
-          <w:rFonts w:ascii="Arial" w:hAnsi="Arial" w:cs="Arial"/>
-          <w:sz w:val="22"/>
-          <w:szCs w:val="22"/>
-        </w:rPr>
-        <w:t xml:space="preserve"> descripción de cómo está organizado el resto</w:t>
+        <w:ind w:firstLine="720"/>
+        <w:rPr>
+          <w:rFonts w:ascii="Arial" w:hAnsi="Arial" w:cs="Arial"/>
+          <w:sz w:val="22"/>
+          <w:szCs w:val="22"/>
+        </w:rPr>
+      </w:pPr>
+      <w:r>
+        <w:rPr>
+          <w:rFonts w:ascii="Arial" w:hAnsi="Arial" w:cs="Arial"/>
+          <w:sz w:val="22"/>
+          <w:szCs w:val="22"/>
+        </w:rPr>
+        <w:t>En el contexto actual del desarrollo web, donde la competencia por la atención del usuario es cada vez más intensa y los motores de búsqueda integran la calidad de la experiencia como factor de posicionamiento, comprender y optimizar estas métricas ha dejado de ser una práctica opcional para convertirse en un requisito fundamental. Google incorporó oficialmente los Core Web Vitals como señal de ranking desde 2021, lo que impacta directamente en el tráfico orgánico de cualquier sitio web.</w:t>
       </w:r>
       <w:r>
         <w:rPr>
@@ -642,6 +1913,7 @@
           <w:szCs w:val="22"/>
         </w:rPr>
       </w:pPr>
+      <w:bookmarkStart w:id="2" w:name="_Toc231037589"/>
       <w:r>
         <w:rPr>
           <w:rFonts w:ascii="Arial" w:hAnsi="Arial" w:cs="Arial"/>
@@ -654,6 +1926,7 @@
         <w:lastRenderedPageBreak/>
         <w:t>Desarrollo</w:t>
       </w:r>
+      <w:bookmarkEnd w:id="2"/>
     </w:p>
     <w:p>
       <w:pPr>
@@ -667,6 +1940,7 @@
           <w:szCs w:val="22"/>
         </w:rPr>
       </w:pPr>
+      <w:bookmarkStart w:id="3" w:name="_Toc231037590"/>
       <w:r>
         <w:rPr>
           <w:rFonts w:ascii="Arial" w:hAnsi="Arial" w:cs="Arial"/>
@@ -678,6 +1952,7 @@
         </w:rPr>
         <w:t>Definición técnica</w:t>
       </w:r>
+      <w:bookmarkEnd w:id="3"/>
     </w:p>
     <w:p>
       <w:pPr>
@@ -1171,7 +2446,7 @@
               <w:sz w:val="22"/>
               <w:szCs w:val="22"/>
             </w:rPr>
-            <w:instrText xml:space="preserve"> CITATION Arj26 \l 5130 </w:instrText>
+            <w:instrText xml:space="preserve">CITATION Arj26 \l 5130 </w:instrText>
           </w:r>
           <w:r>
             <w:rPr>
@@ -1184,6 +2459,7 @@
           <w:r>
             <w:rPr>
               <w:rFonts w:ascii="Arial" w:hAnsi="Arial" w:cs="Arial"/>
+              <w:noProof/>
               <w:sz w:val="22"/>
               <w:szCs w:val="22"/>
             </w:rPr>
@@ -1192,10 +2468,11 @@
           <w:r>
             <w:rPr>
               <w:rFonts w:ascii="Arial" w:hAnsi="Arial" w:cs="Arial"/>
-              <w:sz w:val="22"/>
-              <w:szCs w:val="22"/>
-            </w:rPr>
-            <w:t>(Karel, Core Web Vtals, 2026)</w:t>
+              <w:noProof/>
+              <w:sz w:val="22"/>
+              <w:szCs w:val="22"/>
+            </w:rPr>
+            <w:t>(Karel, Core Web Vitals, 2026)</w:t>
           </w:r>
           <w:r>
             <w:rPr>
@@ -1220,6 +2497,7 @@
           <w:szCs w:val="22"/>
         </w:rPr>
       </w:pPr>
+      <w:bookmarkStart w:id="4" w:name="_Toc231037591"/>
       <w:r>
         <w:rPr>
           <w:rFonts w:ascii="Arial" w:hAnsi="Arial" w:cs="Arial"/>
@@ -1229,8 +2507,9 @@
           <w:sz w:val="22"/>
           <w:szCs w:val="22"/>
         </w:rPr>
-        <w:t xml:space="preserve">Funcionamiento interno </w:t>
-      </w:r>
+        <w:t>Funcionamiento interno</w:t>
+      </w:r>
+      <w:bookmarkEnd w:id="4"/>
     </w:p>
     <w:p>
       <w:pPr>
@@ -1608,6 +2887,7 @@
           <w:szCs w:val="22"/>
         </w:rPr>
       </w:pPr>
+      <w:bookmarkStart w:id="5" w:name="_Toc231037592"/>
       <w:r>
         <w:rPr>
           <w:rFonts w:ascii="Arial" w:hAnsi="Arial" w:cs="Arial"/>
@@ -1618,8 +2898,9 @@
           <w:szCs w:val="22"/>
         </w:rPr>
         <w:lastRenderedPageBreak/>
-        <w:t xml:space="preserve">Casos de uso </w:t>
-      </w:r>
+        <w:t>Casos de uso</w:t>
+      </w:r>
+      <w:bookmarkEnd w:id="5"/>
     </w:p>
     <w:p>
       <w:pPr>
@@ -1702,7 +2983,23 @@
           <w:sz w:val="22"/>
           <w:szCs w:val="22"/>
         </w:rPr>
-        <w:t xml:space="preserve"> que experimentan aumentos de hasta el 100% en sus tazas de conversión </w:t>
+        <w:t xml:space="preserve"> que experimentan aumentos de hasta el 100% en sus ta</w:t>
+      </w:r>
+      <w:r>
+        <w:rPr>
+          <w:rFonts w:ascii="Arial" w:hAnsi="Arial" w:cs="Arial"/>
+          <w:sz w:val="22"/>
+          <w:szCs w:val="22"/>
+        </w:rPr>
+        <w:t>s</w:t>
+      </w:r>
+      <w:r>
+        <w:rPr>
+          <w:rFonts w:ascii="Arial" w:hAnsi="Arial" w:cs="Arial"/>
+          <w:sz w:val="22"/>
+          <w:szCs w:val="22"/>
+        </w:rPr>
+        <w:t xml:space="preserve">as de conversión </w:t>
       </w:r>
       <w:r>
         <w:rPr>
@@ -1878,7 +3175,39 @@
           <w:sz w:val="22"/>
           <w:szCs w:val="22"/>
         </w:rPr>
-        <w:t xml:space="preserve">orizar el rendimiento de móviles. Google penaliza permia la “Experiencia de la </w:t>
+        <w:t xml:space="preserve">orizar el rendimiento de móviles. Google penaliza </w:t>
+      </w:r>
+      <w:r>
+        <w:rPr>
+          <w:rFonts w:ascii="Arial" w:hAnsi="Arial" w:cs="Arial"/>
+          <w:sz w:val="22"/>
+          <w:szCs w:val="22"/>
+        </w:rPr>
+        <w:t xml:space="preserve">o </w:t>
+      </w:r>
+      <w:r>
+        <w:rPr>
+          <w:rFonts w:ascii="Arial" w:hAnsi="Arial" w:cs="Arial"/>
+          <w:sz w:val="22"/>
+          <w:szCs w:val="22"/>
+        </w:rPr>
+        <w:t>p</w:t>
+      </w:r>
+      <w:r>
+        <w:rPr>
+          <w:rFonts w:ascii="Arial" w:hAnsi="Arial" w:cs="Arial"/>
+          <w:sz w:val="22"/>
+          <w:szCs w:val="22"/>
+        </w:rPr>
+        <w:t>r</w:t>
+      </w:r>
+      <w:r>
+        <w:rPr>
+          <w:rFonts w:ascii="Arial" w:hAnsi="Arial" w:cs="Arial"/>
+          <w:sz w:val="22"/>
+          <w:szCs w:val="22"/>
+        </w:rPr>
+        <w:t xml:space="preserve">emia la “Experiencia de la </w:t>
       </w:r>
       <w:r>
         <w:rPr>
@@ -2011,6 +3340,7 @@
           <w:szCs w:val="22"/>
         </w:rPr>
       </w:pPr>
+      <w:bookmarkStart w:id="6" w:name="_Toc231037593"/>
       <w:r>
         <w:rPr>
           <w:rFonts w:ascii="Arial" w:hAnsi="Arial" w:cs="Arial"/>
@@ -2020,8 +3350,9 @@
           <w:sz w:val="22"/>
           <w:szCs w:val="22"/>
         </w:rPr>
-        <w:t xml:space="preserve">Comparativa con alternativas </w:t>
-      </w:r>
+        <w:t>Comparativa con alternativas</w:t>
+      </w:r>
+      <w:bookmarkEnd w:id="6"/>
     </w:p>
     <w:p>
       <w:pPr>
@@ -2127,6 +3458,7 @@
           <w:szCs w:val="22"/>
         </w:rPr>
       </w:pPr>
+      <w:bookmarkStart w:id="7" w:name="_Toc231037594"/>
       <w:r>
         <w:rPr>
           <w:rFonts w:ascii="Arial" w:hAnsi="Arial" w:cs="Arial"/>
@@ -2139,6 +3471,7 @@
         <w:lastRenderedPageBreak/>
         <w:t>Tabla 1</w:t>
       </w:r>
+      <w:bookmarkEnd w:id="7"/>
     </w:p>
     <w:p>
       <w:pPr>
@@ -3932,6 +5265,7 @@
           <w:szCs w:val="22"/>
         </w:rPr>
       </w:pPr>
+      <w:bookmarkStart w:id="8" w:name="_Toc231037595"/>
       <w:r>
         <w:rPr>
           <w:rFonts w:ascii="Arial" w:hAnsi="Arial" w:cs="Arial"/>
@@ -3941,8 +5275,9 @@
           <w:sz w:val="22"/>
           <w:szCs w:val="22"/>
         </w:rPr>
-        <w:t xml:space="preserve">Ecosistema actual </w:t>
-      </w:r>
+        <w:t>Ecosistema actual</w:t>
+      </w:r>
+      <w:bookmarkEnd w:id="8"/>
     </w:p>
     <w:p>
       <w:pPr>
@@ -4036,6 +5371,7 @@
           <w:szCs w:val="22"/>
         </w:rPr>
       </w:pPr>
+      <w:bookmarkStart w:id="9" w:name="_Toc231037596"/>
       <w:r>
         <w:rPr>
           <w:rFonts w:ascii="Arial" w:hAnsi="Arial" w:cs="Arial"/>
@@ -4070,6 +5406,7 @@
         </w:rPr>
         <w:t>.</w:t>
       </w:r>
+      <w:bookmarkEnd w:id="9"/>
     </w:p>
     <w:p>
       <w:pPr>
@@ -4229,6 +5566,7 @@
           <w:szCs w:val="22"/>
         </w:rPr>
       </w:pPr>
+      <w:bookmarkStart w:id="10" w:name="_Toc231037597"/>
       <w:r>
         <w:rPr>
           <w:rFonts w:ascii="Arial" w:hAnsi="Arial" w:cs="Arial"/>
@@ -4251,6 +5589,7 @@
         </w:rPr>
         <w:t>.</w:t>
       </w:r>
+      <w:bookmarkEnd w:id="10"/>
     </w:p>
     <w:p>
       <w:pPr>
@@ -4321,7 +5660,23 @@
           <w:sz w:val="22"/>
           <w:szCs w:val="22"/>
         </w:rPr>
-        <w:t>) muestran que cerca del 52% de los orígenes web en móviles aprueban todas las métricas, mientras que en escritorio la cifra asciende al 58.8%.</w:t>
+        <w:t>) muestran que cerca del 52% de los orígenes web en móviles aprueban todas las métricas, mientras que en escritorio la cifra asciende al 5</w:t>
+      </w:r>
+      <w:r>
+        <w:rPr>
+          <w:rFonts w:ascii="Arial" w:hAnsi="Arial" w:cs="Arial"/>
+          <w:sz w:val="22"/>
+          <w:szCs w:val="22"/>
+        </w:rPr>
+        <w:t>9</w:t>
+      </w:r>
+      <w:r>
+        <w:rPr>
+          <w:rFonts w:ascii="Arial" w:hAnsi="Arial" w:cs="Arial"/>
+          <w:sz w:val="22"/>
+          <w:szCs w:val="22"/>
+        </w:rPr>
+        <w:t>%.</w:t>
       </w:r>
       <w:r>
         <w:rPr>
@@ -4478,6 +5833,7 @@
           <w:szCs w:val="22"/>
         </w:rPr>
       </w:pPr>
+      <w:bookmarkStart w:id="11" w:name="_Toc231037598"/>
       <w:r>
         <w:rPr>
           <w:rFonts w:ascii="Arial" w:hAnsi="Arial" w:cs="Arial"/>
@@ -4500,6 +5856,7 @@
         </w:rPr>
         <w:t>.</w:t>
       </w:r>
+      <w:bookmarkEnd w:id="11"/>
     </w:p>
     <w:p>
       <w:pPr>
@@ -4595,7 +5952,23 @@
           <w:sz w:val="22"/>
           <w:szCs w:val="22"/>
         </w:rPr>
-        <w:t xml:space="preserve">Ecosistema Frontend (State of JS / Frameworks):Frameworks como Next.js (con las mejoras en Server Components), </w:t>
+        <w:t>Ecosistema Frontend (State of JS / Frameworks):</w:t>
+      </w:r>
+      <w:r>
+        <w:rPr>
+          <w:rFonts w:ascii="Arial" w:hAnsi="Arial" w:cs="Arial"/>
+          <w:sz w:val="22"/>
+          <w:szCs w:val="22"/>
+        </w:rPr>
+        <w:t xml:space="preserve"> </w:t>
+      </w:r>
+      <w:r>
+        <w:rPr>
+          <w:rFonts w:ascii="Arial" w:hAnsi="Arial" w:cs="Arial"/>
+          <w:sz w:val="22"/>
+          <w:szCs w:val="22"/>
+        </w:rPr>
+        <w:t xml:space="preserve">Frameworks como Next.js (con las mejoras en Server Components), </w:t>
       </w:r>
       <w:proofErr w:type="spellStart"/>
       <w:r>
@@ -4709,6 +6082,7 @@
           <w:szCs w:val="22"/>
         </w:rPr>
       </w:pPr>
+      <w:bookmarkStart w:id="12" w:name="_Toc231037599"/>
       <w:r>
         <w:rPr>
           <w:rFonts w:ascii="Arial" w:hAnsi="Arial" w:cs="Arial"/>
@@ -4731,6 +6105,7 @@
         </w:rPr>
         <w:t>.</w:t>
       </w:r>
+      <w:bookmarkEnd w:id="12"/>
     </w:p>
     <w:p>
       <w:pPr>
@@ -4873,6 +6248,7 @@
           <w:szCs w:val="22"/>
         </w:rPr>
       </w:pPr>
+      <w:bookmarkStart w:id="13" w:name="_Toc231037600"/>
       <w:r>
         <w:rPr>
           <w:rFonts w:ascii="Arial" w:hAnsi="Arial" w:cs="Arial"/>
@@ -4885,105 +6261,71 @@
         <w:lastRenderedPageBreak/>
         <w:t>Conclusiones</w:t>
       </w:r>
+      <w:bookmarkEnd w:id="13"/>
     </w:p>
     <w:p>
       <w:pPr>
-        <w:rPr>
-          <w:rFonts w:ascii="Arial" w:hAnsi="Arial" w:cs="Arial"/>
-          <w:sz w:val="22"/>
-          <w:szCs w:val="22"/>
-        </w:rPr>
-      </w:pPr>
-      <w:proofErr w:type="gramStart"/>
-      <w:r>
-        <w:rPr>
-          <w:rFonts w:ascii="Arial" w:hAnsi="Arial" w:cs="Arial"/>
-          <w:sz w:val="22"/>
-          <w:szCs w:val="22"/>
-        </w:rPr>
-        <w:t>  Qué</w:t>
-      </w:r>
-      <w:proofErr w:type="gramEnd"/>
-      <w:r>
-        <w:rPr>
-          <w:rFonts w:ascii="Arial" w:hAnsi="Arial" w:cs="Arial"/>
-          <w:sz w:val="22"/>
-          <w:szCs w:val="22"/>
-        </w:rPr>
-        <w:t xml:space="preserve"> aprendieron del tema </w:t>
+        <w:ind w:firstLine="720"/>
+        <w:rPr>
+          <w:rFonts w:ascii="Arial" w:hAnsi="Arial" w:cs="Arial"/>
+          <w:sz w:val="22"/>
+          <w:szCs w:val="22"/>
+        </w:rPr>
+      </w:pPr>
+      <w:r>
+        <w:rPr>
+          <w:rFonts w:ascii="Arial" w:hAnsi="Arial" w:cs="Arial"/>
+          <w:sz w:val="22"/>
+          <w:szCs w:val="22"/>
+        </w:rPr>
+        <w:t>A lo largo de esta investigación se pudo comprender que los Core Web Vitals representan un cambio de paradigma en la forma en que se evalúa el rendimiento web: el foco ya no está en métricas puramente técnicas del servidor, sino en la experiencia concreta y medible del usuario real.</w:t>
       </w:r>
     </w:p>
     <w:p>
       <w:pPr>
-        <w:rPr>
-          <w:rFonts w:ascii="Arial" w:hAnsi="Arial" w:cs="Arial"/>
-          <w:sz w:val="22"/>
-          <w:szCs w:val="22"/>
-        </w:rPr>
-      </w:pPr>
-      <w:proofErr w:type="gramStart"/>
-      <w:r>
-        <w:rPr>
-          <w:rFonts w:ascii="Arial" w:hAnsi="Arial" w:cs="Arial"/>
-          <w:sz w:val="22"/>
-          <w:szCs w:val="22"/>
-        </w:rPr>
-        <w:t>  Cuál</w:t>
-      </w:r>
-      <w:proofErr w:type="gramEnd"/>
-      <w:r>
-        <w:rPr>
-          <w:rFonts w:ascii="Arial" w:hAnsi="Arial" w:cs="Arial"/>
-          <w:sz w:val="22"/>
-          <w:szCs w:val="22"/>
-        </w:rPr>
-        <w:t xml:space="preserve"> es el aporte real de los CWV al desarrollo web moderno </w:t>
+        <w:ind w:firstLine="720"/>
+        <w:rPr>
+          <w:rFonts w:ascii="Arial" w:hAnsi="Arial" w:cs="Arial"/>
+          <w:sz w:val="22"/>
+          <w:szCs w:val="22"/>
+        </w:rPr>
+      </w:pPr>
+      <w:r>
+        <w:rPr>
+          <w:rFonts w:ascii="Arial" w:hAnsi="Arial" w:cs="Arial"/>
+          <w:sz w:val="22"/>
+          <w:szCs w:val="22"/>
+        </w:rPr>
+        <w:t>El aporte más significativo de las CWV al desarrollo web moderno es que establecen un lenguaje común entre desarrolladores, diseñadores y tomadores de decisiones. Métricas como LCP, INP y CLS traducen problemas técnicos complejos — tiempos de renderizado, bloqueo del hilo principal, reordenamiento del DOM — en valores concretos con umbrales claros y consecuencias directas tanto en posicionamiento SEO como en resultados comerciales.</w:t>
       </w:r>
     </w:p>
     <w:p>
       <w:pPr>
-        <w:rPr>
-          <w:rFonts w:ascii="Arial" w:hAnsi="Arial" w:cs="Arial"/>
-          <w:sz w:val="22"/>
-          <w:szCs w:val="22"/>
-        </w:rPr>
-      </w:pPr>
-      <w:proofErr w:type="gramStart"/>
-      <w:r>
-        <w:rPr>
-          <w:rFonts w:ascii="Arial" w:hAnsi="Arial" w:cs="Arial"/>
-          <w:sz w:val="22"/>
-          <w:szCs w:val="22"/>
-        </w:rPr>
-        <w:t>  Recomendación</w:t>
-      </w:r>
-      <w:proofErr w:type="gramEnd"/>
-      <w:r>
-        <w:rPr>
-          <w:rFonts w:ascii="Arial" w:hAnsi="Arial" w:cs="Arial"/>
-          <w:sz w:val="22"/>
-          <w:szCs w:val="22"/>
-        </w:rPr>
-        <w:t xml:space="preserve"> de cuándo aplicarlos en un proyecto real</w:t>
+        <w:ind w:firstLine="720"/>
+        <w:rPr>
+          <w:rFonts w:ascii="Arial" w:hAnsi="Arial" w:cs="Arial"/>
+          <w:sz w:val="22"/>
+          <w:szCs w:val="22"/>
+        </w:rPr>
+      </w:pPr>
+      <w:r>
+        <w:rPr>
+          <w:rFonts w:ascii="Arial" w:hAnsi="Arial" w:cs="Arial"/>
+          <w:sz w:val="22"/>
+          <w:szCs w:val="22"/>
+        </w:rPr>
+        <w:t>Como recomendación práctica, los Core Web Vitals deberían integrarse desde las etapas tempranas de cualquier proyecto web, no solo como una checklist al momento del lanzamiento. Herramientas como PageSpeed Insights, Lighthouse y Google Search Console permiten monitorear estas métricas de forma continua, lo que facilita detectar regresiones antes de que afecten al usuario final. En proyectos con alto tráfico móvil o con modelos de negocio dependientes del posicionamiento orgánico, su optimización debe considerarse una prioridad desde el diseño mismo de la arquitectura frontend.</w:t>
+      </w:r>
+      <w:r>
+        <w:rPr>
+          <w:rFonts w:ascii="Arial" w:hAnsi="Arial" w:cs="Arial"/>
+          <w:sz w:val="22"/>
+          <w:szCs w:val="22"/>
+        </w:rPr>
+        <w:br w:type="page"/>
       </w:r>
     </w:p>
-    <w:p>
-      <w:pPr>
-        <w:rPr>
-          <w:rFonts w:ascii="Arial" w:hAnsi="Arial" w:cs="Arial"/>
-          <w:sz w:val="22"/>
-          <w:szCs w:val="22"/>
-        </w:rPr>
-      </w:pPr>
-      <w:r>
-        <w:rPr>
-          <w:rFonts w:ascii="Arial" w:hAnsi="Arial" w:cs="Arial"/>
-          <w:sz w:val="22"/>
-          <w:szCs w:val="22"/>
-        </w:rPr>
-        <w:br w:type="page"/>
-      </w:r>
-    </w:p>
+    <w:bookmarkStart w:id="14" w:name="_Toc231037601" w:displacedByCustomXml="next"/>
     <w:sdt>
       <w:sdtPr>
         <w:rPr>
@@ -5029,6 +6371,7 @@
             </w:rPr>
             <w:t>Referencias</w:t>
           </w:r>
+          <w:bookmarkEnd w:id="14"/>
         </w:p>
         <w:sdt>
           <w:sdtPr>
@@ -7120,6 +8463,44 @@
     <w:unhideWhenUsed/>
     <w:rsid w:val="006C524B"/>
   </w:style>
+  <w:style w:type="paragraph" w:styleId="TDC1">
+    <w:name w:val="toc 1"/>
+    <w:basedOn w:val="Normal"/>
+    <w:next w:val="Normal"/>
+    <w:autoRedefine/>
+    <w:uiPriority w:val="39"/>
+    <w:unhideWhenUsed/>
+    <w:rsid w:val="001F25F6"/>
+    <w:pPr>
+      <w:spacing w:after="100"/>
+    </w:pPr>
+  </w:style>
+  <w:style w:type="paragraph" w:styleId="TDC2">
+    <w:name w:val="toc 2"/>
+    <w:basedOn w:val="Normal"/>
+    <w:next w:val="Normal"/>
+    <w:autoRedefine/>
+    <w:uiPriority w:val="39"/>
+    <w:unhideWhenUsed/>
+    <w:rsid w:val="001F25F6"/>
+    <w:pPr>
+      <w:spacing w:after="100"/>
+      <w:ind w:left="240"/>
+    </w:pPr>
+  </w:style>
+  <w:style w:type="paragraph" w:styleId="TDC3">
+    <w:name w:val="toc 3"/>
+    <w:basedOn w:val="Normal"/>
+    <w:next w:val="Normal"/>
+    <w:autoRedefine/>
+    <w:uiPriority w:val="39"/>
+    <w:unhideWhenUsed/>
+    <w:rsid w:val="001F25F6"/>
+    <w:pPr>
+      <w:spacing w:after="100"/>
+      <w:ind w:left="480"/>
+    </w:pPr>
+  </w:style>
 </w:styles>
 </file>
 
@@ -7442,28 +8823,6 @@
     <b:RefOrder>1</b:RefOrder>
   </b:Source>
   <b:Source>
-    <b:Tag>Arj26</b:Tag>
-    <b:SourceType>InternetSite</b:SourceType>
-    <b:Guid>{2DE66C75-2BF5-4226-928B-E8ADCB93F30E}</b:Guid>
-    <b:Author>
-      <b:Author>
-        <b:NameList>
-          <b:Person>
-            <b:Last>Karel</b:Last>
-            <b:First>Arjen</b:First>
-          </b:Person>
-        </b:NameList>
-      </b:Author>
-    </b:Author>
-    <b:Title>Core Web Vtals</b:Title>
-    <b:InternetSiteTitle>www.corewebvitals.io</b:InternetSiteTitle>
-    <b:Year>2026</b:Year>
-    <b:Month>Marzo</b:Month>
-    <b:Day>3</b:Day>
-    <b:URL>https://www.corewebvitals.io/es/core-web-vitals</b:URL>
-    <b:RefOrder>5</b:RefOrder>
-  </b:Source>
-  <b:Source>
     <b:Tag>Mar16</b:Tag>
     <b:SourceType>InternetSite</b:SourceType>
     <b:Guid>{B8DC5F9F-2E30-468B-878C-B4C2BC3BB037}</b:Guid>
@@ -7679,11 +9038,33 @@
     <b:URL>https://medium.com/@mernstackdevbykevin/stop-guessing-about-react-performance-start-measuring-with-web-vitals-6189807e1390</b:URL>
     <b:RefOrder>13</b:RefOrder>
   </b:Source>
+  <b:Source>
+    <b:Tag>Arj26</b:Tag>
+    <b:SourceType>InternetSite</b:SourceType>
+    <b:Guid>{9F465C69-F8AD-48C3-9036-9192DADCA1E0}</b:Guid>
+    <b:Author>
+      <b:Author>
+        <b:NameList>
+          <b:Person>
+            <b:Last>Karel</b:Last>
+            <b:First>Arjen</b:First>
+          </b:Person>
+        </b:NameList>
+      </b:Author>
+    </b:Author>
+    <b:Title>Core Web Vitals</b:Title>
+    <b:InternetSiteTitle>www.corewebvitals.io</b:InternetSiteTitle>
+    <b:Year>2026</b:Year>
+    <b:Month>Marzo</b:Month>
+    <b:Day>3</b:Day>
+    <b:URL>https://www.corewebvitals.io/es/core-web-vitals</b:URL>
+    <b:RefOrder>5</b:RefOrder>
+  </b:Source>
 </b:Sources>
 </file>
 
 <file path=customXml/itemProps1.xml><?xml version="1.0" encoding="utf-8"?>
-<ds:datastoreItem xmlns:ds="http://schemas.openxmlformats.org/officeDocument/2006/customXml" ds:itemID="{277AB05A-1F8B-48D4-99A1-3E33D32CDAF7}">
+<ds:datastoreItem xmlns:ds="http://schemas.openxmlformats.org/officeDocument/2006/customXml" ds:itemID="{84FDE0AE-ACCC-4090-B74B-D84A2B919842}">
   <ds:schemaRefs>
     <ds:schemaRef ds:uri="http://schemas.openxmlformats.org/officeDocument/2006/bibliography"/>
   </ds:schemaRefs>

</xml_diff>